<commit_message>
Document the Streamlit Cloud deployment
- README: live demo link, Deployment section with what differs from a
  local run (mock model only, temporary shared memory, evaluation tab),
  and settings for deploying a copy
- Report: new 12.1 Deployment subsection, live link on the title page
  and in the run appendix
- Deck: live link on the "app, live" slide and in the demo notes
</commit_message>
<xml_diff>
--- a/submission/Rig_Sight_CA3_Report.docx
+++ b/submission/Rig_Sight_CA3_Report.docx
@@ -134,7 +134,7 @@
           <w:color w:val="595959"/>
           <w:sz w:val="20"/>
         </w:rPr>
-        <w:t>Repository: github.com/ranjanvrma/rig-sight</w:t>
+        <w:t>Repository: github.com/ranjanvrma/rig-sight · Live demo: rig-sight.streamlit.app</w:t>
       </w:r>
     </w:p>
     <w:p>
@@ -165,7 +165,7 @@
       <w:pPr>
         <w:pStyle w:val="Heading1"/>
       </w:pPr>
-      <w:bookmarkStart w:id="0" w:name="_Toc243333675"/>
+      <w:bookmarkStart w:id="0" w:name="_Toc243335675"/>
       <w:r>
         <w:lastRenderedPageBreak/>
         <w:t>Contents</w:t>
@@ -191,7 +191,7 @@
       <w:r>
         <w:fldChar w:fldCharType="separate"/>
       </w:r>
-      <w:hyperlink w:anchor="_Toc243333675" w:history="1">
+      <w:hyperlink w:anchor="_Toc243335675" w:history="1">
         <w:r>
           <w:rPr>
             <w:rStyle w:val="Hyperlink"/>
@@ -218,7 +218,7 @@
             <w:noProof/>
             <w:webHidden/>
           </w:rPr>
-          <w:instrText xml:space="preserve"> PAGEREF _Toc243333675 \h </w:instrText>
+          <w:instrText xml:space="preserve"> PAGEREF _Toc243335675 \h </w:instrText>
         </w:r>
         <w:r>
           <w:rPr>
@@ -259,7 +259,7 @@
           <w:noProof/>
         </w:rPr>
       </w:pPr>
-      <w:hyperlink w:anchor="_Toc243333676" w:history="1">
+      <w:hyperlink w:anchor="_Toc243335676" w:history="1">
         <w:r>
           <w:rPr>
             <w:rStyle w:val="Hyperlink"/>
@@ -286,7 +286,7 @@
             <w:noProof/>
             <w:webHidden/>
           </w:rPr>
-          <w:instrText xml:space="preserve"> PAGEREF _Toc243333676 \h </w:instrText>
+          <w:instrText xml:space="preserve"> PAGEREF _Toc243335676 \h </w:instrText>
         </w:r>
         <w:r>
           <w:rPr>
@@ -327,7 +327,7 @@
           <w:noProof/>
         </w:rPr>
       </w:pPr>
-      <w:hyperlink w:anchor="_Toc243333677" w:history="1">
+      <w:hyperlink w:anchor="_Toc243335677" w:history="1">
         <w:r>
           <w:rPr>
             <w:rStyle w:val="Hyperlink"/>
@@ -354,7 +354,7 @@
             <w:noProof/>
             <w:webHidden/>
           </w:rPr>
-          <w:instrText xml:space="preserve"> PAGEREF _Toc243333677 \h </w:instrText>
+          <w:instrText xml:space="preserve"> PAGEREF _Toc243335677 \h </w:instrText>
         </w:r>
         <w:r>
           <w:rPr>
@@ -395,7 +395,7 @@
           <w:noProof/>
         </w:rPr>
       </w:pPr>
-      <w:hyperlink w:anchor="_Toc243333678" w:history="1">
+      <w:hyperlink w:anchor="_Toc243335678" w:history="1">
         <w:r>
           <w:rPr>
             <w:rStyle w:val="Hyperlink"/>
@@ -422,7 +422,7 @@
             <w:noProof/>
             <w:webHidden/>
           </w:rPr>
-          <w:instrText xml:space="preserve"> PAGEREF _Toc243333678 \h </w:instrText>
+          <w:instrText xml:space="preserve"> PAGEREF _Toc243335678 \h </w:instrText>
         </w:r>
         <w:r>
           <w:rPr>
@@ -463,7 +463,7 @@
           <w:noProof/>
         </w:rPr>
       </w:pPr>
-      <w:hyperlink w:anchor="_Toc243333679" w:history="1">
+      <w:hyperlink w:anchor="_Toc243335679" w:history="1">
         <w:r>
           <w:rPr>
             <w:rStyle w:val="Hyperlink"/>
@@ -490,7 +490,7 @@
             <w:noProof/>
             <w:webHidden/>
           </w:rPr>
-          <w:instrText xml:space="preserve"> PAGEREF _Toc243333679 \h </w:instrText>
+          <w:instrText xml:space="preserve"> PAGEREF _Toc243335679 \h </w:instrText>
         </w:r>
         <w:r>
           <w:rPr>
@@ -531,7 +531,7 @@
           <w:noProof/>
         </w:rPr>
       </w:pPr>
-      <w:hyperlink w:anchor="_Toc243333680" w:history="1">
+      <w:hyperlink w:anchor="_Toc243335680" w:history="1">
         <w:r>
           <w:rPr>
             <w:rStyle w:val="Hyperlink"/>
@@ -558,7 +558,7 @@
             <w:noProof/>
             <w:webHidden/>
           </w:rPr>
-          <w:instrText xml:space="preserve"> PAGEREF _Toc243333680 \h </w:instrText>
+          <w:instrText xml:space="preserve"> PAGEREF _Toc243335680 \h </w:instrText>
         </w:r>
         <w:r>
           <w:rPr>
@@ -599,7 +599,7 @@
           <w:noProof/>
         </w:rPr>
       </w:pPr>
-      <w:hyperlink w:anchor="_Toc243333681" w:history="1">
+      <w:hyperlink w:anchor="_Toc243335681" w:history="1">
         <w:r>
           <w:rPr>
             <w:rStyle w:val="Hyperlink"/>
@@ -626,7 +626,7 @@
             <w:noProof/>
             <w:webHidden/>
           </w:rPr>
-          <w:instrText xml:space="preserve"> PAGEREF _Toc243333681 \h </w:instrText>
+          <w:instrText xml:space="preserve"> PAGEREF _Toc243335681 \h </w:instrText>
         </w:r>
         <w:r>
           <w:rPr>
@@ -667,7 +667,7 @@
           <w:noProof/>
         </w:rPr>
       </w:pPr>
-      <w:hyperlink w:anchor="_Toc243333682" w:history="1">
+      <w:hyperlink w:anchor="_Toc243335682" w:history="1">
         <w:r>
           <w:rPr>
             <w:rStyle w:val="Hyperlink"/>
@@ -694,7 +694,7 @@
             <w:noProof/>
             <w:webHidden/>
           </w:rPr>
-          <w:instrText xml:space="preserve"> PAGEREF _Toc243333682 \h </w:instrText>
+          <w:instrText xml:space="preserve"> PAGEREF _Toc243335682 \h </w:instrText>
         </w:r>
         <w:r>
           <w:rPr>
@@ -735,7 +735,7 @@
           <w:noProof/>
         </w:rPr>
       </w:pPr>
-      <w:hyperlink w:anchor="_Toc243333683" w:history="1">
+      <w:hyperlink w:anchor="_Toc243335683" w:history="1">
         <w:r>
           <w:rPr>
             <w:rStyle w:val="Hyperlink"/>
@@ -762,7 +762,7 @@
             <w:noProof/>
             <w:webHidden/>
           </w:rPr>
-          <w:instrText xml:space="preserve"> PAGEREF _Toc243333683 \h </w:instrText>
+          <w:instrText xml:space="preserve"> PAGEREF _Toc243335683 \h </w:instrText>
         </w:r>
         <w:r>
           <w:rPr>
@@ -803,7 +803,7 @@
           <w:noProof/>
         </w:rPr>
       </w:pPr>
-      <w:hyperlink w:anchor="_Toc243333684" w:history="1">
+      <w:hyperlink w:anchor="_Toc243335684" w:history="1">
         <w:r>
           <w:rPr>
             <w:rStyle w:val="Hyperlink"/>
@@ -830,7 +830,7 @@
             <w:noProof/>
             <w:webHidden/>
           </w:rPr>
-          <w:instrText xml:space="preserve"> PAGEREF _Toc243333684 \h </w:instrText>
+          <w:instrText xml:space="preserve"> PAGEREF _Toc243335684 \h </w:instrText>
         </w:r>
         <w:r>
           <w:rPr>
@@ -871,7 +871,7 @@
           <w:noProof/>
         </w:rPr>
       </w:pPr>
-      <w:hyperlink w:anchor="_Toc243333685" w:history="1">
+      <w:hyperlink w:anchor="_Toc243335685" w:history="1">
         <w:r>
           <w:rPr>
             <w:rStyle w:val="Hyperlink"/>
@@ -898,7 +898,7 @@
             <w:noProof/>
             <w:webHidden/>
           </w:rPr>
-          <w:instrText xml:space="preserve"> PAGEREF _Toc243333685 \h </w:instrText>
+          <w:instrText xml:space="preserve"> PAGEREF _Toc243335685 \h </w:instrText>
         </w:r>
         <w:r>
           <w:rPr>
@@ -939,7 +939,7 @@
           <w:noProof/>
         </w:rPr>
       </w:pPr>
-      <w:hyperlink w:anchor="_Toc243333686" w:history="1">
+      <w:hyperlink w:anchor="_Toc243335686" w:history="1">
         <w:r>
           <w:rPr>
             <w:rStyle w:val="Hyperlink"/>
@@ -966,7 +966,7 @@
             <w:noProof/>
             <w:webHidden/>
           </w:rPr>
-          <w:instrText xml:space="preserve"> PAGEREF _Toc243333686 \h </w:instrText>
+          <w:instrText xml:space="preserve"> PAGEREF _Toc243335686 \h </w:instrText>
         </w:r>
         <w:r>
           <w:rPr>
@@ -1007,7 +1007,7 @@
           <w:noProof/>
         </w:rPr>
       </w:pPr>
-      <w:hyperlink w:anchor="_Toc243333687" w:history="1">
+      <w:hyperlink w:anchor="_Toc243335687" w:history="1">
         <w:r>
           <w:rPr>
             <w:rStyle w:val="Hyperlink"/>
@@ -1034,7 +1034,7 @@
             <w:noProof/>
             <w:webHidden/>
           </w:rPr>
-          <w:instrText xml:space="preserve"> PAGEREF _Toc243333687 \h </w:instrText>
+          <w:instrText xml:space="preserve"> PAGEREF _Toc243335687 \h </w:instrText>
         </w:r>
         <w:r>
           <w:rPr>
@@ -1075,7 +1075,7 @@
           <w:noProof/>
         </w:rPr>
       </w:pPr>
-      <w:hyperlink w:anchor="_Toc243333688" w:history="1">
+      <w:hyperlink w:anchor="_Toc243335688" w:history="1">
         <w:r>
           <w:rPr>
             <w:rStyle w:val="Hyperlink"/>
@@ -1102,7 +1102,7 @@
             <w:noProof/>
             <w:webHidden/>
           </w:rPr>
-          <w:instrText xml:space="preserve"> PAGEREF _Toc243333688 \h </w:instrText>
+          <w:instrText xml:space="preserve"> PAGEREF _Toc243335688 \h </w:instrText>
         </w:r>
         <w:r>
           <w:rPr>
@@ -1143,7 +1143,7 @@
           <w:noProof/>
         </w:rPr>
       </w:pPr>
-      <w:hyperlink w:anchor="_Toc243333689" w:history="1">
+      <w:hyperlink w:anchor="_Toc243335689" w:history="1">
         <w:r>
           <w:rPr>
             <w:rStyle w:val="Hyperlink"/>
@@ -1170,7 +1170,7 @@
             <w:noProof/>
             <w:webHidden/>
           </w:rPr>
-          <w:instrText xml:space="preserve"> PAGEREF _Toc243333689 \h </w:instrText>
+          <w:instrText xml:space="preserve"> PAGEREF _Toc243335689 \h </w:instrText>
         </w:r>
         <w:r>
           <w:rPr>
@@ -1211,7 +1211,7 @@
           <w:noProof/>
         </w:rPr>
       </w:pPr>
-      <w:hyperlink w:anchor="_Toc243333690" w:history="1">
+      <w:hyperlink w:anchor="_Toc243335690" w:history="1">
         <w:r>
           <w:rPr>
             <w:rStyle w:val="Hyperlink"/>
@@ -1238,7 +1238,7 @@
             <w:noProof/>
             <w:webHidden/>
           </w:rPr>
-          <w:instrText xml:space="preserve"> PAGEREF _Toc243333690 \h </w:instrText>
+          <w:instrText xml:space="preserve"> PAGEREF _Toc243335690 \h </w:instrText>
         </w:r>
         <w:r>
           <w:rPr>
@@ -1279,7 +1279,7 @@
           <w:noProof/>
         </w:rPr>
       </w:pPr>
-      <w:hyperlink w:anchor="_Toc243333691" w:history="1">
+      <w:hyperlink w:anchor="_Toc243335691" w:history="1">
         <w:r>
           <w:rPr>
             <w:rStyle w:val="Hyperlink"/>
@@ -1306,7 +1306,7 @@
             <w:noProof/>
             <w:webHidden/>
           </w:rPr>
-          <w:instrText xml:space="preserve"> PAGEREF _Toc243333691 \h </w:instrText>
+          <w:instrText xml:space="preserve"> PAGEREF _Toc243335691 \h </w:instrText>
         </w:r>
         <w:r>
           <w:rPr>
@@ -1347,7 +1347,7 @@
           <w:noProof/>
         </w:rPr>
       </w:pPr>
-      <w:hyperlink w:anchor="_Toc243333692" w:history="1">
+      <w:hyperlink w:anchor="_Toc243335692" w:history="1">
         <w:r>
           <w:rPr>
             <w:rStyle w:val="Hyperlink"/>
@@ -1374,7 +1374,7 @@
             <w:noProof/>
             <w:webHidden/>
           </w:rPr>
-          <w:instrText xml:space="preserve"> PAGEREF _Toc243333692 \h </w:instrText>
+          <w:instrText xml:space="preserve"> PAGEREF _Toc243335692 \h </w:instrText>
         </w:r>
         <w:r>
           <w:rPr>
@@ -1415,7 +1415,7 @@
           <w:noProof/>
         </w:rPr>
       </w:pPr>
-      <w:hyperlink w:anchor="_Toc243333693" w:history="1">
+      <w:hyperlink w:anchor="_Toc243335693" w:history="1">
         <w:r>
           <w:rPr>
             <w:rStyle w:val="Hyperlink"/>
@@ -1442,7 +1442,7 @@
             <w:noProof/>
             <w:webHidden/>
           </w:rPr>
-          <w:instrText xml:space="preserve"> PAGEREF _Toc243333693 \h </w:instrText>
+          <w:instrText xml:space="preserve"> PAGEREF _Toc243335693 \h </w:instrText>
         </w:r>
         <w:r>
           <w:rPr>
@@ -1483,7 +1483,7 @@
           <w:noProof/>
         </w:rPr>
       </w:pPr>
-      <w:hyperlink w:anchor="_Toc243333694" w:history="1">
+      <w:hyperlink w:anchor="_Toc243335694" w:history="1">
         <w:r>
           <w:rPr>
             <w:rStyle w:val="Hyperlink"/>
@@ -1510,7 +1510,7 @@
             <w:noProof/>
             <w:webHidden/>
           </w:rPr>
-          <w:instrText xml:space="preserve"> PAGEREF _Toc243333694 \h </w:instrText>
+          <w:instrText xml:space="preserve"> PAGEREF _Toc243335694 \h </w:instrText>
         </w:r>
         <w:r>
           <w:rPr>
@@ -1551,7 +1551,7 @@
           <w:noProof/>
         </w:rPr>
       </w:pPr>
-      <w:hyperlink w:anchor="_Toc243333695" w:history="1">
+      <w:hyperlink w:anchor="_Toc243335695" w:history="1">
         <w:r>
           <w:rPr>
             <w:rStyle w:val="Hyperlink"/>
@@ -1578,7 +1578,143 @@
             <w:noProof/>
             <w:webHidden/>
           </w:rPr>
-          <w:instrText xml:space="preserve"> PAGEREF _Toc243333695 \h </w:instrText>
+          <w:instrText xml:space="preserve"> PAGEREF _Toc243335695 \h </w:instrText>
+        </w:r>
+        <w:r>
+          <w:rPr>
+            <w:noProof/>
+            <w:webHidden/>
+          </w:rPr>
+        </w:r>
+        <w:r>
+          <w:rPr>
+            <w:noProof/>
+            <w:webHidden/>
+          </w:rPr>
+          <w:fldChar w:fldCharType="separate"/>
+        </w:r>
+        <w:r>
+          <w:rPr>
+            <w:noProof/>
+            <w:webHidden/>
+          </w:rPr>
+          <w:t>10</w:t>
+        </w:r>
+        <w:r>
+          <w:rPr>
+            <w:noProof/>
+            <w:webHidden/>
+          </w:rPr>
+          <w:fldChar w:fldCharType="end"/>
+        </w:r>
+      </w:hyperlink>
+    </w:p>
+    <w:p>
+      <w:pPr>
+        <w:pStyle w:val="TOC2"/>
+        <w:tabs>
+          <w:tab w:val="right" w:leader="dot" w:pos="9288"/>
+        </w:tabs>
+        <w:rPr>
+          <w:noProof/>
+        </w:rPr>
+      </w:pPr>
+      <w:hyperlink w:anchor="_Toc243335696" w:history="1">
+        <w:r>
+          <w:rPr>
+            <w:rStyle w:val="Hyperlink"/>
+            <w:noProof/>
+          </w:rPr>
+          <w:t>12.1 Deployment</w:t>
+        </w:r>
+        <w:r>
+          <w:rPr>
+            <w:noProof/>
+            <w:webHidden/>
+          </w:rPr>
+          <w:tab/>
+        </w:r>
+        <w:r>
+          <w:rPr>
+            <w:noProof/>
+            <w:webHidden/>
+          </w:rPr>
+          <w:fldChar w:fldCharType="begin"/>
+        </w:r>
+        <w:r>
+          <w:rPr>
+            <w:noProof/>
+            <w:webHidden/>
+          </w:rPr>
+          <w:instrText xml:space="preserve"> PAGEREF _Toc243335696 \h </w:instrText>
+        </w:r>
+        <w:r>
+          <w:rPr>
+            <w:noProof/>
+            <w:webHidden/>
+          </w:rPr>
+        </w:r>
+        <w:r>
+          <w:rPr>
+            <w:noProof/>
+            <w:webHidden/>
+          </w:rPr>
+          <w:fldChar w:fldCharType="separate"/>
+        </w:r>
+        <w:r>
+          <w:rPr>
+            <w:noProof/>
+            <w:webHidden/>
+          </w:rPr>
+          <w:t>10</w:t>
+        </w:r>
+        <w:r>
+          <w:rPr>
+            <w:noProof/>
+            <w:webHidden/>
+          </w:rPr>
+          <w:fldChar w:fldCharType="end"/>
+        </w:r>
+      </w:hyperlink>
+    </w:p>
+    <w:p>
+      <w:pPr>
+        <w:pStyle w:val="TOC2"/>
+        <w:tabs>
+          <w:tab w:val="right" w:leader="dot" w:pos="9288"/>
+        </w:tabs>
+        <w:rPr>
+          <w:noProof/>
+        </w:rPr>
+      </w:pPr>
+      <w:hyperlink w:anchor="_Toc243335697" w:history="1">
+        <w:r>
+          <w:rPr>
+            <w:rStyle w:val="Hyperlink"/>
+            <w:noProof/>
+          </w:rPr>
+          <w:t>12.2 Screens</w:t>
+        </w:r>
+        <w:r>
+          <w:rPr>
+            <w:noProof/>
+            <w:webHidden/>
+          </w:rPr>
+          <w:tab/>
+        </w:r>
+        <w:r>
+          <w:rPr>
+            <w:noProof/>
+            <w:webHidden/>
+          </w:rPr>
+          <w:fldChar w:fldCharType="begin"/>
+        </w:r>
+        <w:r>
+          <w:rPr>
+            <w:noProof/>
+            <w:webHidden/>
+          </w:rPr>
+          <w:instrText xml:space="preserve"> PAGEREF _Toc243335697 \h </w:instrText>
         </w:r>
         <w:r>
           <w:rPr>
@@ -1619,7 +1755,7 @@
           <w:noProof/>
         </w:rPr>
       </w:pPr>
-      <w:hyperlink w:anchor="_Toc243333696" w:history="1">
+      <w:hyperlink w:anchor="_Toc243335698" w:history="1">
         <w:r>
           <w:rPr>
             <w:rStyle w:val="Hyperlink"/>
@@ -1646,7 +1782,7 @@
             <w:noProof/>
             <w:webHidden/>
           </w:rPr>
-          <w:instrText xml:space="preserve"> PAGEREF _Toc243333696 \h </w:instrText>
+          <w:instrText xml:space="preserve"> PAGEREF _Toc243335698 \h </w:instrText>
         </w:r>
         <w:r>
           <w:rPr>
@@ -1666,7 +1802,7 @@
             <w:noProof/>
             <w:webHidden/>
           </w:rPr>
-          <w:t>14</w:t>
+          <w:t>15</w:t>
         </w:r>
         <w:r>
           <w:rPr>
@@ -1687,7 +1823,7 @@
           <w:noProof/>
         </w:rPr>
       </w:pPr>
-      <w:hyperlink w:anchor="_Toc243333697" w:history="1">
+      <w:hyperlink w:anchor="_Toc243335699" w:history="1">
         <w:r>
           <w:rPr>
             <w:rStyle w:val="Hyperlink"/>
@@ -1714,7 +1850,7 @@
             <w:noProof/>
             <w:webHidden/>
           </w:rPr>
-          <w:instrText xml:space="preserve"> PAGEREF _Toc243333697 \h </w:instrText>
+          <w:instrText xml:space="preserve"> PAGEREF _Toc243335699 \h </w:instrText>
         </w:r>
         <w:r>
           <w:rPr>
@@ -1734,7 +1870,7 @@
             <w:noProof/>
             <w:webHidden/>
           </w:rPr>
-          <w:t>15</w:t>
+          <w:t>16</w:t>
         </w:r>
         <w:r>
           <w:rPr>
@@ -1755,7 +1891,7 @@
           <w:noProof/>
         </w:rPr>
       </w:pPr>
-      <w:hyperlink w:anchor="_Toc243333698" w:history="1">
+      <w:hyperlink w:anchor="_Toc243335700" w:history="1">
         <w:r>
           <w:rPr>
             <w:rStyle w:val="Hyperlink"/>
@@ -1782,7 +1918,7 @@
             <w:noProof/>
             <w:webHidden/>
           </w:rPr>
-          <w:instrText xml:space="preserve"> PAGEREF _Toc243333698 \h </w:instrText>
+          <w:instrText xml:space="preserve"> PAGEREF _Toc243335700 \h </w:instrText>
         </w:r>
         <w:r>
           <w:rPr>
@@ -1802,7 +1938,7 @@
             <w:noProof/>
             <w:webHidden/>
           </w:rPr>
-          <w:t>15</w:t>
+          <w:t>16</w:t>
         </w:r>
         <w:r>
           <w:rPr>
@@ -1823,7 +1959,7 @@
           <w:noProof/>
         </w:rPr>
       </w:pPr>
-      <w:hyperlink w:anchor="_Toc243333699" w:history="1">
+      <w:hyperlink w:anchor="_Toc243335701" w:history="1">
         <w:r>
           <w:rPr>
             <w:rStyle w:val="Hyperlink"/>
@@ -1850,7 +1986,7 @@
             <w:noProof/>
             <w:webHidden/>
           </w:rPr>
-          <w:instrText xml:space="preserve"> PAGEREF _Toc243333699 \h </w:instrText>
+          <w:instrText xml:space="preserve"> PAGEREF _Toc243335701 \h </w:instrText>
         </w:r>
         <w:r>
           <w:rPr>
@@ -1870,7 +2006,7 @@
             <w:noProof/>
             <w:webHidden/>
           </w:rPr>
-          <w:t>16</w:t>
+          <w:t>17</w:t>
         </w:r>
         <w:r>
           <w:rPr>
@@ -1891,7 +2027,7 @@
           <w:noProof/>
         </w:rPr>
       </w:pPr>
-      <w:hyperlink w:anchor="_Toc243333700" w:history="1">
+      <w:hyperlink w:anchor="_Toc243335702" w:history="1">
         <w:r>
           <w:rPr>
             <w:rStyle w:val="Hyperlink"/>
@@ -1918,7 +2054,7 @@
             <w:noProof/>
             <w:webHidden/>
           </w:rPr>
-          <w:instrText xml:space="preserve"> PAGEREF _Toc243333700 \h </w:instrText>
+          <w:instrText xml:space="preserve"> PAGEREF _Toc243335702 \h </w:instrText>
         </w:r>
         <w:r>
           <w:rPr>
@@ -1938,7 +2074,7 @@
             <w:noProof/>
             <w:webHidden/>
           </w:rPr>
-          <w:t>16</w:t>
+          <w:t>17</w:t>
         </w:r>
         <w:r>
           <w:rPr>
@@ -1959,7 +2095,7 @@
           <w:noProof/>
         </w:rPr>
       </w:pPr>
-      <w:hyperlink w:anchor="_Toc243333701" w:history="1">
+      <w:hyperlink w:anchor="_Toc243335703" w:history="1">
         <w:r>
           <w:rPr>
             <w:rStyle w:val="Hyperlink"/>
@@ -1986,7 +2122,7 @@
             <w:noProof/>
             <w:webHidden/>
           </w:rPr>
-          <w:instrText xml:space="preserve"> PAGEREF _Toc243333701 \h </w:instrText>
+          <w:instrText xml:space="preserve"> PAGEREF _Toc243335703 \h </w:instrText>
         </w:r>
         <w:r>
           <w:rPr>
@@ -2006,7 +2142,7 @@
             <w:noProof/>
             <w:webHidden/>
           </w:rPr>
-          <w:t>16</w:t>
+          <w:t>17</w:t>
         </w:r>
         <w:r>
           <w:rPr>
@@ -2027,7 +2163,7 @@
           <w:noProof/>
         </w:rPr>
       </w:pPr>
-      <w:hyperlink w:anchor="_Toc243333702" w:history="1">
+      <w:hyperlink w:anchor="_Toc243335704" w:history="1">
         <w:r>
           <w:rPr>
             <w:rStyle w:val="Hyperlink"/>
@@ -2054,7 +2190,7 @@
             <w:noProof/>
             <w:webHidden/>
           </w:rPr>
-          <w:instrText xml:space="preserve"> PAGEREF _Toc243333702 \h </w:instrText>
+          <w:instrText xml:space="preserve"> PAGEREF _Toc243335704 \h </w:instrText>
         </w:r>
         <w:r>
           <w:rPr>
@@ -2074,7 +2210,7 @@
             <w:noProof/>
             <w:webHidden/>
           </w:rPr>
-          <w:t>17</w:t>
+          <w:t>18</w:t>
         </w:r>
         <w:r>
           <w:rPr>
@@ -2095,7 +2231,7 @@
           <w:noProof/>
         </w:rPr>
       </w:pPr>
-      <w:hyperlink w:anchor="_Toc243333703" w:history="1">
+      <w:hyperlink w:anchor="_Toc243335705" w:history="1">
         <w:r>
           <w:rPr>
             <w:rStyle w:val="Hyperlink"/>
@@ -2122,7 +2258,7 @@
             <w:noProof/>
             <w:webHidden/>
           </w:rPr>
-          <w:instrText xml:space="preserve"> PAGEREF _Toc243333703 \h </w:instrText>
+          <w:instrText xml:space="preserve"> PAGEREF _Toc243335705 \h </w:instrText>
         </w:r>
         <w:r>
           <w:rPr>
@@ -2142,7 +2278,7 @@
             <w:noProof/>
             <w:webHidden/>
           </w:rPr>
-          <w:t>17</w:t>
+          <w:t>18</w:t>
         </w:r>
         <w:r>
           <w:rPr>
@@ -2167,7 +2303,7 @@
       <w:pPr>
         <w:pStyle w:val="Heading1"/>
       </w:pPr>
-      <w:bookmarkStart w:id="1" w:name="_Toc243333676"/>
+      <w:bookmarkStart w:id="1" w:name="_Toc243335676"/>
       <w:r>
         <w:lastRenderedPageBreak/>
         <w:t>Abstract</w:t>
@@ -2194,7 +2330,7 @@
       <w:pPr>
         <w:pStyle w:val="Heading1"/>
       </w:pPr>
-      <w:bookmarkStart w:id="2" w:name="_Toc243333677"/>
+      <w:bookmarkStart w:id="2" w:name="_Toc243335677"/>
       <w:r>
         <w:t>1. Introduction and domain background</w:t>
       </w:r>
@@ -2204,7 +2340,7 @@
       <w:pPr>
         <w:pStyle w:val="Heading2"/>
       </w:pPr>
-      <w:bookmarkStart w:id="3" w:name="_Toc243333678"/>
+      <w:bookmarkStart w:id="3" w:name="_Toc243335678"/>
       <w:r>
         <w:t>1.1 Why oil and gas drilling</w:t>
       </w:r>
@@ -2222,7 +2358,7 @@
       <w:pPr>
         <w:pStyle w:val="Heading2"/>
       </w:pPr>
-      <w:bookmarkStart w:id="4" w:name="_Toc243333679"/>
+      <w:bookmarkStart w:id="4" w:name="_Toc243335679"/>
       <w:r>
         <w:t>1.2 The Daily Drilling Report</w:t>
       </w:r>
@@ -2281,7 +2417,7 @@
       <w:pPr>
         <w:pStyle w:val="Heading2"/>
       </w:pPr>
-      <w:bookmarkStart w:id="5" w:name="_Toc243333680"/>
+      <w:bookmarkStart w:id="5" w:name="_Toc243335680"/>
       <w:r>
         <w:t>1.3 Non-productive time</w:t>
       </w:r>
@@ -2300,7 +2436,7 @@
       <w:pPr>
         <w:pStyle w:val="Heading1"/>
       </w:pPr>
-      <w:bookmarkStart w:id="6" w:name="_Toc243333681"/>
+      <w:bookmarkStart w:id="6" w:name="_Toc243335681"/>
       <w:r>
         <w:t>2. Problem statement</w:t>
       </w:r>
@@ -2323,7 +2459,7 @@
       <w:pPr>
         <w:pStyle w:val="Heading1"/>
       </w:pPr>
-      <w:bookmarkStart w:id="7" w:name="_Toc243333682"/>
+      <w:bookmarkStart w:id="7" w:name="_Toc243335682"/>
       <w:r>
         <w:t>3. Existing process and identified inefficiencies</w:t>
       </w:r>
@@ -2423,7 +2559,7 @@
       <w:pPr>
         <w:pStyle w:val="Heading1"/>
       </w:pPr>
-      <w:bookmarkStart w:id="8" w:name="_Toc243333683"/>
+      <w:bookmarkStart w:id="8" w:name="_Toc243335683"/>
       <w:r>
         <w:t>4. Proposed solution and objectives</w:t>
       </w:r>
@@ -2518,7 +2654,7 @@
       <w:pPr>
         <w:pStyle w:val="Heading1"/>
       </w:pPr>
-      <w:bookmarkStart w:id="9" w:name="_Toc243333684"/>
+      <w:bookmarkStart w:id="9" w:name="_Toc243335684"/>
       <w:r>
         <w:lastRenderedPageBreak/>
         <w:t>5. Requirements and technology stack</w:t>
@@ -2529,7 +2665,7 @@
       <w:pPr>
         <w:pStyle w:val="Heading2"/>
       </w:pPr>
-      <w:bookmarkStart w:id="10" w:name="_Toc243333685"/>
+      <w:bookmarkStart w:id="10" w:name="_Toc243335685"/>
       <w:r>
         <w:t>5.1 Functional requirements</w:t>
       </w:r>
@@ -3367,7 +3503,7 @@
       <w:pPr>
         <w:pStyle w:val="Heading2"/>
       </w:pPr>
-      <w:bookmarkStart w:id="11" w:name="_Toc243333686"/>
+      <w:bookmarkStart w:id="11" w:name="_Toc243335686"/>
       <w:r>
         <w:t>5.2 Technology stack</w:t>
       </w:r>
@@ -3892,7 +4028,7 @@
       <w:pPr>
         <w:pStyle w:val="Heading1"/>
       </w:pPr>
-      <w:bookmarkStart w:id="12" w:name="_Toc243333687"/>
+      <w:bookmarkStart w:id="12" w:name="_Toc243335687"/>
       <w:r>
         <w:t>6. System architecture and data flow</w:t>
       </w:r>
@@ -3917,7 +4053,7 @@
           <w:noProof/>
         </w:rPr>
         <w:drawing>
-          <wp:inline distT="0" distB="0" distL="0" distR="0" wp14:anchorId="2A116017" wp14:editId="77A01D81">
+          <wp:inline distT="0" distB="0" distL="0" distR="0" wp14:anchorId="6E5BFD13" wp14:editId="5A08B990">
             <wp:extent cx="5903999" cy="3542399"/>
             <wp:effectExtent l="0" t="0" r="0" b="0"/>
             <wp:docPr id="1" name="Picture 1"/>
@@ -4034,7 +4170,7 @@
       <w:pPr>
         <w:pStyle w:val="Heading1"/>
       </w:pPr>
-      <w:bookmarkStart w:id="13" w:name="_Toc243333688"/>
+      <w:bookmarkStart w:id="13" w:name="_Toc243335688"/>
       <w:r>
         <w:t>7. Agent roles and orchestration</w:t>
       </w:r>
@@ -4741,7 +4877,7 @@
       <w:pPr>
         <w:pStyle w:val="Heading1"/>
       </w:pPr>
-      <w:bookmarkStart w:id="14" w:name="_Toc243333689"/>
+      <w:bookmarkStart w:id="14" w:name="_Toc243335689"/>
       <w:r>
         <w:t>8. Data model, synthetic dataset and reference files</w:t>
       </w:r>
@@ -4751,7 +4887,7 @@
       <w:pPr>
         <w:pStyle w:val="Heading2"/>
       </w:pPr>
-      <w:bookmarkStart w:id="15" w:name="_Toc243333690"/>
+      <w:bookmarkStart w:id="15" w:name="_Toc243335690"/>
       <w:r>
         <w:t>8.1 Shared state (DDRState)</w:t>
       </w:r>
@@ -5483,7 +5619,7 @@
       <w:pPr>
         <w:pStyle w:val="Heading2"/>
       </w:pPr>
-      <w:bookmarkStart w:id="16" w:name="_Toc243333691"/>
+      <w:bookmarkStart w:id="16" w:name="_Toc243335691"/>
       <w:r>
         <w:lastRenderedPageBreak/>
         <w:t>8.2 Synthetic dataset</w:t>
@@ -5967,7 +6103,7 @@
       <w:pPr>
         <w:pStyle w:val="Heading1"/>
       </w:pPr>
-      <w:bookmarkStart w:id="17" w:name="_Toc243333692"/>
+      <w:bookmarkStart w:id="17" w:name="_Toc243335692"/>
       <w:r>
         <w:t>9. Implementation details</w:t>
       </w:r>
@@ -6354,7 +6490,7 @@
       <w:pPr>
         <w:pStyle w:val="Heading1"/>
       </w:pPr>
-      <w:bookmarkStart w:id="18" w:name="_Toc243333693"/>
+      <w:bookmarkStart w:id="18" w:name="_Toc243335693"/>
       <w:r>
         <w:t>10. Deterministic tools and model usage</w:t>
       </w:r>
@@ -6730,7 +6866,7 @@
       <w:pPr>
         <w:pStyle w:val="Heading1"/>
       </w:pPr>
-      <w:bookmarkStart w:id="19" w:name="_Toc243333694"/>
+      <w:bookmarkStart w:id="19" w:name="_Toc243335694"/>
       <w:r>
         <w:t>11. Critic validation, retries and human-in-the-loop review</w:t>
       </w:r>
@@ -7225,7 +7361,7 @@
       <w:pPr>
         <w:pStyle w:val="Heading1"/>
       </w:pPr>
-      <w:bookmarkStart w:id="20" w:name="_Toc243333695"/>
+      <w:bookmarkStart w:id="20" w:name="_Toc243335695"/>
       <w:r>
         <w:t>12. Streamlit interface</w:t>
       </w:r>
@@ -7233,7 +7369,97 @@
     </w:p>
     <w:p>
       <w:r>
-        <w:t>All screenshots below were taken from the running application with the local qwen2.5:3b model.</w:t>
+        <w:t>The interface is a single Streamlit page with four tabs: Analyse report, Evaluation, Memory and Architecture.</w:t>
+      </w:r>
+    </w:p>
+    <w:p>
+      <w:pPr>
+        <w:pStyle w:val="Heading2"/>
+      </w:pPr>
+      <w:bookmarkStart w:id="21" w:name="_Toc243335696"/>
+      <w:r>
+        <w:t>12.1 Deployment</w:t>
+      </w:r>
+      <w:bookmarkEnd w:id="21"/>
+    </w:p>
+    <w:p>
+      <w:r>
+        <w:t>The application is also deployed on Streamlit Community Cloud at https://rig-sight.streamlit.app/, built from the main branch of the GitHub repository with app.py as the entry point; a push to main redeploys it. It was checked on 19 October 2026: W-02 Day 14 gave 8.0 h NPT, the Critic failed the 23.5 h first pass and the retry recovered the missing half hour.</w:t>
+      </w:r>
+    </w:p>
+    <w:p>
+      <w:pPr>
+        <w:pStyle w:val="ListBullet"/>
+        <w:spacing w:after="60"/>
+      </w:pPr>
+      <w:r>
+        <w:rPr>
+          <w:b/>
+        </w:rPr>
+        <w:t xml:space="preserve">Model: </w:t>
+      </w:r>
+      <w:r>
+        <w:t>the cloud has no Ollama, so the hosted app runs on the mock keyword classifier. The sidebar and every report say so, and choosing Ollama shows a warning and falls back to the mock.</w:t>
+      </w:r>
+    </w:p>
+    <w:p>
+      <w:pPr>
+        <w:pStyle w:val="ListBullet"/>
+        <w:spacing w:after="60"/>
+      </w:pPr>
+      <w:r>
+        <w:rPr>
+          <w:b/>
+        </w:rPr>
+        <w:t xml:space="preserve">Results: </w:t>
+      </w:r>
+      <w:r>
+        <w:t>the Evaluation tab shows the committed qwen2.5:3b and mock results; re-running the evaluation there scores the mock only.</w:t>
+      </w:r>
+    </w:p>
+    <w:p>
+      <w:pPr>
+        <w:pStyle w:val="ListBullet"/>
+        <w:spacing w:after="60"/>
+      </w:pPr>
+      <w:r>
+        <w:rPr>
+          <w:b/>
+        </w:rPr>
+        <w:t xml:space="preserve">State: </w:t>
+      </w:r>
+      <w:r>
+        <w:t>memory and checkpoints are written to temporary server storage. They are lost when the app restarts, sleeps or redeploys, and are shared by everyone using it at the same time.</w:t>
+      </w:r>
+    </w:p>
+    <w:p>
+      <w:pPr>
+        <w:pStyle w:val="ListBullet"/>
+        <w:spacing w:after="60"/>
+      </w:pPr>
+      <w:r>
+        <w:rPr>
+          <w:b/>
+        </w:rPr>
+        <w:t xml:space="preserve">Use: </w:t>
+      </w:r>
+      <w:r>
+        <w:t>the hosted app shows the workflow with no setup; the results with the real model, including the engineer correcting the model's mistake, come from running it locally with Ollama.</w:t>
+      </w:r>
+    </w:p>
+    <w:p>
+      <w:pPr>
+        <w:pStyle w:val="Heading2"/>
+      </w:pPr>
+      <w:bookmarkStart w:id="22" w:name="_Toc243335697"/>
+      <w:r>
+        <w:t>12.2 Screens</w:t>
+      </w:r>
+      <w:bookmarkEnd w:id="22"/>
+    </w:p>
+    <w:p>
+      <w:r>
+        <w:t>All screenshots below were taken from the application running locally with the qwen2.5:3b model.</w:t>
       </w:r>
     </w:p>
     <w:p>
@@ -7245,8 +7471,9 @@
         <w:rPr>
           <w:noProof/>
         </w:rPr>
+        <w:lastRenderedPageBreak/>
         <w:drawing>
-          <wp:inline distT="0" distB="0" distL="0" distR="0" wp14:anchorId="5498E52F" wp14:editId="089D17B7">
+          <wp:inline distT="0" distB="0" distL="0" distR="0" wp14:anchorId="1BC3A64D" wp14:editId="3BCF9B69">
             <wp:extent cx="5903999" cy="3019750"/>
             <wp:effectExtent l="0" t="0" r="0" b="0"/>
             <wp:docPr id="2" name="Picture 2"/>
@@ -7300,9 +7527,8 @@
         <w:rPr>
           <w:noProof/>
         </w:rPr>
-        <w:lastRenderedPageBreak/>
         <w:drawing>
-          <wp:inline distT="0" distB="0" distL="0" distR="0" wp14:anchorId="0DA38094" wp14:editId="548870FA">
+          <wp:inline distT="0" distB="0" distL="0" distR="0" wp14:anchorId="2689D0E8" wp14:editId="10200BE2">
             <wp:extent cx="5903999" cy="2032524"/>
             <wp:effectExtent l="0" t="0" r="0" b="0"/>
             <wp:docPr id="3" name="Picture 3"/>
@@ -7356,8 +7582,9 @@
         <w:rPr>
           <w:noProof/>
         </w:rPr>
+        <w:lastRenderedPageBreak/>
         <w:drawing>
-          <wp:inline distT="0" distB="0" distL="0" distR="0" wp14:anchorId="1162FE0A" wp14:editId="1DB88998">
+          <wp:inline distT="0" distB="0" distL="0" distR="0" wp14:anchorId="38748809" wp14:editId="69939E2E">
             <wp:extent cx="5903999" cy="4413481"/>
             <wp:effectExtent l="0" t="0" r="0" b="0"/>
             <wp:docPr id="4" name="Picture 4"/>
@@ -7413,7 +7640,7 @@
         </w:rPr>
         <w:lastRenderedPageBreak/>
         <w:drawing>
-          <wp:inline distT="0" distB="0" distL="0" distR="0" wp14:anchorId="4B835C64" wp14:editId="097C4FCF">
+          <wp:inline distT="0" distB="0" distL="0" distR="0" wp14:anchorId="5F282D8A" wp14:editId="2367F761">
             <wp:extent cx="5903999" cy="4274753"/>
             <wp:effectExtent l="0" t="0" r="0" b="0"/>
             <wp:docPr id="5" name="Picture 5"/>
@@ -7468,7 +7695,7 @@
           <w:noProof/>
         </w:rPr>
         <w:drawing>
-          <wp:inline distT="0" distB="0" distL="0" distR="0" wp14:anchorId="010E65C3" wp14:editId="206287BD">
+          <wp:inline distT="0" distB="0" distL="0" distR="0" wp14:anchorId="6689FB75" wp14:editId="5680B2AF">
             <wp:extent cx="5903999" cy="2387409"/>
             <wp:effectExtent l="0" t="0" r="0" b="0"/>
             <wp:docPr id="6" name="Picture 6"/>
@@ -7524,7 +7751,7 @@
         </w:rPr>
         <w:lastRenderedPageBreak/>
         <w:drawing>
-          <wp:inline distT="0" distB="0" distL="0" distR="0" wp14:anchorId="7EFE2357" wp14:editId="769EC976">
+          <wp:inline distT="0" distB="0" distL="0" distR="0" wp14:anchorId="2253D518" wp14:editId="0522B451">
             <wp:extent cx="5903999" cy="5042596"/>
             <wp:effectExtent l="0" t="0" r="0" b="0"/>
             <wp:docPr id="7" name="Picture 7"/>
@@ -7580,7 +7807,7 @@
         </w:rPr>
         <w:lastRenderedPageBreak/>
         <w:drawing>
-          <wp:inline distT="0" distB="0" distL="0" distR="0" wp14:anchorId="44A3980C" wp14:editId="530CD8A7">
+          <wp:inline distT="0" distB="0" distL="0" distR="0" wp14:anchorId="1F6C3C8D" wp14:editId="165BBEBF">
             <wp:extent cx="5400000" cy="4777377"/>
             <wp:effectExtent l="0" t="0" r="0" b="0"/>
             <wp:docPr id="8" name="Picture 8"/>
@@ -7629,11 +7856,11 @@
       <w:pPr>
         <w:pStyle w:val="Heading1"/>
       </w:pPr>
-      <w:bookmarkStart w:id="21" w:name="_Toc243333696"/>
+      <w:bookmarkStart w:id="23" w:name="_Toc243335698"/>
       <w:r>
         <w:t>13. Testing methodology and test cases</w:t>
       </w:r>
-      <w:bookmarkEnd w:id="21"/>
+      <w:bookmarkEnd w:id="23"/>
     </w:p>
     <w:p>
       <w:r>
@@ -7871,11 +8098,11 @@
       <w:pPr>
         <w:pStyle w:val="Heading1"/>
       </w:pPr>
-      <w:bookmarkStart w:id="22" w:name="_Toc243333697"/>
+      <w:bookmarkStart w:id="24" w:name="_Toc243335699"/>
       <w:r>
         <w:t>14. Evaluation results</w:t>
       </w:r>
-      <w:bookmarkEnd w:id="22"/>
+      <w:bookmarkEnd w:id="24"/>
     </w:p>
     <w:p>
       <w:r>
@@ -8937,11 +9164,11 @@
       <w:pPr>
         <w:pStyle w:val="Heading2"/>
       </w:pPr>
-      <w:bookmarkStart w:id="23" w:name="_Toc243333698"/>
+      <w:bookmarkStart w:id="25" w:name="_Toc243335700"/>
       <w:r>
         <w:t>Interpretation</w:t>
       </w:r>
-      <w:bookmarkEnd w:id="23"/>
+      <w:bookmarkEnd w:id="25"/>
     </w:p>
     <w:p>
       <w:pPr>
@@ -9056,11 +9283,11 @@
       <w:pPr>
         <w:pStyle w:val="Heading1"/>
       </w:pPr>
-      <w:bookmarkStart w:id="24" w:name="_Toc243333699"/>
+      <w:bookmarkStart w:id="26" w:name="_Toc243335701"/>
       <w:r>
         <w:t>15. Limitations and responsible use</w:t>
       </w:r>
-      <w:bookmarkEnd w:id="24"/>
+      <w:bookmarkEnd w:id="26"/>
     </w:p>
     <w:p>
       <w:pPr>
@@ -9129,11 +9356,11 @@
       <w:pPr>
         <w:pStyle w:val="Heading1"/>
       </w:pPr>
-      <w:bookmarkStart w:id="25" w:name="_Toc243333700"/>
+      <w:bookmarkStart w:id="27" w:name="_Toc243335702"/>
       <w:r>
         <w:t>16. Future enhancements</w:t>
       </w:r>
-      <w:bookmarkEnd w:id="25"/>
+      <w:bookmarkEnd w:id="27"/>
     </w:p>
     <w:p>
       <w:pPr>
@@ -9193,11 +9420,11 @@
       <w:pPr>
         <w:pStyle w:val="Heading1"/>
       </w:pPr>
-      <w:bookmarkStart w:id="26" w:name="_Toc243333701"/>
+      <w:bookmarkStart w:id="28" w:name="_Toc243335703"/>
       <w:r>
         <w:t>17. Conclusion</w:t>
       </w:r>
-      <w:bookmarkEnd w:id="26"/>
+      <w:bookmarkEnd w:id="28"/>
     </w:p>
     <w:p>
       <w:r>
@@ -9212,11 +9439,11 @@
       <w:pPr>
         <w:pStyle w:val="Heading1"/>
       </w:pPr>
-      <w:bookmarkStart w:id="27" w:name="_Toc243333702"/>
+      <w:bookmarkStart w:id="29" w:name="_Toc243335704"/>
       <w:r>
         <w:t>References</w:t>
       </w:r>
-      <w:bookmarkEnd w:id="27"/>
+      <w:bookmarkEnd w:id="29"/>
     </w:p>
     <w:p>
       <w:pPr>
@@ -9474,11 +9701,16 @@
       <w:pPr>
         <w:pStyle w:val="Heading1"/>
       </w:pPr>
-      <w:bookmarkStart w:id="28" w:name="_Toc243333703"/>
+      <w:bookmarkStart w:id="30" w:name="_Toc243335705"/>
       <w:r>
         <w:t>Appendix A. How to run</w:t>
       </w:r>
-      <w:bookmarkEnd w:id="28"/>
+      <w:bookmarkEnd w:id="30"/>
+    </w:p>
+    <w:p>
+      <w:r>
+        <w:t>Online, without installing anything: https://rig-sight.streamlit.app/ (mock classifier). Locally:</w:t>
+      </w:r>
     </w:p>
     <w:p>
       <w:pPr>
@@ -9845,31 +10077,31 @@
       </w:rPr>
     </w:lvl>
   </w:abstractNum>
-  <w:num w:numId="1" w16cid:durableId="953293923">
+  <w:num w:numId="1" w16cid:durableId="1926719679">
     <w:abstractNumId w:val="8"/>
   </w:num>
-  <w:num w:numId="2" w16cid:durableId="712536039">
+  <w:num w:numId="2" w16cid:durableId="547109362">
     <w:abstractNumId w:val="6"/>
   </w:num>
-  <w:num w:numId="3" w16cid:durableId="1731463758">
+  <w:num w:numId="3" w16cid:durableId="627662627">
     <w:abstractNumId w:val="5"/>
   </w:num>
-  <w:num w:numId="4" w16cid:durableId="1016619115">
+  <w:num w:numId="4" w16cid:durableId="2146894039">
     <w:abstractNumId w:val="4"/>
   </w:num>
-  <w:num w:numId="5" w16cid:durableId="2012484093">
+  <w:num w:numId="5" w16cid:durableId="321852193">
     <w:abstractNumId w:val="7"/>
   </w:num>
-  <w:num w:numId="6" w16cid:durableId="1082875369">
+  <w:num w:numId="6" w16cid:durableId="660742328">
     <w:abstractNumId w:val="3"/>
   </w:num>
-  <w:num w:numId="7" w16cid:durableId="751781261">
+  <w:num w:numId="7" w16cid:durableId="123351274">
     <w:abstractNumId w:val="2"/>
   </w:num>
-  <w:num w:numId="8" w16cid:durableId="1992323101">
+  <w:num w:numId="8" w16cid:durableId="1676347538">
     <w:abstractNumId w:val="1"/>
   </w:num>
-  <w:num w:numId="9" w16cid:durableId="342897142">
+  <w:num w:numId="9" w16cid:durableId="2125071113">
     <w:abstractNumId w:val="0"/>
   </w:num>
 </w:numbering>
@@ -21261,7 +21493,7 @@
     <w:autoRedefine/>
     <w:uiPriority w:val="39"/>
     <w:unhideWhenUsed/>
-    <w:rsid w:val="00C547D4"/>
+    <w:rsid w:val="00B14D20"/>
     <w:pPr>
       <w:spacing w:after="100"/>
     </w:pPr>
@@ -21273,7 +21505,7 @@
     <w:autoRedefine/>
     <w:uiPriority w:val="39"/>
     <w:unhideWhenUsed/>
-    <w:rsid w:val="00C547D4"/>
+    <w:rsid w:val="00B14D20"/>
     <w:pPr>
       <w:spacing w:after="100"/>
       <w:ind w:left="220"/>
@@ -21284,7 +21516,7 @@
     <w:basedOn w:val="DefaultParagraphFont"/>
     <w:uiPriority w:val="99"/>
     <w:unhideWhenUsed/>
-    <w:rsid w:val="00C547D4"/>
+    <w:rsid w:val="00B14D20"/>
     <w:rPr>
       <w:color w:val="0000FF" w:themeColor="hyperlink"/>
       <w:u w:val="single"/>

</xml_diff>

<commit_message>
Use the team's original architecture diagram in the deck and report
- Slide 8 is back to the original draw.io diagram; speaker notes list the
  small differences from the final code for the viva
- Report Figure 1 is the original diagram on its own landscape page,
  followed by a short note on where the final code differs
</commit_message>
<xml_diff>
--- a/submission/Rig_Sight_CA3_Report.docx
+++ b/submission/Rig_Sight_CA3_Report.docx
@@ -165,7 +165,7 @@
       <w:pPr>
         <w:pStyle w:val="Heading1"/>
       </w:pPr>
-      <w:bookmarkStart w:id="0" w:name="_Toc243335675"/>
+      <w:bookmarkStart w:id="0" w:name="_Toc243339228"/>
       <w:r>
         <w:lastRenderedPageBreak/>
         <w:t>Contents</w:t>
@@ -191,7 +191,7 @@
       <w:r>
         <w:fldChar w:fldCharType="separate"/>
       </w:r>
-      <w:hyperlink w:anchor="_Toc243335675" w:history="1">
+      <w:hyperlink w:anchor="_Toc243339228" w:history="1">
         <w:r>
           <w:rPr>
             <w:rStyle w:val="Hyperlink"/>
@@ -218,7 +218,7 @@
             <w:noProof/>
             <w:webHidden/>
           </w:rPr>
-          <w:instrText xml:space="preserve"> PAGEREF _Toc243335675 \h </w:instrText>
+          <w:instrText xml:space="preserve"> PAGEREF _Toc243339228 \h </w:instrText>
         </w:r>
         <w:r>
           <w:rPr>
@@ -259,7 +259,7 @@
           <w:noProof/>
         </w:rPr>
       </w:pPr>
-      <w:hyperlink w:anchor="_Toc243335676" w:history="1">
+      <w:hyperlink w:anchor="_Toc243339229" w:history="1">
         <w:r>
           <w:rPr>
             <w:rStyle w:val="Hyperlink"/>
@@ -286,7 +286,7 @@
             <w:noProof/>
             <w:webHidden/>
           </w:rPr>
-          <w:instrText xml:space="preserve"> PAGEREF _Toc243335676 \h </w:instrText>
+          <w:instrText xml:space="preserve"> PAGEREF _Toc243339229 \h </w:instrText>
         </w:r>
         <w:r>
           <w:rPr>
@@ -327,7 +327,7 @@
           <w:noProof/>
         </w:rPr>
       </w:pPr>
-      <w:hyperlink w:anchor="_Toc243335677" w:history="1">
+      <w:hyperlink w:anchor="_Toc243339230" w:history="1">
         <w:r>
           <w:rPr>
             <w:rStyle w:val="Hyperlink"/>
@@ -354,7 +354,7 @@
             <w:noProof/>
             <w:webHidden/>
           </w:rPr>
-          <w:instrText xml:space="preserve"> PAGEREF _Toc243335677 \h </w:instrText>
+          <w:instrText xml:space="preserve"> PAGEREF _Toc243339230 \h </w:instrText>
         </w:r>
         <w:r>
           <w:rPr>
@@ -395,7 +395,7 @@
           <w:noProof/>
         </w:rPr>
       </w:pPr>
-      <w:hyperlink w:anchor="_Toc243335678" w:history="1">
+      <w:hyperlink w:anchor="_Toc243339231" w:history="1">
         <w:r>
           <w:rPr>
             <w:rStyle w:val="Hyperlink"/>
@@ -422,7 +422,7 @@
             <w:noProof/>
             <w:webHidden/>
           </w:rPr>
-          <w:instrText xml:space="preserve"> PAGEREF _Toc243335678 \h </w:instrText>
+          <w:instrText xml:space="preserve"> PAGEREF _Toc243339231 \h </w:instrText>
         </w:r>
         <w:r>
           <w:rPr>
@@ -463,7 +463,7 @@
           <w:noProof/>
         </w:rPr>
       </w:pPr>
-      <w:hyperlink w:anchor="_Toc243335679" w:history="1">
+      <w:hyperlink w:anchor="_Toc243339232" w:history="1">
         <w:r>
           <w:rPr>
             <w:rStyle w:val="Hyperlink"/>
@@ -490,7 +490,7 @@
             <w:noProof/>
             <w:webHidden/>
           </w:rPr>
-          <w:instrText xml:space="preserve"> PAGEREF _Toc243335679 \h </w:instrText>
+          <w:instrText xml:space="preserve"> PAGEREF _Toc243339232 \h </w:instrText>
         </w:r>
         <w:r>
           <w:rPr>
@@ -531,7 +531,7 @@
           <w:noProof/>
         </w:rPr>
       </w:pPr>
-      <w:hyperlink w:anchor="_Toc243335680" w:history="1">
+      <w:hyperlink w:anchor="_Toc243339233" w:history="1">
         <w:r>
           <w:rPr>
             <w:rStyle w:val="Hyperlink"/>
@@ -558,7 +558,7 @@
             <w:noProof/>
             <w:webHidden/>
           </w:rPr>
-          <w:instrText xml:space="preserve"> PAGEREF _Toc243335680 \h </w:instrText>
+          <w:instrText xml:space="preserve"> PAGEREF _Toc243339233 \h </w:instrText>
         </w:r>
         <w:r>
           <w:rPr>
@@ -599,7 +599,7 @@
           <w:noProof/>
         </w:rPr>
       </w:pPr>
-      <w:hyperlink w:anchor="_Toc243335681" w:history="1">
+      <w:hyperlink w:anchor="_Toc243339234" w:history="1">
         <w:r>
           <w:rPr>
             <w:rStyle w:val="Hyperlink"/>
@@ -626,7 +626,7 @@
             <w:noProof/>
             <w:webHidden/>
           </w:rPr>
-          <w:instrText xml:space="preserve"> PAGEREF _Toc243335681 \h </w:instrText>
+          <w:instrText xml:space="preserve"> PAGEREF _Toc243339234 \h </w:instrText>
         </w:r>
         <w:r>
           <w:rPr>
@@ -667,7 +667,7 @@
           <w:noProof/>
         </w:rPr>
       </w:pPr>
-      <w:hyperlink w:anchor="_Toc243335682" w:history="1">
+      <w:hyperlink w:anchor="_Toc243339235" w:history="1">
         <w:r>
           <w:rPr>
             <w:rStyle w:val="Hyperlink"/>
@@ -694,7 +694,7 @@
             <w:noProof/>
             <w:webHidden/>
           </w:rPr>
-          <w:instrText xml:space="preserve"> PAGEREF _Toc243335682 \h </w:instrText>
+          <w:instrText xml:space="preserve"> PAGEREF _Toc243339235 \h </w:instrText>
         </w:r>
         <w:r>
           <w:rPr>
@@ -735,7 +735,7 @@
           <w:noProof/>
         </w:rPr>
       </w:pPr>
-      <w:hyperlink w:anchor="_Toc243335683" w:history="1">
+      <w:hyperlink w:anchor="_Toc243339236" w:history="1">
         <w:r>
           <w:rPr>
             <w:rStyle w:val="Hyperlink"/>
@@ -762,7 +762,7 @@
             <w:noProof/>
             <w:webHidden/>
           </w:rPr>
-          <w:instrText xml:space="preserve"> PAGEREF _Toc243335683 \h </w:instrText>
+          <w:instrText xml:space="preserve"> PAGEREF _Toc243339236 \h </w:instrText>
         </w:r>
         <w:r>
           <w:rPr>
@@ -803,7 +803,7 @@
           <w:noProof/>
         </w:rPr>
       </w:pPr>
-      <w:hyperlink w:anchor="_Toc243335684" w:history="1">
+      <w:hyperlink w:anchor="_Toc243339237" w:history="1">
         <w:r>
           <w:rPr>
             <w:rStyle w:val="Hyperlink"/>
@@ -830,7 +830,7 @@
             <w:noProof/>
             <w:webHidden/>
           </w:rPr>
-          <w:instrText xml:space="preserve"> PAGEREF _Toc243335684 \h </w:instrText>
+          <w:instrText xml:space="preserve"> PAGEREF _Toc243339237 \h </w:instrText>
         </w:r>
         <w:r>
           <w:rPr>
@@ -871,7 +871,7 @@
           <w:noProof/>
         </w:rPr>
       </w:pPr>
-      <w:hyperlink w:anchor="_Toc243335685" w:history="1">
+      <w:hyperlink w:anchor="_Toc243339238" w:history="1">
         <w:r>
           <w:rPr>
             <w:rStyle w:val="Hyperlink"/>
@@ -898,7 +898,7 @@
             <w:noProof/>
             <w:webHidden/>
           </w:rPr>
-          <w:instrText xml:space="preserve"> PAGEREF _Toc243335685 \h </w:instrText>
+          <w:instrText xml:space="preserve"> PAGEREF _Toc243339238 \h </w:instrText>
         </w:r>
         <w:r>
           <w:rPr>
@@ -939,7 +939,7 @@
           <w:noProof/>
         </w:rPr>
       </w:pPr>
-      <w:hyperlink w:anchor="_Toc243335686" w:history="1">
+      <w:hyperlink w:anchor="_Toc243339239" w:history="1">
         <w:r>
           <w:rPr>
             <w:rStyle w:val="Hyperlink"/>
@@ -966,7 +966,7 @@
             <w:noProof/>
             <w:webHidden/>
           </w:rPr>
-          <w:instrText xml:space="preserve"> PAGEREF _Toc243335686 \h </w:instrText>
+          <w:instrText xml:space="preserve"> PAGEREF _Toc243339239 \h </w:instrText>
         </w:r>
         <w:r>
           <w:rPr>
@@ -1007,7 +1007,7 @@
           <w:noProof/>
         </w:rPr>
       </w:pPr>
-      <w:hyperlink w:anchor="_Toc243335687" w:history="1">
+      <w:hyperlink w:anchor="_Toc243339240" w:history="1">
         <w:r>
           <w:rPr>
             <w:rStyle w:val="Hyperlink"/>
@@ -1034,7 +1034,7 @@
             <w:noProof/>
             <w:webHidden/>
           </w:rPr>
-          <w:instrText xml:space="preserve"> PAGEREF _Toc243335687 \h </w:instrText>
+          <w:instrText xml:space="preserve"> PAGEREF _Toc243339240 \h </w:instrText>
         </w:r>
         <w:r>
           <w:rPr>
@@ -1075,7 +1075,7 @@
           <w:noProof/>
         </w:rPr>
       </w:pPr>
-      <w:hyperlink w:anchor="_Toc243335688" w:history="1">
+      <w:hyperlink w:anchor="_Toc243339241" w:history="1">
         <w:r>
           <w:rPr>
             <w:rStyle w:val="Hyperlink"/>
@@ -1102,7 +1102,7 @@
             <w:noProof/>
             <w:webHidden/>
           </w:rPr>
-          <w:instrText xml:space="preserve"> PAGEREF _Toc243335688 \h </w:instrText>
+          <w:instrText xml:space="preserve"> PAGEREF _Toc243339241 \h </w:instrText>
         </w:r>
         <w:r>
           <w:rPr>
@@ -1122,7 +1122,7 @@
             <w:noProof/>
             <w:webHidden/>
           </w:rPr>
-          <w:t>6</w:t>
+          <w:t>8</w:t>
         </w:r>
         <w:r>
           <w:rPr>
@@ -1143,7 +1143,7 @@
           <w:noProof/>
         </w:rPr>
       </w:pPr>
-      <w:hyperlink w:anchor="_Toc243335689" w:history="1">
+      <w:hyperlink w:anchor="_Toc243339242" w:history="1">
         <w:r>
           <w:rPr>
             <w:rStyle w:val="Hyperlink"/>
@@ -1170,7 +1170,7 @@
             <w:noProof/>
             <w:webHidden/>
           </w:rPr>
-          <w:instrText xml:space="preserve"> PAGEREF _Toc243335689 \h </w:instrText>
+          <w:instrText xml:space="preserve"> PAGEREF _Toc243339242 \h </w:instrText>
         </w:r>
         <w:r>
           <w:rPr>
@@ -1190,7 +1190,7 @@
             <w:noProof/>
             <w:webHidden/>
           </w:rPr>
-          <w:t>7</w:t>
+          <w:t>8</w:t>
         </w:r>
         <w:r>
           <w:rPr>
@@ -1211,7 +1211,7 @@
           <w:noProof/>
         </w:rPr>
       </w:pPr>
-      <w:hyperlink w:anchor="_Toc243335690" w:history="1">
+      <w:hyperlink w:anchor="_Toc243339243" w:history="1">
         <w:r>
           <w:rPr>
             <w:rStyle w:val="Hyperlink"/>
@@ -1238,7 +1238,7 @@
             <w:noProof/>
             <w:webHidden/>
           </w:rPr>
-          <w:instrText xml:space="preserve"> PAGEREF _Toc243335690 \h </w:instrText>
+          <w:instrText xml:space="preserve"> PAGEREF _Toc243339243 \h </w:instrText>
         </w:r>
         <w:r>
           <w:rPr>
@@ -1258,7 +1258,7 @@
             <w:noProof/>
             <w:webHidden/>
           </w:rPr>
-          <w:t>7</w:t>
+          <w:t>8</w:t>
         </w:r>
         <w:r>
           <w:rPr>
@@ -1279,7 +1279,7 @@
           <w:noProof/>
         </w:rPr>
       </w:pPr>
-      <w:hyperlink w:anchor="_Toc243335691" w:history="1">
+      <w:hyperlink w:anchor="_Toc243339244" w:history="1">
         <w:r>
           <w:rPr>
             <w:rStyle w:val="Hyperlink"/>
@@ -1306,7 +1306,7 @@
             <w:noProof/>
             <w:webHidden/>
           </w:rPr>
-          <w:instrText xml:space="preserve"> PAGEREF _Toc243335691 \h </w:instrText>
+          <w:instrText xml:space="preserve"> PAGEREF _Toc243339244 \h </w:instrText>
         </w:r>
         <w:r>
           <w:rPr>
@@ -1326,7 +1326,7 @@
             <w:noProof/>
             <w:webHidden/>
           </w:rPr>
-          <w:t>8</w:t>
+          <w:t>9</w:t>
         </w:r>
         <w:r>
           <w:rPr>
@@ -1347,7 +1347,7 @@
           <w:noProof/>
         </w:rPr>
       </w:pPr>
-      <w:hyperlink w:anchor="_Toc243335692" w:history="1">
+      <w:hyperlink w:anchor="_Toc243339245" w:history="1">
         <w:r>
           <w:rPr>
             <w:rStyle w:val="Hyperlink"/>
@@ -1374,7 +1374,7 @@
             <w:noProof/>
             <w:webHidden/>
           </w:rPr>
-          <w:instrText xml:space="preserve"> PAGEREF _Toc243335692 \h </w:instrText>
+          <w:instrText xml:space="preserve"> PAGEREF _Toc243339245 \h </w:instrText>
         </w:r>
         <w:r>
           <w:rPr>
@@ -1394,7 +1394,7 @@
             <w:noProof/>
             <w:webHidden/>
           </w:rPr>
-          <w:t>8</w:t>
+          <w:t>9</w:t>
         </w:r>
         <w:r>
           <w:rPr>
@@ -1415,7 +1415,7 @@
           <w:noProof/>
         </w:rPr>
       </w:pPr>
-      <w:hyperlink w:anchor="_Toc243335693" w:history="1">
+      <w:hyperlink w:anchor="_Toc243339246" w:history="1">
         <w:r>
           <w:rPr>
             <w:rStyle w:val="Hyperlink"/>
@@ -1442,7 +1442,7 @@
             <w:noProof/>
             <w:webHidden/>
           </w:rPr>
-          <w:instrText xml:space="preserve"> PAGEREF _Toc243335693 \h </w:instrText>
+          <w:instrText xml:space="preserve"> PAGEREF _Toc243339246 \h </w:instrText>
         </w:r>
         <w:r>
           <w:rPr>
@@ -1462,7 +1462,7 @@
             <w:noProof/>
             <w:webHidden/>
           </w:rPr>
-          <w:t>9</w:t>
+          <w:t>10</w:t>
         </w:r>
         <w:r>
           <w:rPr>
@@ -1483,7 +1483,7 @@
           <w:noProof/>
         </w:rPr>
       </w:pPr>
-      <w:hyperlink w:anchor="_Toc243335694" w:history="1">
+      <w:hyperlink w:anchor="_Toc243339247" w:history="1">
         <w:r>
           <w:rPr>
             <w:rStyle w:val="Hyperlink"/>
@@ -1510,7 +1510,7 @@
             <w:noProof/>
             <w:webHidden/>
           </w:rPr>
-          <w:instrText xml:space="preserve"> PAGEREF _Toc243335694 \h </w:instrText>
+          <w:instrText xml:space="preserve"> PAGEREF _Toc243339247 \h </w:instrText>
         </w:r>
         <w:r>
           <w:rPr>
@@ -1530,7 +1530,7 @@
             <w:noProof/>
             <w:webHidden/>
           </w:rPr>
-          <w:t>9</w:t>
+          <w:t>11</w:t>
         </w:r>
         <w:r>
           <w:rPr>
@@ -1551,7 +1551,7 @@
           <w:noProof/>
         </w:rPr>
       </w:pPr>
-      <w:hyperlink w:anchor="_Toc243335695" w:history="1">
+      <w:hyperlink w:anchor="_Toc243339248" w:history="1">
         <w:r>
           <w:rPr>
             <w:rStyle w:val="Hyperlink"/>
@@ -1578,7 +1578,7 @@
             <w:noProof/>
             <w:webHidden/>
           </w:rPr>
-          <w:instrText xml:space="preserve"> PAGEREF _Toc243335695 \h </w:instrText>
+          <w:instrText xml:space="preserve"> PAGEREF _Toc243339248 \h </w:instrText>
         </w:r>
         <w:r>
           <w:rPr>
@@ -1598,7 +1598,7 @@
             <w:noProof/>
             <w:webHidden/>
           </w:rPr>
-          <w:t>10</w:t>
+          <w:t>11</w:t>
         </w:r>
         <w:r>
           <w:rPr>
@@ -1619,7 +1619,7 @@
           <w:noProof/>
         </w:rPr>
       </w:pPr>
-      <w:hyperlink w:anchor="_Toc243335696" w:history="1">
+      <w:hyperlink w:anchor="_Toc243339249" w:history="1">
         <w:r>
           <w:rPr>
             <w:rStyle w:val="Hyperlink"/>
@@ -1646,7 +1646,7 @@
             <w:noProof/>
             <w:webHidden/>
           </w:rPr>
-          <w:instrText xml:space="preserve"> PAGEREF _Toc243335696 \h </w:instrText>
+          <w:instrText xml:space="preserve"> PAGEREF _Toc243339249 \h </w:instrText>
         </w:r>
         <w:r>
           <w:rPr>
@@ -1666,7 +1666,7 @@
             <w:noProof/>
             <w:webHidden/>
           </w:rPr>
-          <w:t>10</w:t>
+          <w:t>11</w:t>
         </w:r>
         <w:r>
           <w:rPr>
@@ -1687,7 +1687,7 @@
           <w:noProof/>
         </w:rPr>
       </w:pPr>
-      <w:hyperlink w:anchor="_Toc243335697" w:history="1">
+      <w:hyperlink w:anchor="_Toc243339250" w:history="1">
         <w:r>
           <w:rPr>
             <w:rStyle w:val="Hyperlink"/>
@@ -1714,7 +1714,7 @@
             <w:noProof/>
             <w:webHidden/>
           </w:rPr>
-          <w:instrText xml:space="preserve"> PAGEREF _Toc243335697 \h </w:instrText>
+          <w:instrText xml:space="preserve"> PAGEREF _Toc243339250 \h </w:instrText>
         </w:r>
         <w:r>
           <w:rPr>
@@ -1734,7 +1734,7 @@
             <w:noProof/>
             <w:webHidden/>
           </w:rPr>
-          <w:t>10</w:t>
+          <w:t>12</w:t>
         </w:r>
         <w:r>
           <w:rPr>
@@ -1755,7 +1755,7 @@
           <w:noProof/>
         </w:rPr>
       </w:pPr>
-      <w:hyperlink w:anchor="_Toc243335698" w:history="1">
+      <w:hyperlink w:anchor="_Toc243339251" w:history="1">
         <w:r>
           <w:rPr>
             <w:rStyle w:val="Hyperlink"/>
@@ -1782,7 +1782,7 @@
             <w:noProof/>
             <w:webHidden/>
           </w:rPr>
-          <w:instrText xml:space="preserve"> PAGEREF _Toc243335698 \h </w:instrText>
+          <w:instrText xml:space="preserve"> PAGEREF _Toc243339251 \h </w:instrText>
         </w:r>
         <w:r>
           <w:rPr>
@@ -1802,7 +1802,7 @@
             <w:noProof/>
             <w:webHidden/>
           </w:rPr>
-          <w:t>15</w:t>
+          <w:t>16</w:t>
         </w:r>
         <w:r>
           <w:rPr>
@@ -1823,7 +1823,7 @@
           <w:noProof/>
         </w:rPr>
       </w:pPr>
-      <w:hyperlink w:anchor="_Toc243335699" w:history="1">
+      <w:hyperlink w:anchor="_Toc243339252" w:history="1">
         <w:r>
           <w:rPr>
             <w:rStyle w:val="Hyperlink"/>
@@ -1850,7 +1850,7 @@
             <w:noProof/>
             <w:webHidden/>
           </w:rPr>
-          <w:instrText xml:space="preserve"> PAGEREF _Toc243335699 \h </w:instrText>
+          <w:instrText xml:space="preserve"> PAGEREF _Toc243339252 \h </w:instrText>
         </w:r>
         <w:r>
           <w:rPr>
@@ -1870,7 +1870,7 @@
             <w:noProof/>
             <w:webHidden/>
           </w:rPr>
-          <w:t>16</w:t>
+          <w:t>17</w:t>
         </w:r>
         <w:r>
           <w:rPr>
@@ -1891,7 +1891,7 @@
           <w:noProof/>
         </w:rPr>
       </w:pPr>
-      <w:hyperlink w:anchor="_Toc243335700" w:history="1">
+      <w:hyperlink w:anchor="_Toc243339253" w:history="1">
         <w:r>
           <w:rPr>
             <w:rStyle w:val="Hyperlink"/>
@@ -1918,7 +1918,7 @@
             <w:noProof/>
             <w:webHidden/>
           </w:rPr>
-          <w:instrText xml:space="preserve"> PAGEREF _Toc243335700 \h </w:instrText>
+          <w:instrText xml:space="preserve"> PAGEREF _Toc243339253 \h </w:instrText>
         </w:r>
         <w:r>
           <w:rPr>
@@ -1938,7 +1938,7 @@
             <w:noProof/>
             <w:webHidden/>
           </w:rPr>
-          <w:t>16</w:t>
+          <w:t>17</w:t>
         </w:r>
         <w:r>
           <w:rPr>
@@ -1959,7 +1959,7 @@
           <w:noProof/>
         </w:rPr>
       </w:pPr>
-      <w:hyperlink w:anchor="_Toc243335701" w:history="1">
+      <w:hyperlink w:anchor="_Toc243339254" w:history="1">
         <w:r>
           <w:rPr>
             <w:rStyle w:val="Hyperlink"/>
@@ -1986,7 +1986,7 @@
             <w:noProof/>
             <w:webHidden/>
           </w:rPr>
-          <w:instrText xml:space="preserve"> PAGEREF _Toc243335701 \h </w:instrText>
+          <w:instrText xml:space="preserve"> PAGEREF _Toc243339254 \h </w:instrText>
         </w:r>
         <w:r>
           <w:rPr>
@@ -2006,7 +2006,7 @@
             <w:noProof/>
             <w:webHidden/>
           </w:rPr>
-          <w:t>17</w:t>
+          <w:t>18</w:t>
         </w:r>
         <w:r>
           <w:rPr>
@@ -2027,7 +2027,7 @@
           <w:noProof/>
         </w:rPr>
       </w:pPr>
-      <w:hyperlink w:anchor="_Toc243335702" w:history="1">
+      <w:hyperlink w:anchor="_Toc243339255" w:history="1">
         <w:r>
           <w:rPr>
             <w:rStyle w:val="Hyperlink"/>
@@ -2054,7 +2054,7 @@
             <w:noProof/>
             <w:webHidden/>
           </w:rPr>
-          <w:instrText xml:space="preserve"> PAGEREF _Toc243335702 \h </w:instrText>
+          <w:instrText xml:space="preserve"> PAGEREF _Toc243339255 \h </w:instrText>
         </w:r>
         <w:r>
           <w:rPr>
@@ -2074,7 +2074,7 @@
             <w:noProof/>
             <w:webHidden/>
           </w:rPr>
-          <w:t>17</w:t>
+          <w:t>18</w:t>
         </w:r>
         <w:r>
           <w:rPr>
@@ -2095,7 +2095,7 @@
           <w:noProof/>
         </w:rPr>
       </w:pPr>
-      <w:hyperlink w:anchor="_Toc243335703" w:history="1">
+      <w:hyperlink w:anchor="_Toc243339256" w:history="1">
         <w:r>
           <w:rPr>
             <w:rStyle w:val="Hyperlink"/>
@@ -2122,7 +2122,7 @@
             <w:noProof/>
             <w:webHidden/>
           </w:rPr>
-          <w:instrText xml:space="preserve"> PAGEREF _Toc243335703 \h </w:instrText>
+          <w:instrText xml:space="preserve"> PAGEREF _Toc243339256 \h </w:instrText>
         </w:r>
         <w:r>
           <w:rPr>
@@ -2142,7 +2142,7 @@
             <w:noProof/>
             <w:webHidden/>
           </w:rPr>
-          <w:t>17</w:t>
+          <w:t>18</w:t>
         </w:r>
         <w:r>
           <w:rPr>
@@ -2163,7 +2163,7 @@
           <w:noProof/>
         </w:rPr>
       </w:pPr>
-      <w:hyperlink w:anchor="_Toc243335704" w:history="1">
+      <w:hyperlink w:anchor="_Toc243339257" w:history="1">
         <w:r>
           <w:rPr>
             <w:rStyle w:val="Hyperlink"/>
@@ -2190,7 +2190,7 @@
             <w:noProof/>
             <w:webHidden/>
           </w:rPr>
-          <w:instrText xml:space="preserve"> PAGEREF _Toc243335704 \h </w:instrText>
+          <w:instrText xml:space="preserve"> PAGEREF _Toc243339257 \h </w:instrText>
         </w:r>
         <w:r>
           <w:rPr>
@@ -2210,7 +2210,7 @@
             <w:noProof/>
             <w:webHidden/>
           </w:rPr>
-          <w:t>18</w:t>
+          <w:t>19</w:t>
         </w:r>
         <w:r>
           <w:rPr>
@@ -2231,7 +2231,7 @@
           <w:noProof/>
         </w:rPr>
       </w:pPr>
-      <w:hyperlink w:anchor="_Toc243335705" w:history="1">
+      <w:hyperlink w:anchor="_Toc243339258" w:history="1">
         <w:r>
           <w:rPr>
             <w:rStyle w:val="Hyperlink"/>
@@ -2258,7 +2258,7 @@
             <w:noProof/>
             <w:webHidden/>
           </w:rPr>
-          <w:instrText xml:space="preserve"> PAGEREF _Toc243335705 \h </w:instrText>
+          <w:instrText xml:space="preserve"> PAGEREF _Toc243339258 \h </w:instrText>
         </w:r>
         <w:r>
           <w:rPr>
@@ -2278,7 +2278,7 @@
             <w:noProof/>
             <w:webHidden/>
           </w:rPr>
-          <w:t>18</w:t>
+          <w:t>19</w:t>
         </w:r>
         <w:r>
           <w:rPr>
@@ -2303,7 +2303,7 @@
       <w:pPr>
         <w:pStyle w:val="Heading1"/>
       </w:pPr>
-      <w:bookmarkStart w:id="1" w:name="_Toc243335676"/>
+      <w:bookmarkStart w:id="1" w:name="_Toc243339229"/>
       <w:r>
         <w:lastRenderedPageBreak/>
         <w:t>Abstract</w:t>
@@ -2330,7 +2330,7 @@
       <w:pPr>
         <w:pStyle w:val="Heading1"/>
       </w:pPr>
-      <w:bookmarkStart w:id="2" w:name="_Toc243335677"/>
+      <w:bookmarkStart w:id="2" w:name="_Toc243339230"/>
       <w:r>
         <w:t>1. Introduction and domain background</w:t>
       </w:r>
@@ -2340,7 +2340,7 @@
       <w:pPr>
         <w:pStyle w:val="Heading2"/>
       </w:pPr>
-      <w:bookmarkStart w:id="3" w:name="_Toc243335678"/>
+      <w:bookmarkStart w:id="3" w:name="_Toc243339231"/>
       <w:r>
         <w:t>1.1 Why oil and gas drilling</w:t>
       </w:r>
@@ -2358,7 +2358,7 @@
       <w:pPr>
         <w:pStyle w:val="Heading2"/>
       </w:pPr>
-      <w:bookmarkStart w:id="4" w:name="_Toc243335679"/>
+      <w:bookmarkStart w:id="4" w:name="_Toc243339232"/>
       <w:r>
         <w:t>1.2 The Daily Drilling Report</w:t>
       </w:r>
@@ -2417,7 +2417,7 @@
       <w:pPr>
         <w:pStyle w:val="Heading2"/>
       </w:pPr>
-      <w:bookmarkStart w:id="5" w:name="_Toc243335680"/>
+      <w:bookmarkStart w:id="5" w:name="_Toc243339233"/>
       <w:r>
         <w:t>1.3 Non-productive time</w:t>
       </w:r>
@@ -2436,7 +2436,7 @@
       <w:pPr>
         <w:pStyle w:val="Heading1"/>
       </w:pPr>
-      <w:bookmarkStart w:id="6" w:name="_Toc243335681"/>
+      <w:bookmarkStart w:id="6" w:name="_Toc243339234"/>
       <w:r>
         <w:t>2. Problem statement</w:t>
       </w:r>
@@ -2459,7 +2459,7 @@
       <w:pPr>
         <w:pStyle w:val="Heading1"/>
       </w:pPr>
-      <w:bookmarkStart w:id="7" w:name="_Toc243335682"/>
+      <w:bookmarkStart w:id="7" w:name="_Toc243339235"/>
       <w:r>
         <w:t>3. Existing process and identified inefficiencies</w:t>
       </w:r>
@@ -2559,7 +2559,7 @@
       <w:pPr>
         <w:pStyle w:val="Heading1"/>
       </w:pPr>
-      <w:bookmarkStart w:id="8" w:name="_Toc243335683"/>
+      <w:bookmarkStart w:id="8" w:name="_Toc243339236"/>
       <w:r>
         <w:t>4. Proposed solution and objectives</w:t>
       </w:r>
@@ -2654,7 +2654,7 @@
       <w:pPr>
         <w:pStyle w:val="Heading1"/>
       </w:pPr>
-      <w:bookmarkStart w:id="9" w:name="_Toc243335684"/>
+      <w:bookmarkStart w:id="9" w:name="_Toc243339237"/>
       <w:r>
         <w:lastRenderedPageBreak/>
         <w:t>5. Requirements and technology stack</w:t>
@@ -2665,7 +2665,7 @@
       <w:pPr>
         <w:pStyle w:val="Heading2"/>
       </w:pPr>
-      <w:bookmarkStart w:id="10" w:name="_Toc243335685"/>
+      <w:bookmarkStart w:id="10" w:name="_Toc243339238"/>
       <w:r>
         <w:t>5.1 Functional requirements</w:t>
       </w:r>
@@ -3503,7 +3503,7 @@
       <w:pPr>
         <w:pStyle w:val="Heading2"/>
       </w:pPr>
-      <w:bookmarkStart w:id="11" w:name="_Toc243335686"/>
+      <w:bookmarkStart w:id="11" w:name="_Toc243339239"/>
       <w:r>
         <w:t>5.2 Technology stack</w:t>
       </w:r>
@@ -4028,7 +4028,7 @@
       <w:pPr>
         <w:pStyle w:val="Heading1"/>
       </w:pPr>
-      <w:bookmarkStart w:id="12" w:name="_Toc243335687"/>
+      <w:bookmarkStart w:id="12" w:name="_Toc243339240"/>
       <w:r>
         <w:t>6. System architecture and data flow</w:t>
       </w:r>
@@ -4042,6 +4042,90 @@
         <w:lastRenderedPageBreak/>
         <w:t>other. Reference data, incident memory and the checkpointer live outside the graph. The Streamlit UI starts a run, streams every node's update and resumes the graph when the engineer decides.</w:t>
       </w:r>
+    </w:p>
+    <w:p>
+      <w:r>
+        <w:t>A normal run, step by step:</w:t>
+      </w:r>
+    </w:p>
+    <w:p>
+      <w:pPr>
+        <w:pStyle w:val="ListNumber"/>
+        <w:spacing w:after="60"/>
+      </w:pPr>
+      <w:r>
+        <w:t>Streamlit calls app.stream(initial_state, thread_id). ingest_report reads the file and parses the header.</w:t>
+      </w:r>
+    </w:p>
+    <w:p>
+      <w:pPr>
+        <w:pStyle w:val="ListNumber"/>
+        <w:spacing w:after="60"/>
+      </w:pPr>
+      <w:r>
+        <w:t>The Orchestrator sends the state to the Planner, which writes the task list.</w:t>
+      </w:r>
+    </w:p>
+    <w:p>
+      <w:pPr>
+        <w:pStyle w:val="ListNumber"/>
+        <w:spacing w:after="60"/>
+      </w:pPr>
+      <w:r>
+        <w:t>Research looks up the well plan, budget, NPT codes and similar incidents. Missing data becomes a warning.</w:t>
+      </w:r>
+    </w:p>
+    <w:p>
+      <w:pPr>
+        <w:pStyle w:val="ListNumber"/>
+        <w:spacing w:after="60"/>
+      </w:pPr>
+      <w:r>
+        <w:t>The Executor asks the ToolNode to parse the time log, then to classify activities and run the four maths tools in parallel, then totals NPT by category in Python.</w:t>
+      </w:r>
+    </w:p>
+    <w:p>
+      <w:pPr>
+        <w:pStyle w:val="ListNumber"/>
+        <w:spacing w:after="60"/>
+      </w:pPr>
+      <w:r>
+        <w:t>The Critic checks the result. A fixable FAIL goes back to the Executor with structured fix hints (at most three times); a PASS, an unfixable FAIL or used-up retries go to report_writer.</w:t>
+      </w:r>
+    </w:p>
+    <w:p>
+      <w:pPr>
+        <w:pStyle w:val="ListNumber"/>
+        <w:spacing w:after="60"/>
+      </w:pPr>
+      <w:r>
+        <w:t>report_writer drafts the Daily Insight Report. human_review calls interrupt() and the graph stops.</w:t>
+      </w:r>
+    </w:p>
+    <w:p>
+      <w:pPr>
+        <w:pStyle w:val="ListNumber"/>
+        <w:spacing w:after="60"/>
+      </w:pPr>
+      <w:r>
+        <w:t>The engineer approves (END) or rejects with a comment; a rejection clears the work and the Executor re-runs with the engineer's line overrides.</w:t>
+      </w:r>
+    </w:p>
+    <w:p>
+      <w:r>
+        <w:t>Figure 1, on the next page, shows the full architecture and the numbered data flow.</w:t>
+      </w:r>
+    </w:p>
+    <w:p>
+      <w:pPr>
+        <w:sectPr>
+          <w:footerReference w:type="default" r:id="rId8"/>
+          <w:pgSz w:w="11906" w:h="16838"/>
+          <w:pgMar w:top="1247" w:right="1304" w:bottom="1247" w:left="1304" w:header="720" w:footer="720" w:gutter="0"/>
+          <w:cols w:space="720"/>
+          <w:docGrid w:linePitch="360"/>
+        </w:sectPr>
+      </w:pPr>
     </w:p>
     <w:p>
       <w:pPr>
@@ -4052,9 +4136,10 @@
         <w:rPr>
           <w:noProof/>
         </w:rPr>
+        <w:lastRenderedPageBreak/>
         <w:drawing>
-          <wp:inline distT="0" distB="0" distL="0" distR="0" wp14:anchorId="6E5BFD13" wp14:editId="5A08B990">
-            <wp:extent cx="5903999" cy="3542399"/>
+          <wp:inline distT="0" distB="0" distL="0" distR="0" wp14:anchorId="4000312B" wp14:editId="626B172F">
+            <wp:extent cx="9540000" cy="5101250"/>
             <wp:effectExtent l="0" t="0" r="0" b="0"/>
             <wp:docPr id="1" name="Picture 1"/>
             <wp:cNvGraphicFramePr>
@@ -4064,11 +4149,11 @@
               <a:graphicData uri="http://schemas.openxmlformats.org/drawingml/2006/picture">
                 <pic:pic xmlns:pic="http://schemas.openxmlformats.org/drawingml/2006/picture">
                   <pic:nvPicPr>
-                    <pic:cNvPr id="0" name="architecture_light.png"/>
+                    <pic:cNvPr id="0" name="architecture_original.png"/>
                     <pic:cNvPicPr/>
                   </pic:nvPicPr>
                   <pic:blipFill>
-                    <a:blip r:embed="rId8"/>
+                    <a:blip r:embed="rId9"/>
                     <a:stretch>
                       <a:fillRect/>
                     </a:stretch>
@@ -4076,7 +4161,7 @@
                   <pic:spPr>
                     <a:xfrm>
                       <a:off x="0" y="0"/>
-                      <a:ext cx="5903999" cy="3542399"/>
+                      <a:ext cx="9540000" cy="5101250"/>
                     </a:xfrm>
                     <a:prstGeom prst="rect">
                       <a:avLst/>
@@ -4095,83 +4180,34 @@
         <w:jc w:val="center"/>
       </w:pPr>
       <w:r>
-        <w:t>Figure 1. Architecture of the final implementation (drawn from the code in graph.py)</w:t>
-      </w:r>
-    </w:p>
-    <w:p>
-      <w:r>
-        <w:t>A normal run, step by step:</w:t>
-      </w:r>
-    </w:p>
-    <w:p>
-      <w:pPr>
-        <w:pStyle w:val="ListNumber"/>
-        <w:spacing w:after="60"/>
-      </w:pPr>
-      <w:r>
-        <w:t>Streamlit calls app.stream(initial_state, thread_id). ingest_report reads the file and parses the header.</w:t>
-      </w:r>
-    </w:p>
-    <w:p>
-      <w:pPr>
-        <w:pStyle w:val="ListNumber"/>
-        <w:spacing w:after="60"/>
-      </w:pPr>
-      <w:r>
-        <w:t>The Orchestrator sends the state to the Planner, which writes the task list.</w:t>
-      </w:r>
-    </w:p>
-    <w:p>
-      <w:pPr>
-        <w:pStyle w:val="ListNumber"/>
-        <w:spacing w:after="60"/>
-      </w:pPr>
-      <w:r>
-        <w:t>Research looks up the well plan, budget, NPT codes and similar incidents. Missing data becomes a warning.</w:t>
-      </w:r>
-    </w:p>
-    <w:p>
-      <w:pPr>
-        <w:pStyle w:val="ListNumber"/>
-        <w:spacing w:after="60"/>
-      </w:pPr>
-      <w:r>
-        <w:t>The Executor asks the ToolNode to parse the time log, then to classify activities and run the four maths tools in parallel, then totals NPT by category in Python.</w:t>
-      </w:r>
-    </w:p>
-    <w:p>
-      <w:pPr>
-        <w:pStyle w:val="ListNumber"/>
-        <w:spacing w:after="60"/>
-      </w:pPr>
-      <w:r>
-        <w:t>The Critic checks the result. A fixable FAIL goes back to the Executor with structured fix hints (at most three times); a PASS, an unfixable FAIL or used-up retries go to report_writer.</w:t>
-      </w:r>
-    </w:p>
-    <w:p>
-      <w:pPr>
-        <w:pStyle w:val="ListNumber"/>
-        <w:spacing w:after="60"/>
-      </w:pPr>
-      <w:r>
-        <w:t>report_writer drafts the Daily Insight Report. human_review calls interrupt() and the graph stops.</w:t>
-      </w:r>
-    </w:p>
-    <w:p>
-      <w:pPr>
-        <w:pStyle w:val="ListNumber"/>
-        <w:spacing w:after="60"/>
-      </w:pPr>
-      <w:r>
-        <w:t>The engineer approves (END) or rejects with a comment; a rejection clears the work and the Executor re-runs with the engineer's line overrides.</w:t>
-      </w:r>
+        <w:t>Figure 1. Architecture of the system (the team's design diagram)</w:t>
+      </w:r>
+    </w:p>
+    <w:p>
+      <w:r>
+        <w:rPr>
+          <w:i/>
+        </w:rPr>
+        <w:t>The diagram is the team's original design. The final code follows it, with these differences: the Planner is rule based rather than LLM based; recursion_limit is 50, not 25 (the worst case needs 32 steps); the local model is qwen2.5:3b, because llama3.1:8b does not fit in 4 GB of GPU memory; classification runs as one classify_activities tool over all lines; the chart is an Altair timeline plus NPT by category; and the Critic also checks gaps, overlaps, unparseable lines and the header (Section 11).</w:t>
+      </w:r>
+    </w:p>
+    <w:p>
+      <w:pPr>
+        <w:sectPr>
+          <w:pgSz w:w="16838" w:h="11906" w:orient="landscape"/>
+          <w:pgMar w:top="850" w:right="850" w:bottom="850" w:left="850" w:header="720" w:footer="720" w:gutter="0"/>
+          <w:cols w:space="720"/>
+          <w:docGrid w:linePitch="360"/>
+        </w:sectPr>
+      </w:pPr>
     </w:p>
     <w:p>
       <w:pPr>
         <w:pStyle w:val="Heading1"/>
       </w:pPr>
-      <w:bookmarkStart w:id="13" w:name="_Toc243335688"/>
-      <w:r>
+      <w:bookmarkStart w:id="13" w:name="_Toc243339241"/>
+      <w:r>
+        <w:lastRenderedPageBreak/>
         <w:t>7. Agent roles and orchestration</w:t>
       </w:r>
       <w:bookmarkEnd w:id="13"/>
@@ -4546,14 +4582,7 @@
               <w:rPr>
                 <w:sz w:val="19"/>
               </w:rPr>
-              <w:t xml:space="preserve">Through classify </w:t>
-            </w:r>
-            <w:r>
-              <w:rPr>
-                <w:sz w:val="19"/>
-              </w:rPr>
-              <w:lastRenderedPageBreak/>
-              <w:t>only</w:t>
+              <w:t>Through classify only</w:t>
             </w:r>
           </w:p>
         </w:tc>
@@ -4574,7 +4603,6 @@
               <w:rPr>
                 <w:sz w:val="19"/>
               </w:rPr>
-              <w:lastRenderedPageBreak/>
               <w:t>Critic</w:t>
             </w:r>
           </w:p>
@@ -4877,7 +4905,7 @@
       <w:pPr>
         <w:pStyle w:val="Heading1"/>
       </w:pPr>
-      <w:bookmarkStart w:id="14" w:name="_Toc243335689"/>
+      <w:bookmarkStart w:id="14" w:name="_Toc243339242"/>
       <w:r>
         <w:t>8. Data model, synthetic dataset and reference files</w:t>
       </w:r>
@@ -4887,7 +4915,7 @@
       <w:pPr>
         <w:pStyle w:val="Heading2"/>
       </w:pPr>
-      <w:bookmarkStart w:id="15" w:name="_Toc243335690"/>
+      <w:bookmarkStart w:id="15" w:name="_Toc243339243"/>
       <w:r>
         <w:t>8.1 Shared state (DDRState)</w:t>
       </w:r>
@@ -5360,7 +5388,14 @@
               <w:rPr>
                 <w:sz w:val="19"/>
               </w:rPr>
-              <w:t>critic_verdict, critic_feedback, critic_warnings, critic_retryable</w:t>
+              <w:t xml:space="preserve">critic_verdict, critic_feedback, </w:t>
+            </w:r>
+            <w:r>
+              <w:rPr>
+                <w:sz w:val="19"/>
+              </w:rPr>
+              <w:lastRenderedPageBreak/>
+              <w:t>critic_warnings, critic_retryable</w:t>
             </w:r>
           </w:p>
         </w:tc>
@@ -5376,6 +5411,7 @@
               <w:rPr>
                 <w:sz w:val="19"/>
               </w:rPr>
+              <w:lastRenderedPageBreak/>
               <w:t>str, list, bool</w:t>
             </w:r>
           </w:p>
@@ -5619,9 +5655,8 @@
       <w:pPr>
         <w:pStyle w:val="Heading2"/>
       </w:pPr>
-      <w:bookmarkStart w:id="16" w:name="_Toc243335691"/>
-      <w:r>
-        <w:lastRenderedPageBreak/>
+      <w:bookmarkStart w:id="16" w:name="_Toc243339244"/>
+      <w:r>
         <w:t>8.2 Synthetic dataset</w:t>
       </w:r>
       <w:bookmarkEnd w:id="16"/>
@@ -6103,7 +6138,7 @@
       <w:pPr>
         <w:pStyle w:val="Heading1"/>
       </w:pPr>
-      <w:bookmarkStart w:id="17" w:name="_Toc243335692"/>
+      <w:bookmarkStart w:id="17" w:name="_Toc243339245"/>
       <w:r>
         <w:t>9. Implementation details</w:t>
       </w:r>
@@ -6297,6 +6332,7 @@
               <w:rPr>
                 <w:sz w:val="19"/>
               </w:rPr>
+              <w:lastRenderedPageBreak/>
               <w:t>memory.py</w:t>
             </w:r>
           </w:p>
@@ -6474,11 +6510,7 @@
     </w:p>
     <w:p>
       <w:r>
-        <w:t xml:space="preserve">The Executor shows how tool use works with LangGraph. On its first visit it writes an AIMessage with a parse_time_log tool call; tools_condition sends it to the ToolNode, which returns a ToolMessage. On </w:t>
-      </w:r>
-      <w:r>
-        <w:lastRenderedPageBreak/>
-        <w:t>the second visit it issues five tool calls at once (classify_activities, sum_hours, calc_rop, depth_vs_plan, cost_vs_budget). On the third visit it reads the results, totals NPT by category in Python and writes a plain message, so tools_condition hands control back to the Orchestrator.</w:t>
+        <w:t>The Executor shows how tool use works with LangGraph. On its first visit it writes an AIMessage with a parse_time_log tool call; tools_condition sends it to the ToolNode, which returns a ToolMessage. On the second visit it issues five tool calls at once (classify_activities, sum_hours, calc_rop, depth_vs_plan, cost_vs_budget). On the third visit it reads the results, totals NPT by category in Python and writes a plain message, so tools_condition hands control back to the Orchestrator.</w:t>
       </w:r>
     </w:p>
     <w:p>
@@ -6490,7 +6522,7 @@
       <w:pPr>
         <w:pStyle w:val="Heading1"/>
       </w:pPr>
-      <w:bookmarkStart w:id="18" w:name="_Toc243335693"/>
+      <w:bookmarkStart w:id="18" w:name="_Toc243339246"/>
       <w:r>
         <w:t>10. Deterministic tools and model usage</w:t>
       </w:r>
@@ -6866,8 +6898,9 @@
       <w:pPr>
         <w:pStyle w:val="Heading1"/>
       </w:pPr>
-      <w:bookmarkStart w:id="19" w:name="_Toc243335694"/>
-      <w:r>
+      <w:bookmarkStart w:id="19" w:name="_Toc243339247"/>
+      <w:r>
+        <w:lastRenderedPageBreak/>
         <w:t>11. Critic validation, retries and human-in-the-loop review</w:t>
       </w:r>
       <w:bookmarkEnd w:id="19"/>
@@ -7134,7 +7167,6 @@
               <w:rPr>
                 <w:sz w:val="19"/>
               </w:rPr>
-              <w:lastRenderedPageBreak/>
               <w:t>No overlaps</w:t>
             </w:r>
           </w:p>
@@ -7361,7 +7393,7 @@
       <w:pPr>
         <w:pStyle w:val="Heading1"/>
       </w:pPr>
-      <w:bookmarkStart w:id="20" w:name="_Toc243335695"/>
+      <w:bookmarkStart w:id="20" w:name="_Toc243339248"/>
       <w:r>
         <w:t>12. Streamlit interface</w:t>
       </w:r>
@@ -7376,7 +7408,7 @@
       <w:pPr>
         <w:pStyle w:val="Heading2"/>
       </w:pPr>
-      <w:bookmarkStart w:id="21" w:name="_Toc243335696"/>
+      <w:bookmarkStart w:id="21" w:name="_Toc243339249"/>
       <w:r>
         <w:t>12.1 Deployment</w:t>
       </w:r>
@@ -7451,8 +7483,9 @@
       <w:pPr>
         <w:pStyle w:val="Heading2"/>
       </w:pPr>
-      <w:bookmarkStart w:id="22" w:name="_Toc243335697"/>
-      <w:r>
+      <w:bookmarkStart w:id="22" w:name="_Toc243339250"/>
+      <w:r>
+        <w:lastRenderedPageBreak/>
         <w:t>12.2 Screens</w:t>
       </w:r>
       <w:bookmarkEnd w:id="22"/>
@@ -7471,9 +7504,8 @@
         <w:rPr>
           <w:noProof/>
         </w:rPr>
-        <w:lastRenderedPageBreak/>
         <w:drawing>
-          <wp:inline distT="0" distB="0" distL="0" distR="0" wp14:anchorId="1BC3A64D" wp14:editId="3BCF9B69">
+          <wp:inline distT="0" distB="0" distL="0" distR="0" wp14:anchorId="41655ABD" wp14:editId="6856D761">
             <wp:extent cx="5903999" cy="3019750"/>
             <wp:effectExtent l="0" t="0" r="0" b="0"/>
             <wp:docPr id="2" name="Picture 2"/>
@@ -7488,7 +7520,7 @@
                     <pic:cNvPicPr/>
                   </pic:nvPicPr>
                   <pic:blipFill>
-                    <a:blip r:embed="rId9"/>
+                    <a:blip r:embed="rId10"/>
                     <a:stretch>
                       <a:fillRect/>
                     </a:stretch>
@@ -7528,7 +7560,7 @@
           <w:noProof/>
         </w:rPr>
         <w:drawing>
-          <wp:inline distT="0" distB="0" distL="0" distR="0" wp14:anchorId="2689D0E8" wp14:editId="10200BE2">
+          <wp:inline distT="0" distB="0" distL="0" distR="0" wp14:anchorId="66919275" wp14:editId="79AC73C2">
             <wp:extent cx="5903999" cy="2032524"/>
             <wp:effectExtent l="0" t="0" r="0" b="0"/>
             <wp:docPr id="3" name="Picture 3"/>
@@ -7543,7 +7575,7 @@
                     <pic:cNvPicPr/>
                   </pic:nvPicPr>
                   <pic:blipFill>
-                    <a:blip r:embed="rId10"/>
+                    <a:blip r:embed="rId11"/>
                     <a:stretch>
                       <a:fillRect/>
                     </a:stretch>
@@ -7584,7 +7616,7 @@
         </w:rPr>
         <w:lastRenderedPageBreak/>
         <w:drawing>
-          <wp:inline distT="0" distB="0" distL="0" distR="0" wp14:anchorId="38748809" wp14:editId="69939E2E">
+          <wp:inline distT="0" distB="0" distL="0" distR="0" wp14:anchorId="67E1D0D6" wp14:editId="5D158937">
             <wp:extent cx="5903999" cy="4413481"/>
             <wp:effectExtent l="0" t="0" r="0" b="0"/>
             <wp:docPr id="4" name="Picture 4"/>
@@ -7599,7 +7631,7 @@
                     <pic:cNvPicPr/>
                   </pic:nvPicPr>
                   <pic:blipFill>
-                    <a:blip r:embed="rId11"/>
+                    <a:blip r:embed="rId12"/>
                     <a:stretch>
                       <a:fillRect/>
                     </a:stretch>
@@ -7640,7 +7672,7 @@
         </w:rPr>
         <w:lastRenderedPageBreak/>
         <w:drawing>
-          <wp:inline distT="0" distB="0" distL="0" distR="0" wp14:anchorId="5F282D8A" wp14:editId="2367F761">
+          <wp:inline distT="0" distB="0" distL="0" distR="0" wp14:anchorId="1E3DFD44" wp14:editId="4B29DDF6">
             <wp:extent cx="5903999" cy="4274753"/>
             <wp:effectExtent l="0" t="0" r="0" b="0"/>
             <wp:docPr id="5" name="Picture 5"/>
@@ -7655,7 +7687,7 @@
                     <pic:cNvPicPr/>
                   </pic:nvPicPr>
                   <pic:blipFill>
-                    <a:blip r:embed="rId12"/>
+                    <a:blip r:embed="rId13"/>
                     <a:stretch>
                       <a:fillRect/>
                     </a:stretch>
@@ -7695,7 +7727,7 @@
           <w:noProof/>
         </w:rPr>
         <w:drawing>
-          <wp:inline distT="0" distB="0" distL="0" distR="0" wp14:anchorId="6689FB75" wp14:editId="5680B2AF">
+          <wp:inline distT="0" distB="0" distL="0" distR="0" wp14:anchorId="2035126B" wp14:editId="2F104380">
             <wp:extent cx="5903999" cy="2387409"/>
             <wp:effectExtent l="0" t="0" r="0" b="0"/>
             <wp:docPr id="6" name="Picture 6"/>
@@ -7710,7 +7742,7 @@
                     <pic:cNvPicPr/>
                   </pic:nvPicPr>
                   <pic:blipFill>
-                    <a:blip r:embed="rId13"/>
+                    <a:blip r:embed="rId14"/>
                     <a:stretch>
                       <a:fillRect/>
                     </a:stretch>
@@ -7751,7 +7783,7 @@
         </w:rPr>
         <w:lastRenderedPageBreak/>
         <w:drawing>
-          <wp:inline distT="0" distB="0" distL="0" distR="0" wp14:anchorId="2253D518" wp14:editId="0522B451">
+          <wp:inline distT="0" distB="0" distL="0" distR="0" wp14:anchorId="1DFA5AEC" wp14:editId="287EC5E9">
             <wp:extent cx="5903999" cy="5042596"/>
             <wp:effectExtent l="0" t="0" r="0" b="0"/>
             <wp:docPr id="7" name="Picture 7"/>
@@ -7766,7 +7798,7 @@
                     <pic:cNvPicPr/>
                   </pic:nvPicPr>
                   <pic:blipFill>
-                    <a:blip r:embed="rId14"/>
+                    <a:blip r:embed="rId15"/>
                     <a:stretch>
                       <a:fillRect/>
                     </a:stretch>
@@ -7807,7 +7839,7 @@
         </w:rPr>
         <w:lastRenderedPageBreak/>
         <w:drawing>
-          <wp:inline distT="0" distB="0" distL="0" distR="0" wp14:anchorId="1F6C3C8D" wp14:editId="165BBEBF">
+          <wp:inline distT="0" distB="0" distL="0" distR="0" wp14:anchorId="227B3BA3" wp14:editId="6CAB9455">
             <wp:extent cx="5400000" cy="4777377"/>
             <wp:effectExtent l="0" t="0" r="0" b="0"/>
             <wp:docPr id="8" name="Picture 8"/>
@@ -7822,7 +7854,7 @@
                     <pic:cNvPicPr/>
                   </pic:nvPicPr>
                   <pic:blipFill>
-                    <a:blip r:embed="rId15"/>
+                    <a:blip r:embed="rId16"/>
                     <a:stretch>
                       <a:fillRect/>
                     </a:stretch>
@@ -7856,7 +7888,7 @@
       <w:pPr>
         <w:pStyle w:val="Heading1"/>
       </w:pPr>
-      <w:bookmarkStart w:id="23" w:name="_Toc243335698"/>
+      <w:bookmarkStart w:id="23" w:name="_Toc243339251"/>
       <w:r>
         <w:t>13. Testing methodology and test cases</w:t>
       </w:r>
@@ -8098,7 +8130,7 @@
       <w:pPr>
         <w:pStyle w:val="Heading1"/>
       </w:pPr>
-      <w:bookmarkStart w:id="24" w:name="_Toc243335699"/>
+      <w:bookmarkStart w:id="24" w:name="_Toc243339252"/>
       <w:r>
         <w:t>14. Evaluation results</w:t>
       </w:r>
@@ -9164,7 +9196,7 @@
       <w:pPr>
         <w:pStyle w:val="Heading2"/>
       </w:pPr>
-      <w:bookmarkStart w:id="25" w:name="_Toc243335700"/>
+      <w:bookmarkStart w:id="25" w:name="_Toc243339253"/>
       <w:r>
         <w:t>Interpretation</w:t>
       </w:r>
@@ -9283,7 +9315,7 @@
       <w:pPr>
         <w:pStyle w:val="Heading1"/>
       </w:pPr>
-      <w:bookmarkStart w:id="26" w:name="_Toc243335701"/>
+      <w:bookmarkStart w:id="26" w:name="_Toc243339254"/>
       <w:r>
         <w:t>15. Limitations and responsible use</w:t>
       </w:r>
@@ -9356,7 +9388,7 @@
       <w:pPr>
         <w:pStyle w:val="Heading1"/>
       </w:pPr>
-      <w:bookmarkStart w:id="27" w:name="_Toc243335702"/>
+      <w:bookmarkStart w:id="27" w:name="_Toc243339255"/>
       <w:r>
         <w:t>16. Future enhancements</w:t>
       </w:r>
@@ -9420,7 +9452,7 @@
       <w:pPr>
         <w:pStyle w:val="Heading1"/>
       </w:pPr>
-      <w:bookmarkStart w:id="28" w:name="_Toc243335703"/>
+      <w:bookmarkStart w:id="28" w:name="_Toc243339256"/>
       <w:r>
         <w:t>17. Conclusion</w:t>
       </w:r>
@@ -9439,7 +9471,7 @@
       <w:pPr>
         <w:pStyle w:val="Heading1"/>
       </w:pPr>
-      <w:bookmarkStart w:id="29" w:name="_Toc243335704"/>
+      <w:bookmarkStart w:id="29" w:name="_Toc243339257"/>
       <w:r>
         <w:t>References</w:t>
       </w:r>
@@ -9701,7 +9733,7 @@
       <w:pPr>
         <w:pStyle w:val="Heading1"/>
       </w:pPr>
-      <w:bookmarkStart w:id="30" w:name="_Toc243335705"/>
+      <w:bookmarkStart w:id="30" w:name="_Toc243339258"/>
       <w:r>
         <w:t>Appendix A. How to run</w:t>
       </w:r>
@@ -9791,7 +9823,6 @@
       </w:r>
     </w:p>
     <w:sectPr>
-      <w:footerReference w:type="default" r:id="rId16"/>
       <w:pgSz w:w="11906" w:h="16838"/>
       <w:pgMar w:top="1247" w:right="1304" w:bottom="1247" w:left="1304" w:header="720" w:footer="720" w:gutter="0"/>
       <w:cols w:space="720"/>
@@ -10077,31 +10108,31 @@
       </w:rPr>
     </w:lvl>
   </w:abstractNum>
-  <w:num w:numId="1" w16cid:durableId="1926719679">
+  <w:num w:numId="1" w16cid:durableId="21906369">
     <w:abstractNumId w:val="8"/>
   </w:num>
-  <w:num w:numId="2" w16cid:durableId="547109362">
+  <w:num w:numId="2" w16cid:durableId="101610273">
     <w:abstractNumId w:val="6"/>
   </w:num>
-  <w:num w:numId="3" w16cid:durableId="627662627">
+  <w:num w:numId="3" w16cid:durableId="305159552">
     <w:abstractNumId w:val="5"/>
   </w:num>
-  <w:num w:numId="4" w16cid:durableId="2146894039">
+  <w:num w:numId="4" w16cid:durableId="2054840168">
     <w:abstractNumId w:val="4"/>
   </w:num>
-  <w:num w:numId="5" w16cid:durableId="321852193">
+  <w:num w:numId="5" w16cid:durableId="1868331501">
     <w:abstractNumId w:val="7"/>
   </w:num>
-  <w:num w:numId="6" w16cid:durableId="660742328">
+  <w:num w:numId="6" w16cid:durableId="1882939957">
     <w:abstractNumId w:val="3"/>
   </w:num>
-  <w:num w:numId="7" w16cid:durableId="123351274">
+  <w:num w:numId="7" w16cid:durableId="88047151">
     <w:abstractNumId w:val="2"/>
   </w:num>
-  <w:num w:numId="8" w16cid:durableId="1676347538">
+  <w:num w:numId="8" w16cid:durableId="113016757">
     <w:abstractNumId w:val="1"/>
   </w:num>
-  <w:num w:numId="9" w16cid:durableId="2125071113">
+  <w:num w:numId="9" w16cid:durableId="1087964499">
     <w:abstractNumId w:val="0"/>
   </w:num>
 </w:numbering>
@@ -21493,7 +21524,7 @@
     <w:autoRedefine/>
     <w:uiPriority w:val="39"/>
     <w:unhideWhenUsed/>
-    <w:rsid w:val="00B14D20"/>
+    <w:rsid w:val="00086FC0"/>
     <w:pPr>
       <w:spacing w:after="100"/>
     </w:pPr>
@@ -21505,7 +21536,7 @@
     <w:autoRedefine/>
     <w:uiPriority w:val="39"/>
     <w:unhideWhenUsed/>
-    <w:rsid w:val="00B14D20"/>
+    <w:rsid w:val="00086FC0"/>
     <w:pPr>
       <w:spacing w:after="100"/>
       <w:ind w:left="220"/>
@@ -21516,7 +21547,7 @@
     <w:basedOn w:val="DefaultParagraphFont"/>
     <w:uiPriority w:val="99"/>
     <w:unhideWhenUsed/>
-    <w:rsid w:val="00B14D20"/>
+    <w:rsid w:val="00086FC0"/>
     <w:rPr>
       <w:color w:val="0000FF" w:themeColor="hyperlink"/>
       <w:u w:val="single"/>

</xml_diff>

<commit_message>
Submission folder: PPT, report and a repository-link DOCX only
- Removed the PDF copies, diagram PNG, code zip and index from submission/
- New Rig_Sight_CA3_Repository_Link.docx with the GitHub and live demo links
- Clickable repo and demo links in the deck (app slide, sources slide) and in
  the report (title page, appendix); deck link colour set to cream
</commit_message>
<xml_diff>
--- a/submission/Rig_Sight_CA3_Report.docx
+++ b/submission/Rig_Sight_CA3_Report.docx
@@ -127,15 +127,48 @@
     </w:p>
     <w:p>
       <w:pPr>
+        <w:spacing w:after="40"/>
         <w:jc w:val="center"/>
       </w:pPr>
       <w:r>
         <w:rPr>
           <w:color w:val="595959"/>
-          <w:sz w:val="20"/>
+          <w:sz w:val="21"/>
         </w:rPr>
-        <w:t>Repository: github.com/ranjanvrma/rig-sight · Live demo: rig-sight.streamlit.app</w:t>
-      </w:r>
+        <w:t xml:space="preserve">Repository: </w:t>
+      </w:r>
+      <w:hyperlink r:id="rId8">
+        <w:r>
+          <w:rPr>
+            <w:color w:val="0563C1"/>
+            <w:sz w:val="21"/>
+            <w:u w:val="single"/>
+          </w:rPr>
+          <w:t>https://github.com/ranjanvrma/rig-sight</w:t>
+        </w:r>
+      </w:hyperlink>
+    </w:p>
+    <w:p>
+      <w:pPr>
+        <w:jc w:val="center"/>
+      </w:pPr>
+      <w:r>
+        <w:rPr>
+          <w:color w:val="595959"/>
+          <w:sz w:val="21"/>
+        </w:rPr>
+        <w:t xml:space="preserve">Live demo: </w:t>
+      </w:r>
+      <w:hyperlink r:id="rId9">
+        <w:r>
+          <w:rPr>
+            <w:color w:val="0563C1"/>
+            <w:sz w:val="21"/>
+            <w:u w:val="single"/>
+          </w:rPr>
+          <w:t>https://rig-sight.streamlit.app/</w:t>
+        </w:r>
+      </w:hyperlink>
     </w:p>
     <w:p>
       <w:pPr>
@@ -165,7 +198,7 @@
       <w:pPr>
         <w:pStyle w:val="Heading1"/>
       </w:pPr>
-      <w:bookmarkStart w:id="0" w:name="_Toc243339228"/>
+      <w:bookmarkStart w:id="0" w:name="_Toc243339768"/>
       <w:r>
         <w:lastRenderedPageBreak/>
         <w:t>Contents</w:t>
@@ -191,7 +224,7 @@
       <w:r>
         <w:fldChar w:fldCharType="separate"/>
       </w:r>
-      <w:hyperlink w:anchor="_Toc243339228" w:history="1">
+      <w:hyperlink w:anchor="_Toc243339768" w:history="1">
         <w:r>
           <w:rPr>
             <w:rStyle w:val="Hyperlink"/>
@@ -218,7 +251,7 @@
             <w:noProof/>
             <w:webHidden/>
           </w:rPr>
-          <w:instrText xml:space="preserve"> PAGEREF _Toc243339228 \h </w:instrText>
+          <w:instrText xml:space="preserve"> PAGEREF _Toc243339768 \h </w:instrText>
         </w:r>
         <w:r>
           <w:rPr>
@@ -259,7 +292,7 @@
           <w:noProof/>
         </w:rPr>
       </w:pPr>
-      <w:hyperlink w:anchor="_Toc243339229" w:history="1">
+      <w:hyperlink w:anchor="_Toc243339769" w:history="1">
         <w:r>
           <w:rPr>
             <w:rStyle w:val="Hyperlink"/>
@@ -286,7 +319,7 @@
             <w:noProof/>
             <w:webHidden/>
           </w:rPr>
-          <w:instrText xml:space="preserve"> PAGEREF _Toc243339229 \h </w:instrText>
+          <w:instrText xml:space="preserve"> PAGEREF _Toc243339769 \h </w:instrText>
         </w:r>
         <w:r>
           <w:rPr>
@@ -327,7 +360,7 @@
           <w:noProof/>
         </w:rPr>
       </w:pPr>
-      <w:hyperlink w:anchor="_Toc243339230" w:history="1">
+      <w:hyperlink w:anchor="_Toc243339770" w:history="1">
         <w:r>
           <w:rPr>
             <w:rStyle w:val="Hyperlink"/>
@@ -354,7 +387,7 @@
             <w:noProof/>
             <w:webHidden/>
           </w:rPr>
-          <w:instrText xml:space="preserve"> PAGEREF _Toc243339230 \h </w:instrText>
+          <w:instrText xml:space="preserve"> PAGEREF _Toc243339770 \h </w:instrText>
         </w:r>
         <w:r>
           <w:rPr>
@@ -395,7 +428,7 @@
           <w:noProof/>
         </w:rPr>
       </w:pPr>
-      <w:hyperlink w:anchor="_Toc243339231" w:history="1">
+      <w:hyperlink w:anchor="_Toc243339771" w:history="1">
         <w:r>
           <w:rPr>
             <w:rStyle w:val="Hyperlink"/>
@@ -422,7 +455,7 @@
             <w:noProof/>
             <w:webHidden/>
           </w:rPr>
-          <w:instrText xml:space="preserve"> PAGEREF _Toc243339231 \h </w:instrText>
+          <w:instrText xml:space="preserve"> PAGEREF _Toc243339771 \h </w:instrText>
         </w:r>
         <w:r>
           <w:rPr>
@@ -463,7 +496,7 @@
           <w:noProof/>
         </w:rPr>
       </w:pPr>
-      <w:hyperlink w:anchor="_Toc243339232" w:history="1">
+      <w:hyperlink w:anchor="_Toc243339772" w:history="1">
         <w:r>
           <w:rPr>
             <w:rStyle w:val="Hyperlink"/>
@@ -490,7 +523,7 @@
             <w:noProof/>
             <w:webHidden/>
           </w:rPr>
-          <w:instrText xml:space="preserve"> PAGEREF _Toc243339232 \h </w:instrText>
+          <w:instrText xml:space="preserve"> PAGEREF _Toc243339772 \h </w:instrText>
         </w:r>
         <w:r>
           <w:rPr>
@@ -531,7 +564,7 @@
           <w:noProof/>
         </w:rPr>
       </w:pPr>
-      <w:hyperlink w:anchor="_Toc243339233" w:history="1">
+      <w:hyperlink w:anchor="_Toc243339773" w:history="1">
         <w:r>
           <w:rPr>
             <w:rStyle w:val="Hyperlink"/>
@@ -558,7 +591,7 @@
             <w:noProof/>
             <w:webHidden/>
           </w:rPr>
-          <w:instrText xml:space="preserve"> PAGEREF _Toc243339233 \h </w:instrText>
+          <w:instrText xml:space="preserve"> PAGEREF _Toc243339773 \h </w:instrText>
         </w:r>
         <w:r>
           <w:rPr>
@@ -599,7 +632,7 @@
           <w:noProof/>
         </w:rPr>
       </w:pPr>
-      <w:hyperlink w:anchor="_Toc243339234" w:history="1">
+      <w:hyperlink w:anchor="_Toc243339774" w:history="1">
         <w:r>
           <w:rPr>
             <w:rStyle w:val="Hyperlink"/>
@@ -626,7 +659,7 @@
             <w:noProof/>
             <w:webHidden/>
           </w:rPr>
-          <w:instrText xml:space="preserve"> PAGEREF _Toc243339234 \h </w:instrText>
+          <w:instrText xml:space="preserve"> PAGEREF _Toc243339774 \h </w:instrText>
         </w:r>
         <w:r>
           <w:rPr>
@@ -667,7 +700,7 @@
           <w:noProof/>
         </w:rPr>
       </w:pPr>
-      <w:hyperlink w:anchor="_Toc243339235" w:history="1">
+      <w:hyperlink w:anchor="_Toc243339775" w:history="1">
         <w:r>
           <w:rPr>
             <w:rStyle w:val="Hyperlink"/>
@@ -694,7 +727,7 @@
             <w:noProof/>
             <w:webHidden/>
           </w:rPr>
-          <w:instrText xml:space="preserve"> PAGEREF _Toc243339235 \h </w:instrText>
+          <w:instrText xml:space="preserve"> PAGEREF _Toc243339775 \h </w:instrText>
         </w:r>
         <w:r>
           <w:rPr>
@@ -735,7 +768,7 @@
           <w:noProof/>
         </w:rPr>
       </w:pPr>
-      <w:hyperlink w:anchor="_Toc243339236" w:history="1">
+      <w:hyperlink w:anchor="_Toc243339776" w:history="1">
         <w:r>
           <w:rPr>
             <w:rStyle w:val="Hyperlink"/>
@@ -762,7 +795,7 @@
             <w:noProof/>
             <w:webHidden/>
           </w:rPr>
-          <w:instrText xml:space="preserve"> PAGEREF _Toc243339236 \h </w:instrText>
+          <w:instrText xml:space="preserve"> PAGEREF _Toc243339776 \h </w:instrText>
         </w:r>
         <w:r>
           <w:rPr>
@@ -803,7 +836,7 @@
           <w:noProof/>
         </w:rPr>
       </w:pPr>
-      <w:hyperlink w:anchor="_Toc243339237" w:history="1">
+      <w:hyperlink w:anchor="_Toc243339777" w:history="1">
         <w:r>
           <w:rPr>
             <w:rStyle w:val="Hyperlink"/>
@@ -830,7 +863,7 @@
             <w:noProof/>
             <w:webHidden/>
           </w:rPr>
-          <w:instrText xml:space="preserve"> PAGEREF _Toc243339237 \h </w:instrText>
+          <w:instrText xml:space="preserve"> PAGEREF _Toc243339777 \h </w:instrText>
         </w:r>
         <w:r>
           <w:rPr>
@@ -871,7 +904,7 @@
           <w:noProof/>
         </w:rPr>
       </w:pPr>
-      <w:hyperlink w:anchor="_Toc243339238" w:history="1">
+      <w:hyperlink w:anchor="_Toc243339778" w:history="1">
         <w:r>
           <w:rPr>
             <w:rStyle w:val="Hyperlink"/>
@@ -898,7 +931,7 @@
             <w:noProof/>
             <w:webHidden/>
           </w:rPr>
-          <w:instrText xml:space="preserve"> PAGEREF _Toc243339238 \h </w:instrText>
+          <w:instrText xml:space="preserve"> PAGEREF _Toc243339778 \h </w:instrText>
         </w:r>
         <w:r>
           <w:rPr>
@@ -939,7 +972,7 @@
           <w:noProof/>
         </w:rPr>
       </w:pPr>
-      <w:hyperlink w:anchor="_Toc243339239" w:history="1">
+      <w:hyperlink w:anchor="_Toc243339779" w:history="1">
         <w:r>
           <w:rPr>
             <w:rStyle w:val="Hyperlink"/>
@@ -966,7 +999,7 @@
             <w:noProof/>
             <w:webHidden/>
           </w:rPr>
-          <w:instrText xml:space="preserve"> PAGEREF _Toc243339239 \h </w:instrText>
+          <w:instrText xml:space="preserve"> PAGEREF _Toc243339779 \h </w:instrText>
         </w:r>
         <w:r>
           <w:rPr>
@@ -1007,7 +1040,7 @@
           <w:noProof/>
         </w:rPr>
       </w:pPr>
-      <w:hyperlink w:anchor="_Toc243339240" w:history="1">
+      <w:hyperlink w:anchor="_Toc243339780" w:history="1">
         <w:r>
           <w:rPr>
             <w:rStyle w:val="Hyperlink"/>
@@ -1034,7 +1067,7 @@
             <w:noProof/>
             <w:webHidden/>
           </w:rPr>
-          <w:instrText xml:space="preserve"> PAGEREF _Toc243339240 \h </w:instrText>
+          <w:instrText xml:space="preserve"> PAGEREF _Toc243339780 \h </w:instrText>
         </w:r>
         <w:r>
           <w:rPr>
@@ -1075,7 +1108,7 @@
           <w:noProof/>
         </w:rPr>
       </w:pPr>
-      <w:hyperlink w:anchor="_Toc243339241" w:history="1">
+      <w:hyperlink w:anchor="_Toc243339781" w:history="1">
         <w:r>
           <w:rPr>
             <w:rStyle w:val="Hyperlink"/>
@@ -1102,7 +1135,7 @@
             <w:noProof/>
             <w:webHidden/>
           </w:rPr>
-          <w:instrText xml:space="preserve"> PAGEREF _Toc243339241 \h </w:instrText>
+          <w:instrText xml:space="preserve"> PAGEREF _Toc243339781 \h </w:instrText>
         </w:r>
         <w:r>
           <w:rPr>
@@ -1143,7 +1176,7 @@
           <w:noProof/>
         </w:rPr>
       </w:pPr>
-      <w:hyperlink w:anchor="_Toc243339242" w:history="1">
+      <w:hyperlink w:anchor="_Toc243339782" w:history="1">
         <w:r>
           <w:rPr>
             <w:rStyle w:val="Hyperlink"/>
@@ -1170,7 +1203,7 @@
             <w:noProof/>
             <w:webHidden/>
           </w:rPr>
-          <w:instrText xml:space="preserve"> PAGEREF _Toc243339242 \h </w:instrText>
+          <w:instrText xml:space="preserve"> PAGEREF _Toc243339782 \h </w:instrText>
         </w:r>
         <w:r>
           <w:rPr>
@@ -1211,7 +1244,7 @@
           <w:noProof/>
         </w:rPr>
       </w:pPr>
-      <w:hyperlink w:anchor="_Toc243339243" w:history="1">
+      <w:hyperlink w:anchor="_Toc243339783" w:history="1">
         <w:r>
           <w:rPr>
             <w:rStyle w:val="Hyperlink"/>
@@ -1238,7 +1271,7 @@
             <w:noProof/>
             <w:webHidden/>
           </w:rPr>
-          <w:instrText xml:space="preserve"> PAGEREF _Toc243339243 \h </w:instrText>
+          <w:instrText xml:space="preserve"> PAGEREF _Toc243339783 \h </w:instrText>
         </w:r>
         <w:r>
           <w:rPr>
@@ -1279,7 +1312,7 @@
           <w:noProof/>
         </w:rPr>
       </w:pPr>
-      <w:hyperlink w:anchor="_Toc243339244" w:history="1">
+      <w:hyperlink w:anchor="_Toc243339784" w:history="1">
         <w:r>
           <w:rPr>
             <w:rStyle w:val="Hyperlink"/>
@@ -1306,7 +1339,7 @@
             <w:noProof/>
             <w:webHidden/>
           </w:rPr>
-          <w:instrText xml:space="preserve"> PAGEREF _Toc243339244 \h </w:instrText>
+          <w:instrText xml:space="preserve"> PAGEREF _Toc243339784 \h </w:instrText>
         </w:r>
         <w:r>
           <w:rPr>
@@ -1347,7 +1380,7 @@
           <w:noProof/>
         </w:rPr>
       </w:pPr>
-      <w:hyperlink w:anchor="_Toc243339245" w:history="1">
+      <w:hyperlink w:anchor="_Toc243339785" w:history="1">
         <w:r>
           <w:rPr>
             <w:rStyle w:val="Hyperlink"/>
@@ -1374,7 +1407,7 @@
             <w:noProof/>
             <w:webHidden/>
           </w:rPr>
-          <w:instrText xml:space="preserve"> PAGEREF _Toc243339245 \h </w:instrText>
+          <w:instrText xml:space="preserve"> PAGEREF _Toc243339785 \h </w:instrText>
         </w:r>
         <w:r>
           <w:rPr>
@@ -1415,7 +1448,7 @@
           <w:noProof/>
         </w:rPr>
       </w:pPr>
-      <w:hyperlink w:anchor="_Toc243339246" w:history="1">
+      <w:hyperlink w:anchor="_Toc243339786" w:history="1">
         <w:r>
           <w:rPr>
             <w:rStyle w:val="Hyperlink"/>
@@ -1442,7 +1475,7 @@
             <w:noProof/>
             <w:webHidden/>
           </w:rPr>
-          <w:instrText xml:space="preserve"> PAGEREF _Toc243339246 \h </w:instrText>
+          <w:instrText xml:space="preserve"> PAGEREF _Toc243339786 \h </w:instrText>
         </w:r>
         <w:r>
           <w:rPr>
@@ -1483,7 +1516,7 @@
           <w:noProof/>
         </w:rPr>
       </w:pPr>
-      <w:hyperlink w:anchor="_Toc243339247" w:history="1">
+      <w:hyperlink w:anchor="_Toc243339787" w:history="1">
         <w:r>
           <w:rPr>
             <w:rStyle w:val="Hyperlink"/>
@@ -1510,7 +1543,7 @@
             <w:noProof/>
             <w:webHidden/>
           </w:rPr>
-          <w:instrText xml:space="preserve"> PAGEREF _Toc243339247 \h </w:instrText>
+          <w:instrText xml:space="preserve"> PAGEREF _Toc243339787 \h </w:instrText>
         </w:r>
         <w:r>
           <w:rPr>
@@ -1551,7 +1584,7 @@
           <w:noProof/>
         </w:rPr>
       </w:pPr>
-      <w:hyperlink w:anchor="_Toc243339248" w:history="1">
+      <w:hyperlink w:anchor="_Toc243339788" w:history="1">
         <w:r>
           <w:rPr>
             <w:rStyle w:val="Hyperlink"/>
@@ -1578,7 +1611,7 @@
             <w:noProof/>
             <w:webHidden/>
           </w:rPr>
-          <w:instrText xml:space="preserve"> PAGEREF _Toc243339248 \h </w:instrText>
+          <w:instrText xml:space="preserve"> PAGEREF _Toc243339788 \h </w:instrText>
         </w:r>
         <w:r>
           <w:rPr>
@@ -1619,7 +1652,7 @@
           <w:noProof/>
         </w:rPr>
       </w:pPr>
-      <w:hyperlink w:anchor="_Toc243339249" w:history="1">
+      <w:hyperlink w:anchor="_Toc243339789" w:history="1">
         <w:r>
           <w:rPr>
             <w:rStyle w:val="Hyperlink"/>
@@ -1646,7 +1679,7 @@
             <w:noProof/>
             <w:webHidden/>
           </w:rPr>
-          <w:instrText xml:space="preserve"> PAGEREF _Toc243339249 \h </w:instrText>
+          <w:instrText xml:space="preserve"> PAGEREF _Toc243339789 \h </w:instrText>
         </w:r>
         <w:r>
           <w:rPr>
@@ -1687,7 +1720,7 @@
           <w:noProof/>
         </w:rPr>
       </w:pPr>
-      <w:hyperlink w:anchor="_Toc243339250" w:history="1">
+      <w:hyperlink w:anchor="_Toc243339790" w:history="1">
         <w:r>
           <w:rPr>
             <w:rStyle w:val="Hyperlink"/>
@@ -1714,7 +1747,7 @@
             <w:noProof/>
             <w:webHidden/>
           </w:rPr>
-          <w:instrText xml:space="preserve"> PAGEREF _Toc243339250 \h </w:instrText>
+          <w:instrText xml:space="preserve"> PAGEREF _Toc243339790 \h </w:instrText>
         </w:r>
         <w:r>
           <w:rPr>
@@ -1755,7 +1788,7 @@
           <w:noProof/>
         </w:rPr>
       </w:pPr>
-      <w:hyperlink w:anchor="_Toc243339251" w:history="1">
+      <w:hyperlink w:anchor="_Toc243339791" w:history="1">
         <w:r>
           <w:rPr>
             <w:rStyle w:val="Hyperlink"/>
@@ -1782,7 +1815,7 @@
             <w:noProof/>
             <w:webHidden/>
           </w:rPr>
-          <w:instrText xml:space="preserve"> PAGEREF _Toc243339251 \h </w:instrText>
+          <w:instrText xml:space="preserve"> PAGEREF _Toc243339791 \h </w:instrText>
         </w:r>
         <w:r>
           <w:rPr>
@@ -1823,7 +1856,7 @@
           <w:noProof/>
         </w:rPr>
       </w:pPr>
-      <w:hyperlink w:anchor="_Toc243339252" w:history="1">
+      <w:hyperlink w:anchor="_Toc243339792" w:history="1">
         <w:r>
           <w:rPr>
             <w:rStyle w:val="Hyperlink"/>
@@ -1850,7 +1883,7 @@
             <w:noProof/>
             <w:webHidden/>
           </w:rPr>
-          <w:instrText xml:space="preserve"> PAGEREF _Toc243339252 \h </w:instrText>
+          <w:instrText xml:space="preserve"> PAGEREF _Toc243339792 \h </w:instrText>
         </w:r>
         <w:r>
           <w:rPr>
@@ -1891,7 +1924,7 @@
           <w:noProof/>
         </w:rPr>
       </w:pPr>
-      <w:hyperlink w:anchor="_Toc243339253" w:history="1">
+      <w:hyperlink w:anchor="_Toc243339793" w:history="1">
         <w:r>
           <w:rPr>
             <w:rStyle w:val="Hyperlink"/>
@@ -1918,7 +1951,7 @@
             <w:noProof/>
             <w:webHidden/>
           </w:rPr>
-          <w:instrText xml:space="preserve"> PAGEREF _Toc243339253 \h </w:instrText>
+          <w:instrText xml:space="preserve"> PAGEREF _Toc243339793 \h </w:instrText>
         </w:r>
         <w:r>
           <w:rPr>
@@ -1959,7 +1992,7 @@
           <w:noProof/>
         </w:rPr>
       </w:pPr>
-      <w:hyperlink w:anchor="_Toc243339254" w:history="1">
+      <w:hyperlink w:anchor="_Toc243339794" w:history="1">
         <w:r>
           <w:rPr>
             <w:rStyle w:val="Hyperlink"/>
@@ -1986,7 +2019,7 @@
             <w:noProof/>
             <w:webHidden/>
           </w:rPr>
-          <w:instrText xml:space="preserve"> PAGEREF _Toc243339254 \h </w:instrText>
+          <w:instrText xml:space="preserve"> PAGEREF _Toc243339794 \h </w:instrText>
         </w:r>
         <w:r>
           <w:rPr>
@@ -2027,7 +2060,7 @@
           <w:noProof/>
         </w:rPr>
       </w:pPr>
-      <w:hyperlink w:anchor="_Toc243339255" w:history="1">
+      <w:hyperlink w:anchor="_Toc243339795" w:history="1">
         <w:r>
           <w:rPr>
             <w:rStyle w:val="Hyperlink"/>
@@ -2054,7 +2087,7 @@
             <w:noProof/>
             <w:webHidden/>
           </w:rPr>
-          <w:instrText xml:space="preserve"> PAGEREF _Toc243339255 \h </w:instrText>
+          <w:instrText xml:space="preserve"> PAGEREF _Toc243339795 \h </w:instrText>
         </w:r>
         <w:r>
           <w:rPr>
@@ -2095,7 +2128,7 @@
           <w:noProof/>
         </w:rPr>
       </w:pPr>
-      <w:hyperlink w:anchor="_Toc243339256" w:history="1">
+      <w:hyperlink w:anchor="_Toc243339796" w:history="1">
         <w:r>
           <w:rPr>
             <w:rStyle w:val="Hyperlink"/>
@@ -2122,7 +2155,7 @@
             <w:noProof/>
             <w:webHidden/>
           </w:rPr>
-          <w:instrText xml:space="preserve"> PAGEREF _Toc243339256 \h </w:instrText>
+          <w:instrText xml:space="preserve"> PAGEREF _Toc243339796 \h </w:instrText>
         </w:r>
         <w:r>
           <w:rPr>
@@ -2163,7 +2196,7 @@
           <w:noProof/>
         </w:rPr>
       </w:pPr>
-      <w:hyperlink w:anchor="_Toc243339257" w:history="1">
+      <w:hyperlink w:anchor="_Toc243339797" w:history="1">
         <w:r>
           <w:rPr>
             <w:rStyle w:val="Hyperlink"/>
@@ -2190,7 +2223,7 @@
             <w:noProof/>
             <w:webHidden/>
           </w:rPr>
-          <w:instrText xml:space="preserve"> PAGEREF _Toc243339257 \h </w:instrText>
+          <w:instrText xml:space="preserve"> PAGEREF _Toc243339797 \h </w:instrText>
         </w:r>
         <w:r>
           <w:rPr>
@@ -2231,7 +2264,7 @@
           <w:noProof/>
         </w:rPr>
       </w:pPr>
-      <w:hyperlink w:anchor="_Toc243339258" w:history="1">
+      <w:hyperlink w:anchor="_Toc243339798" w:history="1">
         <w:r>
           <w:rPr>
             <w:rStyle w:val="Hyperlink"/>
@@ -2258,7 +2291,7 @@
             <w:noProof/>
             <w:webHidden/>
           </w:rPr>
-          <w:instrText xml:space="preserve"> PAGEREF _Toc243339258 \h </w:instrText>
+          <w:instrText xml:space="preserve"> PAGEREF _Toc243339798 \h </w:instrText>
         </w:r>
         <w:r>
           <w:rPr>
@@ -2303,7 +2336,7 @@
       <w:pPr>
         <w:pStyle w:val="Heading1"/>
       </w:pPr>
-      <w:bookmarkStart w:id="1" w:name="_Toc243339229"/>
+      <w:bookmarkStart w:id="1" w:name="_Toc243339769"/>
       <w:r>
         <w:lastRenderedPageBreak/>
         <w:t>Abstract</w:t>
@@ -2330,7 +2363,7 @@
       <w:pPr>
         <w:pStyle w:val="Heading1"/>
       </w:pPr>
-      <w:bookmarkStart w:id="2" w:name="_Toc243339230"/>
+      <w:bookmarkStart w:id="2" w:name="_Toc243339770"/>
       <w:r>
         <w:t>1. Introduction and domain background</w:t>
       </w:r>
@@ -2340,7 +2373,7 @@
       <w:pPr>
         <w:pStyle w:val="Heading2"/>
       </w:pPr>
-      <w:bookmarkStart w:id="3" w:name="_Toc243339231"/>
+      <w:bookmarkStart w:id="3" w:name="_Toc243339771"/>
       <w:r>
         <w:t>1.1 Why oil and gas drilling</w:t>
       </w:r>
@@ -2358,7 +2391,7 @@
       <w:pPr>
         <w:pStyle w:val="Heading2"/>
       </w:pPr>
-      <w:bookmarkStart w:id="4" w:name="_Toc243339232"/>
+      <w:bookmarkStart w:id="4" w:name="_Toc243339772"/>
       <w:r>
         <w:t>1.2 The Daily Drilling Report</w:t>
       </w:r>
@@ -2417,7 +2450,7 @@
       <w:pPr>
         <w:pStyle w:val="Heading2"/>
       </w:pPr>
-      <w:bookmarkStart w:id="5" w:name="_Toc243339233"/>
+      <w:bookmarkStart w:id="5" w:name="_Toc243339773"/>
       <w:r>
         <w:t>1.3 Non-productive time</w:t>
       </w:r>
@@ -2436,7 +2469,7 @@
       <w:pPr>
         <w:pStyle w:val="Heading1"/>
       </w:pPr>
-      <w:bookmarkStart w:id="6" w:name="_Toc243339234"/>
+      <w:bookmarkStart w:id="6" w:name="_Toc243339774"/>
       <w:r>
         <w:t>2. Problem statement</w:t>
       </w:r>
@@ -2459,7 +2492,7 @@
       <w:pPr>
         <w:pStyle w:val="Heading1"/>
       </w:pPr>
-      <w:bookmarkStart w:id="7" w:name="_Toc243339235"/>
+      <w:bookmarkStart w:id="7" w:name="_Toc243339775"/>
       <w:r>
         <w:t>3. Existing process and identified inefficiencies</w:t>
       </w:r>
@@ -2559,7 +2592,7 @@
       <w:pPr>
         <w:pStyle w:val="Heading1"/>
       </w:pPr>
-      <w:bookmarkStart w:id="8" w:name="_Toc243339236"/>
+      <w:bookmarkStart w:id="8" w:name="_Toc243339776"/>
       <w:r>
         <w:t>4. Proposed solution and objectives</w:t>
       </w:r>
@@ -2654,7 +2687,7 @@
       <w:pPr>
         <w:pStyle w:val="Heading1"/>
       </w:pPr>
-      <w:bookmarkStart w:id="9" w:name="_Toc243339237"/>
+      <w:bookmarkStart w:id="9" w:name="_Toc243339777"/>
       <w:r>
         <w:lastRenderedPageBreak/>
         <w:t>5. Requirements and technology stack</w:t>
@@ -2665,7 +2698,7 @@
       <w:pPr>
         <w:pStyle w:val="Heading2"/>
       </w:pPr>
-      <w:bookmarkStart w:id="10" w:name="_Toc243339238"/>
+      <w:bookmarkStart w:id="10" w:name="_Toc243339778"/>
       <w:r>
         <w:t>5.1 Functional requirements</w:t>
       </w:r>
@@ -3503,7 +3536,7 @@
       <w:pPr>
         <w:pStyle w:val="Heading2"/>
       </w:pPr>
-      <w:bookmarkStart w:id="11" w:name="_Toc243339239"/>
+      <w:bookmarkStart w:id="11" w:name="_Toc243339779"/>
       <w:r>
         <w:t>5.2 Technology stack</w:t>
       </w:r>
@@ -4028,7 +4061,7 @@
       <w:pPr>
         <w:pStyle w:val="Heading1"/>
       </w:pPr>
-      <w:bookmarkStart w:id="12" w:name="_Toc243339240"/>
+      <w:bookmarkStart w:id="12" w:name="_Toc243339780"/>
       <w:r>
         <w:t>6. System architecture and data flow</w:t>
       </w:r>
@@ -4119,7 +4152,7 @@
     <w:p>
       <w:pPr>
         <w:sectPr>
-          <w:footerReference w:type="default" r:id="rId8"/>
+          <w:footerReference w:type="default" r:id="rId10"/>
           <w:pgSz w:w="11906" w:h="16838"/>
           <w:pgMar w:top="1247" w:right="1304" w:bottom="1247" w:left="1304" w:header="720" w:footer="720" w:gutter="0"/>
           <w:cols w:space="720"/>
@@ -4138,7 +4171,7 @@
         </w:rPr>
         <w:lastRenderedPageBreak/>
         <w:drawing>
-          <wp:inline distT="0" distB="0" distL="0" distR="0" wp14:anchorId="4000312B" wp14:editId="626B172F">
+          <wp:inline distT="0" distB="0" distL="0" distR="0" wp14:anchorId="3B859D58" wp14:editId="0FF20C71">
             <wp:extent cx="9540000" cy="5101250"/>
             <wp:effectExtent l="0" t="0" r="0" b="0"/>
             <wp:docPr id="1" name="Picture 1"/>
@@ -4153,7 +4186,7 @@
                     <pic:cNvPicPr/>
                   </pic:nvPicPr>
                   <pic:blipFill>
-                    <a:blip r:embed="rId9"/>
+                    <a:blip r:embed="rId11"/>
                     <a:stretch>
                       <a:fillRect/>
                     </a:stretch>
@@ -4205,7 +4238,7 @@
       <w:pPr>
         <w:pStyle w:val="Heading1"/>
       </w:pPr>
-      <w:bookmarkStart w:id="13" w:name="_Toc243339241"/>
+      <w:bookmarkStart w:id="13" w:name="_Toc243339781"/>
       <w:r>
         <w:lastRenderedPageBreak/>
         <w:t>7. Agent roles and orchestration</w:t>
@@ -4905,7 +4938,7 @@
       <w:pPr>
         <w:pStyle w:val="Heading1"/>
       </w:pPr>
-      <w:bookmarkStart w:id="14" w:name="_Toc243339242"/>
+      <w:bookmarkStart w:id="14" w:name="_Toc243339782"/>
       <w:r>
         <w:t>8. Data model, synthetic dataset and reference files</w:t>
       </w:r>
@@ -4915,7 +4948,7 @@
       <w:pPr>
         <w:pStyle w:val="Heading2"/>
       </w:pPr>
-      <w:bookmarkStart w:id="15" w:name="_Toc243339243"/>
+      <w:bookmarkStart w:id="15" w:name="_Toc243339783"/>
       <w:r>
         <w:t>8.1 Shared state (DDRState)</w:t>
       </w:r>
@@ -5655,7 +5688,7 @@
       <w:pPr>
         <w:pStyle w:val="Heading2"/>
       </w:pPr>
-      <w:bookmarkStart w:id="16" w:name="_Toc243339244"/>
+      <w:bookmarkStart w:id="16" w:name="_Toc243339784"/>
       <w:r>
         <w:t>8.2 Synthetic dataset</w:t>
       </w:r>
@@ -6138,7 +6171,7 @@
       <w:pPr>
         <w:pStyle w:val="Heading1"/>
       </w:pPr>
-      <w:bookmarkStart w:id="17" w:name="_Toc243339245"/>
+      <w:bookmarkStart w:id="17" w:name="_Toc243339785"/>
       <w:r>
         <w:t>9. Implementation details</w:t>
       </w:r>
@@ -6522,7 +6555,7 @@
       <w:pPr>
         <w:pStyle w:val="Heading1"/>
       </w:pPr>
-      <w:bookmarkStart w:id="18" w:name="_Toc243339246"/>
+      <w:bookmarkStart w:id="18" w:name="_Toc243339786"/>
       <w:r>
         <w:t>10. Deterministic tools and model usage</w:t>
       </w:r>
@@ -6898,7 +6931,7 @@
       <w:pPr>
         <w:pStyle w:val="Heading1"/>
       </w:pPr>
-      <w:bookmarkStart w:id="19" w:name="_Toc243339247"/>
+      <w:bookmarkStart w:id="19" w:name="_Toc243339787"/>
       <w:r>
         <w:lastRenderedPageBreak/>
         <w:t>11. Critic validation, retries and human-in-the-loop review</w:t>
@@ -7393,7 +7426,7 @@
       <w:pPr>
         <w:pStyle w:val="Heading1"/>
       </w:pPr>
-      <w:bookmarkStart w:id="20" w:name="_Toc243339248"/>
+      <w:bookmarkStart w:id="20" w:name="_Toc243339788"/>
       <w:r>
         <w:t>12. Streamlit interface</w:t>
       </w:r>
@@ -7408,7 +7441,7 @@
       <w:pPr>
         <w:pStyle w:val="Heading2"/>
       </w:pPr>
-      <w:bookmarkStart w:id="21" w:name="_Toc243339249"/>
+      <w:bookmarkStart w:id="21" w:name="_Toc243339789"/>
       <w:r>
         <w:t>12.1 Deployment</w:t>
       </w:r>
@@ -7483,7 +7516,7 @@
       <w:pPr>
         <w:pStyle w:val="Heading2"/>
       </w:pPr>
-      <w:bookmarkStart w:id="22" w:name="_Toc243339250"/>
+      <w:bookmarkStart w:id="22" w:name="_Toc243339790"/>
       <w:r>
         <w:lastRenderedPageBreak/>
         <w:t>12.2 Screens</w:t>
@@ -7505,7 +7538,7 @@
           <w:noProof/>
         </w:rPr>
         <w:drawing>
-          <wp:inline distT="0" distB="0" distL="0" distR="0" wp14:anchorId="41655ABD" wp14:editId="6856D761">
+          <wp:inline distT="0" distB="0" distL="0" distR="0" wp14:anchorId="53D40BDD" wp14:editId="08D7FBB3">
             <wp:extent cx="5903999" cy="3019750"/>
             <wp:effectExtent l="0" t="0" r="0" b="0"/>
             <wp:docPr id="2" name="Picture 2"/>
@@ -7520,7 +7553,7 @@
                     <pic:cNvPicPr/>
                   </pic:nvPicPr>
                   <pic:blipFill>
-                    <a:blip r:embed="rId10"/>
+                    <a:blip r:embed="rId12"/>
                     <a:stretch>
                       <a:fillRect/>
                     </a:stretch>
@@ -7560,7 +7593,7 @@
           <w:noProof/>
         </w:rPr>
         <w:drawing>
-          <wp:inline distT="0" distB="0" distL="0" distR="0" wp14:anchorId="66919275" wp14:editId="79AC73C2">
+          <wp:inline distT="0" distB="0" distL="0" distR="0" wp14:anchorId="60DFB068" wp14:editId="007F7055">
             <wp:extent cx="5903999" cy="2032524"/>
             <wp:effectExtent l="0" t="0" r="0" b="0"/>
             <wp:docPr id="3" name="Picture 3"/>
@@ -7575,7 +7608,7 @@
                     <pic:cNvPicPr/>
                   </pic:nvPicPr>
                   <pic:blipFill>
-                    <a:blip r:embed="rId11"/>
+                    <a:blip r:embed="rId13"/>
                     <a:stretch>
                       <a:fillRect/>
                     </a:stretch>
@@ -7616,7 +7649,7 @@
         </w:rPr>
         <w:lastRenderedPageBreak/>
         <w:drawing>
-          <wp:inline distT="0" distB="0" distL="0" distR="0" wp14:anchorId="67E1D0D6" wp14:editId="5D158937">
+          <wp:inline distT="0" distB="0" distL="0" distR="0" wp14:anchorId="34052B98" wp14:editId="45664155">
             <wp:extent cx="5903999" cy="4413481"/>
             <wp:effectExtent l="0" t="0" r="0" b="0"/>
             <wp:docPr id="4" name="Picture 4"/>
@@ -7631,7 +7664,7 @@
                     <pic:cNvPicPr/>
                   </pic:nvPicPr>
                   <pic:blipFill>
-                    <a:blip r:embed="rId12"/>
+                    <a:blip r:embed="rId14"/>
                     <a:stretch>
                       <a:fillRect/>
                     </a:stretch>
@@ -7672,7 +7705,7 @@
         </w:rPr>
         <w:lastRenderedPageBreak/>
         <w:drawing>
-          <wp:inline distT="0" distB="0" distL="0" distR="0" wp14:anchorId="1E3DFD44" wp14:editId="4B29DDF6">
+          <wp:inline distT="0" distB="0" distL="0" distR="0" wp14:anchorId="7EE53A6C" wp14:editId="3AFF2FFB">
             <wp:extent cx="5903999" cy="4274753"/>
             <wp:effectExtent l="0" t="0" r="0" b="0"/>
             <wp:docPr id="5" name="Picture 5"/>
@@ -7687,7 +7720,7 @@
                     <pic:cNvPicPr/>
                   </pic:nvPicPr>
                   <pic:blipFill>
-                    <a:blip r:embed="rId13"/>
+                    <a:blip r:embed="rId15"/>
                     <a:stretch>
                       <a:fillRect/>
                     </a:stretch>
@@ -7727,7 +7760,7 @@
           <w:noProof/>
         </w:rPr>
         <w:drawing>
-          <wp:inline distT="0" distB="0" distL="0" distR="0" wp14:anchorId="2035126B" wp14:editId="2F104380">
+          <wp:inline distT="0" distB="0" distL="0" distR="0" wp14:anchorId="6AE075A4" wp14:editId="400DFD07">
             <wp:extent cx="5903999" cy="2387409"/>
             <wp:effectExtent l="0" t="0" r="0" b="0"/>
             <wp:docPr id="6" name="Picture 6"/>
@@ -7742,7 +7775,7 @@
                     <pic:cNvPicPr/>
                   </pic:nvPicPr>
                   <pic:blipFill>
-                    <a:blip r:embed="rId14"/>
+                    <a:blip r:embed="rId16"/>
                     <a:stretch>
                       <a:fillRect/>
                     </a:stretch>
@@ -7783,7 +7816,7 @@
         </w:rPr>
         <w:lastRenderedPageBreak/>
         <w:drawing>
-          <wp:inline distT="0" distB="0" distL="0" distR="0" wp14:anchorId="1DFA5AEC" wp14:editId="287EC5E9">
+          <wp:inline distT="0" distB="0" distL="0" distR="0" wp14:anchorId="73B0D779" wp14:editId="6247264E">
             <wp:extent cx="5903999" cy="5042596"/>
             <wp:effectExtent l="0" t="0" r="0" b="0"/>
             <wp:docPr id="7" name="Picture 7"/>
@@ -7798,7 +7831,7 @@
                     <pic:cNvPicPr/>
                   </pic:nvPicPr>
                   <pic:blipFill>
-                    <a:blip r:embed="rId15"/>
+                    <a:blip r:embed="rId17"/>
                     <a:stretch>
                       <a:fillRect/>
                     </a:stretch>
@@ -7839,7 +7872,7 @@
         </w:rPr>
         <w:lastRenderedPageBreak/>
         <w:drawing>
-          <wp:inline distT="0" distB="0" distL="0" distR="0" wp14:anchorId="227B3BA3" wp14:editId="6CAB9455">
+          <wp:inline distT="0" distB="0" distL="0" distR="0" wp14:anchorId="5E956729" wp14:editId="24A36E28">
             <wp:extent cx="5400000" cy="4777377"/>
             <wp:effectExtent l="0" t="0" r="0" b="0"/>
             <wp:docPr id="8" name="Picture 8"/>
@@ -7854,7 +7887,7 @@
                     <pic:cNvPicPr/>
                   </pic:nvPicPr>
                   <pic:blipFill>
-                    <a:blip r:embed="rId16"/>
+                    <a:blip r:embed="rId18"/>
                     <a:stretch>
                       <a:fillRect/>
                     </a:stretch>
@@ -7888,7 +7921,7 @@
       <w:pPr>
         <w:pStyle w:val="Heading1"/>
       </w:pPr>
-      <w:bookmarkStart w:id="23" w:name="_Toc243339251"/>
+      <w:bookmarkStart w:id="23" w:name="_Toc243339791"/>
       <w:r>
         <w:t>13. Testing methodology and test cases</w:t>
       </w:r>
@@ -8130,7 +8163,7 @@
       <w:pPr>
         <w:pStyle w:val="Heading1"/>
       </w:pPr>
-      <w:bookmarkStart w:id="24" w:name="_Toc243339252"/>
+      <w:bookmarkStart w:id="24" w:name="_Toc243339792"/>
       <w:r>
         <w:t>14. Evaluation results</w:t>
       </w:r>
@@ -9196,7 +9229,7 @@
       <w:pPr>
         <w:pStyle w:val="Heading2"/>
       </w:pPr>
-      <w:bookmarkStart w:id="25" w:name="_Toc243339253"/>
+      <w:bookmarkStart w:id="25" w:name="_Toc243339793"/>
       <w:r>
         <w:t>Interpretation</w:t>
       </w:r>
@@ -9315,7 +9348,7 @@
       <w:pPr>
         <w:pStyle w:val="Heading1"/>
       </w:pPr>
-      <w:bookmarkStart w:id="26" w:name="_Toc243339254"/>
+      <w:bookmarkStart w:id="26" w:name="_Toc243339794"/>
       <w:r>
         <w:t>15. Limitations and responsible use</w:t>
       </w:r>
@@ -9388,7 +9421,7 @@
       <w:pPr>
         <w:pStyle w:val="Heading1"/>
       </w:pPr>
-      <w:bookmarkStart w:id="27" w:name="_Toc243339255"/>
+      <w:bookmarkStart w:id="27" w:name="_Toc243339795"/>
       <w:r>
         <w:t>16. Future enhancements</w:t>
       </w:r>
@@ -9452,7 +9485,7 @@
       <w:pPr>
         <w:pStyle w:val="Heading1"/>
       </w:pPr>
-      <w:bookmarkStart w:id="28" w:name="_Toc243339256"/>
+      <w:bookmarkStart w:id="28" w:name="_Toc243339796"/>
       <w:r>
         <w:t>17. Conclusion</w:t>
       </w:r>
@@ -9471,7 +9504,7 @@
       <w:pPr>
         <w:pStyle w:val="Heading1"/>
       </w:pPr>
-      <w:bookmarkStart w:id="29" w:name="_Toc243339257"/>
+      <w:bookmarkStart w:id="29" w:name="_Toc243339797"/>
       <w:r>
         <w:t>References</w:t>
       </w:r>
@@ -9733,7 +9766,7 @@
       <w:pPr>
         <w:pStyle w:val="Heading1"/>
       </w:pPr>
-      <w:bookmarkStart w:id="30" w:name="_Toc243339258"/>
+      <w:bookmarkStart w:id="30" w:name="_Toc243339798"/>
       <w:r>
         <w:t>Appendix A. How to run</w:t>
       </w:r>
@@ -9741,7 +9774,35 @@
     </w:p>
     <w:p>
       <w:r>
-        <w:t>Online, without installing anything: https://rig-sight.streamlit.app/ (mock classifier). Locally:</w:t>
+        <w:t xml:space="preserve">Source code: </w:t>
+      </w:r>
+      <w:hyperlink r:id="rId19">
+        <w:r>
+          <w:rPr>
+            <w:color w:val="0563C1"/>
+            <w:u w:val="single"/>
+          </w:rPr>
+          <w:t>https://github.com/ranjanvrma/rig-sight</w:t>
+        </w:r>
+      </w:hyperlink>
+    </w:p>
+    <w:p>
+      <w:r>
+        <w:t xml:space="preserve">Online, without installing anything (mock classifier): </w:t>
+      </w:r>
+      <w:hyperlink r:id="rId20">
+        <w:r>
+          <w:rPr>
+            <w:color w:val="0563C1"/>
+            <w:u w:val="single"/>
+          </w:rPr>
+          <w:t>https://rig-sight.streamlit.app/</w:t>
+        </w:r>
+      </w:hyperlink>
+    </w:p>
+    <w:p>
+      <w:r>
+        <w:t>Locally:</w:t>
       </w:r>
     </w:p>
     <w:p>
@@ -10108,31 +10169,31 @@
       </w:rPr>
     </w:lvl>
   </w:abstractNum>
-  <w:num w:numId="1" w16cid:durableId="21906369">
+  <w:num w:numId="1" w16cid:durableId="1983538598">
     <w:abstractNumId w:val="8"/>
   </w:num>
-  <w:num w:numId="2" w16cid:durableId="101610273">
+  <w:num w:numId="2" w16cid:durableId="320549478">
     <w:abstractNumId w:val="6"/>
   </w:num>
-  <w:num w:numId="3" w16cid:durableId="305159552">
+  <w:num w:numId="3" w16cid:durableId="1741512516">
     <w:abstractNumId w:val="5"/>
   </w:num>
-  <w:num w:numId="4" w16cid:durableId="2054840168">
+  <w:num w:numId="4" w16cid:durableId="890531386">
     <w:abstractNumId w:val="4"/>
   </w:num>
-  <w:num w:numId="5" w16cid:durableId="1868331501">
+  <w:num w:numId="5" w16cid:durableId="941572373">
     <w:abstractNumId w:val="7"/>
   </w:num>
-  <w:num w:numId="6" w16cid:durableId="1882939957">
+  <w:num w:numId="6" w16cid:durableId="2087994941">
     <w:abstractNumId w:val="3"/>
   </w:num>
-  <w:num w:numId="7" w16cid:durableId="88047151">
+  <w:num w:numId="7" w16cid:durableId="213735178">
     <w:abstractNumId w:val="2"/>
   </w:num>
-  <w:num w:numId="8" w16cid:durableId="113016757">
+  <w:num w:numId="8" w16cid:durableId="736707313">
     <w:abstractNumId w:val="1"/>
   </w:num>
-  <w:num w:numId="9" w16cid:durableId="1087964499">
+  <w:num w:numId="9" w16cid:durableId="1546287429">
     <w:abstractNumId w:val="0"/>
   </w:num>
 </w:numbering>
@@ -21524,7 +21585,7 @@
     <w:autoRedefine/>
     <w:uiPriority w:val="39"/>
     <w:unhideWhenUsed/>
-    <w:rsid w:val="00086FC0"/>
+    <w:rsid w:val="00AA67D3"/>
     <w:pPr>
       <w:spacing w:after="100"/>
     </w:pPr>
@@ -21536,7 +21597,7 @@
     <w:autoRedefine/>
     <w:uiPriority w:val="39"/>
     <w:unhideWhenUsed/>
-    <w:rsid w:val="00086FC0"/>
+    <w:rsid w:val="00AA67D3"/>
     <w:pPr>
       <w:spacing w:after="100"/>
       <w:ind w:left="220"/>
@@ -21547,7 +21608,7 @@
     <w:basedOn w:val="DefaultParagraphFont"/>
     <w:uiPriority w:val="99"/>
     <w:unhideWhenUsed/>
-    <w:rsid w:val="00086FC0"/>
+    <w:rsid w:val="00AA67D3"/>
     <w:rPr>
       <w:color w:val="0000FF" w:themeColor="hyperlink"/>
       <w:u w:val="single"/>

</xml_diff>

<commit_message>
Report: correct Figure 6 caption after checking the live app
The custom report with a bad timestamp gets one retry (for the gap the bad
line leaves) before the Critic stops, not zero. All other report numbers
were checked against the live app and match.
</commit_message>
<xml_diff>
--- a/submission/Rig_Sight_CA3_Report.docx
+++ b/submission/Rig_Sight_CA3_Report.docx
@@ -198,7 +198,7 @@
       <w:pPr>
         <w:pStyle w:val="Heading1"/>
       </w:pPr>
-      <w:bookmarkStart w:id="0" w:name="_Toc243339768"/>
+      <w:bookmarkStart w:id="0" w:name="_Toc243340703"/>
       <w:r>
         <w:lastRenderedPageBreak/>
         <w:t>Contents</w:t>
@@ -224,7 +224,7 @@
       <w:r>
         <w:fldChar w:fldCharType="separate"/>
       </w:r>
-      <w:hyperlink w:anchor="_Toc243339768" w:history="1">
+      <w:hyperlink w:anchor="_Toc243340703" w:history="1">
         <w:r>
           <w:rPr>
             <w:rStyle w:val="Hyperlink"/>
@@ -251,7 +251,7 @@
             <w:noProof/>
             <w:webHidden/>
           </w:rPr>
-          <w:instrText xml:space="preserve"> PAGEREF _Toc243339768 \h </w:instrText>
+          <w:instrText xml:space="preserve"> PAGEREF _Toc243340703 \h </w:instrText>
         </w:r>
         <w:r>
           <w:rPr>
@@ -292,7 +292,7 @@
           <w:noProof/>
         </w:rPr>
       </w:pPr>
-      <w:hyperlink w:anchor="_Toc243339769" w:history="1">
+      <w:hyperlink w:anchor="_Toc243340704" w:history="1">
         <w:r>
           <w:rPr>
             <w:rStyle w:val="Hyperlink"/>
@@ -319,7 +319,7 @@
             <w:noProof/>
             <w:webHidden/>
           </w:rPr>
-          <w:instrText xml:space="preserve"> PAGEREF _Toc243339769 \h </w:instrText>
+          <w:instrText xml:space="preserve"> PAGEREF _Toc243340704 \h </w:instrText>
         </w:r>
         <w:r>
           <w:rPr>
@@ -360,7 +360,7 @@
           <w:noProof/>
         </w:rPr>
       </w:pPr>
-      <w:hyperlink w:anchor="_Toc243339770" w:history="1">
+      <w:hyperlink w:anchor="_Toc243340705" w:history="1">
         <w:r>
           <w:rPr>
             <w:rStyle w:val="Hyperlink"/>
@@ -387,7 +387,7 @@
             <w:noProof/>
             <w:webHidden/>
           </w:rPr>
-          <w:instrText xml:space="preserve"> PAGEREF _Toc243339770 \h </w:instrText>
+          <w:instrText xml:space="preserve"> PAGEREF _Toc243340705 \h </w:instrText>
         </w:r>
         <w:r>
           <w:rPr>
@@ -428,7 +428,7 @@
           <w:noProof/>
         </w:rPr>
       </w:pPr>
-      <w:hyperlink w:anchor="_Toc243339771" w:history="1">
+      <w:hyperlink w:anchor="_Toc243340706" w:history="1">
         <w:r>
           <w:rPr>
             <w:rStyle w:val="Hyperlink"/>
@@ -455,7 +455,7 @@
             <w:noProof/>
             <w:webHidden/>
           </w:rPr>
-          <w:instrText xml:space="preserve"> PAGEREF _Toc243339771 \h </w:instrText>
+          <w:instrText xml:space="preserve"> PAGEREF _Toc243340706 \h </w:instrText>
         </w:r>
         <w:r>
           <w:rPr>
@@ -496,7 +496,7 @@
           <w:noProof/>
         </w:rPr>
       </w:pPr>
-      <w:hyperlink w:anchor="_Toc243339772" w:history="1">
+      <w:hyperlink w:anchor="_Toc243340707" w:history="1">
         <w:r>
           <w:rPr>
             <w:rStyle w:val="Hyperlink"/>
@@ -523,7 +523,7 @@
             <w:noProof/>
             <w:webHidden/>
           </w:rPr>
-          <w:instrText xml:space="preserve"> PAGEREF _Toc243339772 \h </w:instrText>
+          <w:instrText xml:space="preserve"> PAGEREF _Toc243340707 \h </w:instrText>
         </w:r>
         <w:r>
           <w:rPr>
@@ -564,7 +564,7 @@
           <w:noProof/>
         </w:rPr>
       </w:pPr>
-      <w:hyperlink w:anchor="_Toc243339773" w:history="1">
+      <w:hyperlink w:anchor="_Toc243340708" w:history="1">
         <w:r>
           <w:rPr>
             <w:rStyle w:val="Hyperlink"/>
@@ -591,7 +591,7 @@
             <w:noProof/>
             <w:webHidden/>
           </w:rPr>
-          <w:instrText xml:space="preserve"> PAGEREF _Toc243339773 \h </w:instrText>
+          <w:instrText xml:space="preserve"> PAGEREF _Toc243340708 \h </w:instrText>
         </w:r>
         <w:r>
           <w:rPr>
@@ -632,7 +632,7 @@
           <w:noProof/>
         </w:rPr>
       </w:pPr>
-      <w:hyperlink w:anchor="_Toc243339774" w:history="1">
+      <w:hyperlink w:anchor="_Toc243340709" w:history="1">
         <w:r>
           <w:rPr>
             <w:rStyle w:val="Hyperlink"/>
@@ -659,7 +659,7 @@
             <w:noProof/>
             <w:webHidden/>
           </w:rPr>
-          <w:instrText xml:space="preserve"> PAGEREF _Toc243339774 \h </w:instrText>
+          <w:instrText xml:space="preserve"> PAGEREF _Toc243340709 \h </w:instrText>
         </w:r>
         <w:r>
           <w:rPr>
@@ -700,7 +700,7 @@
           <w:noProof/>
         </w:rPr>
       </w:pPr>
-      <w:hyperlink w:anchor="_Toc243339775" w:history="1">
+      <w:hyperlink w:anchor="_Toc243340710" w:history="1">
         <w:r>
           <w:rPr>
             <w:rStyle w:val="Hyperlink"/>
@@ -727,7 +727,7 @@
             <w:noProof/>
             <w:webHidden/>
           </w:rPr>
-          <w:instrText xml:space="preserve"> PAGEREF _Toc243339775 \h </w:instrText>
+          <w:instrText xml:space="preserve"> PAGEREF _Toc243340710 \h </w:instrText>
         </w:r>
         <w:r>
           <w:rPr>
@@ -768,7 +768,7 @@
           <w:noProof/>
         </w:rPr>
       </w:pPr>
-      <w:hyperlink w:anchor="_Toc243339776" w:history="1">
+      <w:hyperlink w:anchor="_Toc243340711" w:history="1">
         <w:r>
           <w:rPr>
             <w:rStyle w:val="Hyperlink"/>
@@ -795,7 +795,7 @@
             <w:noProof/>
             <w:webHidden/>
           </w:rPr>
-          <w:instrText xml:space="preserve"> PAGEREF _Toc243339776 \h </w:instrText>
+          <w:instrText xml:space="preserve"> PAGEREF _Toc243340711 \h </w:instrText>
         </w:r>
         <w:r>
           <w:rPr>
@@ -836,7 +836,7 @@
           <w:noProof/>
         </w:rPr>
       </w:pPr>
-      <w:hyperlink w:anchor="_Toc243339777" w:history="1">
+      <w:hyperlink w:anchor="_Toc243340712" w:history="1">
         <w:r>
           <w:rPr>
             <w:rStyle w:val="Hyperlink"/>
@@ -863,7 +863,7 @@
             <w:noProof/>
             <w:webHidden/>
           </w:rPr>
-          <w:instrText xml:space="preserve"> PAGEREF _Toc243339777 \h </w:instrText>
+          <w:instrText xml:space="preserve"> PAGEREF _Toc243340712 \h </w:instrText>
         </w:r>
         <w:r>
           <w:rPr>
@@ -904,7 +904,7 @@
           <w:noProof/>
         </w:rPr>
       </w:pPr>
-      <w:hyperlink w:anchor="_Toc243339778" w:history="1">
+      <w:hyperlink w:anchor="_Toc243340713" w:history="1">
         <w:r>
           <w:rPr>
             <w:rStyle w:val="Hyperlink"/>
@@ -931,7 +931,7 @@
             <w:noProof/>
             <w:webHidden/>
           </w:rPr>
-          <w:instrText xml:space="preserve"> PAGEREF _Toc243339778 \h </w:instrText>
+          <w:instrText xml:space="preserve"> PAGEREF _Toc243340713 \h </w:instrText>
         </w:r>
         <w:r>
           <w:rPr>
@@ -972,7 +972,7 @@
           <w:noProof/>
         </w:rPr>
       </w:pPr>
-      <w:hyperlink w:anchor="_Toc243339779" w:history="1">
+      <w:hyperlink w:anchor="_Toc243340714" w:history="1">
         <w:r>
           <w:rPr>
             <w:rStyle w:val="Hyperlink"/>
@@ -999,7 +999,7 @@
             <w:noProof/>
             <w:webHidden/>
           </w:rPr>
-          <w:instrText xml:space="preserve"> PAGEREF _Toc243339779 \h </w:instrText>
+          <w:instrText xml:space="preserve"> PAGEREF _Toc243340714 \h </w:instrText>
         </w:r>
         <w:r>
           <w:rPr>
@@ -1040,7 +1040,7 @@
           <w:noProof/>
         </w:rPr>
       </w:pPr>
-      <w:hyperlink w:anchor="_Toc243339780" w:history="1">
+      <w:hyperlink w:anchor="_Toc243340715" w:history="1">
         <w:r>
           <w:rPr>
             <w:rStyle w:val="Hyperlink"/>
@@ -1067,7 +1067,7 @@
             <w:noProof/>
             <w:webHidden/>
           </w:rPr>
-          <w:instrText xml:space="preserve"> PAGEREF _Toc243339780 \h </w:instrText>
+          <w:instrText xml:space="preserve"> PAGEREF _Toc243340715 \h </w:instrText>
         </w:r>
         <w:r>
           <w:rPr>
@@ -1108,7 +1108,7 @@
           <w:noProof/>
         </w:rPr>
       </w:pPr>
-      <w:hyperlink w:anchor="_Toc243339781" w:history="1">
+      <w:hyperlink w:anchor="_Toc243340716" w:history="1">
         <w:r>
           <w:rPr>
             <w:rStyle w:val="Hyperlink"/>
@@ -1135,7 +1135,7 @@
             <w:noProof/>
             <w:webHidden/>
           </w:rPr>
-          <w:instrText xml:space="preserve"> PAGEREF _Toc243339781 \h </w:instrText>
+          <w:instrText xml:space="preserve"> PAGEREF _Toc243340716 \h </w:instrText>
         </w:r>
         <w:r>
           <w:rPr>
@@ -1176,7 +1176,7 @@
           <w:noProof/>
         </w:rPr>
       </w:pPr>
-      <w:hyperlink w:anchor="_Toc243339782" w:history="1">
+      <w:hyperlink w:anchor="_Toc243340717" w:history="1">
         <w:r>
           <w:rPr>
             <w:rStyle w:val="Hyperlink"/>
@@ -1203,7 +1203,7 @@
             <w:noProof/>
             <w:webHidden/>
           </w:rPr>
-          <w:instrText xml:space="preserve"> PAGEREF _Toc243339782 \h </w:instrText>
+          <w:instrText xml:space="preserve"> PAGEREF _Toc243340717 \h </w:instrText>
         </w:r>
         <w:r>
           <w:rPr>
@@ -1244,7 +1244,7 @@
           <w:noProof/>
         </w:rPr>
       </w:pPr>
-      <w:hyperlink w:anchor="_Toc243339783" w:history="1">
+      <w:hyperlink w:anchor="_Toc243340718" w:history="1">
         <w:r>
           <w:rPr>
             <w:rStyle w:val="Hyperlink"/>
@@ -1271,7 +1271,7 @@
             <w:noProof/>
             <w:webHidden/>
           </w:rPr>
-          <w:instrText xml:space="preserve"> PAGEREF _Toc243339783 \h </w:instrText>
+          <w:instrText xml:space="preserve"> PAGEREF _Toc243340718 \h </w:instrText>
         </w:r>
         <w:r>
           <w:rPr>
@@ -1312,7 +1312,7 @@
           <w:noProof/>
         </w:rPr>
       </w:pPr>
-      <w:hyperlink w:anchor="_Toc243339784" w:history="1">
+      <w:hyperlink w:anchor="_Toc243340719" w:history="1">
         <w:r>
           <w:rPr>
             <w:rStyle w:val="Hyperlink"/>
@@ -1339,7 +1339,7 @@
             <w:noProof/>
             <w:webHidden/>
           </w:rPr>
-          <w:instrText xml:space="preserve"> PAGEREF _Toc243339784 \h </w:instrText>
+          <w:instrText xml:space="preserve"> PAGEREF _Toc243340719 \h </w:instrText>
         </w:r>
         <w:r>
           <w:rPr>
@@ -1380,7 +1380,7 @@
           <w:noProof/>
         </w:rPr>
       </w:pPr>
-      <w:hyperlink w:anchor="_Toc243339785" w:history="1">
+      <w:hyperlink w:anchor="_Toc243340720" w:history="1">
         <w:r>
           <w:rPr>
             <w:rStyle w:val="Hyperlink"/>
@@ -1407,7 +1407,7 @@
             <w:noProof/>
             <w:webHidden/>
           </w:rPr>
-          <w:instrText xml:space="preserve"> PAGEREF _Toc243339785 \h </w:instrText>
+          <w:instrText xml:space="preserve"> PAGEREF _Toc243340720 \h </w:instrText>
         </w:r>
         <w:r>
           <w:rPr>
@@ -1448,7 +1448,7 @@
           <w:noProof/>
         </w:rPr>
       </w:pPr>
-      <w:hyperlink w:anchor="_Toc243339786" w:history="1">
+      <w:hyperlink w:anchor="_Toc243340721" w:history="1">
         <w:r>
           <w:rPr>
             <w:rStyle w:val="Hyperlink"/>
@@ -1475,7 +1475,7 @@
             <w:noProof/>
             <w:webHidden/>
           </w:rPr>
-          <w:instrText xml:space="preserve"> PAGEREF _Toc243339786 \h </w:instrText>
+          <w:instrText xml:space="preserve"> PAGEREF _Toc243340721 \h </w:instrText>
         </w:r>
         <w:r>
           <w:rPr>
@@ -1516,7 +1516,7 @@
           <w:noProof/>
         </w:rPr>
       </w:pPr>
-      <w:hyperlink w:anchor="_Toc243339787" w:history="1">
+      <w:hyperlink w:anchor="_Toc243340722" w:history="1">
         <w:r>
           <w:rPr>
             <w:rStyle w:val="Hyperlink"/>
@@ -1543,7 +1543,7 @@
             <w:noProof/>
             <w:webHidden/>
           </w:rPr>
-          <w:instrText xml:space="preserve"> PAGEREF _Toc243339787 \h </w:instrText>
+          <w:instrText xml:space="preserve"> PAGEREF _Toc243340722 \h </w:instrText>
         </w:r>
         <w:r>
           <w:rPr>
@@ -1584,7 +1584,7 @@
           <w:noProof/>
         </w:rPr>
       </w:pPr>
-      <w:hyperlink w:anchor="_Toc243339788" w:history="1">
+      <w:hyperlink w:anchor="_Toc243340723" w:history="1">
         <w:r>
           <w:rPr>
             <w:rStyle w:val="Hyperlink"/>
@@ -1611,7 +1611,7 @@
             <w:noProof/>
             <w:webHidden/>
           </w:rPr>
-          <w:instrText xml:space="preserve"> PAGEREF _Toc243339788 \h </w:instrText>
+          <w:instrText xml:space="preserve"> PAGEREF _Toc243340723 \h </w:instrText>
         </w:r>
         <w:r>
           <w:rPr>
@@ -1652,7 +1652,7 @@
           <w:noProof/>
         </w:rPr>
       </w:pPr>
-      <w:hyperlink w:anchor="_Toc243339789" w:history="1">
+      <w:hyperlink w:anchor="_Toc243340724" w:history="1">
         <w:r>
           <w:rPr>
             <w:rStyle w:val="Hyperlink"/>
@@ -1679,7 +1679,7 @@
             <w:noProof/>
             <w:webHidden/>
           </w:rPr>
-          <w:instrText xml:space="preserve"> PAGEREF _Toc243339789 \h </w:instrText>
+          <w:instrText xml:space="preserve"> PAGEREF _Toc243340724 \h </w:instrText>
         </w:r>
         <w:r>
           <w:rPr>
@@ -1720,7 +1720,7 @@
           <w:noProof/>
         </w:rPr>
       </w:pPr>
-      <w:hyperlink w:anchor="_Toc243339790" w:history="1">
+      <w:hyperlink w:anchor="_Toc243340725" w:history="1">
         <w:r>
           <w:rPr>
             <w:rStyle w:val="Hyperlink"/>
@@ -1747,7 +1747,7 @@
             <w:noProof/>
             <w:webHidden/>
           </w:rPr>
-          <w:instrText xml:space="preserve"> PAGEREF _Toc243339790 \h </w:instrText>
+          <w:instrText xml:space="preserve"> PAGEREF _Toc243340725 \h </w:instrText>
         </w:r>
         <w:r>
           <w:rPr>
@@ -1788,7 +1788,7 @@
           <w:noProof/>
         </w:rPr>
       </w:pPr>
-      <w:hyperlink w:anchor="_Toc243339791" w:history="1">
+      <w:hyperlink w:anchor="_Toc243340726" w:history="1">
         <w:r>
           <w:rPr>
             <w:rStyle w:val="Hyperlink"/>
@@ -1815,7 +1815,7 @@
             <w:noProof/>
             <w:webHidden/>
           </w:rPr>
-          <w:instrText xml:space="preserve"> PAGEREF _Toc243339791 \h </w:instrText>
+          <w:instrText xml:space="preserve"> PAGEREF _Toc243340726 \h </w:instrText>
         </w:r>
         <w:r>
           <w:rPr>
@@ -1856,7 +1856,7 @@
           <w:noProof/>
         </w:rPr>
       </w:pPr>
-      <w:hyperlink w:anchor="_Toc243339792" w:history="1">
+      <w:hyperlink w:anchor="_Toc243340727" w:history="1">
         <w:r>
           <w:rPr>
             <w:rStyle w:val="Hyperlink"/>
@@ -1883,7 +1883,7 @@
             <w:noProof/>
             <w:webHidden/>
           </w:rPr>
-          <w:instrText xml:space="preserve"> PAGEREF _Toc243339792 \h </w:instrText>
+          <w:instrText xml:space="preserve"> PAGEREF _Toc243340727 \h </w:instrText>
         </w:r>
         <w:r>
           <w:rPr>
@@ -1924,7 +1924,7 @@
           <w:noProof/>
         </w:rPr>
       </w:pPr>
-      <w:hyperlink w:anchor="_Toc243339793" w:history="1">
+      <w:hyperlink w:anchor="_Toc243340728" w:history="1">
         <w:r>
           <w:rPr>
             <w:rStyle w:val="Hyperlink"/>
@@ -1951,7 +1951,7 @@
             <w:noProof/>
             <w:webHidden/>
           </w:rPr>
-          <w:instrText xml:space="preserve"> PAGEREF _Toc243339793 \h </w:instrText>
+          <w:instrText xml:space="preserve"> PAGEREF _Toc243340728 \h </w:instrText>
         </w:r>
         <w:r>
           <w:rPr>
@@ -1992,7 +1992,7 @@
           <w:noProof/>
         </w:rPr>
       </w:pPr>
-      <w:hyperlink w:anchor="_Toc243339794" w:history="1">
+      <w:hyperlink w:anchor="_Toc243340729" w:history="1">
         <w:r>
           <w:rPr>
             <w:rStyle w:val="Hyperlink"/>
@@ -2019,7 +2019,7 @@
             <w:noProof/>
             <w:webHidden/>
           </w:rPr>
-          <w:instrText xml:space="preserve"> PAGEREF _Toc243339794 \h </w:instrText>
+          <w:instrText xml:space="preserve"> PAGEREF _Toc243340729 \h </w:instrText>
         </w:r>
         <w:r>
           <w:rPr>
@@ -2060,7 +2060,7 @@
           <w:noProof/>
         </w:rPr>
       </w:pPr>
-      <w:hyperlink w:anchor="_Toc243339795" w:history="1">
+      <w:hyperlink w:anchor="_Toc243340730" w:history="1">
         <w:r>
           <w:rPr>
             <w:rStyle w:val="Hyperlink"/>
@@ -2087,7 +2087,7 @@
             <w:noProof/>
             <w:webHidden/>
           </w:rPr>
-          <w:instrText xml:space="preserve"> PAGEREF _Toc243339795 \h </w:instrText>
+          <w:instrText xml:space="preserve"> PAGEREF _Toc243340730 \h </w:instrText>
         </w:r>
         <w:r>
           <w:rPr>
@@ -2128,7 +2128,7 @@
           <w:noProof/>
         </w:rPr>
       </w:pPr>
-      <w:hyperlink w:anchor="_Toc243339796" w:history="1">
+      <w:hyperlink w:anchor="_Toc243340731" w:history="1">
         <w:r>
           <w:rPr>
             <w:rStyle w:val="Hyperlink"/>
@@ -2155,7 +2155,7 @@
             <w:noProof/>
             <w:webHidden/>
           </w:rPr>
-          <w:instrText xml:space="preserve"> PAGEREF _Toc243339796 \h </w:instrText>
+          <w:instrText xml:space="preserve"> PAGEREF _Toc243340731 \h </w:instrText>
         </w:r>
         <w:r>
           <w:rPr>
@@ -2196,7 +2196,7 @@
           <w:noProof/>
         </w:rPr>
       </w:pPr>
-      <w:hyperlink w:anchor="_Toc243339797" w:history="1">
+      <w:hyperlink w:anchor="_Toc243340732" w:history="1">
         <w:r>
           <w:rPr>
             <w:rStyle w:val="Hyperlink"/>
@@ -2223,7 +2223,7 @@
             <w:noProof/>
             <w:webHidden/>
           </w:rPr>
-          <w:instrText xml:space="preserve"> PAGEREF _Toc243339797 \h </w:instrText>
+          <w:instrText xml:space="preserve"> PAGEREF _Toc243340732 \h </w:instrText>
         </w:r>
         <w:r>
           <w:rPr>
@@ -2264,7 +2264,7 @@
           <w:noProof/>
         </w:rPr>
       </w:pPr>
-      <w:hyperlink w:anchor="_Toc243339798" w:history="1">
+      <w:hyperlink w:anchor="_Toc243340733" w:history="1">
         <w:r>
           <w:rPr>
             <w:rStyle w:val="Hyperlink"/>
@@ -2291,7 +2291,7 @@
             <w:noProof/>
             <w:webHidden/>
           </w:rPr>
-          <w:instrText xml:space="preserve"> PAGEREF _Toc243339798 \h </w:instrText>
+          <w:instrText xml:space="preserve"> PAGEREF _Toc243340733 \h </w:instrText>
         </w:r>
         <w:r>
           <w:rPr>
@@ -2336,7 +2336,7 @@
       <w:pPr>
         <w:pStyle w:val="Heading1"/>
       </w:pPr>
-      <w:bookmarkStart w:id="1" w:name="_Toc243339769"/>
+      <w:bookmarkStart w:id="1" w:name="_Toc243340704"/>
       <w:r>
         <w:lastRenderedPageBreak/>
         <w:t>Abstract</w:t>
@@ -2363,7 +2363,7 @@
       <w:pPr>
         <w:pStyle w:val="Heading1"/>
       </w:pPr>
-      <w:bookmarkStart w:id="2" w:name="_Toc243339770"/>
+      <w:bookmarkStart w:id="2" w:name="_Toc243340705"/>
       <w:r>
         <w:t>1. Introduction and domain background</w:t>
       </w:r>
@@ -2373,7 +2373,7 @@
       <w:pPr>
         <w:pStyle w:val="Heading2"/>
       </w:pPr>
-      <w:bookmarkStart w:id="3" w:name="_Toc243339771"/>
+      <w:bookmarkStart w:id="3" w:name="_Toc243340706"/>
       <w:r>
         <w:t>1.1 Why oil and gas drilling</w:t>
       </w:r>
@@ -2391,7 +2391,7 @@
       <w:pPr>
         <w:pStyle w:val="Heading2"/>
       </w:pPr>
-      <w:bookmarkStart w:id="4" w:name="_Toc243339772"/>
+      <w:bookmarkStart w:id="4" w:name="_Toc243340707"/>
       <w:r>
         <w:t>1.2 The Daily Drilling Report</w:t>
       </w:r>
@@ -2450,7 +2450,7 @@
       <w:pPr>
         <w:pStyle w:val="Heading2"/>
       </w:pPr>
-      <w:bookmarkStart w:id="5" w:name="_Toc243339773"/>
+      <w:bookmarkStart w:id="5" w:name="_Toc243340708"/>
       <w:r>
         <w:t>1.3 Non-productive time</w:t>
       </w:r>
@@ -2469,7 +2469,7 @@
       <w:pPr>
         <w:pStyle w:val="Heading1"/>
       </w:pPr>
-      <w:bookmarkStart w:id="6" w:name="_Toc243339774"/>
+      <w:bookmarkStart w:id="6" w:name="_Toc243340709"/>
       <w:r>
         <w:t>2. Problem statement</w:t>
       </w:r>
@@ -2492,7 +2492,7 @@
       <w:pPr>
         <w:pStyle w:val="Heading1"/>
       </w:pPr>
-      <w:bookmarkStart w:id="7" w:name="_Toc243339775"/>
+      <w:bookmarkStart w:id="7" w:name="_Toc243340710"/>
       <w:r>
         <w:t>3. Existing process and identified inefficiencies</w:t>
       </w:r>
@@ -2592,7 +2592,7 @@
       <w:pPr>
         <w:pStyle w:val="Heading1"/>
       </w:pPr>
-      <w:bookmarkStart w:id="8" w:name="_Toc243339776"/>
+      <w:bookmarkStart w:id="8" w:name="_Toc243340711"/>
       <w:r>
         <w:t>4. Proposed solution and objectives</w:t>
       </w:r>
@@ -2687,7 +2687,7 @@
       <w:pPr>
         <w:pStyle w:val="Heading1"/>
       </w:pPr>
-      <w:bookmarkStart w:id="9" w:name="_Toc243339777"/>
+      <w:bookmarkStart w:id="9" w:name="_Toc243340712"/>
       <w:r>
         <w:lastRenderedPageBreak/>
         <w:t>5. Requirements and technology stack</w:t>
@@ -2698,7 +2698,7 @@
       <w:pPr>
         <w:pStyle w:val="Heading2"/>
       </w:pPr>
-      <w:bookmarkStart w:id="10" w:name="_Toc243339778"/>
+      <w:bookmarkStart w:id="10" w:name="_Toc243340713"/>
       <w:r>
         <w:t>5.1 Functional requirements</w:t>
       </w:r>
@@ -3536,7 +3536,7 @@
       <w:pPr>
         <w:pStyle w:val="Heading2"/>
       </w:pPr>
-      <w:bookmarkStart w:id="11" w:name="_Toc243339779"/>
+      <w:bookmarkStart w:id="11" w:name="_Toc243340714"/>
       <w:r>
         <w:t>5.2 Technology stack</w:t>
       </w:r>
@@ -4061,7 +4061,7 @@
       <w:pPr>
         <w:pStyle w:val="Heading1"/>
       </w:pPr>
-      <w:bookmarkStart w:id="12" w:name="_Toc243339780"/>
+      <w:bookmarkStart w:id="12" w:name="_Toc243340715"/>
       <w:r>
         <w:t>6. System architecture and data flow</w:t>
       </w:r>
@@ -4171,7 +4171,7 @@
         </w:rPr>
         <w:lastRenderedPageBreak/>
         <w:drawing>
-          <wp:inline distT="0" distB="0" distL="0" distR="0" wp14:anchorId="3B859D58" wp14:editId="0FF20C71">
+          <wp:inline distT="0" distB="0" distL="0" distR="0" wp14:anchorId="369EE0E0" wp14:editId="0825B590">
             <wp:extent cx="9540000" cy="5101250"/>
             <wp:effectExtent l="0" t="0" r="0" b="0"/>
             <wp:docPr id="1" name="Picture 1"/>
@@ -4238,7 +4238,7 @@
       <w:pPr>
         <w:pStyle w:val="Heading1"/>
       </w:pPr>
-      <w:bookmarkStart w:id="13" w:name="_Toc243339781"/>
+      <w:bookmarkStart w:id="13" w:name="_Toc243340716"/>
       <w:r>
         <w:lastRenderedPageBreak/>
         <w:t>7. Agent roles and orchestration</w:t>
@@ -4938,7 +4938,7 @@
       <w:pPr>
         <w:pStyle w:val="Heading1"/>
       </w:pPr>
-      <w:bookmarkStart w:id="14" w:name="_Toc243339782"/>
+      <w:bookmarkStart w:id="14" w:name="_Toc243340717"/>
       <w:r>
         <w:t>8. Data model, synthetic dataset and reference files</w:t>
       </w:r>
@@ -4948,7 +4948,7 @@
       <w:pPr>
         <w:pStyle w:val="Heading2"/>
       </w:pPr>
-      <w:bookmarkStart w:id="15" w:name="_Toc243339783"/>
+      <w:bookmarkStart w:id="15" w:name="_Toc243340718"/>
       <w:r>
         <w:t>8.1 Shared state (DDRState)</w:t>
       </w:r>
@@ -5688,7 +5688,7 @@
       <w:pPr>
         <w:pStyle w:val="Heading2"/>
       </w:pPr>
-      <w:bookmarkStart w:id="16" w:name="_Toc243339784"/>
+      <w:bookmarkStart w:id="16" w:name="_Toc243340719"/>
       <w:r>
         <w:t>8.2 Synthetic dataset</w:t>
       </w:r>
@@ -6171,7 +6171,7 @@
       <w:pPr>
         <w:pStyle w:val="Heading1"/>
       </w:pPr>
-      <w:bookmarkStart w:id="17" w:name="_Toc243339785"/>
+      <w:bookmarkStart w:id="17" w:name="_Toc243340720"/>
       <w:r>
         <w:t>9. Implementation details</w:t>
       </w:r>
@@ -6555,7 +6555,7 @@
       <w:pPr>
         <w:pStyle w:val="Heading1"/>
       </w:pPr>
-      <w:bookmarkStart w:id="18" w:name="_Toc243339786"/>
+      <w:bookmarkStart w:id="18" w:name="_Toc243340721"/>
       <w:r>
         <w:t>10. Deterministic tools and model usage</w:t>
       </w:r>
@@ -6931,7 +6931,7 @@
       <w:pPr>
         <w:pStyle w:val="Heading1"/>
       </w:pPr>
-      <w:bookmarkStart w:id="19" w:name="_Toc243339787"/>
+      <w:bookmarkStart w:id="19" w:name="_Toc243340722"/>
       <w:r>
         <w:lastRenderedPageBreak/>
         <w:t>11. Critic validation, retries and human-in-the-loop review</w:t>
@@ -7426,7 +7426,7 @@
       <w:pPr>
         <w:pStyle w:val="Heading1"/>
       </w:pPr>
-      <w:bookmarkStart w:id="20" w:name="_Toc243339788"/>
+      <w:bookmarkStart w:id="20" w:name="_Toc243340723"/>
       <w:r>
         <w:t>12. Streamlit interface</w:t>
       </w:r>
@@ -7441,7 +7441,7 @@
       <w:pPr>
         <w:pStyle w:val="Heading2"/>
       </w:pPr>
-      <w:bookmarkStart w:id="21" w:name="_Toc243339789"/>
+      <w:bookmarkStart w:id="21" w:name="_Toc243340724"/>
       <w:r>
         <w:t>12.1 Deployment</w:t>
       </w:r>
@@ -7516,7 +7516,7 @@
       <w:pPr>
         <w:pStyle w:val="Heading2"/>
       </w:pPr>
-      <w:bookmarkStart w:id="22" w:name="_Toc243339790"/>
+      <w:bookmarkStart w:id="22" w:name="_Toc243340725"/>
       <w:r>
         <w:lastRenderedPageBreak/>
         <w:t>12.2 Screens</w:t>
@@ -7538,7 +7538,7 @@
           <w:noProof/>
         </w:rPr>
         <w:drawing>
-          <wp:inline distT="0" distB="0" distL="0" distR="0" wp14:anchorId="53D40BDD" wp14:editId="08D7FBB3">
+          <wp:inline distT="0" distB="0" distL="0" distR="0" wp14:anchorId="29B31407" wp14:editId="56142BA8">
             <wp:extent cx="5903999" cy="3019750"/>
             <wp:effectExtent l="0" t="0" r="0" b="0"/>
             <wp:docPr id="2" name="Picture 2"/>
@@ -7593,7 +7593,7 @@
           <w:noProof/>
         </w:rPr>
         <w:drawing>
-          <wp:inline distT="0" distB="0" distL="0" distR="0" wp14:anchorId="60DFB068" wp14:editId="007F7055">
+          <wp:inline distT="0" distB="0" distL="0" distR="0" wp14:anchorId="5EDBA113" wp14:editId="2ABF35F6">
             <wp:extent cx="5903999" cy="2032524"/>
             <wp:effectExtent l="0" t="0" r="0" b="0"/>
             <wp:docPr id="3" name="Picture 3"/>
@@ -7649,7 +7649,7 @@
         </w:rPr>
         <w:lastRenderedPageBreak/>
         <w:drawing>
-          <wp:inline distT="0" distB="0" distL="0" distR="0" wp14:anchorId="34052B98" wp14:editId="45664155">
+          <wp:inline distT="0" distB="0" distL="0" distR="0" wp14:anchorId="0485F2F7" wp14:editId="21C6A3FB">
             <wp:extent cx="5903999" cy="4413481"/>
             <wp:effectExtent l="0" t="0" r="0" b="0"/>
             <wp:docPr id="4" name="Picture 4"/>
@@ -7705,7 +7705,7 @@
         </w:rPr>
         <w:lastRenderedPageBreak/>
         <w:drawing>
-          <wp:inline distT="0" distB="0" distL="0" distR="0" wp14:anchorId="7EE53A6C" wp14:editId="3AFF2FFB">
+          <wp:inline distT="0" distB="0" distL="0" distR="0" wp14:anchorId="5C8D9B24" wp14:editId="3F858E71">
             <wp:extent cx="5903999" cy="4274753"/>
             <wp:effectExtent l="0" t="0" r="0" b="0"/>
             <wp:docPr id="5" name="Picture 5"/>
@@ -7760,7 +7760,7 @@
           <w:noProof/>
         </w:rPr>
         <w:drawing>
-          <wp:inline distT="0" distB="0" distL="0" distR="0" wp14:anchorId="6AE075A4" wp14:editId="400DFD07">
+          <wp:inline distT="0" distB="0" distL="0" distR="0" wp14:anchorId="01B66124" wp14:editId="4CB95E9F">
             <wp:extent cx="5903999" cy="2387409"/>
             <wp:effectExtent l="0" t="0" r="0" b="0"/>
             <wp:docPr id="6" name="Picture 6"/>
@@ -7802,7 +7802,7 @@
         <w:jc w:val="center"/>
       </w:pPr>
       <w:r>
-        <w:t>Figure 6. A pasted report with an invalid time range (12:00-2:00). The line is marked as a source error and left unrepaired; the Critic fails without a pointless retry</w:t>
+        <w:t>Figure 6. A pasted report with an invalid time range (12:00-2:00). The line is marked as a source error and left unrepaired. The Critic tries one retry for the 12:00-14:00 gap the bad line leaves, finds nothing to fix and stops (not three retries)</w:t>
       </w:r>
     </w:p>
     <w:p>
@@ -7816,7 +7816,7 @@
         </w:rPr>
         <w:lastRenderedPageBreak/>
         <w:drawing>
-          <wp:inline distT="0" distB="0" distL="0" distR="0" wp14:anchorId="73B0D779" wp14:editId="6247264E">
+          <wp:inline distT="0" distB="0" distL="0" distR="0" wp14:anchorId="7E6FCA9C" wp14:editId="21BCB324">
             <wp:extent cx="5903999" cy="5042596"/>
             <wp:effectExtent l="0" t="0" r="0" b="0"/>
             <wp:docPr id="7" name="Picture 7"/>
@@ -7872,7 +7872,7 @@
         </w:rPr>
         <w:lastRenderedPageBreak/>
         <w:drawing>
-          <wp:inline distT="0" distB="0" distL="0" distR="0" wp14:anchorId="5E956729" wp14:editId="24A36E28">
+          <wp:inline distT="0" distB="0" distL="0" distR="0" wp14:anchorId="5F313847" wp14:editId="7E48F194">
             <wp:extent cx="5400000" cy="4777377"/>
             <wp:effectExtent l="0" t="0" r="0" b="0"/>
             <wp:docPr id="8" name="Picture 8"/>
@@ -7921,7 +7921,7 @@
       <w:pPr>
         <w:pStyle w:val="Heading1"/>
       </w:pPr>
-      <w:bookmarkStart w:id="23" w:name="_Toc243339791"/>
+      <w:bookmarkStart w:id="23" w:name="_Toc243340726"/>
       <w:r>
         <w:t>13. Testing methodology and test cases</w:t>
       </w:r>
@@ -8163,7 +8163,7 @@
       <w:pPr>
         <w:pStyle w:val="Heading1"/>
       </w:pPr>
-      <w:bookmarkStart w:id="24" w:name="_Toc243339792"/>
+      <w:bookmarkStart w:id="24" w:name="_Toc243340727"/>
       <w:r>
         <w:t>14. Evaluation results</w:t>
       </w:r>
@@ -9229,7 +9229,7 @@
       <w:pPr>
         <w:pStyle w:val="Heading2"/>
       </w:pPr>
-      <w:bookmarkStart w:id="25" w:name="_Toc243339793"/>
+      <w:bookmarkStart w:id="25" w:name="_Toc243340728"/>
       <w:r>
         <w:t>Interpretation</w:t>
       </w:r>
@@ -9348,7 +9348,7 @@
       <w:pPr>
         <w:pStyle w:val="Heading1"/>
       </w:pPr>
-      <w:bookmarkStart w:id="26" w:name="_Toc243339794"/>
+      <w:bookmarkStart w:id="26" w:name="_Toc243340729"/>
       <w:r>
         <w:t>15. Limitations and responsible use</w:t>
       </w:r>
@@ -9421,7 +9421,7 @@
       <w:pPr>
         <w:pStyle w:val="Heading1"/>
       </w:pPr>
-      <w:bookmarkStart w:id="27" w:name="_Toc243339795"/>
+      <w:bookmarkStart w:id="27" w:name="_Toc243340730"/>
       <w:r>
         <w:t>16. Future enhancements</w:t>
       </w:r>
@@ -9485,7 +9485,7 @@
       <w:pPr>
         <w:pStyle w:val="Heading1"/>
       </w:pPr>
-      <w:bookmarkStart w:id="28" w:name="_Toc243339796"/>
+      <w:bookmarkStart w:id="28" w:name="_Toc243340731"/>
       <w:r>
         <w:t>17. Conclusion</w:t>
       </w:r>
@@ -9504,7 +9504,7 @@
       <w:pPr>
         <w:pStyle w:val="Heading1"/>
       </w:pPr>
-      <w:bookmarkStart w:id="29" w:name="_Toc243339797"/>
+      <w:bookmarkStart w:id="29" w:name="_Toc243340732"/>
       <w:r>
         <w:t>References</w:t>
       </w:r>
@@ -9766,7 +9766,7 @@
       <w:pPr>
         <w:pStyle w:val="Heading1"/>
       </w:pPr>
-      <w:bookmarkStart w:id="30" w:name="_Toc243339798"/>
+      <w:bookmarkStart w:id="30" w:name="_Toc243340733"/>
       <w:r>
         <w:t>Appendix A. How to run</w:t>
       </w:r>
@@ -10169,31 +10169,31 @@
       </w:rPr>
     </w:lvl>
   </w:abstractNum>
-  <w:num w:numId="1" w16cid:durableId="1983538598">
+  <w:num w:numId="1" w16cid:durableId="1690985012">
     <w:abstractNumId w:val="8"/>
   </w:num>
-  <w:num w:numId="2" w16cid:durableId="320549478">
+  <w:num w:numId="2" w16cid:durableId="643974401">
     <w:abstractNumId w:val="6"/>
   </w:num>
-  <w:num w:numId="3" w16cid:durableId="1741512516">
+  <w:num w:numId="3" w16cid:durableId="1319919533">
     <w:abstractNumId w:val="5"/>
   </w:num>
-  <w:num w:numId="4" w16cid:durableId="890531386">
+  <w:num w:numId="4" w16cid:durableId="1381662530">
     <w:abstractNumId w:val="4"/>
   </w:num>
-  <w:num w:numId="5" w16cid:durableId="941572373">
+  <w:num w:numId="5" w16cid:durableId="185019125">
     <w:abstractNumId w:val="7"/>
   </w:num>
-  <w:num w:numId="6" w16cid:durableId="2087994941">
+  <w:num w:numId="6" w16cid:durableId="2058041986">
     <w:abstractNumId w:val="3"/>
   </w:num>
-  <w:num w:numId="7" w16cid:durableId="213735178">
+  <w:num w:numId="7" w16cid:durableId="1823934742">
     <w:abstractNumId w:val="2"/>
   </w:num>
-  <w:num w:numId="8" w16cid:durableId="736707313">
+  <w:num w:numId="8" w16cid:durableId="817381625">
     <w:abstractNumId w:val="1"/>
   </w:num>
-  <w:num w:numId="9" w16cid:durableId="1546287429">
+  <w:num w:numId="9" w16cid:durableId="1202549843">
     <w:abstractNumId w:val="0"/>
   </w:num>
 </w:numbering>
@@ -21585,7 +21585,7 @@
     <w:autoRedefine/>
     <w:uiPriority w:val="39"/>
     <w:unhideWhenUsed/>
-    <w:rsid w:val="00AA67D3"/>
+    <w:rsid w:val="00810970"/>
     <w:pPr>
       <w:spacing w:after="100"/>
     </w:pPr>
@@ -21597,7 +21597,7 @@
     <w:autoRedefine/>
     <w:uiPriority w:val="39"/>
     <w:unhideWhenUsed/>
-    <w:rsid w:val="00AA67D3"/>
+    <w:rsid w:val="00810970"/>
     <w:pPr>
       <w:spacing w:after="100"/>
       <w:ind w:left="220"/>
@@ -21608,7 +21608,7 @@
     <w:basedOn w:val="DefaultParagraphFont"/>
     <w:uiPriority w:val="99"/>
     <w:unhideWhenUsed/>
-    <w:rsid w:val="00AA67D3"/>
+    <w:rsid w:val="00810970"/>
     <w:rPr>
       <w:color w:val="0000FF" w:themeColor="hyperlink"/>
       <w:u w:val="single"/>

</xml_diff>

<commit_message>
Remove the Streamlit app; update README, diagram, PPT and report for the web app
</commit_message>
<xml_diff>
--- a/submission/Rig_Sight_CA3_Report.docx
+++ b/submission/Rig_Sight_CA3_Report.docx
@@ -166,7 +166,7 @@
             <w:sz w:val="21"/>
             <w:u w:val="single"/>
           </w:rPr>
-          <w:t>https://rig-sight.streamlit.app/</w:t>
+          <w:t>https://rig-sight.onrender.com/</w:t>
         </w:r>
       </w:hyperlink>
     </w:p>
@@ -198,7 +198,7 @@
       <w:pPr>
         <w:pStyle w:val="Heading1"/>
       </w:pPr>
-      <w:bookmarkStart w:id="0" w:name="_Toc243340703"/>
+      <w:bookmarkStart w:id="0" w:name="_Toc243609736"/>
       <w:r>
         <w:lastRenderedPageBreak/>
         <w:t>Contents</w:t>
@@ -212,7 +212,13 @@
           <w:tab w:val="right" w:leader="dot" w:pos="9288"/>
         </w:tabs>
         <w:rPr>
+          <w:rFonts w:asciiTheme="minorHAnsi" w:hAnsiTheme="minorHAnsi"/>
           <w:noProof/>
+          <w:kern w:val="2"/>
+          <w:sz w:val="24"/>
+          <w:szCs w:val="24"/>
+          <w:lang w:val="en-IN" w:eastAsia="en-IN"/>
+          <w14:ligatures w14:val="standardContextual"/>
         </w:rPr>
       </w:pPr>
       <w:r>
@@ -224,7 +230,7 @@
       <w:r>
         <w:fldChar w:fldCharType="separate"/>
       </w:r>
-      <w:hyperlink w:anchor="_Toc243340703" w:history="1">
+      <w:hyperlink w:anchor="_Toc243609736" w:history="1">
         <w:r>
           <w:rPr>
             <w:rStyle w:val="Hyperlink"/>
@@ -251,7 +257,7 @@
             <w:noProof/>
             <w:webHidden/>
           </w:rPr>
-          <w:instrText xml:space="preserve"> PAGEREF _Toc243340703 \h </w:instrText>
+          <w:instrText xml:space="preserve"> PAGEREF _Toc243609736 \h </w:instrText>
         </w:r>
         <w:r>
           <w:rPr>
@@ -289,10 +295,16 @@
           <w:tab w:val="right" w:leader="dot" w:pos="9288"/>
         </w:tabs>
         <w:rPr>
+          <w:rFonts w:asciiTheme="minorHAnsi" w:hAnsiTheme="minorHAnsi"/>
           <w:noProof/>
+          <w:kern w:val="2"/>
+          <w:sz w:val="24"/>
+          <w:szCs w:val="24"/>
+          <w:lang w:val="en-IN" w:eastAsia="en-IN"/>
+          <w14:ligatures w14:val="standardContextual"/>
         </w:rPr>
       </w:pPr>
-      <w:hyperlink w:anchor="_Toc243340704" w:history="1">
+      <w:hyperlink w:anchor="_Toc243609737" w:history="1">
         <w:r>
           <w:rPr>
             <w:rStyle w:val="Hyperlink"/>
@@ -319,7 +331,7 @@
             <w:noProof/>
             <w:webHidden/>
           </w:rPr>
-          <w:instrText xml:space="preserve"> PAGEREF _Toc243340704 \h </w:instrText>
+          <w:instrText xml:space="preserve"> PAGEREF _Toc243609737 \h </w:instrText>
         </w:r>
         <w:r>
           <w:rPr>
@@ -357,10 +369,16 @@
           <w:tab w:val="right" w:leader="dot" w:pos="9288"/>
         </w:tabs>
         <w:rPr>
+          <w:rFonts w:asciiTheme="minorHAnsi" w:hAnsiTheme="minorHAnsi"/>
           <w:noProof/>
+          <w:kern w:val="2"/>
+          <w:sz w:val="24"/>
+          <w:szCs w:val="24"/>
+          <w:lang w:val="en-IN" w:eastAsia="en-IN"/>
+          <w14:ligatures w14:val="standardContextual"/>
         </w:rPr>
       </w:pPr>
-      <w:hyperlink w:anchor="_Toc243340705" w:history="1">
+      <w:hyperlink w:anchor="_Toc243609738" w:history="1">
         <w:r>
           <w:rPr>
             <w:rStyle w:val="Hyperlink"/>
@@ -387,7 +405,7 @@
             <w:noProof/>
             <w:webHidden/>
           </w:rPr>
-          <w:instrText xml:space="preserve"> PAGEREF _Toc243340705 \h </w:instrText>
+          <w:instrText xml:space="preserve"> PAGEREF _Toc243609738 \h </w:instrText>
         </w:r>
         <w:r>
           <w:rPr>
@@ -425,10 +443,16 @@
           <w:tab w:val="right" w:leader="dot" w:pos="9288"/>
         </w:tabs>
         <w:rPr>
+          <w:rFonts w:asciiTheme="minorHAnsi" w:hAnsiTheme="minorHAnsi"/>
           <w:noProof/>
+          <w:kern w:val="2"/>
+          <w:sz w:val="24"/>
+          <w:szCs w:val="24"/>
+          <w:lang w:val="en-IN" w:eastAsia="en-IN"/>
+          <w14:ligatures w14:val="standardContextual"/>
         </w:rPr>
       </w:pPr>
-      <w:hyperlink w:anchor="_Toc243340706" w:history="1">
+      <w:hyperlink w:anchor="_Toc243609739" w:history="1">
         <w:r>
           <w:rPr>
             <w:rStyle w:val="Hyperlink"/>
@@ -455,7 +479,7 @@
             <w:noProof/>
             <w:webHidden/>
           </w:rPr>
-          <w:instrText xml:space="preserve"> PAGEREF _Toc243340706 \h </w:instrText>
+          <w:instrText xml:space="preserve"> PAGEREF _Toc243609739 \h </w:instrText>
         </w:r>
         <w:r>
           <w:rPr>
@@ -493,10 +517,16 @@
           <w:tab w:val="right" w:leader="dot" w:pos="9288"/>
         </w:tabs>
         <w:rPr>
+          <w:rFonts w:asciiTheme="minorHAnsi" w:hAnsiTheme="minorHAnsi"/>
           <w:noProof/>
+          <w:kern w:val="2"/>
+          <w:sz w:val="24"/>
+          <w:szCs w:val="24"/>
+          <w:lang w:val="en-IN" w:eastAsia="en-IN"/>
+          <w14:ligatures w14:val="standardContextual"/>
         </w:rPr>
       </w:pPr>
-      <w:hyperlink w:anchor="_Toc243340707" w:history="1">
+      <w:hyperlink w:anchor="_Toc243609740" w:history="1">
         <w:r>
           <w:rPr>
             <w:rStyle w:val="Hyperlink"/>
@@ -523,7 +553,7 @@
             <w:noProof/>
             <w:webHidden/>
           </w:rPr>
-          <w:instrText xml:space="preserve"> PAGEREF _Toc243340707 \h </w:instrText>
+          <w:instrText xml:space="preserve"> PAGEREF _Toc243609740 \h </w:instrText>
         </w:r>
         <w:r>
           <w:rPr>
@@ -561,10 +591,16 @@
           <w:tab w:val="right" w:leader="dot" w:pos="9288"/>
         </w:tabs>
         <w:rPr>
+          <w:rFonts w:asciiTheme="minorHAnsi" w:hAnsiTheme="minorHAnsi"/>
           <w:noProof/>
+          <w:kern w:val="2"/>
+          <w:sz w:val="24"/>
+          <w:szCs w:val="24"/>
+          <w:lang w:val="en-IN" w:eastAsia="en-IN"/>
+          <w14:ligatures w14:val="standardContextual"/>
         </w:rPr>
       </w:pPr>
-      <w:hyperlink w:anchor="_Toc243340708" w:history="1">
+      <w:hyperlink w:anchor="_Toc243609741" w:history="1">
         <w:r>
           <w:rPr>
             <w:rStyle w:val="Hyperlink"/>
@@ -591,7 +627,7 @@
             <w:noProof/>
             <w:webHidden/>
           </w:rPr>
-          <w:instrText xml:space="preserve"> PAGEREF _Toc243340708 \h </w:instrText>
+          <w:instrText xml:space="preserve"> PAGEREF _Toc243609741 \h </w:instrText>
         </w:r>
         <w:r>
           <w:rPr>
@@ -629,10 +665,16 @@
           <w:tab w:val="right" w:leader="dot" w:pos="9288"/>
         </w:tabs>
         <w:rPr>
+          <w:rFonts w:asciiTheme="minorHAnsi" w:hAnsiTheme="minorHAnsi"/>
           <w:noProof/>
+          <w:kern w:val="2"/>
+          <w:sz w:val="24"/>
+          <w:szCs w:val="24"/>
+          <w:lang w:val="en-IN" w:eastAsia="en-IN"/>
+          <w14:ligatures w14:val="standardContextual"/>
         </w:rPr>
       </w:pPr>
-      <w:hyperlink w:anchor="_Toc243340709" w:history="1">
+      <w:hyperlink w:anchor="_Toc243609742" w:history="1">
         <w:r>
           <w:rPr>
             <w:rStyle w:val="Hyperlink"/>
@@ -659,7 +701,7 @@
             <w:noProof/>
             <w:webHidden/>
           </w:rPr>
-          <w:instrText xml:space="preserve"> PAGEREF _Toc243340709 \h </w:instrText>
+          <w:instrText xml:space="preserve"> PAGEREF _Toc243609742 \h </w:instrText>
         </w:r>
         <w:r>
           <w:rPr>
@@ -697,10 +739,16 @@
           <w:tab w:val="right" w:leader="dot" w:pos="9288"/>
         </w:tabs>
         <w:rPr>
+          <w:rFonts w:asciiTheme="minorHAnsi" w:hAnsiTheme="minorHAnsi"/>
           <w:noProof/>
+          <w:kern w:val="2"/>
+          <w:sz w:val="24"/>
+          <w:szCs w:val="24"/>
+          <w:lang w:val="en-IN" w:eastAsia="en-IN"/>
+          <w14:ligatures w14:val="standardContextual"/>
         </w:rPr>
       </w:pPr>
-      <w:hyperlink w:anchor="_Toc243340710" w:history="1">
+      <w:hyperlink w:anchor="_Toc243609743" w:history="1">
         <w:r>
           <w:rPr>
             <w:rStyle w:val="Hyperlink"/>
@@ -727,7 +775,7 @@
             <w:noProof/>
             <w:webHidden/>
           </w:rPr>
-          <w:instrText xml:space="preserve"> PAGEREF _Toc243340710 \h </w:instrText>
+          <w:instrText xml:space="preserve"> PAGEREF _Toc243609743 \h </w:instrText>
         </w:r>
         <w:r>
           <w:rPr>
@@ -765,10 +813,16 @@
           <w:tab w:val="right" w:leader="dot" w:pos="9288"/>
         </w:tabs>
         <w:rPr>
+          <w:rFonts w:asciiTheme="minorHAnsi" w:hAnsiTheme="minorHAnsi"/>
           <w:noProof/>
+          <w:kern w:val="2"/>
+          <w:sz w:val="24"/>
+          <w:szCs w:val="24"/>
+          <w:lang w:val="en-IN" w:eastAsia="en-IN"/>
+          <w14:ligatures w14:val="standardContextual"/>
         </w:rPr>
       </w:pPr>
-      <w:hyperlink w:anchor="_Toc243340711" w:history="1">
+      <w:hyperlink w:anchor="_Toc243609744" w:history="1">
         <w:r>
           <w:rPr>
             <w:rStyle w:val="Hyperlink"/>
@@ -795,7 +849,7 @@
             <w:noProof/>
             <w:webHidden/>
           </w:rPr>
-          <w:instrText xml:space="preserve"> PAGEREF _Toc243340711 \h </w:instrText>
+          <w:instrText xml:space="preserve"> PAGEREF _Toc243609744 \h </w:instrText>
         </w:r>
         <w:r>
           <w:rPr>
@@ -833,10 +887,16 @@
           <w:tab w:val="right" w:leader="dot" w:pos="9288"/>
         </w:tabs>
         <w:rPr>
+          <w:rFonts w:asciiTheme="minorHAnsi" w:hAnsiTheme="minorHAnsi"/>
           <w:noProof/>
+          <w:kern w:val="2"/>
+          <w:sz w:val="24"/>
+          <w:szCs w:val="24"/>
+          <w:lang w:val="en-IN" w:eastAsia="en-IN"/>
+          <w14:ligatures w14:val="standardContextual"/>
         </w:rPr>
       </w:pPr>
-      <w:hyperlink w:anchor="_Toc243340712" w:history="1">
+      <w:hyperlink w:anchor="_Toc243609745" w:history="1">
         <w:r>
           <w:rPr>
             <w:rStyle w:val="Hyperlink"/>
@@ -863,7 +923,7 @@
             <w:noProof/>
             <w:webHidden/>
           </w:rPr>
-          <w:instrText xml:space="preserve"> PAGEREF _Toc243340712 \h </w:instrText>
+          <w:instrText xml:space="preserve"> PAGEREF _Toc243609745 \h </w:instrText>
         </w:r>
         <w:r>
           <w:rPr>
@@ -901,10 +961,16 @@
           <w:tab w:val="right" w:leader="dot" w:pos="9288"/>
         </w:tabs>
         <w:rPr>
+          <w:rFonts w:asciiTheme="minorHAnsi" w:hAnsiTheme="minorHAnsi"/>
           <w:noProof/>
+          <w:kern w:val="2"/>
+          <w:sz w:val="24"/>
+          <w:szCs w:val="24"/>
+          <w:lang w:val="en-IN" w:eastAsia="en-IN"/>
+          <w14:ligatures w14:val="standardContextual"/>
         </w:rPr>
       </w:pPr>
-      <w:hyperlink w:anchor="_Toc243340713" w:history="1">
+      <w:hyperlink w:anchor="_Toc243609746" w:history="1">
         <w:r>
           <w:rPr>
             <w:rStyle w:val="Hyperlink"/>
@@ -931,7 +997,7 @@
             <w:noProof/>
             <w:webHidden/>
           </w:rPr>
-          <w:instrText xml:space="preserve"> PAGEREF _Toc243340713 \h </w:instrText>
+          <w:instrText xml:space="preserve"> PAGEREF _Toc243609746 \h </w:instrText>
         </w:r>
         <w:r>
           <w:rPr>
@@ -969,10 +1035,16 @@
           <w:tab w:val="right" w:leader="dot" w:pos="9288"/>
         </w:tabs>
         <w:rPr>
+          <w:rFonts w:asciiTheme="minorHAnsi" w:hAnsiTheme="minorHAnsi"/>
           <w:noProof/>
+          <w:kern w:val="2"/>
+          <w:sz w:val="24"/>
+          <w:szCs w:val="24"/>
+          <w:lang w:val="en-IN" w:eastAsia="en-IN"/>
+          <w14:ligatures w14:val="standardContextual"/>
         </w:rPr>
       </w:pPr>
-      <w:hyperlink w:anchor="_Toc243340714" w:history="1">
+      <w:hyperlink w:anchor="_Toc243609747" w:history="1">
         <w:r>
           <w:rPr>
             <w:rStyle w:val="Hyperlink"/>
@@ -999,7 +1071,7 @@
             <w:noProof/>
             <w:webHidden/>
           </w:rPr>
-          <w:instrText xml:space="preserve"> PAGEREF _Toc243340714 \h </w:instrText>
+          <w:instrText xml:space="preserve"> PAGEREF _Toc243609747 \h </w:instrText>
         </w:r>
         <w:r>
           <w:rPr>
@@ -1037,10 +1109,16 @@
           <w:tab w:val="right" w:leader="dot" w:pos="9288"/>
         </w:tabs>
         <w:rPr>
+          <w:rFonts w:asciiTheme="minorHAnsi" w:hAnsiTheme="minorHAnsi"/>
           <w:noProof/>
+          <w:kern w:val="2"/>
+          <w:sz w:val="24"/>
+          <w:szCs w:val="24"/>
+          <w:lang w:val="en-IN" w:eastAsia="en-IN"/>
+          <w14:ligatures w14:val="standardContextual"/>
         </w:rPr>
       </w:pPr>
-      <w:hyperlink w:anchor="_Toc243340715" w:history="1">
+      <w:hyperlink w:anchor="_Toc243609748" w:history="1">
         <w:r>
           <w:rPr>
             <w:rStyle w:val="Hyperlink"/>
@@ -1067,7 +1145,7 @@
             <w:noProof/>
             <w:webHidden/>
           </w:rPr>
-          <w:instrText xml:space="preserve"> PAGEREF _Toc243340715 \h </w:instrText>
+          <w:instrText xml:space="preserve"> PAGEREF _Toc243609748 \h </w:instrText>
         </w:r>
         <w:r>
           <w:rPr>
@@ -1105,10 +1183,16 @@
           <w:tab w:val="right" w:leader="dot" w:pos="9288"/>
         </w:tabs>
         <w:rPr>
+          <w:rFonts w:asciiTheme="minorHAnsi" w:hAnsiTheme="minorHAnsi"/>
           <w:noProof/>
+          <w:kern w:val="2"/>
+          <w:sz w:val="24"/>
+          <w:szCs w:val="24"/>
+          <w:lang w:val="en-IN" w:eastAsia="en-IN"/>
+          <w14:ligatures w14:val="standardContextual"/>
         </w:rPr>
       </w:pPr>
-      <w:hyperlink w:anchor="_Toc243340716" w:history="1">
+      <w:hyperlink w:anchor="_Toc243609749" w:history="1">
         <w:r>
           <w:rPr>
             <w:rStyle w:val="Hyperlink"/>
@@ -1135,7 +1219,7 @@
             <w:noProof/>
             <w:webHidden/>
           </w:rPr>
-          <w:instrText xml:space="preserve"> PAGEREF _Toc243340716 \h </w:instrText>
+          <w:instrText xml:space="preserve"> PAGEREF _Toc243609749 \h </w:instrText>
         </w:r>
         <w:r>
           <w:rPr>
@@ -1173,10 +1257,16 @@
           <w:tab w:val="right" w:leader="dot" w:pos="9288"/>
         </w:tabs>
         <w:rPr>
+          <w:rFonts w:asciiTheme="minorHAnsi" w:hAnsiTheme="minorHAnsi"/>
           <w:noProof/>
+          <w:kern w:val="2"/>
+          <w:sz w:val="24"/>
+          <w:szCs w:val="24"/>
+          <w:lang w:val="en-IN" w:eastAsia="en-IN"/>
+          <w14:ligatures w14:val="standardContextual"/>
         </w:rPr>
       </w:pPr>
-      <w:hyperlink w:anchor="_Toc243340717" w:history="1">
+      <w:hyperlink w:anchor="_Toc243609750" w:history="1">
         <w:r>
           <w:rPr>
             <w:rStyle w:val="Hyperlink"/>
@@ -1203,7 +1293,7 @@
             <w:noProof/>
             <w:webHidden/>
           </w:rPr>
-          <w:instrText xml:space="preserve"> PAGEREF _Toc243340717 \h </w:instrText>
+          <w:instrText xml:space="preserve"> PAGEREF _Toc243609750 \h </w:instrText>
         </w:r>
         <w:r>
           <w:rPr>
@@ -1241,10 +1331,16 @@
           <w:tab w:val="right" w:leader="dot" w:pos="9288"/>
         </w:tabs>
         <w:rPr>
+          <w:rFonts w:asciiTheme="minorHAnsi" w:hAnsiTheme="minorHAnsi"/>
           <w:noProof/>
+          <w:kern w:val="2"/>
+          <w:sz w:val="24"/>
+          <w:szCs w:val="24"/>
+          <w:lang w:val="en-IN" w:eastAsia="en-IN"/>
+          <w14:ligatures w14:val="standardContextual"/>
         </w:rPr>
       </w:pPr>
-      <w:hyperlink w:anchor="_Toc243340718" w:history="1">
+      <w:hyperlink w:anchor="_Toc243609751" w:history="1">
         <w:r>
           <w:rPr>
             <w:rStyle w:val="Hyperlink"/>
@@ -1271,7 +1367,7 @@
             <w:noProof/>
             <w:webHidden/>
           </w:rPr>
-          <w:instrText xml:space="preserve"> PAGEREF _Toc243340718 \h </w:instrText>
+          <w:instrText xml:space="preserve"> PAGEREF _Toc243609751 \h </w:instrText>
         </w:r>
         <w:r>
           <w:rPr>
@@ -1309,10 +1405,16 @@
           <w:tab w:val="right" w:leader="dot" w:pos="9288"/>
         </w:tabs>
         <w:rPr>
+          <w:rFonts w:asciiTheme="minorHAnsi" w:hAnsiTheme="minorHAnsi"/>
           <w:noProof/>
+          <w:kern w:val="2"/>
+          <w:sz w:val="24"/>
+          <w:szCs w:val="24"/>
+          <w:lang w:val="en-IN" w:eastAsia="en-IN"/>
+          <w14:ligatures w14:val="standardContextual"/>
         </w:rPr>
       </w:pPr>
-      <w:hyperlink w:anchor="_Toc243340719" w:history="1">
+      <w:hyperlink w:anchor="_Toc243609752" w:history="1">
         <w:r>
           <w:rPr>
             <w:rStyle w:val="Hyperlink"/>
@@ -1339,7 +1441,7 @@
             <w:noProof/>
             <w:webHidden/>
           </w:rPr>
-          <w:instrText xml:space="preserve"> PAGEREF _Toc243340719 \h </w:instrText>
+          <w:instrText xml:space="preserve"> PAGEREF _Toc243609752 \h </w:instrText>
         </w:r>
         <w:r>
           <w:rPr>
@@ -1377,10 +1479,16 @@
           <w:tab w:val="right" w:leader="dot" w:pos="9288"/>
         </w:tabs>
         <w:rPr>
+          <w:rFonts w:asciiTheme="minorHAnsi" w:hAnsiTheme="minorHAnsi"/>
           <w:noProof/>
+          <w:kern w:val="2"/>
+          <w:sz w:val="24"/>
+          <w:szCs w:val="24"/>
+          <w:lang w:val="en-IN" w:eastAsia="en-IN"/>
+          <w14:ligatures w14:val="standardContextual"/>
         </w:rPr>
       </w:pPr>
-      <w:hyperlink w:anchor="_Toc243340720" w:history="1">
+      <w:hyperlink w:anchor="_Toc243609753" w:history="1">
         <w:r>
           <w:rPr>
             <w:rStyle w:val="Hyperlink"/>
@@ -1407,7 +1515,7 @@
             <w:noProof/>
             <w:webHidden/>
           </w:rPr>
-          <w:instrText xml:space="preserve"> PAGEREF _Toc243340720 \h </w:instrText>
+          <w:instrText xml:space="preserve"> PAGEREF _Toc243609753 \h </w:instrText>
         </w:r>
         <w:r>
           <w:rPr>
@@ -1445,10 +1553,16 @@
           <w:tab w:val="right" w:leader="dot" w:pos="9288"/>
         </w:tabs>
         <w:rPr>
+          <w:rFonts w:asciiTheme="minorHAnsi" w:hAnsiTheme="minorHAnsi"/>
           <w:noProof/>
+          <w:kern w:val="2"/>
+          <w:sz w:val="24"/>
+          <w:szCs w:val="24"/>
+          <w:lang w:val="en-IN" w:eastAsia="en-IN"/>
+          <w14:ligatures w14:val="standardContextual"/>
         </w:rPr>
       </w:pPr>
-      <w:hyperlink w:anchor="_Toc243340721" w:history="1">
+      <w:hyperlink w:anchor="_Toc243609754" w:history="1">
         <w:r>
           <w:rPr>
             <w:rStyle w:val="Hyperlink"/>
@@ -1475,7 +1589,7 @@
             <w:noProof/>
             <w:webHidden/>
           </w:rPr>
-          <w:instrText xml:space="preserve"> PAGEREF _Toc243340721 \h </w:instrText>
+          <w:instrText xml:space="preserve"> PAGEREF _Toc243609754 \h </w:instrText>
         </w:r>
         <w:r>
           <w:rPr>
@@ -1513,10 +1627,16 @@
           <w:tab w:val="right" w:leader="dot" w:pos="9288"/>
         </w:tabs>
         <w:rPr>
+          <w:rFonts w:asciiTheme="minorHAnsi" w:hAnsiTheme="minorHAnsi"/>
           <w:noProof/>
+          <w:kern w:val="2"/>
+          <w:sz w:val="24"/>
+          <w:szCs w:val="24"/>
+          <w:lang w:val="en-IN" w:eastAsia="en-IN"/>
+          <w14:ligatures w14:val="standardContextual"/>
         </w:rPr>
       </w:pPr>
-      <w:hyperlink w:anchor="_Toc243340722" w:history="1">
+      <w:hyperlink w:anchor="_Toc243609755" w:history="1">
         <w:r>
           <w:rPr>
             <w:rStyle w:val="Hyperlink"/>
@@ -1543,7 +1663,7 @@
             <w:noProof/>
             <w:webHidden/>
           </w:rPr>
-          <w:instrText xml:space="preserve"> PAGEREF _Toc243340722 \h </w:instrText>
+          <w:instrText xml:space="preserve"> PAGEREF _Toc243609755 \h </w:instrText>
         </w:r>
         <w:r>
           <w:rPr>
@@ -1563,7 +1683,7 @@
             <w:noProof/>
             <w:webHidden/>
           </w:rPr>
-          <w:t>11</w:t>
+          <w:t>10</w:t>
         </w:r>
         <w:r>
           <w:rPr>
@@ -1581,16 +1701,22 @@
           <w:tab w:val="right" w:leader="dot" w:pos="9288"/>
         </w:tabs>
         <w:rPr>
+          <w:rFonts w:asciiTheme="minorHAnsi" w:hAnsiTheme="minorHAnsi"/>
           <w:noProof/>
+          <w:kern w:val="2"/>
+          <w:sz w:val="24"/>
+          <w:szCs w:val="24"/>
+          <w:lang w:val="en-IN" w:eastAsia="en-IN"/>
+          <w14:ligatures w14:val="standardContextual"/>
         </w:rPr>
       </w:pPr>
-      <w:hyperlink w:anchor="_Toc243340723" w:history="1">
+      <w:hyperlink w:anchor="_Toc243609756" w:history="1">
         <w:r>
           <w:rPr>
             <w:rStyle w:val="Hyperlink"/>
             <w:noProof/>
           </w:rPr>
-          <w:t>12. Streamlit interface</w:t>
+          <w:t>12. Web interface</w:t>
         </w:r>
         <w:r>
           <w:rPr>
@@ -1611,7 +1737,7 @@
             <w:noProof/>
             <w:webHidden/>
           </w:rPr>
-          <w:instrText xml:space="preserve"> PAGEREF _Toc243340723 \h </w:instrText>
+          <w:instrText xml:space="preserve"> PAGEREF _Toc243609756 \h </w:instrText>
         </w:r>
         <w:r>
           <w:rPr>
@@ -1649,10 +1775,16 @@
           <w:tab w:val="right" w:leader="dot" w:pos="9288"/>
         </w:tabs>
         <w:rPr>
+          <w:rFonts w:asciiTheme="minorHAnsi" w:hAnsiTheme="minorHAnsi"/>
           <w:noProof/>
+          <w:kern w:val="2"/>
+          <w:sz w:val="24"/>
+          <w:szCs w:val="24"/>
+          <w:lang w:val="en-IN" w:eastAsia="en-IN"/>
+          <w14:ligatures w14:val="standardContextual"/>
         </w:rPr>
       </w:pPr>
-      <w:hyperlink w:anchor="_Toc243340724" w:history="1">
+      <w:hyperlink w:anchor="_Toc243609757" w:history="1">
         <w:r>
           <w:rPr>
             <w:rStyle w:val="Hyperlink"/>
@@ -1679,7 +1811,7 @@
             <w:noProof/>
             <w:webHidden/>
           </w:rPr>
-          <w:instrText xml:space="preserve"> PAGEREF _Toc243340724 \h </w:instrText>
+          <w:instrText xml:space="preserve"> PAGEREF _Toc243609757 \h </w:instrText>
         </w:r>
         <w:r>
           <w:rPr>
@@ -1717,10 +1849,16 @@
           <w:tab w:val="right" w:leader="dot" w:pos="9288"/>
         </w:tabs>
         <w:rPr>
+          <w:rFonts w:asciiTheme="minorHAnsi" w:hAnsiTheme="minorHAnsi"/>
           <w:noProof/>
+          <w:kern w:val="2"/>
+          <w:sz w:val="24"/>
+          <w:szCs w:val="24"/>
+          <w:lang w:val="en-IN" w:eastAsia="en-IN"/>
+          <w14:ligatures w14:val="standardContextual"/>
         </w:rPr>
       </w:pPr>
-      <w:hyperlink w:anchor="_Toc243340725" w:history="1">
+      <w:hyperlink w:anchor="_Toc243609758" w:history="1">
         <w:r>
           <w:rPr>
             <w:rStyle w:val="Hyperlink"/>
@@ -1747,7 +1885,7 @@
             <w:noProof/>
             <w:webHidden/>
           </w:rPr>
-          <w:instrText xml:space="preserve"> PAGEREF _Toc243340725 \h </w:instrText>
+          <w:instrText xml:space="preserve"> PAGEREF _Toc243609758 \h </w:instrText>
         </w:r>
         <w:r>
           <w:rPr>
@@ -1767,7 +1905,7 @@
             <w:noProof/>
             <w:webHidden/>
           </w:rPr>
-          <w:t>12</w:t>
+          <w:t>11</w:t>
         </w:r>
         <w:r>
           <w:rPr>
@@ -1785,10 +1923,16 @@
           <w:tab w:val="right" w:leader="dot" w:pos="9288"/>
         </w:tabs>
         <w:rPr>
+          <w:rFonts w:asciiTheme="minorHAnsi" w:hAnsiTheme="minorHAnsi"/>
           <w:noProof/>
+          <w:kern w:val="2"/>
+          <w:sz w:val="24"/>
+          <w:szCs w:val="24"/>
+          <w:lang w:val="en-IN" w:eastAsia="en-IN"/>
+          <w14:ligatures w14:val="standardContextual"/>
         </w:rPr>
       </w:pPr>
-      <w:hyperlink w:anchor="_Toc243340726" w:history="1">
+      <w:hyperlink w:anchor="_Toc243609759" w:history="1">
         <w:r>
           <w:rPr>
             <w:rStyle w:val="Hyperlink"/>
@@ -1815,7 +1959,7 @@
             <w:noProof/>
             <w:webHidden/>
           </w:rPr>
-          <w:instrText xml:space="preserve"> PAGEREF _Toc243340726 \h </w:instrText>
+          <w:instrText xml:space="preserve"> PAGEREF _Toc243609759 \h </w:instrText>
         </w:r>
         <w:r>
           <w:rPr>
@@ -1835,7 +1979,7 @@
             <w:noProof/>
             <w:webHidden/>
           </w:rPr>
-          <w:t>16</w:t>
+          <w:t>15</w:t>
         </w:r>
         <w:r>
           <w:rPr>
@@ -1853,10 +1997,16 @@
           <w:tab w:val="right" w:leader="dot" w:pos="9288"/>
         </w:tabs>
         <w:rPr>
+          <w:rFonts w:asciiTheme="minorHAnsi" w:hAnsiTheme="minorHAnsi"/>
           <w:noProof/>
+          <w:kern w:val="2"/>
+          <w:sz w:val="24"/>
+          <w:szCs w:val="24"/>
+          <w:lang w:val="en-IN" w:eastAsia="en-IN"/>
+          <w14:ligatures w14:val="standardContextual"/>
         </w:rPr>
       </w:pPr>
-      <w:hyperlink w:anchor="_Toc243340727" w:history="1">
+      <w:hyperlink w:anchor="_Toc243609760" w:history="1">
         <w:r>
           <w:rPr>
             <w:rStyle w:val="Hyperlink"/>
@@ -1883,7 +2033,7 @@
             <w:noProof/>
             <w:webHidden/>
           </w:rPr>
-          <w:instrText xml:space="preserve"> PAGEREF _Toc243340727 \h </w:instrText>
+          <w:instrText xml:space="preserve"> PAGEREF _Toc243609760 \h </w:instrText>
         </w:r>
         <w:r>
           <w:rPr>
@@ -1903,7 +2053,7 @@
             <w:noProof/>
             <w:webHidden/>
           </w:rPr>
-          <w:t>17</w:t>
+          <w:t>16</w:t>
         </w:r>
         <w:r>
           <w:rPr>
@@ -1921,10 +2071,16 @@
           <w:tab w:val="right" w:leader="dot" w:pos="9288"/>
         </w:tabs>
         <w:rPr>
+          <w:rFonts w:asciiTheme="minorHAnsi" w:hAnsiTheme="minorHAnsi"/>
           <w:noProof/>
+          <w:kern w:val="2"/>
+          <w:sz w:val="24"/>
+          <w:szCs w:val="24"/>
+          <w:lang w:val="en-IN" w:eastAsia="en-IN"/>
+          <w14:ligatures w14:val="standardContextual"/>
         </w:rPr>
       </w:pPr>
-      <w:hyperlink w:anchor="_Toc243340728" w:history="1">
+      <w:hyperlink w:anchor="_Toc243609761" w:history="1">
         <w:r>
           <w:rPr>
             <w:rStyle w:val="Hyperlink"/>
@@ -1951,7 +2107,7 @@
             <w:noProof/>
             <w:webHidden/>
           </w:rPr>
-          <w:instrText xml:space="preserve"> PAGEREF _Toc243340728 \h </w:instrText>
+          <w:instrText xml:space="preserve"> PAGEREF _Toc243609761 \h </w:instrText>
         </w:r>
         <w:r>
           <w:rPr>
@@ -1971,7 +2127,7 @@
             <w:noProof/>
             <w:webHidden/>
           </w:rPr>
-          <w:t>17</w:t>
+          <w:t>16</w:t>
         </w:r>
         <w:r>
           <w:rPr>
@@ -1989,10 +2145,16 @@
           <w:tab w:val="right" w:leader="dot" w:pos="9288"/>
         </w:tabs>
         <w:rPr>
+          <w:rFonts w:asciiTheme="minorHAnsi" w:hAnsiTheme="minorHAnsi"/>
           <w:noProof/>
+          <w:kern w:val="2"/>
+          <w:sz w:val="24"/>
+          <w:szCs w:val="24"/>
+          <w:lang w:val="en-IN" w:eastAsia="en-IN"/>
+          <w14:ligatures w14:val="standardContextual"/>
         </w:rPr>
       </w:pPr>
-      <w:hyperlink w:anchor="_Toc243340729" w:history="1">
+      <w:hyperlink w:anchor="_Toc243609762" w:history="1">
         <w:r>
           <w:rPr>
             <w:rStyle w:val="Hyperlink"/>
@@ -2019,7 +2181,7 @@
             <w:noProof/>
             <w:webHidden/>
           </w:rPr>
-          <w:instrText xml:space="preserve"> PAGEREF _Toc243340729 \h </w:instrText>
+          <w:instrText xml:space="preserve"> PAGEREF _Toc243609762 \h </w:instrText>
         </w:r>
         <w:r>
           <w:rPr>
@@ -2039,7 +2201,7 @@
             <w:noProof/>
             <w:webHidden/>
           </w:rPr>
-          <w:t>18</w:t>
+          <w:t>17</w:t>
         </w:r>
         <w:r>
           <w:rPr>
@@ -2057,10 +2219,16 @@
           <w:tab w:val="right" w:leader="dot" w:pos="9288"/>
         </w:tabs>
         <w:rPr>
+          <w:rFonts w:asciiTheme="minorHAnsi" w:hAnsiTheme="minorHAnsi"/>
           <w:noProof/>
+          <w:kern w:val="2"/>
+          <w:sz w:val="24"/>
+          <w:szCs w:val="24"/>
+          <w:lang w:val="en-IN" w:eastAsia="en-IN"/>
+          <w14:ligatures w14:val="standardContextual"/>
         </w:rPr>
       </w:pPr>
-      <w:hyperlink w:anchor="_Toc243340730" w:history="1">
+      <w:hyperlink w:anchor="_Toc243609763" w:history="1">
         <w:r>
           <w:rPr>
             <w:rStyle w:val="Hyperlink"/>
@@ -2087,7 +2255,7 @@
             <w:noProof/>
             <w:webHidden/>
           </w:rPr>
-          <w:instrText xml:space="preserve"> PAGEREF _Toc243340730 \h </w:instrText>
+          <w:instrText xml:space="preserve"> PAGEREF _Toc243609763 \h </w:instrText>
         </w:r>
         <w:r>
           <w:rPr>
@@ -2107,7 +2275,7 @@
             <w:noProof/>
             <w:webHidden/>
           </w:rPr>
-          <w:t>18</w:t>
+          <w:t>17</w:t>
         </w:r>
         <w:r>
           <w:rPr>
@@ -2125,10 +2293,16 @@
           <w:tab w:val="right" w:leader="dot" w:pos="9288"/>
         </w:tabs>
         <w:rPr>
+          <w:rFonts w:asciiTheme="minorHAnsi" w:hAnsiTheme="minorHAnsi"/>
           <w:noProof/>
+          <w:kern w:val="2"/>
+          <w:sz w:val="24"/>
+          <w:szCs w:val="24"/>
+          <w:lang w:val="en-IN" w:eastAsia="en-IN"/>
+          <w14:ligatures w14:val="standardContextual"/>
         </w:rPr>
       </w:pPr>
-      <w:hyperlink w:anchor="_Toc243340731" w:history="1">
+      <w:hyperlink w:anchor="_Toc243609764" w:history="1">
         <w:r>
           <w:rPr>
             <w:rStyle w:val="Hyperlink"/>
@@ -2155,7 +2329,7 @@
             <w:noProof/>
             <w:webHidden/>
           </w:rPr>
-          <w:instrText xml:space="preserve"> PAGEREF _Toc243340731 \h </w:instrText>
+          <w:instrText xml:space="preserve"> PAGEREF _Toc243609764 \h </w:instrText>
         </w:r>
         <w:r>
           <w:rPr>
@@ -2175,7 +2349,7 @@
             <w:noProof/>
             <w:webHidden/>
           </w:rPr>
-          <w:t>18</w:t>
+          <w:t>17</w:t>
         </w:r>
         <w:r>
           <w:rPr>
@@ -2193,10 +2367,16 @@
           <w:tab w:val="right" w:leader="dot" w:pos="9288"/>
         </w:tabs>
         <w:rPr>
+          <w:rFonts w:asciiTheme="minorHAnsi" w:hAnsiTheme="minorHAnsi"/>
           <w:noProof/>
+          <w:kern w:val="2"/>
+          <w:sz w:val="24"/>
+          <w:szCs w:val="24"/>
+          <w:lang w:val="en-IN" w:eastAsia="en-IN"/>
+          <w14:ligatures w14:val="standardContextual"/>
         </w:rPr>
       </w:pPr>
-      <w:hyperlink w:anchor="_Toc243340732" w:history="1">
+      <w:hyperlink w:anchor="_Toc243609765" w:history="1">
         <w:r>
           <w:rPr>
             <w:rStyle w:val="Hyperlink"/>
@@ -2223,7 +2403,7 @@
             <w:noProof/>
             <w:webHidden/>
           </w:rPr>
-          <w:instrText xml:space="preserve"> PAGEREF _Toc243340732 \h </w:instrText>
+          <w:instrText xml:space="preserve"> PAGEREF _Toc243609765 \h </w:instrText>
         </w:r>
         <w:r>
           <w:rPr>
@@ -2243,7 +2423,7 @@
             <w:noProof/>
             <w:webHidden/>
           </w:rPr>
-          <w:t>19</w:t>
+          <w:t>18</w:t>
         </w:r>
         <w:r>
           <w:rPr>
@@ -2261,10 +2441,16 @@
           <w:tab w:val="right" w:leader="dot" w:pos="9288"/>
         </w:tabs>
         <w:rPr>
+          <w:rFonts w:asciiTheme="minorHAnsi" w:hAnsiTheme="minorHAnsi"/>
           <w:noProof/>
+          <w:kern w:val="2"/>
+          <w:sz w:val="24"/>
+          <w:szCs w:val="24"/>
+          <w:lang w:val="en-IN" w:eastAsia="en-IN"/>
+          <w14:ligatures w14:val="standardContextual"/>
         </w:rPr>
       </w:pPr>
-      <w:hyperlink w:anchor="_Toc243340733" w:history="1">
+      <w:hyperlink w:anchor="_Toc243609766" w:history="1">
         <w:r>
           <w:rPr>
             <w:rStyle w:val="Hyperlink"/>
@@ -2291,7 +2477,7 @@
             <w:noProof/>
             <w:webHidden/>
           </w:rPr>
-          <w:instrText xml:space="preserve"> PAGEREF _Toc243340733 \h </w:instrText>
+          <w:instrText xml:space="preserve"> PAGEREF _Toc243609766 \h </w:instrText>
         </w:r>
         <w:r>
           <w:rPr>
@@ -2311,7 +2497,7 @@
             <w:noProof/>
             <w:webHidden/>
           </w:rPr>
-          <w:t>19</w:t>
+          <w:t>18</w:t>
         </w:r>
         <w:r>
           <w:rPr>
@@ -2336,7 +2522,7 @@
       <w:pPr>
         <w:pStyle w:val="Heading1"/>
       </w:pPr>
-      <w:bookmarkStart w:id="1" w:name="_Toc243340704"/>
+      <w:bookmarkStart w:id="1" w:name="_Toc243609737"/>
       <w:r>
         <w:lastRenderedPageBreak/>
         <w:t>Abstract</w:t>
@@ -2345,25 +2531,19 @@
     </w:p>
     <w:p>
       <w:r>
-        <w:t xml:space="preserve">Every drilling rig sends a Daily Drilling Report (DDR) each morning, and most of it is free text typed by the crew. Hours that are paid for but do not move the well forward, called non-productive time (NPT), hide inside those sentences, so they are rarely totalled and lessons are lost between wells. This project builds a working proof of concept in which a team of LangGraph agents reads a DDR, plans the work, looks up reference data and past incidents, computes every number with deterministic Python tools, </w:t>
-      </w:r>
-      <w:r>
-        <w:t>checks its own output with a Critic that can send work back with specific feedback, and pauses for a drilling engineer to approve or reject an evidence-backed insight report. A local language model (qwen2.5:3b through Ollama) is used only to label log lines; a keyword classifier is the fallback and is always reported as such.</w:t>
-      </w:r>
-    </w:p>
-    <w:p>
-      <w:r>
-        <w:t>On 15 synthetic reports with a known answer key, the full graph had a mean NPT error of 0.47 h per report, got every planted NPT line's category right (100%), caught both deliberately planted log errors (2/2) and produced time logs that add to 24 h in 15/15 reports. A single-prompt chatbot using the same model had a mean error of 3.83 h, and its time log added to 24 h in only 1/15 reports. The remaining errors come from the model confidently labelling planned work as NPT; the engineer review step corrects t</w:t>
-      </w:r>
-      <w:r>
-        <w:t>hem. 48 automated tests cover the tools, the Critic, retries, human review, malformed input and the user interface.</w:t>
+        <w:t>Every drilling rig sends a Daily Drilling Report (DDR) each morning, and most of it is free text typed by the crew. Hours that are paid for but do not move the well forward, called non-productive time (NPT), hide inside those sentences, so they are rarely totalled and lessons are lost between wells. This project builds a working proof of concept in which a team of LangGraph agents reads a DDR, plans the work, looks up reference data and past incidents, computes every number with deterministic Python tools, checks its own output with a Critic that can send work back with specific feedback, and pauses for a drilling engineer to approve or reject an evidence-backed insight report. A local language model (qwen2.5:3b through Ollama) is used only to label log lines; a keyword classifier is the fallback and is always reported as such.</w:t>
+      </w:r>
+    </w:p>
+    <w:p>
+      <w:r>
+        <w:t>On 15 synthetic reports with a known answer key, the full graph had a mean NPT error of 0.47 h per report, got every planted NPT line's category right (100%), caught both deliberately planted log errors (2/2) and produced time logs that add to 24 h in 15/15 reports. A single-prompt chatbot using the same model had a mean error of 3.83 h, and its time log added to 24 h in only 1/15 reports. The remaining errors come from the model confidently labelling planned work as NPT; the engineer review step corrects them. 48 automated tests cover the tools, the Critic, retries, human review, malformed input and the user interface.</w:t>
       </w:r>
     </w:p>
     <w:p>
       <w:pPr>
         <w:pStyle w:val="Heading1"/>
       </w:pPr>
-      <w:bookmarkStart w:id="2" w:name="_Toc243340705"/>
+      <w:bookmarkStart w:id="2" w:name="_Toc243609738"/>
       <w:r>
         <w:t>1. Introduction and domain background</w:t>
       </w:r>
@@ -2373,7 +2553,7 @@
       <w:pPr>
         <w:pStyle w:val="Heading2"/>
       </w:pPr>
-      <w:bookmarkStart w:id="3" w:name="_Toc243340706"/>
+      <w:bookmarkStart w:id="3" w:name="_Toc243609739"/>
       <w:r>
         <w:t>1.1 Why oil and gas drilling</w:t>
       </w:r>
@@ -2381,17 +2561,14 @@
     </w:p>
     <w:p>
       <w:r>
-        <w:t>Drilling and completing wells takes 40 to 50 percent of an offshore operator's capital spend (Source 9), and a drillship cost close to $400,000 a day in late 2025 (Source 10), roughly $16,000 for every hour the well does not progress. Operators that tracked lost time closely cut NPT from about 16 percent to 9 percent within a year (Source 9). The industry has also started buying agentic AI: in 2025 ADNOC awarded AIQ a $340 million contract to deploy agentic systems across more than 28 fields (Source 11), wh</w:t>
-      </w:r>
-      <w:r>
-        <w:t>ile the SPE ATCE 2026 programme openly asks how far agents can be trusted with operational decisions (Source 4). That combination, real money and an open question of trust, makes the domain a good fit for an agentic proof of concept with a human in the loop.</w:t>
+        <w:t>Drilling and completing wells takes 40 to 50 percent of an offshore operator's capital spend (Source 9), and a drillship cost close to $400,000 a day in late 2025 (Source 10), roughly $16,000 for every hour the well does not progress. Operators that tracked lost time closely cut NPT from about 16 percent to 9 percent within a year (Source 9). The industry has also started buying agentic AI: in 2025 ADNOC awarded AIQ a $340 million contract to deploy agentic systems across more than 28 fields (Source 11), while the SPE ATCE 2026 programme openly asks how far agents can be trusted with operational decisions (Source 4). That combination, real money and an open question of trust, makes the domain a good fit for an agentic proof of concept with a human in the loop.</w:t>
       </w:r>
     </w:p>
     <w:p>
       <w:pPr>
         <w:pStyle w:val="Heading2"/>
       </w:pPr>
-      <w:bookmarkStart w:id="4" w:name="_Toc243340707"/>
+      <w:bookmarkStart w:id="4" w:name="_Toc243609740"/>
       <w:r>
         <w:t>1.2 The Daily Drilling Report</w:t>
       </w:r>
@@ -2450,7 +2627,7 @@
       <w:pPr>
         <w:pStyle w:val="Heading2"/>
       </w:pPr>
-      <w:bookmarkStart w:id="5" w:name="_Toc243340708"/>
+      <w:bookmarkStart w:id="5" w:name="_Toc243609741"/>
       <w:r>
         <w:t>1.3 Non-productive time</w:t>
       </w:r>
@@ -2469,7 +2646,7 @@
       <w:pPr>
         <w:pStyle w:val="Heading1"/>
       </w:pPr>
-      <w:bookmarkStart w:id="6" w:name="_Toc243340709"/>
+      <w:bookmarkStart w:id="6" w:name="_Toc243609742"/>
       <w:r>
         <w:t>2. Problem statement</w:t>
       </w:r>
@@ -2492,7 +2669,7 @@
       <w:pPr>
         <w:pStyle w:val="Heading1"/>
       </w:pPr>
-      <w:bookmarkStart w:id="7" w:name="_Toc243340710"/>
+      <w:bookmarkStart w:id="7" w:name="_Toc243609743"/>
       <w:r>
         <w:t>3. Existing process and identified inefficiencies</w:t>
       </w:r>
@@ -2592,7 +2769,7 @@
       <w:pPr>
         <w:pStyle w:val="Heading1"/>
       </w:pPr>
-      <w:bookmarkStart w:id="8" w:name="_Toc243340711"/>
+      <w:bookmarkStart w:id="8" w:name="_Toc243609744"/>
       <w:r>
         <w:t>4. Proposed solution and objectives</w:t>
       </w:r>
@@ -2687,7 +2864,7 @@
       <w:pPr>
         <w:pStyle w:val="Heading1"/>
       </w:pPr>
-      <w:bookmarkStart w:id="9" w:name="_Toc243340712"/>
+      <w:bookmarkStart w:id="9" w:name="_Toc243609745"/>
       <w:r>
         <w:lastRenderedPageBreak/>
         <w:t>5. Requirements and technology stack</w:t>
@@ -2698,7 +2875,7 @@
       <w:pPr>
         <w:pStyle w:val="Heading2"/>
       </w:pPr>
-      <w:bookmarkStart w:id="10" w:name="_Toc243340713"/>
+      <w:bookmarkStart w:id="10" w:name="_Toc243609746"/>
       <w:r>
         <w:t>5.1 Functional requirements</w:t>
       </w:r>
@@ -2832,7 +3009,7 @@
               <w:rPr>
                 <w:sz w:val="19"/>
               </w:rPr>
-              <w:t>ingest_report, app custom report</w:t>
+              <w:t>ingest_report, custom report in the web app</w:t>
             </w:r>
           </w:p>
         </w:tc>
@@ -3415,7 +3592,7 @@
               <w:rPr>
                 <w:sz w:val="19"/>
               </w:rPr>
-              <w:t>app.py</w:t>
+              <w:t>web app: api.py + web/</w:t>
             </w:r>
           </w:p>
         </w:tc>
@@ -3536,7 +3713,7 @@
       <w:pPr>
         <w:pStyle w:val="Heading2"/>
       </w:pPr>
-      <w:bookmarkStart w:id="11" w:name="_Toc243340714"/>
+      <w:bookmarkStart w:id="11" w:name="_Toc243609747"/>
       <w:r>
         <w:t>5.2 Technology stack</w:t>
       </w:r>
@@ -3972,7 +4149,7 @@
               <w:rPr>
                 <w:sz w:val="19"/>
               </w:rPr>
-              <w:t>Streamlit 1.55+, Altair charts</w:t>
+              <w:t>FastAPI + plain HTML, CSS and JavaScript</w:t>
             </w:r>
           </w:p>
         </w:tc>
@@ -3988,7 +4165,7 @@
               <w:rPr>
                 <w:sz w:val="19"/>
               </w:rPr>
-              <w:t>Course requirement</w:t>
+              <w:t>Simple to run and explain; no build step</w:t>
             </w:r>
           </w:p>
         </w:tc>
@@ -4025,7 +4202,7 @@
               <w:rPr>
                 <w:sz w:val="19"/>
               </w:rPr>
-              <w:t>pytest (48 tests), Streamlit AppTest</w:t>
+              <w:t>pytest (57 tests), FastAPI TestClient</w:t>
             </w:r>
           </w:p>
         </w:tc>
@@ -4061,7 +4238,7 @@
       <w:pPr>
         <w:pStyle w:val="Heading1"/>
       </w:pPr>
-      <w:bookmarkStart w:id="12" w:name="_Toc243340715"/>
+      <w:bookmarkStart w:id="12" w:name="_Toc243609748"/>
       <w:r>
         <w:t>6. System architecture and data flow</w:t>
       </w:r>
@@ -4069,11 +4246,7 @@
     </w:p>
     <w:p>
       <w:r>
-        <w:t xml:space="preserve">The design is hub and spoke (Figure 1). The Orchestrator sits in the middle, reads the shared state and decides which agent works next. Every agent hands back to the Orchestrator; agents never call each </w:t>
-      </w:r>
-      <w:r>
-        <w:lastRenderedPageBreak/>
-        <w:t>other. Reference data, incident memory and the checkpointer live outside the graph. The Streamlit UI starts a run, streams every node's update and resumes the graph when the engineer decides.</w:t>
+        <w:t>The design is hub and spoke (Figure 1). The Orchestrator sits in the middle, reads the shared state and decides which agent works next. Every agent hands back to the Orchestrator; agents never call each other. Reference data, incident memory and the checkpointer live outside the graph. The web app starts a run, streams every node's update and resumes the graph when the engineer decides.</w:t>
       </w:r>
     </w:p>
     <w:p>
@@ -4087,7 +4260,8 @@
         <w:spacing w:after="60"/>
       </w:pPr>
       <w:r>
-        <w:t>Streamlit calls app.stream(initial_state, thread_id). ingest_report reads the file and parses the header.</w:t>
+        <w:lastRenderedPageBreak/>
+        <w:t>The web app calls app.stream(initial_state, thread_id). ingest_report reads the file and parses the header.</w:t>
       </w:r>
     </w:p>
     <w:p>
@@ -4172,7 +4346,7 @@
         <w:lastRenderedPageBreak/>
         <w:drawing>
           <wp:inline distT="0" distB="0" distL="0" distR="0" wp14:anchorId="369EE0E0" wp14:editId="0825B590">
-            <wp:extent cx="9540000" cy="5101250"/>
+            <wp:extent cx="9540000" cy="5100918"/>
             <wp:effectExtent l="0" t="0" r="0" b="0"/>
             <wp:docPr id="1" name="Picture 1"/>
             <wp:cNvGraphicFramePr>
@@ -4194,7 +4368,7 @@
                   <pic:spPr>
                     <a:xfrm>
                       <a:off x="0" y="0"/>
-                      <a:ext cx="9540000" cy="5101250"/>
+                      <a:ext cx="9540000" cy="5100918"/>
                     </a:xfrm>
                     <a:prstGeom prst="rect">
                       <a:avLst/>
@@ -4221,7 +4395,7 @@
         <w:rPr>
           <w:i/>
         </w:rPr>
-        <w:t>The diagram is the team's original design. The final code follows it, with these differences: the Planner is rule based rather than LLM based; recursion_limit is 50, not 25 (the worst case needs 32 steps); the local model is qwen2.5:3b, because llama3.1:8b does not fit in 4 GB of GPU memory; classification runs as one classify_activities tool over all lines; the chart is an Altair timeline plus NPT by category; and the Critic also checks gaps, overlaps, unparseable lines and the header (Section 11).</w:t>
+        <w:t>The diagram is the team's design, updated to match the final code (rule-based Planner, qwen2.5:3b, recursion_limit 50, a web app as the front end). Two details are simplified in the drawing: classification runs as one classify_activities tool over all lines, and the Critic also checks gaps, overlaps, unparseable lines and the header (Section 11).</w:t>
       </w:r>
     </w:p>
     <w:p>
@@ -4238,7 +4412,7 @@
       <w:pPr>
         <w:pStyle w:val="Heading1"/>
       </w:pPr>
-      <w:bookmarkStart w:id="13" w:name="_Toc243340716"/>
+      <w:bookmarkStart w:id="13" w:name="_Toc243609749"/>
       <w:r>
         <w:lastRenderedPageBreak/>
         <w:t>7. Agent roles and orchestration</w:t>
@@ -4938,7 +5112,7 @@
       <w:pPr>
         <w:pStyle w:val="Heading1"/>
       </w:pPr>
-      <w:bookmarkStart w:id="14" w:name="_Toc243340717"/>
+      <w:bookmarkStart w:id="14" w:name="_Toc243609750"/>
       <w:r>
         <w:t>8. Data model, synthetic dataset and reference files</w:t>
       </w:r>
@@ -4948,7 +5122,7 @@
       <w:pPr>
         <w:pStyle w:val="Heading2"/>
       </w:pPr>
-      <w:bookmarkStart w:id="15" w:name="_Toc243340718"/>
+      <w:bookmarkStart w:id="15" w:name="_Toc243609751"/>
       <w:r>
         <w:t>8.1 Shared state (DDRState)</w:t>
       </w:r>
@@ -5421,14 +5595,7 @@
               <w:rPr>
                 <w:sz w:val="19"/>
               </w:rPr>
-              <w:t xml:space="preserve">critic_verdict, critic_feedback, </w:t>
-            </w:r>
-            <w:r>
-              <w:rPr>
-                <w:sz w:val="19"/>
-              </w:rPr>
-              <w:lastRenderedPageBreak/>
-              <w:t>critic_warnings, critic_retryable</w:t>
+              <w:t>critic_verdict, critic_feedback, critic_warnings, critic_retryable</w:t>
             </w:r>
           </w:p>
         </w:tc>
@@ -5444,7 +5611,6 @@
               <w:rPr>
                 <w:sz w:val="19"/>
               </w:rPr>
-              <w:lastRenderedPageBreak/>
               <w:t>str, list, bool</w:t>
             </w:r>
           </w:p>
@@ -5588,6 +5754,7 @@
               <w:rPr>
                 <w:sz w:val="19"/>
               </w:rPr>
+              <w:lastRenderedPageBreak/>
               <w:t>overrides, engineer_decision, engineer_comment</w:t>
             </w:r>
           </w:p>
@@ -5688,7 +5855,7 @@
       <w:pPr>
         <w:pStyle w:val="Heading2"/>
       </w:pPr>
-      <w:bookmarkStart w:id="16" w:name="_Toc243340719"/>
+      <w:bookmarkStart w:id="16" w:name="_Toc243609752"/>
       <w:r>
         <w:t>8.2 Synthetic dataset</w:t>
       </w:r>
@@ -6171,7 +6338,7 @@
       <w:pPr>
         <w:pStyle w:val="Heading1"/>
       </w:pPr>
-      <w:bookmarkStart w:id="17" w:name="_Toc243340720"/>
+      <w:bookmarkStart w:id="17" w:name="_Toc243609753"/>
       <w:r>
         <w:t>9. Implementation details</w:t>
       </w:r>
@@ -6365,7 +6532,6 @@
               <w:rPr>
                 <w:sz w:val="19"/>
               </w:rPr>
-              <w:lastRenderedPageBreak/>
               <w:t>memory.py</w:t>
             </w:r>
           </w:p>
@@ -6403,7 +6569,7 @@
               <w:rPr>
                 <w:sz w:val="19"/>
               </w:rPr>
-              <w:t>app.py</w:t>
+              <w:t>api.py, web/</w:t>
             </w:r>
           </w:p>
         </w:tc>
@@ -6419,7 +6585,7 @@
               <w:rPr>
                 <w:sz w:val="19"/>
               </w:rPr>
-              <w:t>Streamlit UI</w:t>
+              <w:t>Web app: FastAPI server (API + pages) and the front end</w:t>
             </w:r>
           </w:p>
         </w:tc>
@@ -6530,7 +6696,7 @@
               <w:rPr>
                 <w:sz w:val="19"/>
               </w:rPr>
-              <w:t>48 pytest tests</w:t>
+              <w:t>57 pytest tests</w:t>
             </w:r>
           </w:p>
         </w:tc>
@@ -6543,6 +6709,7 @@
     </w:p>
     <w:p>
       <w:r>
+        <w:lastRenderedPageBreak/>
         <w:t>The Executor shows how tool use works with LangGraph. On its first visit it writes an AIMessage with a parse_time_log tool call; tools_condition sends it to the ToolNode, which returns a ToolMessage. On the second visit it issues five tool calls at once (classify_activities, sum_hours, calc_rop, depth_vs_plan, cost_vs_budget). On the third visit it reads the results, totals NPT by category in Python and writes a plain message, so tools_condition hands control back to the Orchestrator.</w:t>
       </w:r>
     </w:p>
@@ -6555,7 +6722,7 @@
       <w:pPr>
         <w:pStyle w:val="Heading1"/>
       </w:pPr>
-      <w:bookmarkStart w:id="18" w:name="_Toc243340721"/>
+      <w:bookmarkStart w:id="18" w:name="_Toc243609754"/>
       <w:r>
         <w:t>10. Deterministic tools and model usage</w:t>
       </w:r>
@@ -6924,16 +7091,15 @@
     </w:p>
     <w:p>
       <w:r>
-        <w:t>The model never does arithmetic. When Ollama is not running, the app uses the mock and says so in the sidebar, in every activity ('labelled_by') and in the report ('Lines labelled by: mock').</w:t>
+        <w:t>The model never does arithmetic. When Ollama is not running, the app uses the mock and says so in the top bar, in every activity ('labelled_by') and in the report ('Lines labelled by: mock').</w:t>
       </w:r>
     </w:p>
     <w:p>
       <w:pPr>
         <w:pStyle w:val="Heading1"/>
       </w:pPr>
-      <w:bookmarkStart w:id="19" w:name="_Toc243340722"/>
-      <w:r>
-        <w:lastRenderedPageBreak/>
+      <w:bookmarkStart w:id="19" w:name="_Toc243609755"/>
+      <w:r>
         <w:t>11. Critic validation, retries and human-in-the-loop review</w:t>
       </w:r>
       <w:bookmarkEnd w:id="19"/>
@@ -7200,6 +7366,7 @@
               <w:rPr>
                 <w:sz w:val="19"/>
               </w:rPr>
+              <w:lastRenderedPageBreak/>
               <w:t>No overlaps</w:t>
             </w:r>
           </w:p>
@@ -7426,22 +7593,22 @@
       <w:pPr>
         <w:pStyle w:val="Heading1"/>
       </w:pPr>
-      <w:bookmarkStart w:id="20" w:name="_Toc243340723"/>
-      <w:r>
-        <w:t>12. Streamlit interface</w:t>
+      <w:bookmarkStart w:id="20" w:name="_Toc243609756"/>
+      <w:r>
+        <w:t>12. Web interface</w:t>
       </w:r>
       <w:bookmarkEnd w:id="20"/>
     </w:p>
     <w:p>
       <w:r>
-        <w:t>The interface is a single Streamlit page with four tabs: Analyse report, Evaluation, Memory and Architecture.</w:t>
+        <w:t>The interface is a web app. A small FastAPI server (api.py) runs the graph and streams every agent step to one page written in plain HTML, CSS and JavaScript (no build step). It has four pages: Analyse, Evaluation, Memory and Architecture, with a light and a dark theme.</w:t>
       </w:r>
     </w:p>
     <w:p>
       <w:pPr>
         <w:pStyle w:val="Heading2"/>
       </w:pPr>
-      <w:bookmarkStart w:id="21" w:name="_Toc243340724"/>
+      <w:bookmarkStart w:id="21" w:name="_Toc243609757"/>
       <w:r>
         <w:t>12.1 Deployment</w:t>
       </w:r>
@@ -7449,7 +7616,7 @@
     </w:p>
     <w:p>
       <w:r>
-        <w:t>The application is also deployed on Streamlit Community Cloud at https://rig-sight.streamlit.app/, built from the main branch of the GitHub repository with app.py as the entry point; a push to main redeploys it. It was checked on 19 October 2026: W-02 Day 14 gave 8.0 h NPT, the Critic failed the 23.5 h first pass and the retry recovered the missing half hour.</w:t>
+        <w:t>The application is deployed on Render at https://rig-sight.onrender.com/, built from the main branch of the GitHub repository and started with uvicorn api:app; a push to main redeploys it. On the hosted mock model, W-02 Day 14 gives 8.0 h NPT: the Critic fails the 23.5 h first pass and the retry recovers the missing half hour.</w:t>
       </w:r>
     </w:p>
     <w:p>
@@ -7464,7 +7631,7 @@
         <w:t xml:space="preserve">Model: </w:t>
       </w:r>
       <w:r>
-        <w:t>the cloud has no Ollama, so the hosted app runs on the mock keyword classifier. The sidebar and every report say so, and choosing Ollama shows a warning and falls back to the mock.</w:t>
+        <w:t>the host has no Ollama, so the hosted app runs on the mock keyword classifier. The top bar and every report say so.</w:t>
       </w:r>
     </w:p>
     <w:p>
@@ -7479,7 +7646,7 @@
         <w:t xml:space="preserve">Results: </w:t>
       </w:r>
       <w:r>
-        <w:t>the Evaluation tab shows the committed qwen2.5:3b and mock results; re-running the evaluation there scores the mock only.</w:t>
+        <w:t>the Evaluation page shows the committed qwen2.5:3b and mock results.</w:t>
       </w:r>
     </w:p>
     <w:p>
@@ -7516,9 +7683,8 @@
       <w:pPr>
         <w:pStyle w:val="Heading2"/>
       </w:pPr>
-      <w:bookmarkStart w:id="22" w:name="_Toc243340725"/>
-      <w:r>
-        <w:lastRenderedPageBreak/>
+      <w:bookmarkStart w:id="22" w:name="_Toc243609758"/>
+      <w:r>
         <w:t>12.2 Screens</w:t>
       </w:r>
       <w:bookmarkEnd w:id="22"/>
@@ -7537,9 +7703,10 @@
         <w:rPr>
           <w:noProof/>
         </w:rPr>
+        <w:lastRenderedPageBreak/>
         <w:drawing>
           <wp:inline distT="0" distB="0" distL="0" distR="0" wp14:anchorId="29B31407" wp14:editId="56142BA8">
-            <wp:extent cx="5903999" cy="3019750"/>
+            <wp:extent cx="5903999" cy="2893294"/>
             <wp:effectExtent l="0" t="0" r="0" b="0"/>
             <wp:docPr id="2" name="Picture 2"/>
             <wp:cNvGraphicFramePr>
@@ -7561,7 +7728,7 @@
                   <pic:spPr>
                     <a:xfrm>
                       <a:off x="0" y="0"/>
-                      <a:ext cx="5903999" cy="3019750"/>
+                      <a:ext cx="5903999" cy="2893294"/>
                     </a:xfrm>
                     <a:prstGeom prst="rect">
                       <a:avLst/>
@@ -7580,7 +7747,7 @@
         <w:jc w:val="center"/>
       </w:pPr>
       <w:r>
-        <w:t>Figure 2. W-02 Day 14 after a run: KPI tiles, the time log with NPT lines labelled (category · hours · confidence) and the line recovered from REMARKS, and the live agent trace including the Critic's FAIL and the retry</w:t>
+        <w:t>Figure 2. W-02 Day 14 after the first run: KPI tiles, the time log with NPT lines labelled (category · hours · confidence) and the line recovered from REMARKS, and the agent pipeline including the retry</w:t>
       </w:r>
     </w:p>
     <w:p>
@@ -7594,7 +7761,7 @@
         </w:rPr>
         <w:drawing>
           <wp:inline distT="0" distB="0" distL="0" distR="0" wp14:anchorId="5EDBA113" wp14:editId="2ABF35F6">
-            <wp:extent cx="5903999" cy="2032524"/>
+            <wp:extent cx="5903999" cy="930693"/>
             <wp:effectExtent l="0" t="0" r="0" b="0"/>
             <wp:docPr id="3" name="Picture 3"/>
             <wp:cNvGraphicFramePr>
@@ -7616,7 +7783,7 @@
                   <pic:spPr>
                     <a:xfrm>
                       <a:off x="0" y="0"/>
-                      <a:ext cx="5903999" cy="2032524"/>
+                      <a:ext cx="5903999" cy="930693"/>
                     </a:xfrm>
                     <a:prstGeom prst="rect">
                       <a:avLst/>
@@ -7635,7 +7802,7 @@
         <w:jc w:val="center"/>
       </w:pPr>
       <w:r>
-        <w:t>Figure 3. Where the 24 hours went: timeline and NPT by category, the Planner's tasks, the Critic's two checks and similar past incidents from memory</w:t>
+        <w:t>Figure 3. Where the 24 hours went (timeline and NPT by category) and the Critic's checks: FAIL on the 23.5 h first pass, PASS after the retry</w:t>
       </w:r>
     </w:p>
     <w:p>
@@ -7647,10 +7814,9 @@
         <w:rPr>
           <w:noProof/>
         </w:rPr>
-        <w:lastRenderedPageBreak/>
         <w:drawing>
           <wp:inline distT="0" distB="0" distL="0" distR="0" wp14:anchorId="0485F2F7" wp14:editId="21C6A3FB">
-            <wp:extent cx="5903999" cy="4413481"/>
+            <wp:extent cx="5903999" cy="2550043"/>
             <wp:effectExtent l="0" t="0" r="0" b="0"/>
             <wp:docPr id="4" name="Picture 4"/>
             <wp:cNvGraphicFramePr>
@@ -7672,7 +7838,7 @@
                   <pic:spPr>
                     <a:xfrm>
                       <a:off x="0" y="0"/>
-                      <a:ext cx="5903999" cy="4413481"/>
+                      <a:ext cx="5903999" cy="2550043"/>
                     </a:xfrm>
                     <a:prstGeom prst="rect">
                       <a:avLst/>
@@ -7691,7 +7857,7 @@
         <w:jc w:val="center"/>
       </w:pPr>
       <w:r>
-        <w:t>Figure 4. First draft of the Daily Insight Report and the engineer review panel. The model has labelled line 7 (slip and cut) as NPT</w:t>
+        <w:t>Figure 4. First draft of the Daily Insight Report, the engineer review panel and the check against the answer key. The model has labelled line 7 (slip and cut) as NPT</w:t>
       </w:r>
     </w:p>
     <w:p>
@@ -7706,7 +7872,7 @@
         <w:lastRenderedPageBreak/>
         <w:drawing>
           <wp:inline distT="0" distB="0" distL="0" distR="0" wp14:anchorId="5C8D9B24" wp14:editId="3F858E71">
-            <wp:extent cx="5903999" cy="4274753"/>
+            <wp:extent cx="5903999" cy="2460719"/>
             <wp:effectExtent l="0" t="0" r="0" b="0"/>
             <wp:docPr id="5" name="Picture 5"/>
             <wp:cNvGraphicFramePr>
@@ -7728,7 +7894,7 @@
                   <pic:spPr>
                     <a:xfrm>
                       <a:off x="0" y="0"/>
-                      <a:ext cx="5903999" cy="4274753"/>
+                      <a:ext cx="5903999" cy="2460719"/>
                     </a:xfrm>
                     <a:prstGeom prst="rect">
                       <a:avLst/>
@@ -7747,7 +7913,7 @@
         <w:jc w:val="center"/>
       </w:pPr>
       <w:r>
-        <w:t>Figure 5. After the engineer rejected with 'line 7 is planned, not NPT' and then approved: 8.0 h NPT, matching the answer key</w:t>
+        <w:t>Figure 5. After the engineer rejected with 'line 7 is planned, not NPT' and then approved: 8.0 h NPT, matching the answer key on every row</w:t>
       </w:r>
     </w:p>
     <w:p>
@@ -7761,7 +7927,7 @@
         </w:rPr>
         <w:drawing>
           <wp:inline distT="0" distB="0" distL="0" distR="0" wp14:anchorId="01B66124" wp14:editId="4CB95E9F">
-            <wp:extent cx="5903999" cy="2387409"/>
+            <wp:extent cx="5903999" cy="3688198"/>
             <wp:effectExtent l="0" t="0" r="0" b="0"/>
             <wp:docPr id="6" name="Picture 6"/>
             <wp:cNvGraphicFramePr>
@@ -7783,7 +7949,7 @@
                   <pic:spPr>
                     <a:xfrm>
                       <a:off x="0" y="0"/>
-                      <a:ext cx="5903999" cy="2387409"/>
+                      <a:ext cx="5903999" cy="3688198"/>
                     </a:xfrm>
                     <a:prstGeom prst="rect">
                       <a:avLst/>
@@ -7817,7 +7983,7 @@
         <w:lastRenderedPageBreak/>
         <w:drawing>
           <wp:inline distT="0" distB="0" distL="0" distR="0" wp14:anchorId="7E6FCA9C" wp14:editId="21BCB324">
-            <wp:extent cx="5903999" cy="5042596"/>
+            <wp:extent cx="5903999" cy="4151249"/>
             <wp:effectExtent l="0" t="0" r="0" b="0"/>
             <wp:docPr id="7" name="Picture 7"/>
             <wp:cNvGraphicFramePr>
@@ -7839,7 +8005,7 @@
                   <pic:spPr>
                     <a:xfrm>
                       <a:off x="0" y="0"/>
-                      <a:ext cx="5903999" cy="5042596"/>
+                      <a:ext cx="5903999" cy="4151249"/>
                     </a:xfrm>
                     <a:prstGeom prst="rect">
                       <a:avLst/>
@@ -7858,7 +8024,7 @@
         <w:jc w:val="center"/>
       </w:pPr>
       <w:r>
-        <w:t>Figure 7. Evaluation tab with the saved results for the local model and the mock</w:t>
+        <w:t>Figure 7. Evaluation page with the saved results for the local model and the mock</w:t>
       </w:r>
     </w:p>
     <w:p>
@@ -7873,7 +8039,7 @@
         <w:lastRenderedPageBreak/>
         <w:drawing>
           <wp:inline distT="0" distB="0" distL="0" distR="0" wp14:anchorId="5F313847" wp14:editId="7E48F194">
-            <wp:extent cx="5400000" cy="4777377"/>
+            <wp:extent cx="5400000" cy="4310795"/>
             <wp:effectExtent l="0" t="0" r="0" b="0"/>
             <wp:docPr id="8" name="Picture 8"/>
             <wp:cNvGraphicFramePr>
@@ -7895,7 +8061,7 @@
                   <pic:spPr>
                     <a:xfrm>
                       <a:off x="0" y="0"/>
-                      <a:ext cx="5400000" cy="4777377"/>
+                      <a:ext cx="5400000" cy="4310795"/>
                     </a:xfrm>
                     <a:prstGeom prst="rect">
                       <a:avLst/>
@@ -7914,14 +8080,14 @@
         <w:jc w:val="center"/>
       </w:pPr>
       <w:r>
-        <w:t>Figure 8. Memory tab: seed incidents, failed cases written by the Critic and the engineer's decisions from the runs above</w:t>
+        <w:t>Figure 8. Memory page: seed incidents, failed cases written by the Critic and the engineer's decisions from the runs above</w:t>
       </w:r>
     </w:p>
     <w:p>
       <w:pPr>
         <w:pStyle w:val="Heading1"/>
       </w:pPr>
-      <w:bookmarkStart w:id="23" w:name="_Toc243340726"/>
+      <w:bookmarkStart w:id="23" w:name="_Toc243609759"/>
       <w:r>
         <w:t>13. Testing methodology and test cases</w:t>
       </w:r>
@@ -7929,7 +8095,7 @@
     </w:p>
     <w:p>
       <w:r>
-        <w:t>Automated tests are in tests/ and run with python -m pytest. All 48 pass. They use the mock classifier and a temporary memory database, so they are deterministic and do not touch the committed data or a running model.</w:t>
+        <w:t>Automated tests are in tests/ and run with python -m pytest. All 57 pass. They use the mock classifier and a temporary memory database, so they are deterministic and do not touch the committed data or a running model.</w:t>
       </w:r>
     </w:p>
     <w:p>
@@ -8062,13 +8228,7 @@
               <w:rPr>
                 <w:sz w:val="19"/>
               </w:rPr>
-              <w:t>All 15 reports: 24 h, Critic PASS, depth and ROP equal to the answer key, every NPT claim on its own line, NPT total equals the NPT lines. Mock exact on 14/15 (the WOC trap flagged as low confidence). Clean day. Critic catches the hidden line and the overlap and the retry fixes them, with the correction disclosed. Failed cases stored. No-Critic ablation. Approve ends the graph. Reject with an override re-runs and corrects. Invalid timestamp, missing header, empty log and unknown well handled. Worst case sto</w:t>
-            </w:r>
-            <w:r>
-              <w:rPr>
-                <w:sz w:val="19"/>
-              </w:rPr>
-              <w:t>ps after 3 retries and still reaches the engineer. Mock reported as mock. LLM summary with an invented number rejected; one with only computed numbers kept. Ollama unavailable falls back to the mock</w:t>
+              <w:t>All 15 reports: 24 h, Critic PASS, depth and ROP equal to the answer key, every NPT claim on its own line, NPT total equals the NPT lines. Mock exact on 14/15 (the WOC trap flagged as low confidence). Clean day. Critic catches the hidden line and the overlap and the retry fixes them, with the correction disclosed. Failed cases stored. No-Critic ablation. Approve ends the graph. Reject with an override re-runs and corrects. Invalid timestamp, missing header, empty log and unknown well handled. Worst case stops after 3 retries and still reaches the engineer. Mock reported as mock. LLM summary with an invented number rejected; one with only computed numbers kept. Ollama unavailable falls back to the mock</w:t>
             </w:r>
           </w:p>
         </w:tc>
@@ -8126,8 +8286,7 @@
               <w:rPr>
                 <w:sz w:val="19"/>
               </w:rPr>
-              <w:lastRenderedPageBreak/>
-              <w:t>test_app.py</w:t>
+              <w:t>test_api.py</w:t>
             </w:r>
           </w:p>
         </w:tc>
@@ -8143,7 +8302,7 @@
               <w:rPr>
                 <w:sz w:val="19"/>
               </w:rPr>
-              <w:t>Streamlit app loads, runs W-02 D14 to the engineer pause and approves; custom report shows the unresolved source error; other tabs render</w:t>
+              <w:t>Web API: a run streams each agent step and pauses for review; approve, reject with an override, custom report, bad input, per-page titles and descriptions, 404, robots.txt and sitemap, security headers, input limits, rate limit</w:t>
             </w:r>
           </w:p>
         </w:tc>
@@ -8156,6 +8315,7 @@
     </w:p>
     <w:p>
       <w:r>
+        <w:lastRenderedPageBreak/>
         <w:t>Evaluation (evaluate.py) runs the same 15 reports through three configurations with the same model: the full graph, the graph without the Critic (route goes straight from the Executor to the report writer), and a single-prompt chatbot that is asked for NPT hours by category, the total hours and the line numbers it used. The chatbot prompt contains no example numbers, so it is not nudged towards an answer.</w:t>
       </w:r>
     </w:p>
@@ -8163,7 +8323,7 @@
       <w:pPr>
         <w:pStyle w:val="Heading1"/>
       </w:pPr>
-      <w:bookmarkStart w:id="24" w:name="_Toc243340727"/>
+      <w:bookmarkStart w:id="24" w:name="_Toc243609760"/>
       <w:r>
         <w:t>14. Evaluation results</w:t>
       </w:r>
@@ -9229,7 +9389,7 @@
       <w:pPr>
         <w:pStyle w:val="Heading2"/>
       </w:pPr>
-      <w:bookmarkStart w:id="25" w:name="_Toc243340728"/>
+      <w:bookmarkStart w:id="25" w:name="_Toc243609761"/>
       <w:r>
         <w:t>Interpretation</w:t>
       </w:r>
@@ -9292,11 +9452,7 @@
         <w:t xml:space="preserve">The two remaining errors are confident mislabels of planned work: </w:t>
       </w:r>
       <w:r>
-        <w:t xml:space="preserve">'slipped and cut drill line, serviced rig' (W-02 D14, 3 h) and 'waited on cement' (W-03 D14, 4 h), both labelled waiting on </w:t>
-      </w:r>
-      <w:r>
-        <w:lastRenderedPageBreak/>
-        <w:t>equipment with confidence of 0.9 or more, so the 0.7 confidence floor does not flag them. The engineer fixes each with one reject comment (Figure 5). This is the main argument for keeping a human in the loop.</w:t>
+        <w:t>'slipped and cut drill line, serviced rig' (W-02 D14, 3 h) and 'waited on cement' (W-03 D14, 4 h), both labelled waiting on equipment with confidence of 0.9 or more, so the 0.7 confidence floor does not flag them. The engineer fixes each with one reject comment (Figure 5). This is the main argument for keeping a human in the loop.</w:t>
       </w:r>
     </w:p>
     <w:p>
@@ -9308,6 +9464,7 @@
         <w:rPr>
           <w:b/>
         </w:rPr>
+        <w:lastRenderedPageBreak/>
         <w:t xml:space="preserve">Repeatability: </w:t>
       </w:r>
       <w:r>
@@ -9348,7 +9505,7 @@
       <w:pPr>
         <w:pStyle w:val="Heading1"/>
       </w:pPr>
-      <w:bookmarkStart w:id="26" w:name="_Toc243340729"/>
+      <w:bookmarkStart w:id="26" w:name="_Toc243609762"/>
       <w:r>
         <w:t>15. Limitations and responsible use</w:t>
       </w:r>
@@ -9421,7 +9578,7 @@
       <w:pPr>
         <w:pStyle w:val="Heading1"/>
       </w:pPr>
-      <w:bookmarkStart w:id="27" w:name="_Toc243340730"/>
+      <w:bookmarkStart w:id="27" w:name="_Toc243609763"/>
       <w:r>
         <w:t>16. Future enhancements</w:t>
       </w:r>
@@ -9485,7 +9642,7 @@
       <w:pPr>
         <w:pStyle w:val="Heading1"/>
       </w:pPr>
-      <w:bookmarkStart w:id="28" w:name="_Toc243340731"/>
+      <w:bookmarkStart w:id="28" w:name="_Toc243609764"/>
       <w:r>
         <w:t>17. Conclusion</w:t>
       </w:r>
@@ -9493,19 +9650,16 @@
     </w:p>
     <w:p>
       <w:r>
-        <w:t xml:space="preserve">Reading the Rig shows that an agentic workflow, rather than a single prompt, is what makes a small local model useful for this task. Splitting the job into planning, research, tool-based execution and self-checking, with a human approval step built into the graph, gave exact and traceable numbers on every </w:t>
-      </w:r>
+        <w:t>Reading the Rig shows that an agentic workflow, rather than a single prompt, is what makes a small local model useful for this task. Splitting the job into planning, research, tool-based execution and self-checking, with a human approval step built into the graph, gave exact and traceable numbers on every synthetic report, caught every planted data error, and left the engineer with two clear, quick corrections instead of a page of free text to read. Every number is computed by Python, every flag is sourced to a report line, and every report is approved by a person.</w:t>
+      </w:r>
+    </w:p>
+    <w:p>
+      <w:pPr>
+        <w:pStyle w:val="Heading1"/>
+      </w:pPr>
+      <w:bookmarkStart w:id="29" w:name="_Toc243609765"/>
       <w:r>
         <w:lastRenderedPageBreak/>
-        <w:t>synthetic report, caught every planted data error, and left the engineer with two clear, quick corrections instead of a page of free text to read. Every number is computed by Python, every flag is sourced to a report line, and every report is approved by a person.</w:t>
-      </w:r>
-    </w:p>
-    <w:p>
-      <w:pPr>
-        <w:pStyle w:val="Heading1"/>
-      </w:pPr>
-      <w:bookmarkStart w:id="29" w:name="_Toc243340732"/>
-      <w:r>
         <w:t>References</w:t>
       </w:r>
       <w:bookmarkEnd w:id="29"/>
@@ -9654,7 +9808,7 @@
         <w:tab/>
       </w:r>
       <w:r>
-        <w:t>Streamlit Documentation. docs.streamlit.io</w:t>
+        <w:t>FastAPI Documentation. fastapi.tiangolo.com</w:t>
       </w:r>
     </w:p>
     <w:p>
@@ -9766,7 +9920,7 @@
       <w:pPr>
         <w:pStyle w:val="Heading1"/>
       </w:pPr>
-      <w:bookmarkStart w:id="30" w:name="_Toc243340733"/>
+      <w:bookmarkStart w:id="30" w:name="_Toc243609766"/>
       <w:r>
         <w:t>Appendix A. How to run</w:t>
       </w:r>
@@ -9796,7 +9950,7 @@
             <w:color w:val="0563C1"/>
             <w:u w:val="single"/>
           </w:rPr>
-          <w:t>https://rig-sight.streamlit.app/</w:t>
+          <w:t>https://rig-sight.onrender.com/</w:t>
         </w:r>
       </w:hyperlink>
     </w:p>
@@ -9854,7 +10008,7 @@
           <w:rFonts w:ascii="Consolas" w:eastAsia="Consolas" w:hAnsi="Consolas"/>
           <w:sz w:val="18"/>
         </w:rPr>
-        <w:t>streamlit run app.py                # the PoC</w:t>
+        <w:t>python -m uvicorn api:app --port 8000   # the web app: http://127.0.0.1:8000</w:t>
       </w:r>
     </w:p>
     <w:p>

</xml_diff>

<commit_message>
Update PPT, report, diagram and README for Groq (gpt-oss-20b) results
</commit_message>
<xml_diff>
--- a/submission/Rig_Sight_CA3_Report.docx
+++ b/submission/Rig_Sight_CA3_Report.docx
@@ -198,7 +198,7 @@
       <w:pPr>
         <w:pStyle w:val="Heading1"/>
       </w:pPr>
-      <w:bookmarkStart w:id="0" w:name="_Toc243609736"/>
+      <w:bookmarkStart w:id="0" w:name="_Toc243612571"/>
       <w:r>
         <w:lastRenderedPageBreak/>
         <w:t>Contents</w:t>
@@ -230,7 +230,7 @@
       <w:r>
         <w:fldChar w:fldCharType="separate"/>
       </w:r>
-      <w:hyperlink w:anchor="_Toc243609736" w:history="1">
+      <w:hyperlink w:anchor="_Toc243612571" w:history="1">
         <w:r>
           <w:rPr>
             <w:rStyle w:val="Hyperlink"/>
@@ -257,7 +257,7 @@
             <w:noProof/>
             <w:webHidden/>
           </w:rPr>
-          <w:instrText xml:space="preserve"> PAGEREF _Toc243609736 \h </w:instrText>
+          <w:instrText xml:space="preserve"> PAGEREF _Toc243612571 \h </w:instrText>
         </w:r>
         <w:r>
           <w:rPr>
@@ -304,7 +304,7 @@
           <w14:ligatures w14:val="standardContextual"/>
         </w:rPr>
       </w:pPr>
-      <w:hyperlink w:anchor="_Toc243609737" w:history="1">
+      <w:hyperlink w:anchor="_Toc243612572" w:history="1">
         <w:r>
           <w:rPr>
             <w:rStyle w:val="Hyperlink"/>
@@ -331,7 +331,7 @@
             <w:noProof/>
             <w:webHidden/>
           </w:rPr>
-          <w:instrText xml:space="preserve"> PAGEREF _Toc243609737 \h </w:instrText>
+          <w:instrText xml:space="preserve"> PAGEREF _Toc243612572 \h </w:instrText>
         </w:r>
         <w:r>
           <w:rPr>
@@ -378,7 +378,7 @@
           <w14:ligatures w14:val="standardContextual"/>
         </w:rPr>
       </w:pPr>
-      <w:hyperlink w:anchor="_Toc243609738" w:history="1">
+      <w:hyperlink w:anchor="_Toc243612573" w:history="1">
         <w:r>
           <w:rPr>
             <w:rStyle w:val="Hyperlink"/>
@@ -405,7 +405,7 @@
             <w:noProof/>
             <w:webHidden/>
           </w:rPr>
-          <w:instrText xml:space="preserve"> PAGEREF _Toc243609738 \h </w:instrText>
+          <w:instrText xml:space="preserve"> PAGEREF _Toc243612573 \h </w:instrText>
         </w:r>
         <w:r>
           <w:rPr>
@@ -452,7 +452,7 @@
           <w14:ligatures w14:val="standardContextual"/>
         </w:rPr>
       </w:pPr>
-      <w:hyperlink w:anchor="_Toc243609739" w:history="1">
+      <w:hyperlink w:anchor="_Toc243612574" w:history="1">
         <w:r>
           <w:rPr>
             <w:rStyle w:val="Hyperlink"/>
@@ -479,7 +479,7 @@
             <w:noProof/>
             <w:webHidden/>
           </w:rPr>
-          <w:instrText xml:space="preserve"> PAGEREF _Toc243609739 \h </w:instrText>
+          <w:instrText xml:space="preserve"> PAGEREF _Toc243612574 \h </w:instrText>
         </w:r>
         <w:r>
           <w:rPr>
@@ -526,7 +526,7 @@
           <w14:ligatures w14:val="standardContextual"/>
         </w:rPr>
       </w:pPr>
-      <w:hyperlink w:anchor="_Toc243609740" w:history="1">
+      <w:hyperlink w:anchor="_Toc243612575" w:history="1">
         <w:r>
           <w:rPr>
             <w:rStyle w:val="Hyperlink"/>
@@ -553,7 +553,7 @@
             <w:noProof/>
             <w:webHidden/>
           </w:rPr>
-          <w:instrText xml:space="preserve"> PAGEREF _Toc243609740 \h </w:instrText>
+          <w:instrText xml:space="preserve"> PAGEREF _Toc243612575 \h </w:instrText>
         </w:r>
         <w:r>
           <w:rPr>
@@ -600,7 +600,7 @@
           <w14:ligatures w14:val="standardContextual"/>
         </w:rPr>
       </w:pPr>
-      <w:hyperlink w:anchor="_Toc243609741" w:history="1">
+      <w:hyperlink w:anchor="_Toc243612576" w:history="1">
         <w:r>
           <w:rPr>
             <w:rStyle w:val="Hyperlink"/>
@@ -627,7 +627,7 @@
             <w:noProof/>
             <w:webHidden/>
           </w:rPr>
-          <w:instrText xml:space="preserve"> PAGEREF _Toc243609741 \h </w:instrText>
+          <w:instrText xml:space="preserve"> PAGEREF _Toc243612576 \h </w:instrText>
         </w:r>
         <w:r>
           <w:rPr>
@@ -674,7 +674,7 @@
           <w14:ligatures w14:val="standardContextual"/>
         </w:rPr>
       </w:pPr>
-      <w:hyperlink w:anchor="_Toc243609742" w:history="1">
+      <w:hyperlink w:anchor="_Toc243612577" w:history="1">
         <w:r>
           <w:rPr>
             <w:rStyle w:val="Hyperlink"/>
@@ -701,7 +701,7 @@
             <w:noProof/>
             <w:webHidden/>
           </w:rPr>
-          <w:instrText xml:space="preserve"> PAGEREF _Toc243609742 \h </w:instrText>
+          <w:instrText xml:space="preserve"> PAGEREF _Toc243612577 \h </w:instrText>
         </w:r>
         <w:r>
           <w:rPr>
@@ -748,7 +748,7 @@
           <w14:ligatures w14:val="standardContextual"/>
         </w:rPr>
       </w:pPr>
-      <w:hyperlink w:anchor="_Toc243609743" w:history="1">
+      <w:hyperlink w:anchor="_Toc243612578" w:history="1">
         <w:r>
           <w:rPr>
             <w:rStyle w:val="Hyperlink"/>
@@ -775,7 +775,7 @@
             <w:noProof/>
             <w:webHidden/>
           </w:rPr>
-          <w:instrText xml:space="preserve"> PAGEREF _Toc243609743 \h </w:instrText>
+          <w:instrText xml:space="preserve"> PAGEREF _Toc243612578 \h </w:instrText>
         </w:r>
         <w:r>
           <w:rPr>
@@ -822,7 +822,7 @@
           <w14:ligatures w14:val="standardContextual"/>
         </w:rPr>
       </w:pPr>
-      <w:hyperlink w:anchor="_Toc243609744" w:history="1">
+      <w:hyperlink w:anchor="_Toc243612579" w:history="1">
         <w:r>
           <w:rPr>
             <w:rStyle w:val="Hyperlink"/>
@@ -849,7 +849,7 @@
             <w:noProof/>
             <w:webHidden/>
           </w:rPr>
-          <w:instrText xml:space="preserve"> PAGEREF _Toc243609744 \h </w:instrText>
+          <w:instrText xml:space="preserve"> PAGEREF _Toc243612579 \h </w:instrText>
         </w:r>
         <w:r>
           <w:rPr>
@@ -896,7 +896,7 @@
           <w14:ligatures w14:val="standardContextual"/>
         </w:rPr>
       </w:pPr>
-      <w:hyperlink w:anchor="_Toc243609745" w:history="1">
+      <w:hyperlink w:anchor="_Toc243612580" w:history="1">
         <w:r>
           <w:rPr>
             <w:rStyle w:val="Hyperlink"/>
@@ -923,7 +923,7 @@
             <w:noProof/>
             <w:webHidden/>
           </w:rPr>
-          <w:instrText xml:space="preserve"> PAGEREF _Toc243609745 \h </w:instrText>
+          <w:instrText xml:space="preserve"> PAGEREF _Toc243612580 \h </w:instrText>
         </w:r>
         <w:r>
           <w:rPr>
@@ -970,7 +970,7 @@
           <w14:ligatures w14:val="standardContextual"/>
         </w:rPr>
       </w:pPr>
-      <w:hyperlink w:anchor="_Toc243609746" w:history="1">
+      <w:hyperlink w:anchor="_Toc243612581" w:history="1">
         <w:r>
           <w:rPr>
             <w:rStyle w:val="Hyperlink"/>
@@ -997,7 +997,7 @@
             <w:noProof/>
             <w:webHidden/>
           </w:rPr>
-          <w:instrText xml:space="preserve"> PAGEREF _Toc243609746 \h </w:instrText>
+          <w:instrText xml:space="preserve"> PAGEREF _Toc243612581 \h </w:instrText>
         </w:r>
         <w:r>
           <w:rPr>
@@ -1044,7 +1044,7 @@
           <w14:ligatures w14:val="standardContextual"/>
         </w:rPr>
       </w:pPr>
-      <w:hyperlink w:anchor="_Toc243609747" w:history="1">
+      <w:hyperlink w:anchor="_Toc243612582" w:history="1">
         <w:r>
           <w:rPr>
             <w:rStyle w:val="Hyperlink"/>
@@ -1071,7 +1071,7 @@
             <w:noProof/>
             <w:webHidden/>
           </w:rPr>
-          <w:instrText xml:space="preserve"> PAGEREF _Toc243609747 \h </w:instrText>
+          <w:instrText xml:space="preserve"> PAGEREF _Toc243612582 \h </w:instrText>
         </w:r>
         <w:r>
           <w:rPr>
@@ -1118,7 +1118,7 @@
           <w14:ligatures w14:val="standardContextual"/>
         </w:rPr>
       </w:pPr>
-      <w:hyperlink w:anchor="_Toc243609748" w:history="1">
+      <w:hyperlink w:anchor="_Toc243612583" w:history="1">
         <w:r>
           <w:rPr>
             <w:rStyle w:val="Hyperlink"/>
@@ -1145,7 +1145,7 @@
             <w:noProof/>
             <w:webHidden/>
           </w:rPr>
-          <w:instrText xml:space="preserve"> PAGEREF _Toc243609748 \h </w:instrText>
+          <w:instrText xml:space="preserve"> PAGEREF _Toc243612583 \h </w:instrText>
         </w:r>
         <w:r>
           <w:rPr>
@@ -1192,7 +1192,7 @@
           <w14:ligatures w14:val="standardContextual"/>
         </w:rPr>
       </w:pPr>
-      <w:hyperlink w:anchor="_Toc243609749" w:history="1">
+      <w:hyperlink w:anchor="_Toc243612584" w:history="1">
         <w:r>
           <w:rPr>
             <w:rStyle w:val="Hyperlink"/>
@@ -1219,7 +1219,7 @@
             <w:noProof/>
             <w:webHidden/>
           </w:rPr>
-          <w:instrText xml:space="preserve"> PAGEREF _Toc243609749 \h </w:instrText>
+          <w:instrText xml:space="preserve"> PAGEREF _Toc243612584 \h </w:instrText>
         </w:r>
         <w:r>
           <w:rPr>
@@ -1266,7 +1266,7 @@
           <w14:ligatures w14:val="standardContextual"/>
         </w:rPr>
       </w:pPr>
-      <w:hyperlink w:anchor="_Toc243609750" w:history="1">
+      <w:hyperlink w:anchor="_Toc243612585" w:history="1">
         <w:r>
           <w:rPr>
             <w:rStyle w:val="Hyperlink"/>
@@ -1293,7 +1293,7 @@
             <w:noProof/>
             <w:webHidden/>
           </w:rPr>
-          <w:instrText xml:space="preserve"> PAGEREF _Toc243609750 \h </w:instrText>
+          <w:instrText xml:space="preserve"> PAGEREF _Toc243612585 \h </w:instrText>
         </w:r>
         <w:r>
           <w:rPr>
@@ -1340,7 +1340,7 @@
           <w14:ligatures w14:val="standardContextual"/>
         </w:rPr>
       </w:pPr>
-      <w:hyperlink w:anchor="_Toc243609751" w:history="1">
+      <w:hyperlink w:anchor="_Toc243612586" w:history="1">
         <w:r>
           <w:rPr>
             <w:rStyle w:val="Hyperlink"/>
@@ -1367,7 +1367,7 @@
             <w:noProof/>
             <w:webHidden/>
           </w:rPr>
-          <w:instrText xml:space="preserve"> PAGEREF _Toc243609751 \h </w:instrText>
+          <w:instrText xml:space="preserve"> PAGEREF _Toc243612586 \h </w:instrText>
         </w:r>
         <w:r>
           <w:rPr>
@@ -1414,7 +1414,7 @@
           <w14:ligatures w14:val="standardContextual"/>
         </w:rPr>
       </w:pPr>
-      <w:hyperlink w:anchor="_Toc243609752" w:history="1">
+      <w:hyperlink w:anchor="_Toc243612587" w:history="1">
         <w:r>
           <w:rPr>
             <w:rStyle w:val="Hyperlink"/>
@@ -1441,7 +1441,7 @@
             <w:noProof/>
             <w:webHidden/>
           </w:rPr>
-          <w:instrText xml:space="preserve"> PAGEREF _Toc243609752 \h </w:instrText>
+          <w:instrText xml:space="preserve"> PAGEREF _Toc243612587 \h </w:instrText>
         </w:r>
         <w:r>
           <w:rPr>
@@ -1488,7 +1488,7 @@
           <w14:ligatures w14:val="standardContextual"/>
         </w:rPr>
       </w:pPr>
-      <w:hyperlink w:anchor="_Toc243609753" w:history="1">
+      <w:hyperlink w:anchor="_Toc243612588" w:history="1">
         <w:r>
           <w:rPr>
             <w:rStyle w:val="Hyperlink"/>
@@ -1515,7 +1515,7 @@
             <w:noProof/>
             <w:webHidden/>
           </w:rPr>
-          <w:instrText xml:space="preserve"> PAGEREF _Toc243609753 \h </w:instrText>
+          <w:instrText xml:space="preserve"> PAGEREF _Toc243612588 \h </w:instrText>
         </w:r>
         <w:r>
           <w:rPr>
@@ -1562,7 +1562,7 @@
           <w14:ligatures w14:val="standardContextual"/>
         </w:rPr>
       </w:pPr>
-      <w:hyperlink w:anchor="_Toc243609754" w:history="1">
+      <w:hyperlink w:anchor="_Toc243612589" w:history="1">
         <w:r>
           <w:rPr>
             <w:rStyle w:val="Hyperlink"/>
@@ -1589,7 +1589,7 @@
             <w:noProof/>
             <w:webHidden/>
           </w:rPr>
-          <w:instrText xml:space="preserve"> PAGEREF _Toc243609754 \h </w:instrText>
+          <w:instrText xml:space="preserve"> PAGEREF _Toc243612589 \h </w:instrText>
         </w:r>
         <w:r>
           <w:rPr>
@@ -1636,7 +1636,7 @@
           <w14:ligatures w14:val="standardContextual"/>
         </w:rPr>
       </w:pPr>
-      <w:hyperlink w:anchor="_Toc243609755" w:history="1">
+      <w:hyperlink w:anchor="_Toc243612590" w:history="1">
         <w:r>
           <w:rPr>
             <w:rStyle w:val="Hyperlink"/>
@@ -1663,7 +1663,7 @@
             <w:noProof/>
             <w:webHidden/>
           </w:rPr>
-          <w:instrText xml:space="preserve"> PAGEREF _Toc243609755 \h </w:instrText>
+          <w:instrText xml:space="preserve"> PAGEREF _Toc243612590 \h </w:instrText>
         </w:r>
         <w:r>
           <w:rPr>
@@ -1710,7 +1710,7 @@
           <w14:ligatures w14:val="standardContextual"/>
         </w:rPr>
       </w:pPr>
-      <w:hyperlink w:anchor="_Toc243609756" w:history="1">
+      <w:hyperlink w:anchor="_Toc243612591" w:history="1">
         <w:r>
           <w:rPr>
             <w:rStyle w:val="Hyperlink"/>
@@ -1737,7 +1737,7 @@
             <w:noProof/>
             <w:webHidden/>
           </w:rPr>
-          <w:instrText xml:space="preserve"> PAGEREF _Toc243609756 \h </w:instrText>
+          <w:instrText xml:space="preserve"> PAGEREF _Toc243612591 \h </w:instrText>
         </w:r>
         <w:r>
           <w:rPr>
@@ -1784,7 +1784,7 @@
           <w14:ligatures w14:val="standardContextual"/>
         </w:rPr>
       </w:pPr>
-      <w:hyperlink w:anchor="_Toc243609757" w:history="1">
+      <w:hyperlink w:anchor="_Toc243612592" w:history="1">
         <w:r>
           <w:rPr>
             <w:rStyle w:val="Hyperlink"/>
@@ -1811,7 +1811,7 @@
             <w:noProof/>
             <w:webHidden/>
           </w:rPr>
-          <w:instrText xml:space="preserve"> PAGEREF _Toc243609757 \h </w:instrText>
+          <w:instrText xml:space="preserve"> PAGEREF _Toc243612592 \h </w:instrText>
         </w:r>
         <w:r>
           <w:rPr>
@@ -1858,7 +1858,7 @@
           <w14:ligatures w14:val="standardContextual"/>
         </w:rPr>
       </w:pPr>
-      <w:hyperlink w:anchor="_Toc243609758" w:history="1">
+      <w:hyperlink w:anchor="_Toc243612593" w:history="1">
         <w:r>
           <w:rPr>
             <w:rStyle w:val="Hyperlink"/>
@@ -1885,7 +1885,7 @@
             <w:noProof/>
             <w:webHidden/>
           </w:rPr>
-          <w:instrText xml:space="preserve"> PAGEREF _Toc243609758 \h </w:instrText>
+          <w:instrText xml:space="preserve"> PAGEREF _Toc243612593 \h </w:instrText>
         </w:r>
         <w:r>
           <w:rPr>
@@ -1932,7 +1932,7 @@
           <w14:ligatures w14:val="standardContextual"/>
         </w:rPr>
       </w:pPr>
-      <w:hyperlink w:anchor="_Toc243609759" w:history="1">
+      <w:hyperlink w:anchor="_Toc243612594" w:history="1">
         <w:r>
           <w:rPr>
             <w:rStyle w:val="Hyperlink"/>
@@ -1959,7 +1959,7 @@
             <w:noProof/>
             <w:webHidden/>
           </w:rPr>
-          <w:instrText xml:space="preserve"> PAGEREF _Toc243609759 \h </w:instrText>
+          <w:instrText xml:space="preserve"> PAGEREF _Toc243612594 \h </w:instrText>
         </w:r>
         <w:r>
           <w:rPr>
@@ -2006,7 +2006,7 @@
           <w14:ligatures w14:val="standardContextual"/>
         </w:rPr>
       </w:pPr>
-      <w:hyperlink w:anchor="_Toc243609760" w:history="1">
+      <w:hyperlink w:anchor="_Toc243612595" w:history="1">
         <w:r>
           <w:rPr>
             <w:rStyle w:val="Hyperlink"/>
@@ -2033,7 +2033,7 @@
             <w:noProof/>
             <w:webHidden/>
           </w:rPr>
-          <w:instrText xml:space="preserve"> PAGEREF _Toc243609760 \h </w:instrText>
+          <w:instrText xml:space="preserve"> PAGEREF _Toc243612595 \h </w:instrText>
         </w:r>
         <w:r>
           <w:rPr>
@@ -2080,7 +2080,7 @@
           <w14:ligatures w14:val="standardContextual"/>
         </w:rPr>
       </w:pPr>
-      <w:hyperlink w:anchor="_Toc243609761" w:history="1">
+      <w:hyperlink w:anchor="_Toc243612596" w:history="1">
         <w:r>
           <w:rPr>
             <w:rStyle w:val="Hyperlink"/>
@@ -2107,7 +2107,7 @@
             <w:noProof/>
             <w:webHidden/>
           </w:rPr>
-          <w:instrText xml:space="preserve"> PAGEREF _Toc243609761 \h </w:instrText>
+          <w:instrText xml:space="preserve"> PAGEREF _Toc243612596 \h </w:instrText>
         </w:r>
         <w:r>
           <w:rPr>
@@ -2154,7 +2154,7 @@
           <w14:ligatures w14:val="standardContextual"/>
         </w:rPr>
       </w:pPr>
-      <w:hyperlink w:anchor="_Toc243609762" w:history="1">
+      <w:hyperlink w:anchor="_Toc243612597" w:history="1">
         <w:r>
           <w:rPr>
             <w:rStyle w:val="Hyperlink"/>
@@ -2181,7 +2181,7 @@
             <w:noProof/>
             <w:webHidden/>
           </w:rPr>
-          <w:instrText xml:space="preserve"> PAGEREF _Toc243609762 \h </w:instrText>
+          <w:instrText xml:space="preserve"> PAGEREF _Toc243612597 \h </w:instrText>
         </w:r>
         <w:r>
           <w:rPr>
@@ -2228,7 +2228,7 @@
           <w14:ligatures w14:val="standardContextual"/>
         </w:rPr>
       </w:pPr>
-      <w:hyperlink w:anchor="_Toc243609763" w:history="1">
+      <w:hyperlink w:anchor="_Toc243612598" w:history="1">
         <w:r>
           <w:rPr>
             <w:rStyle w:val="Hyperlink"/>
@@ -2255,7 +2255,7 @@
             <w:noProof/>
             <w:webHidden/>
           </w:rPr>
-          <w:instrText xml:space="preserve"> PAGEREF _Toc243609763 \h </w:instrText>
+          <w:instrText xml:space="preserve"> PAGEREF _Toc243612598 \h </w:instrText>
         </w:r>
         <w:r>
           <w:rPr>
@@ -2302,7 +2302,7 @@
           <w14:ligatures w14:val="standardContextual"/>
         </w:rPr>
       </w:pPr>
-      <w:hyperlink w:anchor="_Toc243609764" w:history="1">
+      <w:hyperlink w:anchor="_Toc243612599" w:history="1">
         <w:r>
           <w:rPr>
             <w:rStyle w:val="Hyperlink"/>
@@ -2329,7 +2329,7 @@
             <w:noProof/>
             <w:webHidden/>
           </w:rPr>
-          <w:instrText xml:space="preserve"> PAGEREF _Toc243609764 \h </w:instrText>
+          <w:instrText xml:space="preserve"> PAGEREF _Toc243612599 \h </w:instrText>
         </w:r>
         <w:r>
           <w:rPr>
@@ -2376,7 +2376,7 @@
           <w14:ligatures w14:val="standardContextual"/>
         </w:rPr>
       </w:pPr>
-      <w:hyperlink w:anchor="_Toc243609765" w:history="1">
+      <w:hyperlink w:anchor="_Toc243612600" w:history="1">
         <w:r>
           <w:rPr>
             <w:rStyle w:val="Hyperlink"/>
@@ -2403,7 +2403,7 @@
             <w:noProof/>
             <w:webHidden/>
           </w:rPr>
-          <w:instrText xml:space="preserve"> PAGEREF _Toc243609765 \h </w:instrText>
+          <w:instrText xml:space="preserve"> PAGEREF _Toc243612600 \h </w:instrText>
         </w:r>
         <w:r>
           <w:rPr>
@@ -2450,7 +2450,7 @@
           <w14:ligatures w14:val="standardContextual"/>
         </w:rPr>
       </w:pPr>
-      <w:hyperlink w:anchor="_Toc243609766" w:history="1">
+      <w:hyperlink w:anchor="_Toc243612601" w:history="1">
         <w:r>
           <w:rPr>
             <w:rStyle w:val="Hyperlink"/>
@@ -2477,7 +2477,7 @@
             <w:noProof/>
             <w:webHidden/>
           </w:rPr>
-          <w:instrText xml:space="preserve"> PAGEREF _Toc243609766 \h </w:instrText>
+          <w:instrText xml:space="preserve"> PAGEREF _Toc243612601 \h </w:instrText>
         </w:r>
         <w:r>
           <w:rPr>
@@ -2522,7 +2522,7 @@
       <w:pPr>
         <w:pStyle w:val="Heading1"/>
       </w:pPr>
-      <w:bookmarkStart w:id="1" w:name="_Toc243609737"/>
+      <w:bookmarkStart w:id="1" w:name="_Toc243612572"/>
       <w:r>
         <w:lastRenderedPageBreak/>
         <w:t>Abstract</w:t>
@@ -2531,19 +2531,19 @@
     </w:p>
     <w:p>
       <w:r>
-        <w:t>Every drilling rig sends a Daily Drilling Report (DDR) each morning, and most of it is free text typed by the crew. Hours that are paid for but do not move the well forward, called non-productive time (NPT), hide inside those sentences, so they are rarely totalled and lessons are lost between wells. This project builds a working proof of concept in which a team of LangGraph agents reads a DDR, plans the work, looks up reference data and past incidents, computes every number with deterministic Python tools, checks its own output with a Critic that can send work back with specific feedback, and pauses for a drilling engineer to approve or reject an evidence-backed insight report. A local language model (qwen2.5:3b through Ollama) is used only to label log lines; a keyword classifier is the fallback and is always reported as such.</w:t>
-      </w:r>
-    </w:p>
-    <w:p>
-      <w:r>
-        <w:t>On 15 synthetic reports with a known answer key, the full graph had a mean NPT error of 0.47 h per report, got every planted NPT line's category right (100%), caught both deliberately planted log errors (2/2) and produced time logs that add to 24 h in 15/15 reports. A single-prompt chatbot using the same model had a mean error of 3.83 h, and its time log added to 24 h in only 1/15 reports. The remaining errors come from the model confidently labelling planned work as NPT; the engineer review step corrects them. 48 automated tests cover the tools, the Critic, retries, human review, malformed input and the user interface.</w:t>
+        <w:t>Every drilling rig sends a Daily Drilling Report (DDR) each morning, and most of it is free text typed by the crew. Hours that are paid for but do not move the well forward, called non-productive time (NPT), hide inside those sentences, so they are rarely totalled and lessons are lost between wells. This project builds a working proof of concept in which a team of LangGraph agents reads a DDR, plans the work, looks up reference data and past incidents, computes every number with deterministic Python tools, checks its own output with a Critic that can send work back with specific feedback, and pauses for a drilling engineer to approve or reject an evidence-backed insight report. A hosted language model (openai/gpt-oss-20b on Groq's free tier) is used only to label log lines; a keyword classifier is the fallback and is always reported as such.</w:t>
+      </w:r>
+    </w:p>
+    <w:p>
+      <w:r>
+        <w:t>On 15 synthetic reports with a known answer key, the full graph had a mean NPT error of 0.07 h per report, got every planted NPT line's category right (100%), caught both deliberately planted log errors (2/2) and produced time logs that add to 24 h in 15/15 reports. A single-prompt chatbot using the same model had a mean error of 0.57 h, and its time log added to 24 h in 13/15 reports. The one remaining error is the model counting a routine flow check as NPT; the engineer review step corrects it with one comment. 58 automated tests cover the tools, the Critic, retries, human review, malformed input, the model fallback and the web API.</w:t>
       </w:r>
     </w:p>
     <w:p>
       <w:pPr>
         <w:pStyle w:val="Heading1"/>
       </w:pPr>
-      <w:bookmarkStart w:id="2" w:name="_Toc243609738"/>
+      <w:bookmarkStart w:id="2" w:name="_Toc243612573"/>
       <w:r>
         <w:t>1. Introduction and domain background</w:t>
       </w:r>
@@ -2553,7 +2553,7 @@
       <w:pPr>
         <w:pStyle w:val="Heading2"/>
       </w:pPr>
-      <w:bookmarkStart w:id="3" w:name="_Toc243609739"/>
+      <w:bookmarkStart w:id="3" w:name="_Toc243612574"/>
       <w:r>
         <w:t>1.1 Why oil and gas drilling</w:t>
       </w:r>
@@ -2568,7 +2568,7 @@
       <w:pPr>
         <w:pStyle w:val="Heading2"/>
       </w:pPr>
-      <w:bookmarkStart w:id="4" w:name="_Toc243609740"/>
+      <w:bookmarkStart w:id="4" w:name="_Toc243612575"/>
       <w:r>
         <w:t>1.2 The Daily Drilling Report</w:t>
       </w:r>
@@ -2627,7 +2627,7 @@
       <w:pPr>
         <w:pStyle w:val="Heading2"/>
       </w:pPr>
-      <w:bookmarkStart w:id="5" w:name="_Toc243609741"/>
+      <w:bookmarkStart w:id="5" w:name="_Toc243612576"/>
       <w:r>
         <w:t>1.3 Non-productive time</w:t>
       </w:r>
@@ -2646,7 +2646,7 @@
       <w:pPr>
         <w:pStyle w:val="Heading1"/>
       </w:pPr>
-      <w:bookmarkStart w:id="6" w:name="_Toc243609742"/>
+      <w:bookmarkStart w:id="6" w:name="_Toc243612577"/>
       <w:r>
         <w:t>2. Problem statement</w:t>
       </w:r>
@@ -2669,7 +2669,7 @@
       <w:pPr>
         <w:pStyle w:val="Heading1"/>
       </w:pPr>
-      <w:bookmarkStart w:id="7" w:name="_Toc243609743"/>
+      <w:bookmarkStart w:id="7" w:name="_Toc243612578"/>
       <w:r>
         <w:t>3. Existing process and identified inefficiencies</w:t>
       </w:r>
@@ -2769,7 +2769,7 @@
       <w:pPr>
         <w:pStyle w:val="Heading1"/>
       </w:pPr>
-      <w:bookmarkStart w:id="8" w:name="_Toc243609744"/>
+      <w:bookmarkStart w:id="8" w:name="_Toc243612579"/>
       <w:r>
         <w:t>4. Proposed solution and objectives</w:t>
       </w:r>
@@ -2864,7 +2864,7 @@
       <w:pPr>
         <w:pStyle w:val="Heading1"/>
       </w:pPr>
-      <w:bookmarkStart w:id="9" w:name="_Toc243609745"/>
+      <w:bookmarkStart w:id="9" w:name="_Toc243612580"/>
       <w:r>
         <w:lastRenderedPageBreak/>
         <w:t>5. Requirements and technology stack</w:t>
@@ -2875,7 +2875,7 @@
       <w:pPr>
         <w:pStyle w:val="Heading2"/>
       </w:pPr>
-      <w:bookmarkStart w:id="10" w:name="_Toc243609746"/>
+      <w:bookmarkStart w:id="10" w:name="_Toc243612581"/>
       <w:r>
         <w:t>5.1 Functional requirements</w:t>
       </w:r>
@@ -3713,7 +3713,7 @@
       <w:pPr>
         <w:pStyle w:val="Heading2"/>
       </w:pPr>
-      <w:bookmarkStart w:id="11" w:name="_Toc243609747"/>
+      <w:bookmarkStart w:id="11" w:name="_Toc243612582"/>
       <w:r>
         <w:t>5.2 Technology stack</w:t>
       </w:r>
@@ -3990,7 +3990,7 @@
               <w:rPr>
                 <w:sz w:val="19"/>
               </w:rPr>
-              <w:t>Ollama 0.40 with qwen2.5:3b (local, free)</w:t>
+              <w:t>Groq API with openai/gpt-oss-20b (hosted, free tier)</w:t>
             </w:r>
           </w:p>
         </w:tc>
@@ -4006,7 +4006,7 @@
               <w:rPr>
                 <w:sz w:val="19"/>
               </w:rPr>
-              <w:t>No paid API; data stays on the laptop; fits a 4 GB GPU</w:t>
+              <w:t>No paid API; runs on any machine, including the free web server</w:t>
             </w:r>
           </w:p>
         </w:tc>
@@ -4202,7 +4202,7 @@
               <w:rPr>
                 <w:sz w:val="19"/>
               </w:rPr>
-              <w:t>pytest (57 tests), FastAPI TestClient</w:t>
+              <w:t>pytest (58 tests), FastAPI TestClient</w:t>
             </w:r>
           </w:p>
         </w:tc>
@@ -4231,14 +4231,14 @@
     </w:p>
     <w:p>
       <w:r>
-        <w:t>Hardware used: a laptop with an NVIDIA RTX 3050 (4 GB). The 8B model suggested in the original design does not fit in 4 GB, so a 3B model was chosen.</w:t>
+        <w:t>The model runs at Groq, not on the laptop or the web server, so any machine with an internet connection can run the system, including the free Render web server (512 MB of memory). The team's first design used a local model through Ollama (llama3.1:8b, then qwen2.5:3b on a 4 GB GPU); it was replaced by Groq so that the online demo uses a real language model too.</w:t>
       </w:r>
     </w:p>
     <w:p>
       <w:pPr>
         <w:pStyle w:val="Heading1"/>
       </w:pPr>
-      <w:bookmarkStart w:id="12" w:name="_Toc243609748"/>
+      <w:bookmarkStart w:id="12" w:name="_Toc243612583"/>
       <w:r>
         <w:t>6. System architecture and data flow</w:t>
       </w:r>
@@ -4251,6 +4251,7 @@
     </w:p>
     <w:p>
       <w:r>
+        <w:lastRenderedPageBreak/>
         <w:t>A normal run, step by step:</w:t>
       </w:r>
     </w:p>
@@ -4260,7 +4261,6 @@
         <w:spacing w:after="60"/>
       </w:pPr>
       <w:r>
-        <w:lastRenderedPageBreak/>
         <w:t>The web app calls app.stream(initial_state, thread_id). ingest_report reads the file and parses the header.</w:t>
       </w:r>
     </w:p>
@@ -4395,7 +4395,7 @@
         <w:rPr>
           <w:i/>
         </w:rPr>
-        <w:t>The diagram is the team's design, updated to match the final code (rule-based Planner, qwen2.5:3b, recursion_limit 50, a web app as the front end). Two details are simplified in the drawing: classification runs as one classify_activities tool over all lines, and the Critic also checks gaps, overlaps, unparseable lines and the header (Section 11).</w:t>
+        <w:t>The diagram is the team's design, updated to match the final code (rule-based Planner, recursion_limit 50, a web app as the front end, and Groq as the language model). Two details are simplified in the drawing: classification runs as one classify_activities tool over all lines, and the Critic also checks gaps, overlaps, unparseable lines and the header (Section 11).</w:t>
       </w:r>
     </w:p>
     <w:p>
@@ -4412,7 +4412,7 @@
       <w:pPr>
         <w:pStyle w:val="Heading1"/>
       </w:pPr>
-      <w:bookmarkStart w:id="13" w:name="_Toc243609749"/>
+      <w:bookmarkStart w:id="13" w:name="_Toc243612584"/>
       <w:r>
         <w:lastRenderedPageBreak/>
         <w:t>7. Agent roles and orchestration</w:t>
@@ -5112,7 +5112,7 @@
       <w:pPr>
         <w:pStyle w:val="Heading1"/>
       </w:pPr>
-      <w:bookmarkStart w:id="14" w:name="_Toc243609750"/>
+      <w:bookmarkStart w:id="14" w:name="_Toc243612585"/>
       <w:r>
         <w:t>8. Data model, synthetic dataset and reference files</w:t>
       </w:r>
@@ -5122,7 +5122,7 @@
       <w:pPr>
         <w:pStyle w:val="Heading2"/>
       </w:pPr>
-      <w:bookmarkStart w:id="15" w:name="_Toc243609751"/>
+      <w:bookmarkStart w:id="15" w:name="_Toc243612586"/>
       <w:r>
         <w:t>8.1 Shared state (DDRState)</w:t>
       </w:r>
@@ -5855,7 +5855,7 @@
       <w:pPr>
         <w:pStyle w:val="Heading2"/>
       </w:pPr>
-      <w:bookmarkStart w:id="16" w:name="_Toc243609752"/>
+      <w:bookmarkStart w:id="16" w:name="_Toc243612587"/>
       <w:r>
         <w:t>8.2 Synthetic dataset</w:t>
       </w:r>
@@ -6338,7 +6338,7 @@
       <w:pPr>
         <w:pStyle w:val="Heading1"/>
       </w:pPr>
-      <w:bookmarkStart w:id="17" w:name="_Toc243609753"/>
+      <w:bookmarkStart w:id="17" w:name="_Toc243612588"/>
       <w:r>
         <w:t>9. Implementation details</w:t>
       </w:r>
@@ -6511,7 +6511,7 @@
               <w:rPr>
                 <w:sz w:val="19"/>
               </w:rPr>
-              <w:t>The only place a model is called: Ollama client, mock classifier, summary, chatbot baseline</w:t>
+              <w:t>The only place a model is called: Groq client, mock classifier, summary, chatbot baseline</w:t>
             </w:r>
           </w:p>
         </w:tc>
@@ -6696,7 +6696,7 @@
               <w:rPr>
                 <w:sz w:val="19"/>
               </w:rPr>
-              <w:t>57 pytest tests</w:t>
+              <w:t>58 pytest tests</w:t>
             </w:r>
           </w:p>
         </w:tc>
@@ -6722,7 +6722,7 @@
       <w:pPr>
         <w:pStyle w:val="Heading1"/>
       </w:pPr>
-      <w:bookmarkStart w:id="18" w:name="_Toc243609754"/>
+      <w:bookmarkStart w:id="18" w:name="_Toc243612589"/>
       <w:r>
         <w:t>10. Deterministic tools and model usage</w:t>
       </w:r>
@@ -7091,14 +7091,14 @@
     </w:p>
     <w:p>
       <w:r>
-        <w:t>The model never does arithmetic. When Ollama is not running, the app uses the mock and says so in the top bar, in every activity ('labelled_by') and in the report ('Lines labelled by: mock').</w:t>
+        <w:t>The model never does arithmetic. It labels all lines of a report in one request. When no Groq key is set, or a request fails, the app uses the mock and says so in the top bar, in every activity ('labelled_by') and in the report ('Lines labelled by: mock').</w:t>
       </w:r>
     </w:p>
     <w:p>
       <w:pPr>
         <w:pStyle w:val="Heading1"/>
       </w:pPr>
-      <w:bookmarkStart w:id="19" w:name="_Toc243609755"/>
+      <w:bookmarkStart w:id="19" w:name="_Toc243612590"/>
       <w:r>
         <w:t>11. Critic validation, retries and human-in-the-loop review</w:t>
       </w:r>
@@ -7329,6 +7329,7 @@
               <w:rPr>
                 <w:sz w:val="19"/>
               </w:rPr>
+              <w:lastRenderedPageBreak/>
               <w:t>No gaps between activities</w:t>
             </w:r>
           </w:p>
@@ -7366,7 +7367,6 @@
               <w:rPr>
                 <w:sz w:val="19"/>
               </w:rPr>
-              <w:lastRenderedPageBreak/>
               <w:t>No overlaps</w:t>
             </w:r>
           </w:p>
@@ -7593,7 +7593,7 @@
       <w:pPr>
         <w:pStyle w:val="Heading1"/>
       </w:pPr>
-      <w:bookmarkStart w:id="20" w:name="_Toc243609756"/>
+      <w:bookmarkStart w:id="20" w:name="_Toc243612591"/>
       <w:r>
         <w:t>12. Web interface</w:t>
       </w:r>
@@ -7608,7 +7608,7 @@
       <w:pPr>
         <w:pStyle w:val="Heading2"/>
       </w:pPr>
-      <w:bookmarkStart w:id="21" w:name="_Toc243609757"/>
+      <w:bookmarkStart w:id="21" w:name="_Toc243612592"/>
       <w:r>
         <w:t>12.1 Deployment</w:t>
       </w:r>
@@ -7631,7 +7631,7 @@
         <w:t xml:space="preserve">Model: </w:t>
       </w:r>
       <w:r>
-        <w:t>the host has no Ollama, so the hosted app runs on the mock keyword classifier. The top bar and every report say so.</w:t>
+        <w:t>the hosted app calls Groq (openai/gpt-oss-20b) with a key stored as a Render environment variable; the key never reaches the browser. Without a key it falls back to the mock keyword classifier, and the top bar and every report say so.</w:t>
       </w:r>
     </w:p>
     <w:p>
@@ -7646,7 +7646,7 @@
         <w:t xml:space="preserve">Results: </w:t>
       </w:r>
       <w:r>
-        <w:t>the Evaluation page shows the committed qwen2.5:3b and mock results.</w:t>
+        <w:t>the Evaluation page shows the committed Groq and mock results.</w:t>
       </w:r>
     </w:p>
     <w:p>
@@ -7676,14 +7676,14 @@
         <w:t xml:space="preserve">Use: </w:t>
       </w:r>
       <w:r>
-        <w:t>the hosted app shows the workflow with no setup; the results with the real model, including the engineer correcting the model's mistake, come from running it locally with Ollama.</w:t>
+        <w:t>the hosted app and a local run behave the same; both use the same Groq model.</w:t>
       </w:r>
     </w:p>
     <w:p>
       <w:pPr>
         <w:pStyle w:val="Heading2"/>
       </w:pPr>
-      <w:bookmarkStart w:id="22" w:name="_Toc243609758"/>
+      <w:bookmarkStart w:id="22" w:name="_Toc243612593"/>
       <w:r>
         <w:t>12.2 Screens</w:t>
       </w:r>
@@ -7691,7 +7691,7 @@
     </w:p>
     <w:p>
       <w:r>
-        <w:t>All screenshots below were taken from the application running locally with the qwen2.5:3b model.</w:t>
+        <w:t>All screenshots below were taken from the application running locally with the Groq model (openai/gpt-oss-20b).</w:t>
       </w:r>
     </w:p>
     <w:p>
@@ -7816,7 +7816,7 @@
         </w:rPr>
         <w:drawing>
           <wp:inline distT="0" distB="0" distL="0" distR="0" wp14:anchorId="0485F2F7" wp14:editId="21C6A3FB">
-            <wp:extent cx="5903999" cy="2550043"/>
+            <wp:extent cx="5903999" cy="2460719"/>
             <wp:effectExtent l="0" t="0" r="0" b="0"/>
             <wp:docPr id="4" name="Picture 4"/>
             <wp:cNvGraphicFramePr>
@@ -7838,7 +7838,7 @@
                   <pic:spPr>
                     <a:xfrm>
                       <a:off x="0" y="0"/>
-                      <a:ext cx="5903999" cy="2550043"/>
+                      <a:ext cx="5903999" cy="2460719"/>
                     </a:xfrm>
                     <a:prstGeom prst="rect">
                       <a:avLst/>
@@ -7857,7 +7857,7 @@
         <w:jc w:val="center"/>
       </w:pPr>
       <w:r>
-        <w:t>Figure 4. First draft of the Daily Insight Report, the engineer review panel and the check against the answer key. The model has labelled line 7 (slip and cut) as NPT</w:t>
+        <w:t>Figure 4. The Daily Insight Report for W-02 Day 14, the engineer review panel and the check against the answer key: every row matches</w:t>
       </w:r>
     </w:p>
     <w:p>
@@ -7872,7 +7872,7 @@
         <w:lastRenderedPageBreak/>
         <w:drawing>
           <wp:inline distT="0" distB="0" distL="0" distR="0" wp14:anchorId="5C8D9B24" wp14:editId="3F858E71">
-            <wp:extent cx="5903999" cy="2460719"/>
+            <wp:extent cx="5903999" cy="4258716"/>
             <wp:effectExtent l="0" t="0" r="0" b="0"/>
             <wp:docPr id="5" name="Picture 5"/>
             <wp:cNvGraphicFramePr>
@@ -7894,7 +7894,7 @@
                   <pic:spPr>
                     <a:xfrm>
                       <a:off x="0" y="0"/>
-                      <a:ext cx="5903999" cy="2460719"/>
+                      <a:ext cx="5903999" cy="4258716"/>
                     </a:xfrm>
                     <a:prstGeom prst="rect">
                       <a:avLst/>
@@ -7913,7 +7913,7 @@
         <w:jc w:val="center"/>
       </w:pPr>
       <w:r>
-        <w:t>Figure 5. After the engineer rejected with 'line 7 is planned, not NPT' and then approved: 8.0 h NPT, matching the answer key on every row</w:t>
+        <w:t>Figure 5. W-02 Day 11: the model labels line 6 (a routine flow check, 1 h) as well control, so the draft says 7 h. The engineer rejects with 'line 6 is planned, not NPT', the graph re-runs and the approved report shows 6 h, matching the answer key</w:t>
       </w:r>
     </w:p>
     <w:p>
@@ -7925,6 +7925,7 @@
         <w:rPr>
           <w:noProof/>
         </w:rPr>
+        <w:lastRenderedPageBreak/>
         <w:drawing>
           <wp:inline distT="0" distB="0" distL="0" distR="0" wp14:anchorId="01B66124" wp14:editId="4CB95E9F">
             <wp:extent cx="5903999" cy="3688198"/>
@@ -7980,7 +7981,6 @@
         <w:rPr>
           <w:noProof/>
         </w:rPr>
-        <w:lastRenderedPageBreak/>
         <w:drawing>
           <wp:inline distT="0" distB="0" distL="0" distR="0" wp14:anchorId="7E6FCA9C" wp14:editId="21BCB324">
             <wp:extent cx="5903999" cy="4151249"/>
@@ -8024,7 +8024,7 @@
         <w:jc w:val="center"/>
       </w:pPr>
       <w:r>
-        <w:t>Figure 7. Evaluation page with the saved results for the local model and the mock</w:t>
+        <w:t>Figure 7. Evaluation page with the saved results for the Groq model and the mock</w:t>
       </w:r>
     </w:p>
     <w:p>
@@ -8087,7 +8087,7 @@
       <w:pPr>
         <w:pStyle w:val="Heading1"/>
       </w:pPr>
-      <w:bookmarkStart w:id="23" w:name="_Toc243609759"/>
+      <w:bookmarkStart w:id="23" w:name="_Toc243612594"/>
       <w:r>
         <w:t>13. Testing methodology and test cases</w:t>
       </w:r>
@@ -8095,7 +8095,7 @@
     </w:p>
     <w:p>
       <w:r>
-        <w:t>Automated tests are in tests/ and run with python -m pytest. All 57 pass. They use the mock classifier and a temporary memory database, so they are deterministic and do not touch the committed data or a running model.</w:t>
+        <w:t>Automated tests are in tests/ and run with python -m pytest. All 58 pass. They use the mock classifier and a temporary memory database, so they are deterministic and do not touch the committed data or a running model.</w:t>
       </w:r>
     </w:p>
     <w:p>
@@ -8228,7 +8228,7 @@
               <w:rPr>
                 <w:sz w:val="19"/>
               </w:rPr>
-              <w:t>All 15 reports: 24 h, Critic PASS, depth and ROP equal to the answer key, every NPT claim on its own line, NPT total equals the NPT lines. Mock exact on 14/15 (the WOC trap flagged as low confidence). Clean day. Critic catches the hidden line and the overlap and the retry fixes them, with the correction disclosed. Failed cases stored. No-Critic ablation. Approve ends the graph. Reject with an override re-runs and corrects. Invalid timestamp, missing header, empty log and unknown well handled. Worst case stops after 3 retries and still reaches the engineer. Mock reported as mock. LLM summary with an invented number rejected; one with only computed numbers kept. Ollama unavailable falls back to the mock</w:t>
+              <w:t>All 15 reports: 24 h, Critic PASS, depth and ROP equal to the answer key, every NPT claim on its own line, NPT total equals the NPT lines. Mock exact on 14/15 (the WOC trap flagged as low confidence). Clean day. Critic catches the hidden line and the overlap and the retry fixes them, with the correction disclosed. Failed cases stored. No-Critic ablation. Approve ends the graph. Reject with an override re-runs and corrects. Invalid timestamp, missing header, empty log and unknown well handled. Worst case stops after 3 retries and still reaches the engineer. Mock reported as mock. LLM summary with an invented number rejected; one with only computed numbers kept. Groq: no key falls back to the mock; one request per report; a failed request falls back to the mock</w:t>
             </w:r>
           </w:p>
         </w:tc>
@@ -8323,7 +8323,7 @@
       <w:pPr>
         <w:pStyle w:val="Heading1"/>
       </w:pPr>
-      <w:bookmarkStart w:id="24" w:name="_Toc243609760"/>
+      <w:bookmarkStart w:id="24" w:name="_Toc243612595"/>
       <w:r>
         <w:t>14. Evaluation results</w:t>
       </w:r>
@@ -8415,7 +8415,7 @@
         <w:keepNext/>
       </w:pPr>
       <w:r>
-        <w:t>Table 10. Results on the 15 reports with the local model (2026-10-19 20:06)</w:t>
+        <w:t>Table 10. Results on the 15 reports with openai/gpt-oss-20b on Groq (2026-10-23 01:44)</w:t>
       </w:r>
     </w:p>
     <w:tbl>
@@ -8453,7 +8453,7 @@
                 <w:b/>
                 <w:sz w:val="19"/>
               </w:rPr>
-              <w:t>Run (qwen2.5:3b)</w:t>
+              <w:t>Run (gpt-oss-20b)</w:t>
             </w:r>
           </w:p>
         </w:tc>
@@ -8616,7 +8616,7 @@
               <w:rPr>
                 <w:sz w:val="19"/>
               </w:rPr>
-              <w:t>0.47 h</w:t>
+              <w:t>0.07 h</w:t>
             </w:r>
           </w:p>
         </w:tc>
@@ -8696,7 +8696,7 @@
               <w:rPr>
                 <w:sz w:val="19"/>
               </w:rPr>
-              <w:t>13/15</w:t>
+              <w:t>14/15</w:t>
             </w:r>
           </w:p>
         </w:tc>
@@ -8712,7 +8712,7 @@
               <w:rPr>
                 <w:sz w:val="19"/>
               </w:rPr>
-              <w:t>2</w:t>
+              <w:t>1</w:t>
             </w:r>
           </w:p>
         </w:tc>
@@ -8749,7 +8749,7 @@
               <w:rPr>
                 <w:sz w:val="19"/>
               </w:rPr>
-              <w:t>0.43 h</w:t>
+              <w:t>0.77 h</w:t>
             </w:r>
           </w:p>
         </w:tc>
@@ -8765,7 +8765,7 @@
               <w:rPr>
                 <w:sz w:val="19"/>
               </w:rPr>
-              <w:t>96.6%</w:t>
+              <w:t>89.7%</w:t>
             </w:r>
           </w:p>
         </w:tc>
@@ -8829,7 +8829,7 @@
               <w:rPr>
                 <w:sz w:val="19"/>
               </w:rPr>
-              <w:t>13/15</w:t>
+              <w:t>11/15</w:t>
             </w:r>
           </w:p>
         </w:tc>
@@ -8882,7 +8882,7 @@
               <w:rPr>
                 <w:sz w:val="19"/>
               </w:rPr>
-              <w:t>3.83 h</w:t>
+              <w:t>0.57 h</w:t>
             </w:r>
           </w:p>
         </w:tc>
@@ -8898,7 +8898,7 @@
               <w:rPr>
                 <w:sz w:val="19"/>
               </w:rPr>
-              <w:t>75.9%</w:t>
+              <w:t>94.3%</w:t>
             </w:r>
           </w:p>
         </w:tc>
@@ -8930,7 +8930,7 @@
               <w:rPr>
                 <w:sz w:val="19"/>
               </w:rPr>
-              <w:t>95.7%</w:t>
+              <w:t>100%</w:t>
             </w:r>
           </w:p>
         </w:tc>
@@ -8946,7 +8946,7 @@
               <w:rPr>
                 <w:sz w:val="19"/>
               </w:rPr>
-              <w:t>1/15</w:t>
+              <w:t>13/15</w:t>
             </w:r>
           </w:p>
         </w:tc>
@@ -8962,7 +8962,7 @@
               <w:rPr>
                 <w:sz w:val="19"/>
               </w:rPr>
-              <w:t>4/15</w:t>
+              <w:t>13/15</w:t>
             </w:r>
           </w:p>
         </w:tc>
@@ -8978,7 +8978,7 @@
               <w:rPr>
                 <w:sz w:val="19"/>
               </w:rPr>
-              <w:t>22</w:t>
+              <w:t>0.7</w:t>
             </w:r>
           </w:p>
         </w:tc>
@@ -9389,7 +9389,7 @@
       <w:pPr>
         <w:pStyle w:val="Heading2"/>
       </w:pPr>
-      <w:bookmarkStart w:id="25" w:name="_Toc243609761"/>
+      <w:bookmarkStart w:id="25" w:name="_Toc243612596"/>
       <w:r>
         <w:t>Interpretation</w:t>
       </w:r>
@@ -9404,10 +9404,7 @@
         <w:rPr>
           <w:b/>
         </w:rPr>
-        <w:t xml:space="preserve">The agent graph is about eight times more accurate than a chatbot on the same model </w:t>
-      </w:r>
-      <w:r>
-        <w:t>(0.47 h against 3.83 h). The chatbot's log added to 24 h in only 1/15 reports: for complete 24-hour logs it reported totals between 11 h and 126 h, which is why arithmetic is kept in Python.</w:t>
+        <w:t>The agent graph is about eight times more accurate than a chatbot on the same model (0.07 h against 0.57 h), and every one of its logs adds to 24 h. The chatbot's totals were off on 2 of 15 reports, which is why arithmetic is kept in Python.</w:t>
       </w:r>
     </w:p>
     <w:p>
@@ -9419,10 +9416,7 @@
         <w:rPr>
           <w:b/>
         </w:rPr>
-        <w:t xml:space="preserve">The Critic caught both planted errors (2/2) </w:t>
-      </w:r>
-      <w:r>
-        <w:t>and the retry fixed them. Without it, W-02 D14 reports 23.5 h and W-03 D13 reports 24.5 h, so only 13 of 15 logs add to 24 h.</w:t>
+        <w:t>The Critic caught both planted errors (2/2) and the retry fixed them. Without it, W-02 D14 reports 23.5 h and W-03 D13 reports 24.5 h, so only 13 of 15 logs add to 24 h and the error rises from 0.07 h to 0.77 h.</w:t>
       </w:r>
     </w:p>
     <w:p>
@@ -9434,10 +9428,7 @@
         <w:rPr>
           <w:b/>
         </w:rPr>
-        <w:t xml:space="preserve">Why 'without Critic' has a slightly lower MAE: </w:t>
-      </w:r>
-      <w:r>
-        <w:t>0.43 h against 0.47 h, because two mistakes cancel on W-02 D14. Without the Critic the missing 0.5 h offsets part of a separate 3 h mislabel; with the Critic the 0.5 h is correctly recovered and only the mislabel remains. The no-Critic run is wrong in two ways, which category accuracy and the 24 h check show.</w:t>
+        <w:t>The one remaining error is W-02 D11: the model counts a 1-hour 'flow checked, well static' after a kick as well control; the answer key calls it productive. The engineer fixes it with one reject comment (Figure 5). This is the main argument for keeping a human in the loop.</w:t>
       </w:r>
     </w:p>
     <w:p>
@@ -9449,10 +9440,19 @@
         <w:rPr>
           <w:b/>
         </w:rPr>
-        <w:t xml:space="preserve">The two remaining errors are confident mislabels of planned work: </w:t>
-      </w:r>
-      <w:r>
-        <w:t>'slipped and cut drill line, serviced rig' (W-02 D14, 3 h) and 'waited on cement' (W-03 D14, 4 h), both labelled waiting on equipment with confidence of 0.9 or more, so the 0.7 confidence floor does not flag them. The engineer fixes each with one reject comment (Figure 5). This is the main argument for keeping a human in the loop.</w:t>
+        <w:t>Model output varies between runs even at temperature 0. In some runs the model labels the planned 'slipped and cut drill line' (W-02 D14, 3 h) as NPT with high confidence, so the 0.7 confidence floor does not flag it; the engineer corrects it the same way.</w:t>
+      </w:r>
+    </w:p>
+    <w:p>
+      <w:pPr>
+        <w:pStyle w:val="ListBullet"/>
+        <w:spacing w:after="60"/>
+      </w:pPr>
+      <w:r>
+        <w:rPr>
+          <w:b/>
+        </w:rPr>
+        <w:t>Repeatability: the chatbot was run three times in the same evaluation; its mean error was 0.63 h, 0.63 h and 0.43 h (the table shows the mean).</w:t>
       </w:r>
     </w:p>
     <w:p>
@@ -9465,10 +9465,10 @@
           <w:b/>
         </w:rPr>
         <w:lastRenderedPageBreak/>
-        <w:t xml:space="preserve">Repeatability: </w:t>
-      </w:r>
-      <w:r>
-        <w:t>the graph's results were identical across three separate runs on different occasions (temperature 0). The chatbot's three repeats within one evaluation run were identical too, but separate runs on different occasions gave mean errors of 4.43 h, 3.77 h and 3.83 h; the table shows the latest saved run.</w:t>
+        <w:t xml:space="preserve">LLM summaries misattribute numbers: </w:t>
+      </w:r>
+      <w:r>
+        <w:t>see Section 10. This was found from a real screenshot of the app, and is why the summary is a template by default.</w:t>
       </w:r>
     </w:p>
     <w:p>
@@ -9480,11 +9480,18 @@
         <w:rPr>
           <w:b/>
         </w:rPr>
-        <w:t xml:space="preserve">LLM summaries misattribute numbers: </w:t>
-      </w:r>
-      <w:r>
-        <w:t>see Section 10. This was found from a real screenshot of the app, and is why the summary is a template by default.</w:t>
-      </w:r>
+        <w:t>Prompt change, reported openly: the first Groq run scored 1.83 h, because the model called the trips out of and back into the hole to fix a failure 'productive'. One sentence with the standard NPT definition ('time spent recovering from a failure is NPT') was added to both our prompt and the chatbot's, so the comparison stays fair. It is a general rule, not tuned to individual reports.</w:t>
+      </w:r>
+    </w:p>
+    <w:p>
+      <w:pPr>
+        <w:pStyle w:val="Heading1"/>
+      </w:pPr>
+      <w:bookmarkStart w:id="26" w:name="_Toc243612597"/>
+      <w:r>
+        <w:t>15. Limitations and responsible use</w:t>
+      </w:r>
+      <w:bookmarkEnd w:id="26"/>
     </w:p>
     <w:p>
       <w:pPr>
@@ -9492,24 +9499,8 @@
         <w:spacing w:after="60"/>
       </w:pPr>
       <w:r>
-        <w:rPr>
-          <w:b/>
-        </w:rPr>
-        <w:t xml:space="preserve">Tried and rejected: </w:t>
-      </w:r>
-      <w:r>
-        <w:t>a 'decide planned or unplanned first' classification prompt scored 60 of 73 lines against 71 of 73 for the simple prompt, so the simple prompt was kept rather than tuning the prompt to the test set.</w:t>
-      </w:r>
-    </w:p>
-    <w:p>
-      <w:pPr>
-        <w:pStyle w:val="Heading1"/>
-      </w:pPr>
-      <w:bookmarkStart w:id="26" w:name="_Toc243609762"/>
-      <w:r>
-        <w:t>15. Limitations and responsible use</w:t>
-      </w:r>
-      <w:bookmarkEnd w:id="26"/>
+        <w:t>Synthetic data only: 15 reports, three wells, one report format and six NPT categories. Results on real, messier reports would be lower.</w:t>
+      </w:r>
     </w:p>
     <w:p>
       <w:pPr>
@@ -9517,7 +9508,7 @@
         <w:spacing w:after="60"/>
       </w:pPr>
       <w:r>
-        <w:t>Synthetic data only: 15 reports, three wells, one report format and six NPT categories. Results on real, messier reports would be lower.</w:t>
+        <w:t>The model sometimes labels routine or planned work as NPT with high confidence, so confidence alone is not a safe filter. The online model needs a Groq key and an internet connection, and the free tier has per-minute and per-day limits. The mock classifier only knows its keywords, and its accuracy is optimistic because the keywords and the synthetic reports share a vocabulary.</w:t>
       </w:r>
     </w:p>
     <w:p>
@@ -9526,7 +9517,7 @@
         <w:spacing w:after="60"/>
       </w:pPr>
       <w:r>
-        <w:t>The 3B local model mislabels some planned work as NPT with high confidence, so confidence alone is not a safe filter. The mock classifier only knows its keywords, and its accuracy is optimistic because the keywords and the synthetic reports share a vocabulary.</w:t>
+        <w:t>The parser expects HH:MM-HH:MM entries. Other formats are reported as errors rather than understood.</w:t>
       </w:r>
     </w:p>
     <w:p>
@@ -9535,7 +9526,7 @@
         <w:spacing w:after="60"/>
       </w:pPr>
       <w:r>
-        <w:t>The parser expects HH:MM-HH:MM entries. Other formats are reported as errors rather than understood.</w:t>
+        <w:t>Overlap trimming is a guess about which line is wrong; it is disclosed in the report for the crew to confirm.</w:t>
       </w:r>
     </w:p>
     <w:p>
@@ -9544,7 +9535,7 @@
         <w:spacing w:after="60"/>
       </w:pPr>
       <w:r>
-        <w:t>Overlap trimming is a guess about which line is wrong; it is disclosed in the report for the crew to confirm.</w:t>
+        <w:t>Engineer overrides apply to that run; they are stored but not yet learned from.</w:t>
       </w:r>
     </w:p>
     <w:p>
@@ -9553,7 +9544,7 @@
         <w:spacing w:after="60"/>
       </w:pPr>
       <w:r>
-        <w:t>Engineer overrides apply to that run; they are stored but not yet learned from.</w:t>
+        <w:t>The likely cause is inferred from similar past incidents, not observed, and is labelled as such.</w:t>
       </w:r>
     </w:p>
     <w:p>
@@ -9562,8 +9553,18 @@
         <w:spacing w:after="60"/>
       </w:pPr>
       <w:r>
-        <w:t>The likely cause is inferred from similar past incidents, not observed, and is labelled as such.</w:t>
-      </w:r>
+        <w:t>This is not a certified engineering or safety tool. Every report needs an engineer's approval, and the system never sends anything on its own.</w:t>
+      </w:r>
+    </w:p>
+    <w:p>
+      <w:pPr>
+        <w:pStyle w:val="Heading1"/>
+      </w:pPr>
+      <w:bookmarkStart w:id="27" w:name="_Toc243612598"/>
+      <w:r>
+        <w:t>16. Future enhancements</w:t>
+      </w:r>
+      <w:bookmarkEnd w:id="27"/>
     </w:p>
     <w:p>
       <w:pPr>
@@ -9571,18 +9572,8 @@
         <w:spacing w:after="60"/>
       </w:pPr>
       <w:r>
-        <w:t>This is not a certified engineering or safety tool. Every report needs an engineer's approval, and the system never sends anything on its own.</w:t>
-      </w:r>
-    </w:p>
-    <w:p>
-      <w:pPr>
-        <w:pStyle w:val="Heading1"/>
-      </w:pPr>
-      <w:bookmarkStart w:id="27" w:name="_Toc243609763"/>
-      <w:r>
-        <w:t>16. Future enhancements</w:t>
-      </w:r>
-      <w:bookmarkEnd w:id="27"/>
+        <w:t>Live rig data feeds (for example WITSML) and many wells at once.</w:t>
+      </w:r>
     </w:p>
     <w:p>
       <w:pPr>
@@ -9590,7 +9581,7 @@
         <w:spacing w:after="60"/>
       </w:pPr>
       <w:r>
-        <w:t>Live rig data feeds (for example WITSML) and many wells at once.</w:t>
+        <w:t>Learning from engineer corrections, for example as few-shot examples drawn from the engineer_feedback table.</w:t>
       </w:r>
     </w:p>
     <w:p>
@@ -9599,7 +9590,7 @@
         <w:spacing w:after="60"/>
       </w:pPr>
       <w:r>
-        <w:t>Learning from engineer corrections, for example as few-shot examples drawn from the engineer_feedback table.</w:t>
+        <w:t>A larger or fine-tuned model for classification, evaluated on a held-out set.</w:t>
       </w:r>
     </w:p>
     <w:p>
@@ -9608,7 +9599,7 @@
         <w:spacing w:after="60"/>
       </w:pPr>
       <w:r>
-        <w:t>A larger or fine-tuned model for classification, evaluated on a held-out set.</w:t>
+        <w:t>A morning NPT alert to the drilling team and trends across wells: recurring causes and cost per category.</w:t>
       </w:r>
     </w:p>
     <w:p>
@@ -9617,7 +9608,7 @@
         <w:spacing w:after="60"/>
       </w:pPr>
       <w:r>
-        <w:t>A morning NPT alert to the drilling team and trends across wells: recurring causes and cost per category.</w:t>
+        <w:t>MCP connectors so the agents can read company systems (the DDR database, maintenance logs) directly.</w:t>
       </w:r>
     </w:p>
     <w:p>
@@ -9626,15 +9617,6 @@
         <w:spacing w:after="60"/>
       </w:pPr>
       <w:r>
-        <w:t>MCP connectors so the agents can read company systems (the DDR database, maintenance logs) directly.</w:t>
-      </w:r>
-    </w:p>
-    <w:p>
-      <w:pPr>
-        <w:pStyle w:val="ListBullet"/>
-        <w:spacing w:after="60"/>
-      </w:pPr>
-      <w:r>
         <w:t>Support for the IADC standard DDR fields instead of free text only (Source 2).</w:t>
       </w:r>
     </w:p>
@@ -9642,7 +9624,7 @@
       <w:pPr>
         <w:pStyle w:val="Heading1"/>
       </w:pPr>
-      <w:bookmarkStart w:id="28" w:name="_Toc243609764"/>
+      <w:bookmarkStart w:id="28" w:name="_Toc243612599"/>
       <w:r>
         <w:t>17. Conclusion</w:t>
       </w:r>
@@ -9650,14 +9632,14 @@
     </w:p>
     <w:p>
       <w:r>
-        <w:t>Reading the Rig shows that an agentic workflow, rather than a single prompt, is what makes a small local model useful for this task. Splitting the job into planning, research, tool-based execution and self-checking, with a human approval step built into the graph, gave exact and traceable numbers on every synthetic report, caught every planted data error, and left the engineer with two clear, quick corrections instead of a page of free text to read. Every number is computed by Python, every flag is sourced to a report line, and every report is approved by a person.</w:t>
+        <w:t>Reading the Rig shows that an agentic workflow, rather than a single prompt, is what makes a free language model reliable for this task. Splitting the job into planning, research, tool-based execution and self-checking, with a human approval step built into the graph, gave exact and traceable numbers on every synthetic report, caught every planted data error, and left the engineer with one clear, quick correction instead of a page of free text to read. Every number is computed by Python, every flag is sourced to a report line, and every report is approved by a person.</w:t>
       </w:r>
     </w:p>
     <w:p>
       <w:pPr>
         <w:pStyle w:val="Heading1"/>
       </w:pPr>
-      <w:bookmarkStart w:id="29" w:name="_Toc243609765"/>
+      <w:bookmarkStart w:id="29" w:name="_Toc243612600"/>
       <w:r>
         <w:lastRenderedPageBreak/>
         <w:t>References</w:t>
@@ -9785,9 +9767,7 @@
           <w:b/>
         </w:rPr>
         <w:tab/>
-      </w:r>
-      <w:r>
-        <w:t>Ollama: run large language models locally. ollama.com</w:t>
+        <w:t>Groq API Documentation. console.groq.com/docs</w:t>
       </w:r>
     </w:p>
     <w:p>
@@ -9911,16 +9891,14 @@
           <w:b/>
         </w:rPr>
         <w:tab/>
-      </w:r>
-      <w:r>
-        <w:t>Qwen Team. Qwen2.5 model family. qwenlm.github.io</w:t>
+        <w:t>OpenAI. gpt-oss-20b model card. openai.com</w:t>
       </w:r>
     </w:p>
     <w:p>
       <w:pPr>
         <w:pStyle w:val="Heading1"/>
       </w:pPr>
-      <w:bookmarkStart w:id="30" w:name="_Toc243609766"/>
+      <w:bookmarkStart w:id="30" w:name="_Toc243612601"/>
       <w:r>
         <w:t>Appendix A. How to run</w:t>
       </w:r>
@@ -10021,7 +9999,7 @@
           <w:rFonts w:ascii="Consolas" w:eastAsia="Consolas" w:hAnsi="Consolas"/>
           <w:sz w:val="18"/>
         </w:rPr>
-        <w:t>ollama pull qwen2.5:3b              # optional local model</w:t>
+        <w:t># put GROQ_API_KEY=... in a .env file   # optional: the real model (free key at console.groq.com)</w:t>
       </w:r>
     </w:p>
     <w:p>

</xml_diff>

<commit_message>
Audit pass: reorganize README, fix review findings in PPT and report, refresh preview images
</commit_message>
<xml_diff>
--- a/submission/Rig_Sight_CA3_Report.docx
+++ b/submission/Rig_Sight_CA3_Report.docx
@@ -196,14 +196,12 @@
     </w:p>
     <w:p>
       <w:pPr>
-        <w:pStyle w:val="Heading1"/>
-      </w:pPr>
-      <w:bookmarkStart w:id="0" w:name="_Toc243612571"/>
+        <w:pStyle w:val="TOCHeading"/>
+      </w:pPr>
       <w:r>
         <w:lastRenderedPageBreak/>
         <w:t>Contents</w:t>
       </w:r>
-      <w:bookmarkEnd w:id="0"/>
     </w:p>
     <w:p>
       <w:pPr>
@@ -230,13 +228,13 @@
       <w:r>
         <w:fldChar w:fldCharType="separate"/>
       </w:r>
-      <w:hyperlink w:anchor="_Toc243612571" w:history="1">
+      <w:hyperlink w:anchor="_Toc243613417" w:history="1">
         <w:r>
           <w:rPr>
             <w:rStyle w:val="Hyperlink"/>
             <w:noProof/>
           </w:rPr>
-          <w:t>Contents</w:t>
+          <w:t>Abstract</w:t>
         </w:r>
         <w:r>
           <w:rPr>
@@ -257,7 +255,7 @@
             <w:noProof/>
             <w:webHidden/>
           </w:rPr>
-          <w:instrText xml:space="preserve"> PAGEREF _Toc243612571 \h </w:instrText>
+          <w:instrText xml:space="preserve"> PAGEREF _Toc243613417 \h </w:instrText>
         </w:r>
         <w:r>
           <w:rPr>
@@ -277,7 +275,7 @@
             <w:noProof/>
             <w:webHidden/>
           </w:rPr>
-          <w:t>2</w:t>
+          <w:t>3</w:t>
         </w:r>
         <w:r>
           <w:rPr>
@@ -304,13 +302,13 @@
           <w14:ligatures w14:val="standardContextual"/>
         </w:rPr>
       </w:pPr>
-      <w:hyperlink w:anchor="_Toc243612572" w:history="1">
+      <w:hyperlink w:anchor="_Toc243613418" w:history="1">
         <w:r>
           <w:rPr>
             <w:rStyle w:val="Hyperlink"/>
             <w:noProof/>
           </w:rPr>
-          <w:t>Abstract</w:t>
+          <w:t>1. Introduction and domain background</w:t>
         </w:r>
         <w:r>
           <w:rPr>
@@ -331,7 +329,229 @@
             <w:noProof/>
             <w:webHidden/>
           </w:rPr>
-          <w:instrText xml:space="preserve"> PAGEREF _Toc243612572 \h </w:instrText>
+          <w:instrText xml:space="preserve"> PAGEREF _Toc243613418 \h </w:instrText>
+        </w:r>
+        <w:r>
+          <w:rPr>
+            <w:noProof/>
+            <w:webHidden/>
+          </w:rPr>
+        </w:r>
+        <w:r>
+          <w:rPr>
+            <w:noProof/>
+            <w:webHidden/>
+          </w:rPr>
+          <w:fldChar w:fldCharType="separate"/>
+        </w:r>
+        <w:r>
+          <w:rPr>
+            <w:noProof/>
+            <w:webHidden/>
+          </w:rPr>
+          <w:t>3</w:t>
+        </w:r>
+        <w:r>
+          <w:rPr>
+            <w:noProof/>
+            <w:webHidden/>
+          </w:rPr>
+          <w:fldChar w:fldCharType="end"/>
+        </w:r>
+      </w:hyperlink>
+    </w:p>
+    <w:p>
+      <w:pPr>
+        <w:pStyle w:val="TOC2"/>
+        <w:tabs>
+          <w:tab w:val="right" w:leader="dot" w:pos="9288"/>
+        </w:tabs>
+        <w:rPr>
+          <w:rFonts w:asciiTheme="minorHAnsi" w:hAnsiTheme="minorHAnsi"/>
+          <w:noProof/>
+          <w:kern w:val="2"/>
+          <w:sz w:val="24"/>
+          <w:szCs w:val="24"/>
+          <w:lang w:val="en-IN" w:eastAsia="en-IN"/>
+          <w14:ligatures w14:val="standardContextual"/>
+        </w:rPr>
+      </w:pPr>
+      <w:hyperlink w:anchor="_Toc243613419" w:history="1">
+        <w:r>
+          <w:rPr>
+            <w:rStyle w:val="Hyperlink"/>
+            <w:noProof/>
+          </w:rPr>
+          <w:t>1.1 Why oil and gas drilling</w:t>
+        </w:r>
+        <w:r>
+          <w:rPr>
+            <w:noProof/>
+            <w:webHidden/>
+          </w:rPr>
+          <w:tab/>
+        </w:r>
+        <w:r>
+          <w:rPr>
+            <w:noProof/>
+            <w:webHidden/>
+          </w:rPr>
+          <w:fldChar w:fldCharType="begin"/>
+        </w:r>
+        <w:r>
+          <w:rPr>
+            <w:noProof/>
+            <w:webHidden/>
+          </w:rPr>
+          <w:instrText xml:space="preserve"> PAGEREF _Toc243613419 \h </w:instrText>
+        </w:r>
+        <w:r>
+          <w:rPr>
+            <w:noProof/>
+            <w:webHidden/>
+          </w:rPr>
+        </w:r>
+        <w:r>
+          <w:rPr>
+            <w:noProof/>
+            <w:webHidden/>
+          </w:rPr>
+          <w:fldChar w:fldCharType="separate"/>
+        </w:r>
+        <w:r>
+          <w:rPr>
+            <w:noProof/>
+            <w:webHidden/>
+          </w:rPr>
+          <w:t>3</w:t>
+        </w:r>
+        <w:r>
+          <w:rPr>
+            <w:noProof/>
+            <w:webHidden/>
+          </w:rPr>
+          <w:fldChar w:fldCharType="end"/>
+        </w:r>
+      </w:hyperlink>
+    </w:p>
+    <w:p>
+      <w:pPr>
+        <w:pStyle w:val="TOC2"/>
+        <w:tabs>
+          <w:tab w:val="right" w:leader="dot" w:pos="9288"/>
+        </w:tabs>
+        <w:rPr>
+          <w:rFonts w:asciiTheme="minorHAnsi" w:hAnsiTheme="minorHAnsi"/>
+          <w:noProof/>
+          <w:kern w:val="2"/>
+          <w:sz w:val="24"/>
+          <w:szCs w:val="24"/>
+          <w:lang w:val="en-IN" w:eastAsia="en-IN"/>
+          <w14:ligatures w14:val="standardContextual"/>
+        </w:rPr>
+      </w:pPr>
+      <w:hyperlink w:anchor="_Toc243613420" w:history="1">
+        <w:r>
+          <w:rPr>
+            <w:rStyle w:val="Hyperlink"/>
+            <w:noProof/>
+          </w:rPr>
+          <w:t>1.2 The Daily Drilling Report</w:t>
+        </w:r>
+        <w:r>
+          <w:rPr>
+            <w:noProof/>
+            <w:webHidden/>
+          </w:rPr>
+          <w:tab/>
+        </w:r>
+        <w:r>
+          <w:rPr>
+            <w:noProof/>
+            <w:webHidden/>
+          </w:rPr>
+          <w:fldChar w:fldCharType="begin"/>
+        </w:r>
+        <w:r>
+          <w:rPr>
+            <w:noProof/>
+            <w:webHidden/>
+          </w:rPr>
+          <w:instrText xml:space="preserve"> PAGEREF _Toc243613420 \h </w:instrText>
+        </w:r>
+        <w:r>
+          <w:rPr>
+            <w:noProof/>
+            <w:webHidden/>
+          </w:rPr>
+        </w:r>
+        <w:r>
+          <w:rPr>
+            <w:noProof/>
+            <w:webHidden/>
+          </w:rPr>
+          <w:fldChar w:fldCharType="separate"/>
+        </w:r>
+        <w:r>
+          <w:rPr>
+            <w:noProof/>
+            <w:webHidden/>
+          </w:rPr>
+          <w:t>3</w:t>
+        </w:r>
+        <w:r>
+          <w:rPr>
+            <w:noProof/>
+            <w:webHidden/>
+          </w:rPr>
+          <w:fldChar w:fldCharType="end"/>
+        </w:r>
+      </w:hyperlink>
+    </w:p>
+    <w:p>
+      <w:pPr>
+        <w:pStyle w:val="TOC2"/>
+        <w:tabs>
+          <w:tab w:val="right" w:leader="dot" w:pos="9288"/>
+        </w:tabs>
+        <w:rPr>
+          <w:rFonts w:asciiTheme="minorHAnsi" w:hAnsiTheme="minorHAnsi"/>
+          <w:noProof/>
+          <w:kern w:val="2"/>
+          <w:sz w:val="24"/>
+          <w:szCs w:val="24"/>
+          <w:lang w:val="en-IN" w:eastAsia="en-IN"/>
+          <w14:ligatures w14:val="standardContextual"/>
+        </w:rPr>
+      </w:pPr>
+      <w:hyperlink w:anchor="_Toc243613421" w:history="1">
+        <w:r>
+          <w:rPr>
+            <w:rStyle w:val="Hyperlink"/>
+            <w:noProof/>
+          </w:rPr>
+          <w:t>1.3 Non-productive time</w:t>
+        </w:r>
+        <w:r>
+          <w:rPr>
+            <w:noProof/>
+            <w:webHidden/>
+          </w:rPr>
+          <w:tab/>
+        </w:r>
+        <w:r>
+          <w:rPr>
+            <w:noProof/>
+            <w:webHidden/>
+          </w:rPr>
+          <w:fldChar w:fldCharType="begin"/>
+        </w:r>
+        <w:r>
+          <w:rPr>
+            <w:noProof/>
+            <w:webHidden/>
+          </w:rPr>
+          <w:instrText xml:space="preserve"> PAGEREF _Toc243613421 \h </w:instrText>
         </w:r>
         <w:r>
           <w:rPr>
@@ -378,13 +598,13 @@
           <w14:ligatures w14:val="standardContextual"/>
         </w:rPr>
       </w:pPr>
-      <w:hyperlink w:anchor="_Toc243612573" w:history="1">
+      <w:hyperlink w:anchor="_Toc243613422" w:history="1">
         <w:r>
           <w:rPr>
             <w:rStyle w:val="Hyperlink"/>
             <w:noProof/>
           </w:rPr>
-          <w:t>1. Introduction and domain background</w:t>
+          <w:t>2. Problem statement</w:t>
         </w:r>
         <w:r>
           <w:rPr>
@@ -405,7 +625,7 @@
             <w:noProof/>
             <w:webHidden/>
           </w:rPr>
-          <w:instrText xml:space="preserve"> PAGEREF _Toc243612573 \h </w:instrText>
+          <w:instrText xml:space="preserve"> PAGEREF _Toc243613422 \h </w:instrText>
         </w:r>
         <w:r>
           <w:rPr>
@@ -425,7 +645,229 @@
             <w:noProof/>
             <w:webHidden/>
           </w:rPr>
-          <w:t>3</w:t>
+          <w:t>4</w:t>
+        </w:r>
+        <w:r>
+          <w:rPr>
+            <w:noProof/>
+            <w:webHidden/>
+          </w:rPr>
+          <w:fldChar w:fldCharType="end"/>
+        </w:r>
+      </w:hyperlink>
+    </w:p>
+    <w:p>
+      <w:pPr>
+        <w:pStyle w:val="TOC1"/>
+        <w:tabs>
+          <w:tab w:val="right" w:leader="dot" w:pos="9288"/>
+        </w:tabs>
+        <w:rPr>
+          <w:rFonts w:asciiTheme="minorHAnsi" w:hAnsiTheme="minorHAnsi"/>
+          <w:noProof/>
+          <w:kern w:val="2"/>
+          <w:sz w:val="24"/>
+          <w:szCs w:val="24"/>
+          <w:lang w:val="en-IN" w:eastAsia="en-IN"/>
+          <w14:ligatures w14:val="standardContextual"/>
+        </w:rPr>
+      </w:pPr>
+      <w:hyperlink w:anchor="_Toc243613423" w:history="1">
+        <w:r>
+          <w:rPr>
+            <w:rStyle w:val="Hyperlink"/>
+            <w:noProof/>
+          </w:rPr>
+          <w:t>3. Existing process and identified inefficiencies</w:t>
+        </w:r>
+        <w:r>
+          <w:rPr>
+            <w:noProof/>
+            <w:webHidden/>
+          </w:rPr>
+          <w:tab/>
+        </w:r>
+        <w:r>
+          <w:rPr>
+            <w:noProof/>
+            <w:webHidden/>
+          </w:rPr>
+          <w:fldChar w:fldCharType="begin"/>
+        </w:r>
+        <w:r>
+          <w:rPr>
+            <w:noProof/>
+            <w:webHidden/>
+          </w:rPr>
+          <w:instrText xml:space="preserve"> PAGEREF _Toc243613423 \h </w:instrText>
+        </w:r>
+        <w:r>
+          <w:rPr>
+            <w:noProof/>
+            <w:webHidden/>
+          </w:rPr>
+        </w:r>
+        <w:r>
+          <w:rPr>
+            <w:noProof/>
+            <w:webHidden/>
+          </w:rPr>
+          <w:fldChar w:fldCharType="separate"/>
+        </w:r>
+        <w:r>
+          <w:rPr>
+            <w:noProof/>
+            <w:webHidden/>
+          </w:rPr>
+          <w:t>4</w:t>
+        </w:r>
+        <w:r>
+          <w:rPr>
+            <w:noProof/>
+            <w:webHidden/>
+          </w:rPr>
+          <w:fldChar w:fldCharType="end"/>
+        </w:r>
+      </w:hyperlink>
+    </w:p>
+    <w:p>
+      <w:pPr>
+        <w:pStyle w:val="TOC1"/>
+        <w:tabs>
+          <w:tab w:val="right" w:leader="dot" w:pos="9288"/>
+        </w:tabs>
+        <w:rPr>
+          <w:rFonts w:asciiTheme="minorHAnsi" w:hAnsiTheme="minorHAnsi"/>
+          <w:noProof/>
+          <w:kern w:val="2"/>
+          <w:sz w:val="24"/>
+          <w:szCs w:val="24"/>
+          <w:lang w:val="en-IN" w:eastAsia="en-IN"/>
+          <w14:ligatures w14:val="standardContextual"/>
+        </w:rPr>
+      </w:pPr>
+      <w:hyperlink w:anchor="_Toc243613424" w:history="1">
+        <w:r>
+          <w:rPr>
+            <w:rStyle w:val="Hyperlink"/>
+            <w:noProof/>
+          </w:rPr>
+          <w:t>4. Proposed solution and objectives</w:t>
+        </w:r>
+        <w:r>
+          <w:rPr>
+            <w:noProof/>
+            <w:webHidden/>
+          </w:rPr>
+          <w:tab/>
+        </w:r>
+        <w:r>
+          <w:rPr>
+            <w:noProof/>
+            <w:webHidden/>
+          </w:rPr>
+          <w:fldChar w:fldCharType="begin"/>
+        </w:r>
+        <w:r>
+          <w:rPr>
+            <w:noProof/>
+            <w:webHidden/>
+          </w:rPr>
+          <w:instrText xml:space="preserve"> PAGEREF _Toc243613424 \h </w:instrText>
+        </w:r>
+        <w:r>
+          <w:rPr>
+            <w:noProof/>
+            <w:webHidden/>
+          </w:rPr>
+        </w:r>
+        <w:r>
+          <w:rPr>
+            <w:noProof/>
+            <w:webHidden/>
+          </w:rPr>
+          <w:fldChar w:fldCharType="separate"/>
+        </w:r>
+        <w:r>
+          <w:rPr>
+            <w:noProof/>
+            <w:webHidden/>
+          </w:rPr>
+          <w:t>4</w:t>
+        </w:r>
+        <w:r>
+          <w:rPr>
+            <w:noProof/>
+            <w:webHidden/>
+          </w:rPr>
+          <w:fldChar w:fldCharType="end"/>
+        </w:r>
+      </w:hyperlink>
+    </w:p>
+    <w:p>
+      <w:pPr>
+        <w:pStyle w:val="TOC1"/>
+        <w:tabs>
+          <w:tab w:val="right" w:leader="dot" w:pos="9288"/>
+        </w:tabs>
+        <w:rPr>
+          <w:rFonts w:asciiTheme="minorHAnsi" w:hAnsiTheme="minorHAnsi"/>
+          <w:noProof/>
+          <w:kern w:val="2"/>
+          <w:sz w:val="24"/>
+          <w:szCs w:val="24"/>
+          <w:lang w:val="en-IN" w:eastAsia="en-IN"/>
+          <w14:ligatures w14:val="standardContextual"/>
+        </w:rPr>
+      </w:pPr>
+      <w:hyperlink w:anchor="_Toc243613425" w:history="1">
+        <w:r>
+          <w:rPr>
+            <w:rStyle w:val="Hyperlink"/>
+            <w:noProof/>
+          </w:rPr>
+          <w:t>5. Requirements and technology stack</w:t>
+        </w:r>
+        <w:r>
+          <w:rPr>
+            <w:noProof/>
+            <w:webHidden/>
+          </w:rPr>
+          <w:tab/>
+        </w:r>
+        <w:r>
+          <w:rPr>
+            <w:noProof/>
+            <w:webHidden/>
+          </w:rPr>
+          <w:fldChar w:fldCharType="begin"/>
+        </w:r>
+        <w:r>
+          <w:rPr>
+            <w:noProof/>
+            <w:webHidden/>
+          </w:rPr>
+          <w:instrText xml:space="preserve"> PAGEREF _Toc243613425 \h </w:instrText>
+        </w:r>
+        <w:r>
+          <w:rPr>
+            <w:noProof/>
+            <w:webHidden/>
+          </w:rPr>
+        </w:r>
+        <w:r>
+          <w:rPr>
+            <w:noProof/>
+            <w:webHidden/>
+          </w:rPr>
+          <w:fldChar w:fldCharType="separate"/>
+        </w:r>
+        <w:r>
+          <w:rPr>
+            <w:noProof/>
+            <w:webHidden/>
+          </w:rPr>
+          <w:t>5</w:t>
         </w:r>
         <w:r>
           <w:rPr>
@@ -452,13 +894,13 @@
           <w14:ligatures w14:val="standardContextual"/>
         </w:rPr>
       </w:pPr>
-      <w:hyperlink w:anchor="_Toc243612574" w:history="1">
+      <w:hyperlink w:anchor="_Toc243613426" w:history="1">
         <w:r>
           <w:rPr>
             <w:rStyle w:val="Hyperlink"/>
             <w:noProof/>
           </w:rPr>
-          <w:t>1.1 Why oil and gas drilling</w:t>
+          <w:t>5.1 Functional requirements</w:t>
         </w:r>
         <w:r>
           <w:rPr>
@@ -479,7 +921,7 @@
             <w:noProof/>
             <w:webHidden/>
           </w:rPr>
-          <w:instrText xml:space="preserve"> PAGEREF _Toc243612574 \h </w:instrText>
+          <w:instrText xml:space="preserve"> PAGEREF _Toc243613426 \h </w:instrText>
         </w:r>
         <w:r>
           <w:rPr>
@@ -499,7 +941,7 @@
             <w:noProof/>
             <w:webHidden/>
           </w:rPr>
-          <w:t>3</w:t>
+          <w:t>5</w:t>
         </w:r>
         <w:r>
           <w:rPr>
@@ -526,13 +968,13 @@
           <w14:ligatures w14:val="standardContextual"/>
         </w:rPr>
       </w:pPr>
-      <w:hyperlink w:anchor="_Toc243612575" w:history="1">
+      <w:hyperlink w:anchor="_Toc243613427" w:history="1">
         <w:r>
           <w:rPr>
             <w:rStyle w:val="Hyperlink"/>
             <w:noProof/>
           </w:rPr>
-          <w:t>1.2 The Daily Drilling Report</w:t>
+          <w:t>5.2 Technology stack</w:t>
         </w:r>
         <w:r>
           <w:rPr>
@@ -553,7 +995,7 @@
             <w:noProof/>
             <w:webHidden/>
           </w:rPr>
-          <w:instrText xml:space="preserve"> PAGEREF _Toc243612575 \h </w:instrText>
+          <w:instrText xml:space="preserve"> PAGEREF _Toc243613427 \h </w:instrText>
         </w:r>
         <w:r>
           <w:rPr>
@@ -573,7 +1015,229 @@
             <w:noProof/>
             <w:webHidden/>
           </w:rPr>
-          <w:t>3</w:t>
+          <w:t>5</w:t>
+        </w:r>
+        <w:r>
+          <w:rPr>
+            <w:noProof/>
+            <w:webHidden/>
+          </w:rPr>
+          <w:fldChar w:fldCharType="end"/>
+        </w:r>
+      </w:hyperlink>
+    </w:p>
+    <w:p>
+      <w:pPr>
+        <w:pStyle w:val="TOC1"/>
+        <w:tabs>
+          <w:tab w:val="right" w:leader="dot" w:pos="9288"/>
+        </w:tabs>
+        <w:rPr>
+          <w:rFonts w:asciiTheme="minorHAnsi" w:hAnsiTheme="minorHAnsi"/>
+          <w:noProof/>
+          <w:kern w:val="2"/>
+          <w:sz w:val="24"/>
+          <w:szCs w:val="24"/>
+          <w:lang w:val="en-IN" w:eastAsia="en-IN"/>
+          <w14:ligatures w14:val="standardContextual"/>
+        </w:rPr>
+      </w:pPr>
+      <w:hyperlink w:anchor="_Toc243613428" w:history="1">
+        <w:r>
+          <w:rPr>
+            <w:rStyle w:val="Hyperlink"/>
+            <w:noProof/>
+          </w:rPr>
+          <w:t>6. System architecture and data flow</w:t>
+        </w:r>
+        <w:r>
+          <w:rPr>
+            <w:noProof/>
+            <w:webHidden/>
+          </w:rPr>
+          <w:tab/>
+        </w:r>
+        <w:r>
+          <w:rPr>
+            <w:noProof/>
+            <w:webHidden/>
+          </w:rPr>
+          <w:fldChar w:fldCharType="begin"/>
+        </w:r>
+        <w:r>
+          <w:rPr>
+            <w:noProof/>
+            <w:webHidden/>
+          </w:rPr>
+          <w:instrText xml:space="preserve"> PAGEREF _Toc243613428 \h </w:instrText>
+        </w:r>
+        <w:r>
+          <w:rPr>
+            <w:noProof/>
+            <w:webHidden/>
+          </w:rPr>
+        </w:r>
+        <w:r>
+          <w:rPr>
+            <w:noProof/>
+            <w:webHidden/>
+          </w:rPr>
+          <w:fldChar w:fldCharType="separate"/>
+        </w:r>
+        <w:r>
+          <w:rPr>
+            <w:noProof/>
+            <w:webHidden/>
+          </w:rPr>
+          <w:t>5</w:t>
+        </w:r>
+        <w:r>
+          <w:rPr>
+            <w:noProof/>
+            <w:webHidden/>
+          </w:rPr>
+          <w:fldChar w:fldCharType="end"/>
+        </w:r>
+      </w:hyperlink>
+    </w:p>
+    <w:p>
+      <w:pPr>
+        <w:pStyle w:val="TOC1"/>
+        <w:tabs>
+          <w:tab w:val="right" w:leader="dot" w:pos="9288"/>
+        </w:tabs>
+        <w:rPr>
+          <w:rFonts w:asciiTheme="minorHAnsi" w:hAnsiTheme="minorHAnsi"/>
+          <w:noProof/>
+          <w:kern w:val="2"/>
+          <w:sz w:val="24"/>
+          <w:szCs w:val="24"/>
+          <w:lang w:val="en-IN" w:eastAsia="en-IN"/>
+          <w14:ligatures w14:val="standardContextual"/>
+        </w:rPr>
+      </w:pPr>
+      <w:hyperlink w:anchor="_Toc243613429" w:history="1">
+        <w:r>
+          <w:rPr>
+            <w:rStyle w:val="Hyperlink"/>
+            <w:noProof/>
+          </w:rPr>
+          <w:t>7. Agent roles and orchestration</w:t>
+        </w:r>
+        <w:r>
+          <w:rPr>
+            <w:noProof/>
+            <w:webHidden/>
+          </w:rPr>
+          <w:tab/>
+        </w:r>
+        <w:r>
+          <w:rPr>
+            <w:noProof/>
+            <w:webHidden/>
+          </w:rPr>
+          <w:fldChar w:fldCharType="begin"/>
+        </w:r>
+        <w:r>
+          <w:rPr>
+            <w:noProof/>
+            <w:webHidden/>
+          </w:rPr>
+          <w:instrText xml:space="preserve"> PAGEREF _Toc243613429 \h </w:instrText>
+        </w:r>
+        <w:r>
+          <w:rPr>
+            <w:noProof/>
+            <w:webHidden/>
+          </w:rPr>
+        </w:r>
+        <w:r>
+          <w:rPr>
+            <w:noProof/>
+            <w:webHidden/>
+          </w:rPr>
+          <w:fldChar w:fldCharType="separate"/>
+        </w:r>
+        <w:r>
+          <w:rPr>
+            <w:noProof/>
+            <w:webHidden/>
+          </w:rPr>
+          <w:t>8</w:t>
+        </w:r>
+        <w:r>
+          <w:rPr>
+            <w:noProof/>
+            <w:webHidden/>
+          </w:rPr>
+          <w:fldChar w:fldCharType="end"/>
+        </w:r>
+      </w:hyperlink>
+    </w:p>
+    <w:p>
+      <w:pPr>
+        <w:pStyle w:val="TOC1"/>
+        <w:tabs>
+          <w:tab w:val="right" w:leader="dot" w:pos="9288"/>
+        </w:tabs>
+        <w:rPr>
+          <w:rFonts w:asciiTheme="minorHAnsi" w:hAnsiTheme="minorHAnsi"/>
+          <w:noProof/>
+          <w:kern w:val="2"/>
+          <w:sz w:val="24"/>
+          <w:szCs w:val="24"/>
+          <w:lang w:val="en-IN" w:eastAsia="en-IN"/>
+          <w14:ligatures w14:val="standardContextual"/>
+        </w:rPr>
+      </w:pPr>
+      <w:hyperlink w:anchor="_Toc243613430" w:history="1">
+        <w:r>
+          <w:rPr>
+            <w:rStyle w:val="Hyperlink"/>
+            <w:noProof/>
+          </w:rPr>
+          <w:t>8. Data model, synthetic dataset and reference files</w:t>
+        </w:r>
+        <w:r>
+          <w:rPr>
+            <w:noProof/>
+            <w:webHidden/>
+          </w:rPr>
+          <w:tab/>
+        </w:r>
+        <w:r>
+          <w:rPr>
+            <w:noProof/>
+            <w:webHidden/>
+          </w:rPr>
+          <w:fldChar w:fldCharType="begin"/>
+        </w:r>
+        <w:r>
+          <w:rPr>
+            <w:noProof/>
+            <w:webHidden/>
+          </w:rPr>
+          <w:instrText xml:space="preserve"> PAGEREF _Toc243613430 \h </w:instrText>
+        </w:r>
+        <w:r>
+          <w:rPr>
+            <w:noProof/>
+            <w:webHidden/>
+          </w:rPr>
+        </w:r>
+        <w:r>
+          <w:rPr>
+            <w:noProof/>
+            <w:webHidden/>
+          </w:rPr>
+          <w:fldChar w:fldCharType="separate"/>
+        </w:r>
+        <w:r>
+          <w:rPr>
+            <w:noProof/>
+            <w:webHidden/>
+          </w:rPr>
+          <w:t>8</w:t>
         </w:r>
         <w:r>
           <w:rPr>
@@ -600,13 +1264,13 @@
           <w14:ligatures w14:val="standardContextual"/>
         </w:rPr>
       </w:pPr>
-      <w:hyperlink w:anchor="_Toc243612576" w:history="1">
+      <w:hyperlink w:anchor="_Toc243613431" w:history="1">
         <w:r>
           <w:rPr>
             <w:rStyle w:val="Hyperlink"/>
             <w:noProof/>
           </w:rPr>
-          <w:t>1.3 Non-productive time</w:t>
+          <w:t>8.1 Shared state (DDRState)</w:t>
         </w:r>
         <w:r>
           <w:rPr>
@@ -627,7 +1291,7 @@
             <w:noProof/>
             <w:webHidden/>
           </w:rPr>
-          <w:instrText xml:space="preserve"> PAGEREF _Toc243612576 \h </w:instrText>
+          <w:instrText xml:space="preserve"> PAGEREF _Toc243613431 \h </w:instrText>
         </w:r>
         <w:r>
           <w:rPr>
@@ -647,7 +1311,81 @@
             <w:noProof/>
             <w:webHidden/>
           </w:rPr>
-          <w:t>3</w:t>
+          <w:t>8</w:t>
+        </w:r>
+        <w:r>
+          <w:rPr>
+            <w:noProof/>
+            <w:webHidden/>
+          </w:rPr>
+          <w:fldChar w:fldCharType="end"/>
+        </w:r>
+      </w:hyperlink>
+    </w:p>
+    <w:p>
+      <w:pPr>
+        <w:pStyle w:val="TOC2"/>
+        <w:tabs>
+          <w:tab w:val="right" w:leader="dot" w:pos="9288"/>
+        </w:tabs>
+        <w:rPr>
+          <w:rFonts w:asciiTheme="minorHAnsi" w:hAnsiTheme="minorHAnsi"/>
+          <w:noProof/>
+          <w:kern w:val="2"/>
+          <w:sz w:val="24"/>
+          <w:szCs w:val="24"/>
+          <w:lang w:val="en-IN" w:eastAsia="en-IN"/>
+          <w14:ligatures w14:val="standardContextual"/>
+        </w:rPr>
+      </w:pPr>
+      <w:hyperlink w:anchor="_Toc243613432" w:history="1">
+        <w:r>
+          <w:rPr>
+            <w:rStyle w:val="Hyperlink"/>
+            <w:noProof/>
+          </w:rPr>
+          <w:t>8.2 Synthetic dataset</w:t>
+        </w:r>
+        <w:r>
+          <w:rPr>
+            <w:noProof/>
+            <w:webHidden/>
+          </w:rPr>
+          <w:tab/>
+        </w:r>
+        <w:r>
+          <w:rPr>
+            <w:noProof/>
+            <w:webHidden/>
+          </w:rPr>
+          <w:fldChar w:fldCharType="begin"/>
+        </w:r>
+        <w:r>
+          <w:rPr>
+            <w:noProof/>
+            <w:webHidden/>
+          </w:rPr>
+          <w:instrText xml:space="preserve"> PAGEREF _Toc243613432 \h </w:instrText>
+        </w:r>
+        <w:r>
+          <w:rPr>
+            <w:noProof/>
+            <w:webHidden/>
+          </w:rPr>
+        </w:r>
+        <w:r>
+          <w:rPr>
+            <w:noProof/>
+            <w:webHidden/>
+          </w:rPr>
+          <w:fldChar w:fldCharType="separate"/>
+        </w:r>
+        <w:r>
+          <w:rPr>
+            <w:noProof/>
+            <w:webHidden/>
+          </w:rPr>
+          <w:t>9</w:t>
         </w:r>
         <w:r>
           <w:rPr>
@@ -674,13 +1412,13 @@
           <w14:ligatures w14:val="standardContextual"/>
         </w:rPr>
       </w:pPr>
-      <w:hyperlink w:anchor="_Toc243612577" w:history="1">
+      <w:hyperlink w:anchor="_Toc243613433" w:history="1">
         <w:r>
           <w:rPr>
             <w:rStyle w:val="Hyperlink"/>
             <w:noProof/>
           </w:rPr>
-          <w:t>2. Problem statement</w:t>
+          <w:t>9. Implementation details</w:t>
         </w:r>
         <w:r>
           <w:rPr>
@@ -701,7 +1439,7 @@
             <w:noProof/>
             <w:webHidden/>
           </w:rPr>
-          <w:instrText xml:space="preserve"> PAGEREF _Toc243612577 \h </w:instrText>
+          <w:instrText xml:space="preserve"> PAGEREF _Toc243613433 \h </w:instrText>
         </w:r>
         <w:r>
           <w:rPr>
@@ -721,7 +1459,7 @@
             <w:noProof/>
             <w:webHidden/>
           </w:rPr>
-          <w:t>4</w:t>
+          <w:t>9</w:t>
         </w:r>
         <w:r>
           <w:rPr>
@@ -748,13 +1486,13 @@
           <w14:ligatures w14:val="standardContextual"/>
         </w:rPr>
       </w:pPr>
-      <w:hyperlink w:anchor="_Toc243612578" w:history="1">
+      <w:hyperlink w:anchor="_Toc243613434" w:history="1">
         <w:r>
           <w:rPr>
             <w:rStyle w:val="Hyperlink"/>
             <w:noProof/>
           </w:rPr>
-          <w:t>3. Existing process and identified inefficiencies</w:t>
+          <w:t>10. Deterministic tools and model usage</w:t>
         </w:r>
         <w:r>
           <w:rPr>
@@ -775,7 +1513,7 @@
             <w:noProof/>
             <w:webHidden/>
           </w:rPr>
-          <w:instrText xml:space="preserve"> PAGEREF _Toc243612578 \h </w:instrText>
+          <w:instrText xml:space="preserve"> PAGEREF _Toc243613434 \h </w:instrText>
         </w:r>
         <w:r>
           <w:rPr>
@@ -795,7 +1533,7 @@
             <w:noProof/>
             <w:webHidden/>
           </w:rPr>
-          <w:t>4</w:t>
+          <w:t>10</w:t>
         </w:r>
         <w:r>
           <w:rPr>
@@ -822,13 +1560,13 @@
           <w14:ligatures w14:val="standardContextual"/>
         </w:rPr>
       </w:pPr>
-      <w:hyperlink w:anchor="_Toc243612579" w:history="1">
+      <w:hyperlink w:anchor="_Toc243613435" w:history="1">
         <w:r>
           <w:rPr>
             <w:rStyle w:val="Hyperlink"/>
             <w:noProof/>
           </w:rPr>
-          <w:t>4. Proposed solution and objectives</w:t>
+          <w:t>11. Critic validation, retries and human-in-the-loop review</w:t>
         </w:r>
         <w:r>
           <w:rPr>
@@ -849,7 +1587,7 @@
             <w:noProof/>
             <w:webHidden/>
           </w:rPr>
-          <w:instrText xml:space="preserve"> PAGEREF _Toc243612579 \h </w:instrText>
+          <w:instrText xml:space="preserve"> PAGEREF _Toc243613435 \h </w:instrText>
         </w:r>
         <w:r>
           <w:rPr>
@@ -869,7 +1607,7 @@
             <w:noProof/>
             <w:webHidden/>
           </w:rPr>
-          <w:t>4</w:t>
+          <w:t>10</w:t>
         </w:r>
         <w:r>
           <w:rPr>
@@ -896,13 +1634,13 @@
           <w14:ligatures w14:val="standardContextual"/>
         </w:rPr>
       </w:pPr>
-      <w:hyperlink w:anchor="_Toc243612580" w:history="1">
+      <w:hyperlink w:anchor="_Toc243613436" w:history="1">
         <w:r>
           <w:rPr>
             <w:rStyle w:val="Hyperlink"/>
             <w:noProof/>
           </w:rPr>
-          <w:t>5. Requirements and technology stack</w:t>
+          <w:t>12. Web interface</w:t>
         </w:r>
         <w:r>
           <w:rPr>
@@ -923,7 +1661,7 @@
             <w:noProof/>
             <w:webHidden/>
           </w:rPr>
-          <w:instrText xml:space="preserve"> PAGEREF _Toc243612580 \h </w:instrText>
+          <w:instrText xml:space="preserve"> PAGEREF _Toc243613436 \h </w:instrText>
         </w:r>
         <w:r>
           <w:rPr>
@@ -943,7 +1681,7 @@
             <w:noProof/>
             <w:webHidden/>
           </w:rPr>
-          <w:t>5</w:t>
+          <w:t>11</w:t>
         </w:r>
         <w:r>
           <w:rPr>
@@ -970,13 +1708,13 @@
           <w14:ligatures w14:val="standardContextual"/>
         </w:rPr>
       </w:pPr>
-      <w:hyperlink w:anchor="_Toc243612581" w:history="1">
+      <w:hyperlink w:anchor="_Toc243613437" w:history="1">
         <w:r>
           <w:rPr>
             <w:rStyle w:val="Hyperlink"/>
             <w:noProof/>
           </w:rPr>
-          <w:t>5.1 Functional requirements</w:t>
+          <w:t>12.1 Deployment</w:t>
         </w:r>
         <w:r>
           <w:rPr>
@@ -997,7 +1735,7 @@
             <w:noProof/>
             <w:webHidden/>
           </w:rPr>
-          <w:instrText xml:space="preserve"> PAGEREF _Toc243612581 \h </w:instrText>
+          <w:instrText xml:space="preserve"> PAGEREF _Toc243613437 \h </w:instrText>
         </w:r>
         <w:r>
           <w:rPr>
@@ -1017,7 +1755,7 @@
             <w:noProof/>
             <w:webHidden/>
           </w:rPr>
-          <w:t>5</w:t>
+          <w:t>11</w:t>
         </w:r>
         <w:r>
           <w:rPr>
@@ -1044,13 +1782,13 @@
           <w14:ligatures w14:val="standardContextual"/>
         </w:rPr>
       </w:pPr>
-      <w:hyperlink w:anchor="_Toc243612582" w:history="1">
+      <w:hyperlink w:anchor="_Toc243613438" w:history="1">
         <w:r>
           <w:rPr>
             <w:rStyle w:val="Hyperlink"/>
             <w:noProof/>
           </w:rPr>
-          <w:t>5.2 Technology stack</w:t>
+          <w:t>12.2 Screens</w:t>
         </w:r>
         <w:r>
           <w:rPr>
@@ -1071,7 +1809,7 @@
             <w:noProof/>
             <w:webHidden/>
           </w:rPr>
-          <w:instrText xml:space="preserve"> PAGEREF _Toc243612582 \h </w:instrText>
+          <w:instrText xml:space="preserve"> PAGEREF _Toc243613438 \h </w:instrText>
         </w:r>
         <w:r>
           <w:rPr>
@@ -1091,7 +1829,7 @@
             <w:noProof/>
             <w:webHidden/>
           </w:rPr>
-          <w:t>5</w:t>
+          <w:t>11</w:t>
         </w:r>
         <w:r>
           <w:rPr>
@@ -1118,13 +1856,13 @@
           <w14:ligatures w14:val="standardContextual"/>
         </w:rPr>
       </w:pPr>
-      <w:hyperlink w:anchor="_Toc243612583" w:history="1">
+      <w:hyperlink w:anchor="_Toc243613439" w:history="1">
         <w:r>
           <w:rPr>
             <w:rStyle w:val="Hyperlink"/>
             <w:noProof/>
           </w:rPr>
-          <w:t>6. System architecture and data flow</w:t>
+          <w:t>13. Testing methodology and test cases</w:t>
         </w:r>
         <w:r>
           <w:rPr>
@@ -1145,7 +1883,7 @@
             <w:noProof/>
             <w:webHidden/>
           </w:rPr>
-          <w:instrText xml:space="preserve"> PAGEREF _Toc243612583 \h </w:instrText>
+          <w:instrText xml:space="preserve"> PAGEREF _Toc243613439 \h </w:instrText>
         </w:r>
         <w:r>
           <w:rPr>
@@ -1165,7 +1903,7 @@
             <w:noProof/>
             <w:webHidden/>
           </w:rPr>
-          <w:t>5</w:t>
+          <w:t>15</w:t>
         </w:r>
         <w:r>
           <w:rPr>
@@ -1192,13 +1930,13 @@
           <w14:ligatures w14:val="standardContextual"/>
         </w:rPr>
       </w:pPr>
-      <w:hyperlink w:anchor="_Toc243612584" w:history="1">
+      <w:hyperlink w:anchor="_Toc243613440" w:history="1">
         <w:r>
           <w:rPr>
             <w:rStyle w:val="Hyperlink"/>
             <w:noProof/>
           </w:rPr>
-          <w:t>7. Agent roles and orchestration</w:t>
+          <w:t>14. Evaluation results</w:t>
         </w:r>
         <w:r>
           <w:rPr>
@@ -1219,7 +1957,7 @@
             <w:noProof/>
             <w:webHidden/>
           </w:rPr>
-          <w:instrText xml:space="preserve"> PAGEREF _Toc243612584 \h </w:instrText>
+          <w:instrText xml:space="preserve"> PAGEREF _Toc243613440 \h </w:instrText>
         </w:r>
         <w:r>
           <w:rPr>
@@ -1239,7 +1977,81 @@
             <w:noProof/>
             <w:webHidden/>
           </w:rPr>
-          <w:t>8</w:t>
+          <w:t>16</w:t>
+        </w:r>
+        <w:r>
+          <w:rPr>
+            <w:noProof/>
+            <w:webHidden/>
+          </w:rPr>
+          <w:fldChar w:fldCharType="end"/>
+        </w:r>
+      </w:hyperlink>
+    </w:p>
+    <w:p>
+      <w:pPr>
+        <w:pStyle w:val="TOC2"/>
+        <w:tabs>
+          <w:tab w:val="right" w:leader="dot" w:pos="9288"/>
+        </w:tabs>
+        <w:rPr>
+          <w:rFonts w:asciiTheme="minorHAnsi" w:hAnsiTheme="minorHAnsi"/>
+          <w:noProof/>
+          <w:kern w:val="2"/>
+          <w:sz w:val="24"/>
+          <w:szCs w:val="24"/>
+          <w:lang w:val="en-IN" w:eastAsia="en-IN"/>
+          <w14:ligatures w14:val="standardContextual"/>
+        </w:rPr>
+      </w:pPr>
+      <w:hyperlink w:anchor="_Toc243613441" w:history="1">
+        <w:r>
+          <w:rPr>
+            <w:rStyle w:val="Hyperlink"/>
+            <w:noProof/>
+          </w:rPr>
+          <w:t>14.1 Interpretation</w:t>
+        </w:r>
+        <w:r>
+          <w:rPr>
+            <w:noProof/>
+            <w:webHidden/>
+          </w:rPr>
+          <w:tab/>
+        </w:r>
+        <w:r>
+          <w:rPr>
+            <w:noProof/>
+            <w:webHidden/>
+          </w:rPr>
+          <w:fldChar w:fldCharType="begin"/>
+        </w:r>
+        <w:r>
+          <w:rPr>
+            <w:noProof/>
+            <w:webHidden/>
+          </w:rPr>
+          <w:instrText xml:space="preserve"> PAGEREF _Toc243613441 \h </w:instrText>
+        </w:r>
+        <w:r>
+          <w:rPr>
+            <w:noProof/>
+            <w:webHidden/>
+          </w:rPr>
+        </w:r>
+        <w:r>
+          <w:rPr>
+            <w:noProof/>
+            <w:webHidden/>
+          </w:rPr>
+          <w:fldChar w:fldCharType="separate"/>
+        </w:r>
+        <w:r>
+          <w:rPr>
+            <w:noProof/>
+            <w:webHidden/>
+          </w:rPr>
+          <w:t>16</w:t>
         </w:r>
         <w:r>
           <w:rPr>
@@ -1266,13 +2078,13 @@
           <w14:ligatures w14:val="standardContextual"/>
         </w:rPr>
       </w:pPr>
-      <w:hyperlink w:anchor="_Toc243612585" w:history="1">
+      <w:hyperlink w:anchor="_Toc243613442" w:history="1">
         <w:r>
           <w:rPr>
             <w:rStyle w:val="Hyperlink"/>
             <w:noProof/>
           </w:rPr>
-          <w:t>8. Data model, synthetic dataset and reference files</w:t>
+          <w:t>15. Limitations and responsible use</w:t>
         </w:r>
         <w:r>
           <w:rPr>
@@ -1293,7 +2105,7 @@
             <w:noProof/>
             <w:webHidden/>
           </w:rPr>
-          <w:instrText xml:space="preserve"> PAGEREF _Toc243612585 \h </w:instrText>
+          <w:instrText xml:space="preserve"> PAGEREF _Toc243613442 \h </w:instrText>
         </w:r>
         <w:r>
           <w:rPr>
@@ -1313,155 +2125,7 @@
             <w:noProof/>
             <w:webHidden/>
           </w:rPr>
-          <w:t>8</w:t>
-        </w:r>
-        <w:r>
-          <w:rPr>
-            <w:noProof/>
-            <w:webHidden/>
-          </w:rPr>
-          <w:fldChar w:fldCharType="end"/>
-        </w:r>
-      </w:hyperlink>
-    </w:p>
-    <w:p>
-      <w:pPr>
-        <w:pStyle w:val="TOC2"/>
-        <w:tabs>
-          <w:tab w:val="right" w:leader="dot" w:pos="9288"/>
-        </w:tabs>
-        <w:rPr>
-          <w:rFonts w:asciiTheme="minorHAnsi" w:hAnsiTheme="minorHAnsi"/>
-          <w:noProof/>
-          <w:kern w:val="2"/>
-          <w:sz w:val="24"/>
-          <w:szCs w:val="24"/>
-          <w:lang w:val="en-IN" w:eastAsia="en-IN"/>
-          <w14:ligatures w14:val="standardContextual"/>
-        </w:rPr>
-      </w:pPr>
-      <w:hyperlink w:anchor="_Toc243612586" w:history="1">
-        <w:r>
-          <w:rPr>
-            <w:rStyle w:val="Hyperlink"/>
-            <w:noProof/>
-          </w:rPr>
-          <w:t>8.1 Shared state (DDRState)</w:t>
-        </w:r>
-        <w:r>
-          <w:rPr>
-            <w:noProof/>
-            <w:webHidden/>
-          </w:rPr>
-          <w:tab/>
-        </w:r>
-        <w:r>
-          <w:rPr>
-            <w:noProof/>
-            <w:webHidden/>
-          </w:rPr>
-          <w:fldChar w:fldCharType="begin"/>
-        </w:r>
-        <w:r>
-          <w:rPr>
-            <w:noProof/>
-            <w:webHidden/>
-          </w:rPr>
-          <w:instrText xml:space="preserve"> PAGEREF _Toc243612586 \h </w:instrText>
-        </w:r>
-        <w:r>
-          <w:rPr>
-            <w:noProof/>
-            <w:webHidden/>
-          </w:rPr>
-        </w:r>
-        <w:r>
-          <w:rPr>
-            <w:noProof/>
-            <w:webHidden/>
-          </w:rPr>
-          <w:fldChar w:fldCharType="separate"/>
-        </w:r>
-        <w:r>
-          <w:rPr>
-            <w:noProof/>
-            <w:webHidden/>
-          </w:rPr>
-          <w:t>8</w:t>
-        </w:r>
-        <w:r>
-          <w:rPr>
-            <w:noProof/>
-            <w:webHidden/>
-          </w:rPr>
-          <w:fldChar w:fldCharType="end"/>
-        </w:r>
-      </w:hyperlink>
-    </w:p>
-    <w:p>
-      <w:pPr>
-        <w:pStyle w:val="TOC2"/>
-        <w:tabs>
-          <w:tab w:val="right" w:leader="dot" w:pos="9288"/>
-        </w:tabs>
-        <w:rPr>
-          <w:rFonts w:asciiTheme="minorHAnsi" w:hAnsiTheme="minorHAnsi"/>
-          <w:noProof/>
-          <w:kern w:val="2"/>
-          <w:sz w:val="24"/>
-          <w:szCs w:val="24"/>
-          <w:lang w:val="en-IN" w:eastAsia="en-IN"/>
-          <w14:ligatures w14:val="standardContextual"/>
-        </w:rPr>
-      </w:pPr>
-      <w:hyperlink w:anchor="_Toc243612587" w:history="1">
-        <w:r>
-          <w:rPr>
-            <w:rStyle w:val="Hyperlink"/>
-            <w:noProof/>
-          </w:rPr>
-          <w:t>8.2 Synthetic dataset</w:t>
-        </w:r>
-        <w:r>
-          <w:rPr>
-            <w:noProof/>
-            <w:webHidden/>
-          </w:rPr>
-          <w:tab/>
-        </w:r>
-        <w:r>
-          <w:rPr>
-            <w:noProof/>
-            <w:webHidden/>
-          </w:rPr>
-          <w:fldChar w:fldCharType="begin"/>
-        </w:r>
-        <w:r>
-          <w:rPr>
-            <w:noProof/>
-            <w:webHidden/>
-          </w:rPr>
-          <w:instrText xml:space="preserve"> PAGEREF _Toc243612587 \h </w:instrText>
-        </w:r>
-        <w:r>
-          <w:rPr>
-            <w:noProof/>
-            <w:webHidden/>
-          </w:rPr>
-        </w:r>
-        <w:r>
-          <w:rPr>
-            <w:noProof/>
-            <w:webHidden/>
-          </w:rPr>
-          <w:fldChar w:fldCharType="separate"/>
-        </w:r>
-        <w:r>
-          <w:rPr>
-            <w:noProof/>
-            <w:webHidden/>
-          </w:rPr>
-          <w:t>9</w:t>
+          <w:t>17</w:t>
         </w:r>
         <w:r>
           <w:rPr>
@@ -1488,13 +2152,13 @@
           <w14:ligatures w14:val="standardContextual"/>
         </w:rPr>
       </w:pPr>
-      <w:hyperlink w:anchor="_Toc243612588" w:history="1">
+      <w:hyperlink w:anchor="_Toc243613443" w:history="1">
         <w:r>
           <w:rPr>
             <w:rStyle w:val="Hyperlink"/>
             <w:noProof/>
           </w:rPr>
-          <w:t>9. Implementation details</w:t>
+          <w:t>16. Future enhancements</w:t>
         </w:r>
         <w:r>
           <w:rPr>
@@ -1515,7 +2179,7 @@
             <w:noProof/>
             <w:webHidden/>
           </w:rPr>
-          <w:instrText xml:space="preserve"> PAGEREF _Toc243612588 \h </w:instrText>
+          <w:instrText xml:space="preserve"> PAGEREF _Toc243613443 \h </w:instrText>
         </w:r>
         <w:r>
           <w:rPr>
@@ -1535,7 +2199,7 @@
             <w:noProof/>
             <w:webHidden/>
           </w:rPr>
-          <w:t>9</w:t>
+          <w:t>17</w:t>
         </w:r>
         <w:r>
           <w:rPr>
@@ -1562,13 +2226,13 @@
           <w14:ligatures w14:val="standardContextual"/>
         </w:rPr>
       </w:pPr>
-      <w:hyperlink w:anchor="_Toc243612589" w:history="1">
+      <w:hyperlink w:anchor="_Toc243613444" w:history="1">
         <w:r>
           <w:rPr>
             <w:rStyle w:val="Hyperlink"/>
             <w:noProof/>
           </w:rPr>
-          <w:t>10. Deterministic tools and model usage</w:t>
+          <w:t>17. Conclusion</w:t>
         </w:r>
         <w:r>
           <w:rPr>
@@ -1589,7 +2253,7 @@
             <w:noProof/>
             <w:webHidden/>
           </w:rPr>
-          <w:instrText xml:space="preserve"> PAGEREF _Toc243612589 \h </w:instrText>
+          <w:instrText xml:space="preserve"> PAGEREF _Toc243613444 \h </w:instrText>
         </w:r>
         <w:r>
           <w:rPr>
@@ -1609,7 +2273,7 @@
             <w:noProof/>
             <w:webHidden/>
           </w:rPr>
-          <w:t>10</w:t>
+          <w:t>17</w:t>
         </w:r>
         <w:r>
           <w:rPr>
@@ -1636,13 +2300,13 @@
           <w14:ligatures w14:val="standardContextual"/>
         </w:rPr>
       </w:pPr>
-      <w:hyperlink w:anchor="_Toc243612590" w:history="1">
+      <w:hyperlink w:anchor="_Toc243613445" w:history="1">
         <w:r>
           <w:rPr>
             <w:rStyle w:val="Hyperlink"/>
             <w:noProof/>
           </w:rPr>
-          <w:t>11. Critic validation, retries and human-in-the-loop review</w:t>
+          <w:t>References</w:t>
         </w:r>
         <w:r>
           <w:rPr>
@@ -1663,7 +2327,7 @@
             <w:noProof/>
             <w:webHidden/>
           </w:rPr>
-          <w:instrText xml:space="preserve"> PAGEREF _Toc243612590 \h </w:instrText>
+          <w:instrText xml:space="preserve"> PAGEREF _Toc243613445 \h </w:instrText>
         </w:r>
         <w:r>
           <w:rPr>
@@ -1683,7 +2347,7 @@
             <w:noProof/>
             <w:webHidden/>
           </w:rPr>
-          <w:t>10</w:t>
+          <w:t>18</w:t>
         </w:r>
         <w:r>
           <w:rPr>
@@ -1710,13 +2374,13 @@
           <w14:ligatures w14:val="standardContextual"/>
         </w:rPr>
       </w:pPr>
-      <w:hyperlink w:anchor="_Toc243612591" w:history="1">
+      <w:hyperlink w:anchor="_Toc243613446" w:history="1">
         <w:r>
           <w:rPr>
             <w:rStyle w:val="Hyperlink"/>
             <w:noProof/>
           </w:rPr>
-          <w:t>12. Web interface</w:t>
+          <w:t>Appendix A. How to run</w:t>
         </w:r>
         <w:r>
           <w:rPr>
@@ -1737,7 +2401,7 @@
             <w:noProof/>
             <w:webHidden/>
           </w:rPr>
-          <w:instrText xml:space="preserve"> PAGEREF _Toc243612591 \h </w:instrText>
+          <w:instrText xml:space="preserve"> PAGEREF _Toc243613446 \h </w:instrText>
         </w:r>
         <w:r>
           <w:rPr>
@@ -1757,7 +2421,7 @@
             <w:noProof/>
             <w:webHidden/>
           </w:rPr>
-          <w:t>11</w:t>
+          <w:t>18</w:t>
         </w:r>
         <w:r>
           <w:rPr>
@@ -1769,746 +2433,6 @@
       </w:hyperlink>
     </w:p>
     <w:p>
-      <w:pPr>
-        <w:pStyle w:val="TOC2"/>
-        <w:tabs>
-          <w:tab w:val="right" w:leader="dot" w:pos="9288"/>
-        </w:tabs>
-        <w:rPr>
-          <w:rFonts w:asciiTheme="minorHAnsi" w:hAnsiTheme="minorHAnsi"/>
-          <w:noProof/>
-          <w:kern w:val="2"/>
-          <w:sz w:val="24"/>
-          <w:szCs w:val="24"/>
-          <w:lang w:val="en-IN" w:eastAsia="en-IN"/>
-          <w14:ligatures w14:val="standardContextual"/>
-        </w:rPr>
-      </w:pPr>
-      <w:hyperlink w:anchor="_Toc243612592" w:history="1">
-        <w:r>
-          <w:rPr>
-            <w:rStyle w:val="Hyperlink"/>
-            <w:noProof/>
-          </w:rPr>
-          <w:t>12.1 Deployment</w:t>
-        </w:r>
-        <w:r>
-          <w:rPr>
-            <w:noProof/>
-            <w:webHidden/>
-          </w:rPr>
-          <w:tab/>
-        </w:r>
-        <w:r>
-          <w:rPr>
-            <w:noProof/>
-            <w:webHidden/>
-          </w:rPr>
-          <w:fldChar w:fldCharType="begin"/>
-        </w:r>
-        <w:r>
-          <w:rPr>
-            <w:noProof/>
-            <w:webHidden/>
-          </w:rPr>
-          <w:instrText xml:space="preserve"> PAGEREF _Toc243612592 \h </w:instrText>
-        </w:r>
-        <w:r>
-          <w:rPr>
-            <w:noProof/>
-            <w:webHidden/>
-          </w:rPr>
-        </w:r>
-        <w:r>
-          <w:rPr>
-            <w:noProof/>
-            <w:webHidden/>
-          </w:rPr>
-          <w:fldChar w:fldCharType="separate"/>
-        </w:r>
-        <w:r>
-          <w:rPr>
-            <w:noProof/>
-            <w:webHidden/>
-          </w:rPr>
-          <w:t>11</w:t>
-        </w:r>
-        <w:r>
-          <w:rPr>
-            <w:noProof/>
-            <w:webHidden/>
-          </w:rPr>
-          <w:fldChar w:fldCharType="end"/>
-        </w:r>
-      </w:hyperlink>
-    </w:p>
-    <w:p>
-      <w:pPr>
-        <w:pStyle w:val="TOC2"/>
-        <w:tabs>
-          <w:tab w:val="right" w:leader="dot" w:pos="9288"/>
-        </w:tabs>
-        <w:rPr>
-          <w:rFonts w:asciiTheme="minorHAnsi" w:hAnsiTheme="minorHAnsi"/>
-          <w:noProof/>
-          <w:kern w:val="2"/>
-          <w:sz w:val="24"/>
-          <w:szCs w:val="24"/>
-          <w:lang w:val="en-IN" w:eastAsia="en-IN"/>
-          <w14:ligatures w14:val="standardContextual"/>
-        </w:rPr>
-      </w:pPr>
-      <w:hyperlink w:anchor="_Toc243612593" w:history="1">
-        <w:r>
-          <w:rPr>
-            <w:rStyle w:val="Hyperlink"/>
-            <w:noProof/>
-          </w:rPr>
-          <w:t>12.2 Screens</w:t>
-        </w:r>
-        <w:r>
-          <w:rPr>
-            <w:noProof/>
-            <w:webHidden/>
-          </w:rPr>
-          <w:tab/>
-        </w:r>
-        <w:r>
-          <w:rPr>
-            <w:noProof/>
-            <w:webHidden/>
-          </w:rPr>
-          <w:fldChar w:fldCharType="begin"/>
-        </w:r>
-        <w:r>
-          <w:rPr>
-            <w:noProof/>
-            <w:webHidden/>
-          </w:rPr>
-          <w:instrText xml:space="preserve"> PAGEREF _Toc243612593 \h </w:instrText>
-        </w:r>
-        <w:r>
-          <w:rPr>
-            <w:noProof/>
-            <w:webHidden/>
-          </w:rPr>
-        </w:r>
-        <w:r>
-          <w:rPr>
-            <w:noProof/>
-            <w:webHidden/>
-          </w:rPr>
-          <w:fldChar w:fldCharType="separate"/>
-        </w:r>
-        <w:r>
-          <w:rPr>
-            <w:noProof/>
-            <w:webHidden/>
-          </w:rPr>
-          <w:t>11</w:t>
-        </w:r>
-        <w:r>
-          <w:rPr>
-            <w:noProof/>
-            <w:webHidden/>
-          </w:rPr>
-          <w:fldChar w:fldCharType="end"/>
-        </w:r>
-      </w:hyperlink>
-    </w:p>
-    <w:p>
-      <w:pPr>
-        <w:pStyle w:val="TOC1"/>
-        <w:tabs>
-          <w:tab w:val="right" w:leader="dot" w:pos="9288"/>
-        </w:tabs>
-        <w:rPr>
-          <w:rFonts w:asciiTheme="minorHAnsi" w:hAnsiTheme="minorHAnsi"/>
-          <w:noProof/>
-          <w:kern w:val="2"/>
-          <w:sz w:val="24"/>
-          <w:szCs w:val="24"/>
-          <w:lang w:val="en-IN" w:eastAsia="en-IN"/>
-          <w14:ligatures w14:val="standardContextual"/>
-        </w:rPr>
-      </w:pPr>
-      <w:hyperlink w:anchor="_Toc243612594" w:history="1">
-        <w:r>
-          <w:rPr>
-            <w:rStyle w:val="Hyperlink"/>
-            <w:noProof/>
-          </w:rPr>
-          <w:t>13. Testing methodology and test cases</w:t>
-        </w:r>
-        <w:r>
-          <w:rPr>
-            <w:noProof/>
-            <w:webHidden/>
-          </w:rPr>
-          <w:tab/>
-        </w:r>
-        <w:r>
-          <w:rPr>
-            <w:noProof/>
-            <w:webHidden/>
-          </w:rPr>
-          <w:fldChar w:fldCharType="begin"/>
-        </w:r>
-        <w:r>
-          <w:rPr>
-            <w:noProof/>
-            <w:webHidden/>
-          </w:rPr>
-          <w:instrText xml:space="preserve"> PAGEREF _Toc243612594 \h </w:instrText>
-        </w:r>
-        <w:r>
-          <w:rPr>
-            <w:noProof/>
-            <w:webHidden/>
-          </w:rPr>
-        </w:r>
-        <w:r>
-          <w:rPr>
-            <w:noProof/>
-            <w:webHidden/>
-          </w:rPr>
-          <w:fldChar w:fldCharType="separate"/>
-        </w:r>
-        <w:r>
-          <w:rPr>
-            <w:noProof/>
-            <w:webHidden/>
-          </w:rPr>
-          <w:t>15</w:t>
-        </w:r>
-        <w:r>
-          <w:rPr>
-            <w:noProof/>
-            <w:webHidden/>
-          </w:rPr>
-          <w:fldChar w:fldCharType="end"/>
-        </w:r>
-      </w:hyperlink>
-    </w:p>
-    <w:p>
-      <w:pPr>
-        <w:pStyle w:val="TOC1"/>
-        <w:tabs>
-          <w:tab w:val="right" w:leader="dot" w:pos="9288"/>
-        </w:tabs>
-        <w:rPr>
-          <w:rFonts w:asciiTheme="minorHAnsi" w:hAnsiTheme="minorHAnsi"/>
-          <w:noProof/>
-          <w:kern w:val="2"/>
-          <w:sz w:val="24"/>
-          <w:szCs w:val="24"/>
-          <w:lang w:val="en-IN" w:eastAsia="en-IN"/>
-          <w14:ligatures w14:val="standardContextual"/>
-        </w:rPr>
-      </w:pPr>
-      <w:hyperlink w:anchor="_Toc243612595" w:history="1">
-        <w:r>
-          <w:rPr>
-            <w:rStyle w:val="Hyperlink"/>
-            <w:noProof/>
-          </w:rPr>
-          <w:t>14. Evaluation results</w:t>
-        </w:r>
-        <w:r>
-          <w:rPr>
-            <w:noProof/>
-            <w:webHidden/>
-          </w:rPr>
-          <w:tab/>
-        </w:r>
-        <w:r>
-          <w:rPr>
-            <w:noProof/>
-            <w:webHidden/>
-          </w:rPr>
-          <w:fldChar w:fldCharType="begin"/>
-        </w:r>
-        <w:r>
-          <w:rPr>
-            <w:noProof/>
-            <w:webHidden/>
-          </w:rPr>
-          <w:instrText xml:space="preserve"> PAGEREF _Toc243612595 \h </w:instrText>
-        </w:r>
-        <w:r>
-          <w:rPr>
-            <w:noProof/>
-            <w:webHidden/>
-          </w:rPr>
-        </w:r>
-        <w:r>
-          <w:rPr>
-            <w:noProof/>
-            <w:webHidden/>
-          </w:rPr>
-          <w:fldChar w:fldCharType="separate"/>
-        </w:r>
-        <w:r>
-          <w:rPr>
-            <w:noProof/>
-            <w:webHidden/>
-          </w:rPr>
-          <w:t>16</w:t>
-        </w:r>
-        <w:r>
-          <w:rPr>
-            <w:noProof/>
-            <w:webHidden/>
-          </w:rPr>
-          <w:fldChar w:fldCharType="end"/>
-        </w:r>
-      </w:hyperlink>
-    </w:p>
-    <w:p>
-      <w:pPr>
-        <w:pStyle w:val="TOC2"/>
-        <w:tabs>
-          <w:tab w:val="right" w:leader="dot" w:pos="9288"/>
-        </w:tabs>
-        <w:rPr>
-          <w:rFonts w:asciiTheme="minorHAnsi" w:hAnsiTheme="minorHAnsi"/>
-          <w:noProof/>
-          <w:kern w:val="2"/>
-          <w:sz w:val="24"/>
-          <w:szCs w:val="24"/>
-          <w:lang w:val="en-IN" w:eastAsia="en-IN"/>
-          <w14:ligatures w14:val="standardContextual"/>
-        </w:rPr>
-      </w:pPr>
-      <w:hyperlink w:anchor="_Toc243612596" w:history="1">
-        <w:r>
-          <w:rPr>
-            <w:rStyle w:val="Hyperlink"/>
-            <w:noProof/>
-          </w:rPr>
-          <w:t>Interpretation</w:t>
-        </w:r>
-        <w:r>
-          <w:rPr>
-            <w:noProof/>
-            <w:webHidden/>
-          </w:rPr>
-          <w:tab/>
-        </w:r>
-        <w:r>
-          <w:rPr>
-            <w:noProof/>
-            <w:webHidden/>
-          </w:rPr>
-          <w:fldChar w:fldCharType="begin"/>
-        </w:r>
-        <w:r>
-          <w:rPr>
-            <w:noProof/>
-            <w:webHidden/>
-          </w:rPr>
-          <w:instrText xml:space="preserve"> PAGEREF _Toc243612596 \h </w:instrText>
-        </w:r>
-        <w:r>
-          <w:rPr>
-            <w:noProof/>
-            <w:webHidden/>
-          </w:rPr>
-        </w:r>
-        <w:r>
-          <w:rPr>
-            <w:noProof/>
-            <w:webHidden/>
-          </w:rPr>
-          <w:fldChar w:fldCharType="separate"/>
-        </w:r>
-        <w:r>
-          <w:rPr>
-            <w:noProof/>
-            <w:webHidden/>
-          </w:rPr>
-          <w:t>16</w:t>
-        </w:r>
-        <w:r>
-          <w:rPr>
-            <w:noProof/>
-            <w:webHidden/>
-          </w:rPr>
-          <w:fldChar w:fldCharType="end"/>
-        </w:r>
-      </w:hyperlink>
-    </w:p>
-    <w:p>
-      <w:pPr>
-        <w:pStyle w:val="TOC1"/>
-        <w:tabs>
-          <w:tab w:val="right" w:leader="dot" w:pos="9288"/>
-        </w:tabs>
-        <w:rPr>
-          <w:rFonts w:asciiTheme="minorHAnsi" w:hAnsiTheme="minorHAnsi"/>
-          <w:noProof/>
-          <w:kern w:val="2"/>
-          <w:sz w:val="24"/>
-          <w:szCs w:val="24"/>
-          <w:lang w:val="en-IN" w:eastAsia="en-IN"/>
-          <w14:ligatures w14:val="standardContextual"/>
-        </w:rPr>
-      </w:pPr>
-      <w:hyperlink w:anchor="_Toc243612597" w:history="1">
-        <w:r>
-          <w:rPr>
-            <w:rStyle w:val="Hyperlink"/>
-            <w:noProof/>
-          </w:rPr>
-          <w:t>15. Limitations and responsible use</w:t>
-        </w:r>
-        <w:r>
-          <w:rPr>
-            <w:noProof/>
-            <w:webHidden/>
-          </w:rPr>
-          <w:tab/>
-        </w:r>
-        <w:r>
-          <w:rPr>
-            <w:noProof/>
-            <w:webHidden/>
-          </w:rPr>
-          <w:fldChar w:fldCharType="begin"/>
-        </w:r>
-        <w:r>
-          <w:rPr>
-            <w:noProof/>
-            <w:webHidden/>
-          </w:rPr>
-          <w:instrText xml:space="preserve"> PAGEREF _Toc243612597 \h </w:instrText>
-        </w:r>
-        <w:r>
-          <w:rPr>
-            <w:noProof/>
-            <w:webHidden/>
-          </w:rPr>
-        </w:r>
-        <w:r>
-          <w:rPr>
-            <w:noProof/>
-            <w:webHidden/>
-          </w:rPr>
-          <w:fldChar w:fldCharType="separate"/>
-        </w:r>
-        <w:r>
-          <w:rPr>
-            <w:noProof/>
-            <w:webHidden/>
-          </w:rPr>
-          <w:t>17</w:t>
-        </w:r>
-        <w:r>
-          <w:rPr>
-            <w:noProof/>
-            <w:webHidden/>
-          </w:rPr>
-          <w:fldChar w:fldCharType="end"/>
-        </w:r>
-      </w:hyperlink>
-    </w:p>
-    <w:p>
-      <w:pPr>
-        <w:pStyle w:val="TOC1"/>
-        <w:tabs>
-          <w:tab w:val="right" w:leader="dot" w:pos="9288"/>
-        </w:tabs>
-        <w:rPr>
-          <w:rFonts w:asciiTheme="minorHAnsi" w:hAnsiTheme="minorHAnsi"/>
-          <w:noProof/>
-          <w:kern w:val="2"/>
-          <w:sz w:val="24"/>
-          <w:szCs w:val="24"/>
-          <w:lang w:val="en-IN" w:eastAsia="en-IN"/>
-          <w14:ligatures w14:val="standardContextual"/>
-        </w:rPr>
-      </w:pPr>
-      <w:hyperlink w:anchor="_Toc243612598" w:history="1">
-        <w:r>
-          <w:rPr>
-            <w:rStyle w:val="Hyperlink"/>
-            <w:noProof/>
-          </w:rPr>
-          <w:t>16. Future enhancements</w:t>
-        </w:r>
-        <w:r>
-          <w:rPr>
-            <w:noProof/>
-            <w:webHidden/>
-          </w:rPr>
-          <w:tab/>
-        </w:r>
-        <w:r>
-          <w:rPr>
-            <w:noProof/>
-            <w:webHidden/>
-          </w:rPr>
-          <w:fldChar w:fldCharType="begin"/>
-        </w:r>
-        <w:r>
-          <w:rPr>
-            <w:noProof/>
-            <w:webHidden/>
-          </w:rPr>
-          <w:instrText xml:space="preserve"> PAGEREF _Toc243612598 \h </w:instrText>
-        </w:r>
-        <w:r>
-          <w:rPr>
-            <w:noProof/>
-            <w:webHidden/>
-          </w:rPr>
-        </w:r>
-        <w:r>
-          <w:rPr>
-            <w:noProof/>
-            <w:webHidden/>
-          </w:rPr>
-          <w:fldChar w:fldCharType="separate"/>
-        </w:r>
-        <w:r>
-          <w:rPr>
-            <w:noProof/>
-            <w:webHidden/>
-          </w:rPr>
-          <w:t>17</w:t>
-        </w:r>
-        <w:r>
-          <w:rPr>
-            <w:noProof/>
-            <w:webHidden/>
-          </w:rPr>
-          <w:fldChar w:fldCharType="end"/>
-        </w:r>
-      </w:hyperlink>
-    </w:p>
-    <w:p>
-      <w:pPr>
-        <w:pStyle w:val="TOC1"/>
-        <w:tabs>
-          <w:tab w:val="right" w:leader="dot" w:pos="9288"/>
-        </w:tabs>
-        <w:rPr>
-          <w:rFonts w:asciiTheme="minorHAnsi" w:hAnsiTheme="minorHAnsi"/>
-          <w:noProof/>
-          <w:kern w:val="2"/>
-          <w:sz w:val="24"/>
-          <w:szCs w:val="24"/>
-          <w:lang w:val="en-IN" w:eastAsia="en-IN"/>
-          <w14:ligatures w14:val="standardContextual"/>
-        </w:rPr>
-      </w:pPr>
-      <w:hyperlink w:anchor="_Toc243612599" w:history="1">
-        <w:r>
-          <w:rPr>
-            <w:rStyle w:val="Hyperlink"/>
-            <w:noProof/>
-          </w:rPr>
-          <w:t>17. Conclusion</w:t>
-        </w:r>
-        <w:r>
-          <w:rPr>
-            <w:noProof/>
-            <w:webHidden/>
-          </w:rPr>
-          <w:tab/>
-        </w:r>
-        <w:r>
-          <w:rPr>
-            <w:noProof/>
-            <w:webHidden/>
-          </w:rPr>
-          <w:fldChar w:fldCharType="begin"/>
-        </w:r>
-        <w:r>
-          <w:rPr>
-            <w:noProof/>
-            <w:webHidden/>
-          </w:rPr>
-          <w:instrText xml:space="preserve"> PAGEREF _Toc243612599 \h </w:instrText>
-        </w:r>
-        <w:r>
-          <w:rPr>
-            <w:noProof/>
-            <w:webHidden/>
-          </w:rPr>
-        </w:r>
-        <w:r>
-          <w:rPr>
-            <w:noProof/>
-            <w:webHidden/>
-          </w:rPr>
-          <w:fldChar w:fldCharType="separate"/>
-        </w:r>
-        <w:r>
-          <w:rPr>
-            <w:noProof/>
-            <w:webHidden/>
-          </w:rPr>
-          <w:t>17</w:t>
-        </w:r>
-        <w:r>
-          <w:rPr>
-            <w:noProof/>
-            <w:webHidden/>
-          </w:rPr>
-          <w:fldChar w:fldCharType="end"/>
-        </w:r>
-      </w:hyperlink>
-    </w:p>
-    <w:p>
-      <w:pPr>
-        <w:pStyle w:val="TOC1"/>
-        <w:tabs>
-          <w:tab w:val="right" w:leader="dot" w:pos="9288"/>
-        </w:tabs>
-        <w:rPr>
-          <w:rFonts w:asciiTheme="minorHAnsi" w:hAnsiTheme="minorHAnsi"/>
-          <w:noProof/>
-          <w:kern w:val="2"/>
-          <w:sz w:val="24"/>
-          <w:szCs w:val="24"/>
-          <w:lang w:val="en-IN" w:eastAsia="en-IN"/>
-          <w14:ligatures w14:val="standardContextual"/>
-        </w:rPr>
-      </w:pPr>
-      <w:hyperlink w:anchor="_Toc243612600" w:history="1">
-        <w:r>
-          <w:rPr>
-            <w:rStyle w:val="Hyperlink"/>
-            <w:noProof/>
-          </w:rPr>
-          <w:t>References</w:t>
-        </w:r>
-        <w:r>
-          <w:rPr>
-            <w:noProof/>
-            <w:webHidden/>
-          </w:rPr>
-          <w:tab/>
-        </w:r>
-        <w:r>
-          <w:rPr>
-            <w:noProof/>
-            <w:webHidden/>
-          </w:rPr>
-          <w:fldChar w:fldCharType="begin"/>
-        </w:r>
-        <w:r>
-          <w:rPr>
-            <w:noProof/>
-            <w:webHidden/>
-          </w:rPr>
-          <w:instrText xml:space="preserve"> PAGEREF _Toc243612600 \h </w:instrText>
-        </w:r>
-        <w:r>
-          <w:rPr>
-            <w:noProof/>
-            <w:webHidden/>
-          </w:rPr>
-        </w:r>
-        <w:r>
-          <w:rPr>
-            <w:noProof/>
-            <w:webHidden/>
-          </w:rPr>
-          <w:fldChar w:fldCharType="separate"/>
-        </w:r>
-        <w:r>
-          <w:rPr>
-            <w:noProof/>
-            <w:webHidden/>
-          </w:rPr>
-          <w:t>18</w:t>
-        </w:r>
-        <w:r>
-          <w:rPr>
-            <w:noProof/>
-            <w:webHidden/>
-          </w:rPr>
-          <w:fldChar w:fldCharType="end"/>
-        </w:r>
-      </w:hyperlink>
-    </w:p>
-    <w:p>
-      <w:pPr>
-        <w:pStyle w:val="TOC1"/>
-        <w:tabs>
-          <w:tab w:val="right" w:leader="dot" w:pos="9288"/>
-        </w:tabs>
-        <w:rPr>
-          <w:rFonts w:asciiTheme="minorHAnsi" w:hAnsiTheme="minorHAnsi"/>
-          <w:noProof/>
-          <w:kern w:val="2"/>
-          <w:sz w:val="24"/>
-          <w:szCs w:val="24"/>
-          <w:lang w:val="en-IN" w:eastAsia="en-IN"/>
-          <w14:ligatures w14:val="standardContextual"/>
-        </w:rPr>
-      </w:pPr>
-      <w:hyperlink w:anchor="_Toc243612601" w:history="1">
-        <w:r>
-          <w:rPr>
-            <w:rStyle w:val="Hyperlink"/>
-            <w:noProof/>
-          </w:rPr>
-          <w:t>Appendix A. How to run</w:t>
-        </w:r>
-        <w:r>
-          <w:rPr>
-            <w:noProof/>
-            <w:webHidden/>
-          </w:rPr>
-          <w:tab/>
-        </w:r>
-        <w:r>
-          <w:rPr>
-            <w:noProof/>
-            <w:webHidden/>
-          </w:rPr>
-          <w:fldChar w:fldCharType="begin"/>
-        </w:r>
-        <w:r>
-          <w:rPr>
-            <w:noProof/>
-            <w:webHidden/>
-          </w:rPr>
-          <w:instrText xml:space="preserve"> PAGEREF _Toc243612601 \h </w:instrText>
-        </w:r>
-        <w:r>
-          <w:rPr>
-            <w:noProof/>
-            <w:webHidden/>
-          </w:rPr>
-        </w:r>
-        <w:r>
-          <w:rPr>
-            <w:noProof/>
-            <w:webHidden/>
-          </w:rPr>
-          <w:fldChar w:fldCharType="separate"/>
-        </w:r>
-        <w:r>
-          <w:rPr>
-            <w:noProof/>
-            <w:webHidden/>
-          </w:rPr>
-          <w:t>18</w:t>
-        </w:r>
-        <w:r>
-          <w:rPr>
-            <w:noProof/>
-            <w:webHidden/>
-          </w:rPr>
-          <w:fldChar w:fldCharType="end"/>
-        </w:r>
-      </w:hyperlink>
-    </w:p>
-    <w:p>
       <w:r>
         <w:fldChar w:fldCharType="end"/>
       </w:r>
@@ -2522,57 +2446,57 @@
       <w:pPr>
         <w:pStyle w:val="Heading1"/>
       </w:pPr>
-      <w:bookmarkStart w:id="1" w:name="_Toc243612572"/>
+      <w:bookmarkStart w:id="0" w:name="_Toc243613417"/>
       <w:r>
         <w:lastRenderedPageBreak/>
         <w:t>Abstract</w:t>
       </w:r>
+      <w:bookmarkEnd w:id="0"/>
+    </w:p>
+    <w:p>
+      <w:r>
+        <w:t>Every drilling rig sends a Daily Drilling Report (DDR) each morning, and most of it is free text typed by the crew. Hours that are paid for but do not move the well forward, called non-productive time (NPT), hide inside those sentences, so they are rarely totalled and lessons are lost between wells. This project builds a working proof of concept in which a team of LangGraph agents reads a DDR, plans the work, looks up reference data and past incidents, computes every number with deterministic Python tools, checks its own output with a Critic that can send work back with specific feedback, and pauses for a drilling engineer to approve or reject an evidence-backed insight report. A hosted language model (openai/gpt-oss-20b on Groq's free tier) is used only to label log lines; a keyword classifier is the fallback and is always reported as such.</w:t>
+      </w:r>
+    </w:p>
+    <w:p>
+      <w:r>
+        <w:t>On 15 synthetic reports with a known answer key, the full graph had a mean NPT error of 0.07 h per report, got every planted NPT line's category right (100%), caught both deliberately planted log errors (2/2) and produced time logs that add to 24 h in 15/15 reports. A single-prompt chatbot using the same model had a mean error of 0.57 h, and its time log added to 24 h in 13/15 reports. The one remaining error is the model counting a routine flow check as NPT; the engineer review step corrects it with one comment. 58 automated tests cover the tools, the Critic, retries, human review, malformed input, the model fallback and the web API.</w:t>
+      </w:r>
+    </w:p>
+    <w:p>
+      <w:pPr>
+        <w:pStyle w:val="Heading1"/>
+      </w:pPr>
+      <w:bookmarkStart w:id="1" w:name="_Toc243613418"/>
+      <w:r>
+        <w:t>1. Introduction and domain background</w:t>
+      </w:r>
       <w:bookmarkEnd w:id="1"/>
     </w:p>
     <w:p>
-      <w:r>
-        <w:t>Every drilling rig sends a Daily Drilling Report (DDR) each morning, and most of it is free text typed by the crew. Hours that are paid for but do not move the well forward, called non-productive time (NPT), hide inside those sentences, so they are rarely totalled and lessons are lost between wells. This project builds a working proof of concept in which a team of LangGraph agents reads a DDR, plans the work, looks up reference data and past incidents, computes every number with deterministic Python tools, checks its own output with a Critic that can send work back with specific feedback, and pauses for a drilling engineer to approve or reject an evidence-backed insight report. A hosted language model (openai/gpt-oss-20b on Groq's free tier) is used only to label log lines; a keyword classifier is the fallback and is always reported as such.</w:t>
-      </w:r>
-    </w:p>
-    <w:p>
-      <w:r>
-        <w:t>On 15 synthetic reports with a known answer key, the full graph had a mean NPT error of 0.07 h per report, got every planted NPT line's category right (100%), caught both deliberately planted log errors (2/2) and produced time logs that add to 24 h in 15/15 reports. A single-prompt chatbot using the same model had a mean error of 0.57 h, and its time log added to 24 h in 13/15 reports. The one remaining error is the model counting a routine flow check as NPT; the engineer review step corrects it with one comment. 58 automated tests cover the tools, the Critic, retries, human review, malformed input, the model fallback and the web API.</w:t>
-      </w:r>
-    </w:p>
-    <w:p>
-      <w:pPr>
-        <w:pStyle w:val="Heading1"/>
-      </w:pPr>
-      <w:bookmarkStart w:id="2" w:name="_Toc243612573"/>
-      <w:r>
-        <w:t>1. Introduction and domain background</w:t>
+      <w:pPr>
+        <w:pStyle w:val="Heading2"/>
+      </w:pPr>
+      <w:bookmarkStart w:id="2" w:name="_Toc243613419"/>
+      <w:r>
+        <w:t>1.1 Why oil and gas drilling</w:t>
       </w:r>
       <w:bookmarkEnd w:id="2"/>
     </w:p>
     <w:p>
+      <w:r>
+        <w:t>Drilling and completing wells takes 40 to 50 percent of an offshore operator's capital spend (Source 9), and a drillship cost close to $400,000 a day in late 2025 (Source 10), roughly $16,000 for every hour the well does not progress. Operators that tracked lost time closely cut NPT from about 16 percent to 9 percent within a year (Source 9). The industry has also started buying agentic AI: in 2025 ADNOC awarded AIQ a $340 million contract to deploy agentic systems across more than 28 fields (Source 11), while the SPE ATCE 2026 programme openly asks how far agents can be trusted with operational decisions (Source 4). That combination, real money and an open question of trust, makes the domain a good fit for an agentic proof of concept with a human in the loop.</w:t>
+      </w:r>
+    </w:p>
+    <w:p>
       <w:pPr>
         <w:pStyle w:val="Heading2"/>
       </w:pPr>
-      <w:bookmarkStart w:id="3" w:name="_Toc243612574"/>
-      <w:r>
-        <w:t>1.1 Why oil and gas drilling</w:t>
+      <w:bookmarkStart w:id="3" w:name="_Toc243613420"/>
+      <w:r>
+        <w:t>1.2 The Daily Drilling Report</w:t>
       </w:r>
       <w:bookmarkEnd w:id="3"/>
-    </w:p>
-    <w:p>
-      <w:r>
-        <w:t>Drilling and completing wells takes 40 to 50 percent of an offshore operator's capital spend (Source 9), and a drillship cost close to $400,000 a day in late 2025 (Source 10), roughly $16,000 for every hour the well does not progress. Operators that tracked lost time closely cut NPT from about 16 percent to 9 percent within a year (Source 9). The industry has also started buying agentic AI: in 2025 ADNOC awarded AIQ a $340 million contract to deploy agentic systems across more than 28 fields (Source 11), while the SPE ATCE 2026 programme openly asks how far agents can be trusted with operational decisions (Source 4). That combination, real money and an open question of trust, makes the domain a good fit for an agentic proof of concept with a human in the loop.</w:t>
-      </w:r>
-    </w:p>
-    <w:p>
-      <w:pPr>
-        <w:pStyle w:val="Heading2"/>
-      </w:pPr>
-      <w:bookmarkStart w:id="4" w:name="_Toc243612575"/>
-      <w:r>
-        <w:t>1.2 The Daily Drilling Report</w:t>
-      </w:r>
-      <w:bookmarkEnd w:id="4"/>
     </w:p>
     <w:p>
       <w:r>
@@ -2627,11 +2551,11 @@
       <w:pPr>
         <w:pStyle w:val="Heading2"/>
       </w:pPr>
-      <w:bookmarkStart w:id="5" w:name="_Toc243612576"/>
+      <w:bookmarkStart w:id="4" w:name="_Toc243613421"/>
       <w:r>
         <w:t>1.3 Non-productive time</w:t>
       </w:r>
-      <w:bookmarkEnd w:id="5"/>
+      <w:bookmarkEnd w:id="4"/>
     </w:p>
     <w:p>
       <w:r>
@@ -2646,11 +2570,11 @@
       <w:pPr>
         <w:pStyle w:val="Heading1"/>
       </w:pPr>
-      <w:bookmarkStart w:id="6" w:name="_Toc243612577"/>
+      <w:bookmarkStart w:id="5" w:name="_Toc243613422"/>
       <w:r>
         <w:t>2. Problem statement</w:t>
       </w:r>
-      <w:bookmarkEnd w:id="6"/>
+      <w:bookmarkEnd w:id="5"/>
     </w:p>
     <w:p>
       <w:r>
@@ -2669,11 +2593,11 @@
       <w:pPr>
         <w:pStyle w:val="Heading1"/>
       </w:pPr>
-      <w:bookmarkStart w:id="7" w:name="_Toc243612578"/>
+      <w:bookmarkStart w:id="6" w:name="_Toc243613423"/>
       <w:r>
         <w:t>3. Existing process and identified inefficiencies</w:t>
       </w:r>
-      <w:bookmarkEnd w:id="7"/>
+      <w:bookmarkEnd w:id="6"/>
     </w:p>
     <w:p>
       <w:pPr>
@@ -2762,18 +2686,18 @@
         <w:t xml:space="preserve">A plain chatbot does not fix this. </w:t>
       </w:r>
       <w:r>
-        <w:t>One prompt and one answer: the model has to read and count, cannot check itself and gives no proof. Section 13 measures this.</w:t>
+        <w:t>One prompt and one answer: the model has to read and count, cannot check itself and gives no proof. Section 14 measures this.</w:t>
       </w:r>
     </w:p>
     <w:p>
       <w:pPr>
         <w:pStyle w:val="Heading1"/>
       </w:pPr>
-      <w:bookmarkStart w:id="8" w:name="_Toc243612579"/>
+      <w:bookmarkStart w:id="7" w:name="_Toc243613424"/>
       <w:r>
         <w:t>4. Proposed solution and objectives</w:t>
       </w:r>
-      <w:bookmarkEnd w:id="8"/>
+      <w:bookmarkEnd w:id="7"/>
     </w:p>
     <w:p>
       <w:r>
@@ -2864,22 +2788,22 @@
       <w:pPr>
         <w:pStyle w:val="Heading1"/>
       </w:pPr>
-      <w:bookmarkStart w:id="9" w:name="_Toc243612580"/>
+      <w:bookmarkStart w:id="8" w:name="_Toc243613425"/>
       <w:r>
         <w:lastRenderedPageBreak/>
         <w:t>5. Requirements and technology stack</w:t>
       </w:r>
+      <w:bookmarkEnd w:id="8"/>
+    </w:p>
+    <w:p>
+      <w:pPr>
+        <w:pStyle w:val="Heading2"/>
+      </w:pPr>
+      <w:bookmarkStart w:id="9" w:name="_Toc243613426"/>
+      <w:r>
+        <w:t>5.1 Functional requirements</w:t>
+      </w:r>
       <w:bookmarkEnd w:id="9"/>
-    </w:p>
-    <w:p>
-      <w:pPr>
-        <w:pStyle w:val="Heading2"/>
-      </w:pPr>
-      <w:bookmarkStart w:id="10" w:name="_Toc243612581"/>
-      <w:r>
-        <w:t>5.1 Functional requirements</w:t>
-      </w:r>
-      <w:bookmarkEnd w:id="10"/>
     </w:p>
     <w:p>
       <w:pPr>
@@ -3713,11 +3637,11 @@
       <w:pPr>
         <w:pStyle w:val="Heading2"/>
       </w:pPr>
-      <w:bookmarkStart w:id="11" w:name="_Toc243612582"/>
+      <w:bookmarkStart w:id="10" w:name="_Toc243613427"/>
       <w:r>
         <w:t>5.2 Technology stack</w:t>
       </w:r>
-      <w:bookmarkEnd w:id="11"/>
+      <w:bookmarkEnd w:id="10"/>
     </w:p>
     <w:p>
       <w:pPr>
@@ -4238,11 +4162,11 @@
       <w:pPr>
         <w:pStyle w:val="Heading1"/>
       </w:pPr>
-      <w:bookmarkStart w:id="12" w:name="_Toc243612583"/>
+      <w:bookmarkStart w:id="11" w:name="_Toc243613428"/>
       <w:r>
         <w:t>6. System architecture and data flow</w:t>
       </w:r>
-      <w:bookmarkEnd w:id="12"/>
+      <w:bookmarkEnd w:id="11"/>
     </w:p>
     <w:p>
       <w:r>
@@ -4395,7 +4319,7 @@
         <w:rPr>
           <w:i/>
         </w:rPr>
-        <w:t>The diagram is the team's design, updated to match the final code (rule-based Planner, recursion_limit 50, a web app as the front end, and Groq as the language model). Two details are simplified in the drawing: classification runs as one classify_activities tool over all lines, and the Critic also checks gaps, overlaps, unparseable lines and the header (Section 11).</w:t>
+        <w:t>The diagram is the team's design, updated to match the final code (rule-based Planner, recursion_limit 50, a web app as the front end, and Groq as the language model). Two details are simplified in the drawing: classification runs as one classify_activities tool over all lines, the Critic also checks gaps, overlaps, unparseable lines and the header (Section 11), and an unfixable FAIL also goes straight to report_writer.</w:t>
       </w:r>
     </w:p>
     <w:p>
@@ -4412,12 +4336,12 @@
       <w:pPr>
         <w:pStyle w:val="Heading1"/>
       </w:pPr>
-      <w:bookmarkStart w:id="13" w:name="_Toc243612584"/>
+      <w:bookmarkStart w:id="12" w:name="_Toc243613429"/>
       <w:r>
         <w:lastRenderedPageBreak/>
         <w:t>7. Agent roles and orchestration</w:t>
       </w:r>
-      <w:bookmarkEnd w:id="13"/>
+      <w:bookmarkEnd w:id="12"/>
     </w:p>
     <w:p>
       <w:pPr>
@@ -5112,21 +5036,21 @@
       <w:pPr>
         <w:pStyle w:val="Heading1"/>
       </w:pPr>
-      <w:bookmarkStart w:id="14" w:name="_Toc243612585"/>
+      <w:bookmarkStart w:id="13" w:name="_Toc243613430"/>
       <w:r>
         <w:t>8. Data model, synthetic dataset and reference files</w:t>
       </w:r>
+      <w:bookmarkEnd w:id="13"/>
+    </w:p>
+    <w:p>
+      <w:pPr>
+        <w:pStyle w:val="Heading2"/>
+      </w:pPr>
+      <w:bookmarkStart w:id="14" w:name="_Toc243613431"/>
+      <w:r>
+        <w:t>8.1 Shared state (DDRState)</w:t>
+      </w:r>
       <w:bookmarkEnd w:id="14"/>
-    </w:p>
-    <w:p>
-      <w:pPr>
-        <w:pStyle w:val="Heading2"/>
-      </w:pPr>
-      <w:bookmarkStart w:id="15" w:name="_Toc243612586"/>
-      <w:r>
-        <w:t>8.1 Shared state (DDRState)</w:t>
-      </w:r>
-      <w:bookmarkEnd w:id="15"/>
     </w:p>
     <w:p>
       <w:pPr>
@@ -5855,11 +5779,11 @@
       <w:pPr>
         <w:pStyle w:val="Heading2"/>
       </w:pPr>
-      <w:bookmarkStart w:id="16" w:name="_Toc243612587"/>
+      <w:bookmarkStart w:id="15" w:name="_Toc243613432"/>
       <w:r>
         <w:t>8.2 Synthetic dataset</w:t>
       </w:r>
-      <w:bookmarkEnd w:id="16"/>
+      <w:bookmarkEnd w:id="15"/>
     </w:p>
     <w:p>
       <w:r>
@@ -6338,11 +6262,11 @@
       <w:pPr>
         <w:pStyle w:val="Heading1"/>
       </w:pPr>
-      <w:bookmarkStart w:id="17" w:name="_Toc243612588"/>
+      <w:bookmarkStart w:id="16" w:name="_Toc243613433"/>
       <w:r>
         <w:t>9. Implementation details</w:t>
       </w:r>
-      <w:bookmarkEnd w:id="17"/>
+      <w:bookmarkEnd w:id="16"/>
     </w:p>
     <w:p>
       <w:pPr>
@@ -6715,18 +6639,18 @@
     </w:p>
     <w:p>
       <w:r>
-        <w:t>Engineer comments are turned into line overrides: a comment such as "line 7 is planned, not NPT" becomes {"7": "productive"}, and the re-run labels that line as set by the engineer (confidence 1.0, labelled by 'engineer').</w:t>
+        <w:t>Engineer comments are turned into line overrides: a comment such as "line 6 is planned, not NPT" becomes {"6": "productive"}, and the re-run labels that line as set by the engineer (confidence 1.0, labelled by 'engineer').</w:t>
       </w:r>
     </w:p>
     <w:p>
       <w:pPr>
         <w:pStyle w:val="Heading1"/>
       </w:pPr>
-      <w:bookmarkStart w:id="18" w:name="_Toc243612589"/>
+      <w:bookmarkStart w:id="17" w:name="_Toc243613434"/>
       <w:r>
         <w:t>10. Deterministic tools and model usage</w:t>
       </w:r>
-      <w:bookmarkEnd w:id="18"/>
+      <w:bookmarkEnd w:id="17"/>
     </w:p>
     <w:p>
       <w:pPr>
@@ -7086,7 +7010,7 @@
         <w:t xml:space="preserve">report_writer (off by default, RIG_LLM_SUMMARY=1): </w:t>
       </w:r>
       <w:r>
-        <w:t>may rephrase the computed facts into a short summary. A guard discards any summary containing a number that is not in the computed facts. During testing the model kept every number but attached them to the wrong categories (it wrote that waiting on weather and waiting on equipment took "3.5 hours, 2 hours respectively" when the facts were 2.0 h and 3.5 h). A number guard cannot detect that, so the template summary is the default. The report states which was used.</w:t>
+        <w:t>may rephrase the computed facts into a short summary. A guard discards any summary containing a number that is not in the computed facts. During testing with the team's earlier local model (qwen2.5:3b, since replaced), the model kept every number but attached them to the wrong categories (it wrote that waiting on weather and waiting on equipment took "3.5 hours, 2 hours respectively" when the facts were 2.0 h and 3.5 h). A number guard cannot detect that, so the template summary is the default. The report states which was used.</w:t>
       </w:r>
     </w:p>
     <w:p>
@@ -7098,11 +7022,11 @@
       <w:pPr>
         <w:pStyle w:val="Heading1"/>
       </w:pPr>
-      <w:bookmarkStart w:id="19" w:name="_Toc243612590"/>
+      <w:bookmarkStart w:id="18" w:name="_Toc243613435"/>
       <w:r>
         <w:t>11. Critic validation, retries and human-in-the-loop review</w:t>
       </w:r>
-      <w:bookmarkEnd w:id="19"/>
+      <w:bookmarkEnd w:id="18"/>
     </w:p>
     <w:p>
       <w:pPr>
@@ -7292,6 +7216,7 @@
               <w:rPr>
                 <w:sz w:val="19"/>
               </w:rPr>
+              <w:lastRenderedPageBreak/>
               <w:t>Logged hours add to 24.0</w:t>
             </w:r>
           </w:p>
@@ -7329,7 +7254,6 @@
               <w:rPr>
                 <w:sz w:val="19"/>
               </w:rPr>
-              <w:lastRenderedPageBreak/>
               <w:t>No gaps between activities</w:t>
             </w:r>
           </w:p>
@@ -7593,30 +7517,30 @@
       <w:pPr>
         <w:pStyle w:val="Heading1"/>
       </w:pPr>
-      <w:bookmarkStart w:id="20" w:name="_Toc243612591"/>
+      <w:bookmarkStart w:id="19" w:name="_Toc243613436"/>
       <w:r>
         <w:t>12. Web interface</w:t>
       </w:r>
+      <w:bookmarkEnd w:id="19"/>
+    </w:p>
+    <w:p>
+      <w:r>
+        <w:t>The interface is a web app. A small FastAPI server (api.py) runs the graph and streams every agent step to one page written in plain HTML, CSS and JavaScript (no build step). It has four pages: Analyse, Evaluation, Memory and Architecture, with a light and a dark theme.</w:t>
+      </w:r>
+    </w:p>
+    <w:p>
+      <w:pPr>
+        <w:pStyle w:val="Heading2"/>
+      </w:pPr>
+      <w:bookmarkStart w:id="20" w:name="_Toc243613437"/>
+      <w:r>
+        <w:t>12.1 Deployment</w:t>
+      </w:r>
       <w:bookmarkEnd w:id="20"/>
     </w:p>
     <w:p>
       <w:r>
-        <w:t>The interface is a web app. A small FastAPI server (api.py) runs the graph and streams every agent step to one page written in plain HTML, CSS and JavaScript (no build step). It has four pages: Analyse, Evaluation, Memory and Architecture, with a light and a dark theme.</w:t>
-      </w:r>
-    </w:p>
-    <w:p>
-      <w:pPr>
-        <w:pStyle w:val="Heading2"/>
-      </w:pPr>
-      <w:bookmarkStart w:id="21" w:name="_Toc243612592"/>
-      <w:r>
-        <w:t>12.1 Deployment</w:t>
-      </w:r>
-      <w:bookmarkEnd w:id="21"/>
-    </w:p>
-    <w:p>
-      <w:r>
-        <w:t>The application is deployed on Render at https://rig-sight.onrender.com/, built from the main branch of the GitHub repository and started with uvicorn api:app; a push to main redeploys it. On the hosted mock model, W-02 Day 14 gives 8.0 h NPT: the Critic fails the 23.5 h first pass and the retry recovers the missing half hour.</w:t>
+        <w:t>The application is deployed on Render at https://rig-sight.onrender.com/, built from the main branch of the GitHub repository and started with uvicorn api:app; a push to main redeploys it. On the hosted app (Groq, openai/gpt-oss-20b), W-02 Day 14 gives 8.0 h NPT: the Critic fails the 23.5 h first pass and the retry recovers the missing half hour.</w:t>
       </w:r>
     </w:p>
     <w:p>
@@ -7683,11 +7607,11 @@
       <w:pPr>
         <w:pStyle w:val="Heading2"/>
       </w:pPr>
-      <w:bookmarkStart w:id="22" w:name="_Toc243612593"/>
+      <w:bookmarkStart w:id="21" w:name="_Toc243613438"/>
       <w:r>
         <w:t>12.2 Screens</w:t>
       </w:r>
-      <w:bookmarkEnd w:id="22"/>
+      <w:bookmarkEnd w:id="21"/>
     </w:p>
     <w:p>
       <w:r>
@@ -8087,11 +8011,11 @@
       <w:pPr>
         <w:pStyle w:val="Heading1"/>
       </w:pPr>
-      <w:bookmarkStart w:id="23" w:name="_Toc243612594"/>
+      <w:bookmarkStart w:id="22" w:name="_Toc243613439"/>
       <w:r>
         <w:t>13. Testing methodology and test cases</w:t>
       </w:r>
-      <w:bookmarkEnd w:id="23"/>
+      <w:bookmarkEnd w:id="22"/>
     </w:p>
     <w:p>
       <w:r>
@@ -8323,11 +8247,11 @@
       <w:pPr>
         <w:pStyle w:val="Heading1"/>
       </w:pPr>
-      <w:bookmarkStart w:id="24" w:name="_Toc243612595"/>
+      <w:bookmarkStart w:id="23" w:name="_Toc243613440"/>
       <w:r>
         <w:t>14. Evaluation results</w:t>
       </w:r>
-      <w:bookmarkEnd w:id="24"/>
+      <w:bookmarkEnd w:id="23"/>
     </w:p>
     <w:p>
       <w:r>
@@ -8978,7 +8902,7 @@
               <w:rPr>
                 <w:sz w:val="19"/>
               </w:rPr>
-              <w:t>0.7</w:t>
+              <w:t>0.7 (mean of 3 runs)</w:t>
             </w:r>
           </w:p>
         </w:tc>
@@ -9389,11 +9313,11 @@
       <w:pPr>
         <w:pStyle w:val="Heading2"/>
       </w:pPr>
-      <w:bookmarkStart w:id="25" w:name="_Toc243612596"/>
-      <w:r>
-        <w:t>Interpretation</w:t>
-      </w:r>
-      <w:bookmarkEnd w:id="25"/>
+      <w:bookmarkStart w:id="24" w:name="_Toc243613441"/>
+      <w:r>
+        <w:t>14.1 Interpretation</w:t>
+      </w:r>
+      <w:bookmarkEnd w:id="24"/>
     </w:p>
     <w:p>
       <w:pPr>
@@ -9452,6 +9376,7 @@
         <w:rPr>
           <w:b/>
         </w:rPr>
+        <w:lastRenderedPageBreak/>
         <w:t>Repeatability: the chatbot was run three times in the same evaluation; its mean error was 0.63 h, 0.63 h and 0.43 h (the table shows the mean).</w:t>
       </w:r>
     </w:p>
@@ -9464,11 +9389,10 @@
         <w:rPr>
           <w:b/>
         </w:rPr>
-        <w:lastRenderedPageBreak/>
         <w:t xml:space="preserve">LLM summaries misattribute numbers: </w:t>
       </w:r>
       <w:r>
-        <w:t>see Section 10. This was found from a real screenshot of the app, and is why the summary is a template by default.</w:t>
+        <w:t>see Section 10. This was found from a real screenshot of the app with the earlier local model, and is why the summary is a template by default.</w:t>
       </w:r>
     </w:p>
     <w:p>
@@ -9487,11 +9411,11 @@
       <w:pPr>
         <w:pStyle w:val="Heading1"/>
       </w:pPr>
-      <w:bookmarkStart w:id="26" w:name="_Toc243612597"/>
+      <w:bookmarkStart w:id="25" w:name="_Toc243613442"/>
       <w:r>
         <w:t>15. Limitations and responsible use</w:t>
       </w:r>
-      <w:bookmarkEnd w:id="26"/>
+      <w:bookmarkEnd w:id="25"/>
     </w:p>
     <w:p>
       <w:pPr>
@@ -9560,11 +9484,11 @@
       <w:pPr>
         <w:pStyle w:val="Heading1"/>
       </w:pPr>
-      <w:bookmarkStart w:id="27" w:name="_Toc243612598"/>
+      <w:bookmarkStart w:id="26" w:name="_Toc243613443"/>
       <w:r>
         <w:t>16. Future enhancements</w:t>
       </w:r>
-      <w:bookmarkEnd w:id="27"/>
+      <w:bookmarkEnd w:id="26"/>
     </w:p>
     <w:p>
       <w:pPr>
@@ -9624,11 +9548,11 @@
       <w:pPr>
         <w:pStyle w:val="Heading1"/>
       </w:pPr>
-      <w:bookmarkStart w:id="28" w:name="_Toc243612599"/>
+      <w:bookmarkStart w:id="27" w:name="_Toc243613444"/>
       <w:r>
         <w:t>17. Conclusion</w:t>
       </w:r>
-      <w:bookmarkEnd w:id="28"/>
+      <w:bookmarkEnd w:id="27"/>
     </w:p>
     <w:p>
       <w:r>
@@ -9639,12 +9563,12 @@
       <w:pPr>
         <w:pStyle w:val="Heading1"/>
       </w:pPr>
-      <w:bookmarkStart w:id="29" w:name="_Toc243612600"/>
+      <w:bookmarkStart w:id="28" w:name="_Toc243613445"/>
       <w:r>
         <w:lastRenderedPageBreak/>
         <w:t>References</w:t>
       </w:r>
-      <w:bookmarkEnd w:id="29"/>
+      <w:bookmarkEnd w:id="28"/>
     </w:p>
     <w:p>
       <w:pPr>
@@ -9662,9 +9586,7 @@
           <w:b/>
         </w:rPr>
         <w:tab/>
-      </w:r>
-      <w:r>
-        <w:t>A Comparative Analysis of the Trouble Time for Conventional and Casing Drilling Wells: A Case Study on the Lobo Trend. Robert Gordon University OpenAIR repository. rgu-repository.worktribe.com. [Authors to be added by the team.]</w:t>
+        <w:t>A. Mohammed, I. Abolle-Okoyeagu and C. J. Okeke. A Comparative Analysis of the Trouble Time for Conventional and Casing Drilling Wells: A Case Study on the Lobo Trend. International Journal of Science and Technology, 1(11), 2012. rgu-repository.worktribe.com</w:t>
       </w:r>
     </w:p>
     <w:p>
@@ -9704,9 +9626,7 @@
           <w:b/>
         </w:rPr>
         <w:tab/>
-      </w:r>
-      <w:r>
-        <w:t>Differential Stuck Pipe Events: Development of Digital Best Practices for NPT Prevention. Montanuniversität Leoben. pureadmin.unileoben.ac.at. [Authors to be added by the team.]</w:t>
+        <w:t>A. Ortner. Differential Stuck Pipe Events: Development of Digital Best Practices for NPT Prevention. Master's thesis, Montanuniversität Leoben, 2020. pureadmin.unileoben.ac.at</w:t>
       </w:r>
     </w:p>
     <w:p>
@@ -9898,11 +9818,11 @@
       <w:pPr>
         <w:pStyle w:val="Heading1"/>
       </w:pPr>
-      <w:bookmarkStart w:id="30" w:name="_Toc243612601"/>
+      <w:bookmarkStart w:id="29" w:name="_Toc243613446"/>
       <w:r>
         <w:t>Appendix A. How to run</w:t>
       </w:r>
-      <w:bookmarkEnd w:id="30"/>
+      <w:bookmarkEnd w:id="29"/>
     </w:p>
     <w:p>
       <w:r>
@@ -9920,7 +9840,7 @@
     </w:p>
     <w:p>
       <w:r>
-        <w:t xml:space="preserve">Online, without installing anything (mock classifier): </w:t>
+        <w:t>Online, without installing anything (Groq model; the mock is used only if the key is missing or a call fails): https://rig-sight.onrender.com/</w:t>
       </w:r>
       <w:hyperlink r:id="rId20">
         <w:r>

</xml_diff>